<commit_message>
Chuyen 6 quyen sang phuong an ket qua: ESP32 + ma tran LDR suy goc + motor gat nuoc
- Mo phong so (tools/mo_phong.py): hieu suat 1/2 truc, sai so suy goc Monte Carlo,
  so sanh ma tran vs bam buoc thoi gian; hinh ket_qua_mo_phong_1_truc.png
- trich_xuat.py: thay muc 2.4/2.5 ban goc bang ESP32 + dong co gat nuoc truc vit;
  va cac cau Arduino Mega/servo/buoc-thoi gian; refs [8][9][10] cap nhat
- noi_dung_moi_*.py viet lai: chuong ket qua mo phong, che tao motor gat nuoc,
  lap trinh Arduino IDE + cach cai loi ESP32, phuong phap doc ma tran + ADC,
  code mau ESP32 day du trong Word, tien do tuan 5/10-10/10/2026
- ve_hinh.py: ve lai so do khoi/ket noi ESP32, co khi motor gat nuoc,
  luu do ma tran suy goc (bo luu do buoc-thoi gian)
- build_bao_cao.py/xuat_pdf.py: ho tro khoi code (Consolas/Courier)
- Dựng lại 6 file docx + PDF 68 trang

Co-authored-by: arena-agent <297053741+arena-agent@users.noreply.github.com>
</commit_message>
<xml_diff>
--- a/Bao_cao_1_truc_Che_tao.docx
+++ b/Bao_cao_1_truc_Che_tao.docx
@@ -7,7 +7,7 @@
         <w:pStyle w:val="Heading1"/>
       </w:pPr>
       <w:r>
-        <w:t>CHƯƠNG 1. PHƯƠNG ÁN THIẾT KẾ HỆ THỐNG</w:t>
+        <w:t>CHƯƠNG 1. PHƯƠNG ÁN THIẾT KẾ HỆ THỐNG ĐÃ CHỐT</w:t>
       </w:r>
     </w:p>
     <w:p>
@@ -15,13 +15,147 @@
         <w:pStyle w:val="Heading2"/>
       </w:pPr>
       <w:r>
-        <w:t>1.1. Cấu trúc hệ thống đề xuất</w:t>
+        <w:t>1.1. Phương pháp điều khiển chốt: ma trận LDR suy ra góc quay</w:t>
       </w:r>
     </w:p>
     <w:p>
       <w:pPr/>
       <w:r>
-        <w:t>Phương án đo dùng bốn LDR gắn ở bốn góc mặt pin, ký hiệu trên-trái (L_TT), trên-phải (L_PT), dưới-trái (L_TD) và dưới-phải (L_PD). Mỗi LDR được đặt trên giá đỡ đối xứng, trục cảm quang nghiêng ra ngoài so với pháp tuyến mặt pin một góc β_s; bốn góc gá bằng nhau để độ nhạy các hướng có thể so sánh. Ánh sáng từ mỗi vùng trời chiếu vào một cảm biến khác nhau, tạo cơ sở suy ra hướng lệch theo hai phương.</w:t>
+        <w:t>Bốn LDR gắn ở bốn góc tấm pin, ký hiệu trên-trái (L_TT), trên-phải (L_PT), dưới-trái (L_TD), dưới-phải (L_PD), mỗi cảm biến gá chếch ra ngoài một góc β_s = 30° như nhau. Tổng và các sai lệch chuẩn hóa của ma trận được tính:</w:t>
+      </w:r>
+    </w:p>
+    <w:p>
+      <w:pPr>
+        <w:ind w:firstLine="0"/>
+        <w:jc w:val="center"/>
+      </w:pPr>
+      <w:r>
+        <w:rPr>
+          <w:i/>
+        </w:rPr>
+        <w:t>S = L_TT + L_PT + L_TD + L_PD</w:t>
+      </w:r>
+    </w:p>
+    <w:p>
+      <w:pPr>
+        <w:ind w:firstLine="0"/>
+        <w:jc w:val="center"/>
+      </w:pPr>
+      <w:r>
+        <w:rPr>
+          <w:i/>
+        </w:rPr>
+        <w:t>e_quay = [(L_PT + L_PD) − (L_TT + L_TD)] / S</w:t>
+      </w:r>
+    </w:p>
+    <w:p>
+      <w:pPr>
+        <w:ind w:firstLine="0"/>
+        <w:jc w:val="center"/>
+      </w:pPr>
+      <w:r>
+        <w:rPr>
+          <w:i/>
+        </w:rPr>
+        <w:t>e_nghiêng = [(L_TT + L_PT) − (L_TD + L_PD)] / S</w:t>
+      </w:r>
+    </w:p>
+    <w:p>
+      <w:pPr/>
+      <w:r>
+        <w:t>Vì đáp ứng mỗi kênh tỉ lệ với cos(Δ ∓ β_s) trong mặt phẳng tương ứng, sai lệch chuẩn hóa liên hệ trực tiếp với góc lệch Δ giữa hướng Mặt Trời và pháp tuyến tấm pin:</w:t>
+      </w:r>
+    </w:p>
+    <w:p>
+      <w:pPr>
+        <w:ind w:firstLine="0"/>
+        <w:jc w:val="center"/>
+      </w:pPr>
+      <w:r>
+        <w:rPr>
+          <w:i/>
+        </w:rPr>
+        <w:t>Δ_quay = atan(e_quay / tan β_s);   Δ_nghiêng = atan(e_nghiêng / tan β_s)</w:t>
+      </w:r>
+    </w:p>
+    <w:p>
+      <w:pPr/>
+      <w:r>
+        <w:t>Như vậy mỗi lần đọc ma trận cho ngay góc cần quay, không phải dò bước theo thời gian. Góc đích được tính từ hồi tiếp vị trí và giới hạn trong hành trình:</w:t>
+      </w:r>
+    </w:p>
+    <w:p>
+      <w:pPr>
+        <w:ind w:firstLine="0"/>
+        <w:jc w:val="center"/>
+      </w:pPr>
+      <w:r>
+        <w:rPr>
+          <w:i/>
+        </w:rPr>
+        <w:t>θ_đích = sat(θ_hiện tại + Δ, θ_min, θ_max)</w:t>
+      </w:r>
+    </w:p>
+    <w:p>
+      <w:pPr/>
+      <w:r>
+        <w:t>Động cơ chỉ chạy khi |Δ| &gt; δ = 3° và dừng khi biến trở hồi tiếp báo θ đạt θ_đích; nhờ hộp giảm tốc trục vít tự hãm, tấm pin giữ nguyên vị trí khi dừng hoặc mất điện. Sai lệch chéo e_chéo = [(L_TT + L_PD) − (L_PT + L_TD)]/S chỉ dùng kiểm tra che bóng bất đối xứng, không tham gia phát lệnh.</w:t>
+      </w:r>
+    </w:p>
+    <w:p>
+      <w:pPr>
+        <w:pStyle w:val="Heading2"/>
+      </w:pPr>
+      <w:r>
+        <w:t>1.2. Cấu trúc tổng thể hệ thống</w:t>
+      </w:r>
+    </w:p>
+    <w:p>
+      <w:pPr>
+        <w:ind w:firstLine="0"/>
+        <w:jc w:val="center"/>
+      </w:pPr>
+      <w:r>
+        <w:drawing>
+          <wp:inline xmlns:a="http://schemas.openxmlformats.org/drawingml/2006/main" xmlns:pic="http://schemas.openxmlformats.org/drawingml/2006/picture">
+            <wp:extent cx="5580000" cy="3776295"/>
+            <wp:docPr id="1" name="Picture 1"/>
+            <wp:cNvGraphicFramePr>
+              <a:graphicFrameLocks noChangeAspect="1"/>
+            </wp:cNvGraphicFramePr>
+            <a:graphic>
+              <a:graphicData uri="http://schemas.openxmlformats.org/drawingml/2006/picture">
+                <pic:pic>
+                  <pic:nvPicPr>
+                    <pic:cNvPr id="0" name="so_do_khoi_1_truc.png"/>
+                    <pic:cNvPicPr/>
+                  </pic:nvPicPr>
+                  <pic:blipFill>
+                    <a:blip r:embed="rId10"/>
+                    <a:stretch>
+                      <a:fillRect/>
+                    </a:stretch>
+                  </pic:blipFill>
+                  <pic:spPr>
+                    <a:xfrm>
+                      <a:off x="0" y="0"/>
+                      <a:ext cx="5580000" cy="3776295"/>
+                    </a:xfrm>
+                    <a:prstGeom prst="rect"/>
+                  </pic:spPr>
+                </pic:pic>
+              </a:graphicData>
+            </a:graphic>
+          </wp:inline>
+        </w:drawing>
+      </w:r>
+    </w:p>
+    <w:p>
+      <w:pPr>
+        <w:pStyle w:val="Caption"/>
+      </w:pPr>
+      <w:r>
+        <w:t>Hình 1. Sơ đồ khối hệ thống bám nắng một trục dùng ESP32</w:t>
       </w:r>
     </w:p>
     <w:p>
@@ -30,7 +164,7 @@
         <w:spacing w:after="80"/>
       </w:pPr>
       <w:r>
-        <w:t>Bảng 1. Cấu hình và nhiệm vụ các khối hệ thống một trục</w:t>
+        <w:t>Bảng 1. Các khối chức năng của hệ thống một trục</w:t>
       </w:r>
     </w:p>
     <w:tbl>
@@ -78,7 +212,7 @@
                 <w:b/>
                 <w:sz w:val="22"/>
               </w:rPr>
-              <w:t>Cấu hình đề xuất</w:t>
+              <w:t>Cấu hình chốt</w:t>
             </w:r>
           </w:p>
         </w:tc>
@@ -115,7 +249,7 @@
               <w:rPr>
                 <w:sz w:val="22"/>
               </w:rPr>
-              <w:t>Cảm biến</w:t>
+              <w:t>Cảm biến hướng</w:t>
             </w:r>
           </w:p>
         </w:tc>
@@ -132,7 +266,7 @@
               <w:rPr>
                 <w:sz w:val="22"/>
               </w:rPr>
-              <w:t>4 LDR tại 4 góc, gá nghiêng hướng ra ngoài; BH1750 tham chiếu.</w:t>
+              <w:t>4 LDR gá β_s = 30° ở 4 góc</w:t>
             </w:r>
           </w:p>
         </w:tc>
@@ -149,7 +283,60 @@
               <w:rPr>
                 <w:sz w:val="22"/>
               </w:rPr>
-              <w:t>Đo bốn mức sáng; tạo sai lệch quay và nghiêng.</w:t>
+              <w:t>Lập ma trận sáng, tạo e_quay.</w:t>
+            </w:r>
+          </w:p>
+        </w:tc>
+      </w:tr>
+      <w:tr>
+        <w:tc>
+          <w:tcPr>
+            <w:tcW w:type="dxa" w:w="3010"/>
+          </w:tcPr>
+          <w:p>
+            <w:pPr>
+              <w:spacing w:after="40"/>
+              <w:ind w:firstLine="0"/>
+            </w:pPr>
+            <w:r>
+              <w:rPr>
+                <w:sz w:val="22"/>
+              </w:rPr>
+              <w:t>Hồi tiếp vị trí</w:t>
+            </w:r>
+          </w:p>
+        </w:tc>
+        <w:tc>
+          <w:tcPr>
+            <w:tcW w:type="dxa" w:w="3010"/>
+          </w:tcPr>
+          <w:p>
+            <w:pPr>
+              <w:spacing w:after="40"/>
+              <w:ind w:firstLine="0"/>
+            </w:pPr>
+            <w:r>
+              <w:rPr>
+                <w:sz w:val="22"/>
+              </w:rPr>
+              <w:t>Biến trở xoay 10 k đồng trục</w:t>
+            </w:r>
+          </w:p>
+        </w:tc>
+        <w:tc>
+          <w:tcPr>
+            <w:tcW w:type="dxa" w:w="3010"/>
+          </w:tcPr>
+          <w:p>
+            <w:pPr>
+              <w:spacing w:after="40"/>
+              <w:ind w:firstLine="0"/>
+            </w:pPr>
+            <w:r>
+              <w:rPr>
+                <w:sz w:val="22"/>
+              </w:rPr>
+              <w:t>Báo góc hiện tại để dừng đúng góc đích.</w:t>
             </w:r>
           </w:p>
         </w:tc>
@@ -185,7 +372,7 @@
               <w:rPr>
                 <w:sz w:val="22"/>
               </w:rPr>
-              <w:t>ESP32 + RTC DS3231.</w:t>
+              <w:t>ESP32 DevKit + RTC DS3231</w:t>
             </w:r>
           </w:p>
         </w:tc>
@@ -202,7 +389,7 @@
               <w:rPr>
                 <w:sz w:val="22"/>
               </w:rPr>
-              <w:t>Lọc tín hiệu, tính sai lệch, chạy thuật toán và ghi dữ liệu.</w:t>
+              <w:t>ADC 12 bit, lọc trung vị, suy góc, liên động, ghi log.</w:t>
             </w:r>
           </w:p>
         </w:tc>
@@ -221,7 +408,7 @@
               <w:rPr>
                 <w:sz w:val="22"/>
               </w:rPr>
-              <w:t>Cơ khí</w:t>
+              <w:t>Đo kiểm</w:t>
             </w:r>
           </w:p>
         </w:tc>
@@ -238,7 +425,7 @@
               <w:rPr>
                 <w:sz w:val="22"/>
               </w:rPr>
-              <w:t>Mô hình trong phạm vi đề tài có một trục quay.</w:t>
+              <w:t>ADS1115 (I²C, 16 bit)</w:t>
             </w:r>
           </w:p>
         </w:tc>
@@ -255,7 +442,60 @@
               <w:rPr>
                 <w:sz w:val="22"/>
               </w:rPr>
-              <w:t>Dùng sai lệch ứng với trục lắp; thành phần còn lại được ghi nhận.</w:t>
+              <w:t>Đo U, I tấm pin phục vụ tính năng lượng.</w:t>
+            </w:r>
+          </w:p>
+        </w:tc>
+      </w:tr>
+      <w:tr>
+        <w:tc>
+          <w:tcPr>
+            <w:tcW w:type="dxa" w:w="3010"/>
+          </w:tcPr>
+          <w:p>
+            <w:pPr>
+              <w:spacing w:after="40"/>
+              <w:ind w:firstLine="0"/>
+            </w:pPr>
+            <w:r>
+              <w:rPr>
+                <w:sz w:val="22"/>
+              </w:rPr>
+              <w:t>Chấp hành</w:t>
+            </w:r>
+          </w:p>
+        </w:tc>
+        <w:tc>
+          <w:tcPr>
+            <w:tcW w:type="dxa" w:w="3010"/>
+          </w:tcPr>
+          <w:p>
+            <w:pPr>
+              <w:spacing w:after="40"/>
+              <w:ind w:firstLine="0"/>
+            </w:pPr>
+            <w:r>
+              <w:rPr>
+                <w:sz w:val="22"/>
+              </w:rPr>
+              <w:t>Motor gạt nước 12 V trục vít + relay 2 kênh</w:t>
+            </w:r>
+          </w:p>
+        </w:tc>
+        <w:tc>
+          <w:tcPr>
+            <w:tcW w:type="dxa" w:w="3010"/>
+          </w:tcPr>
+          <w:p>
+            <w:pPr>
+              <w:spacing w:after="40"/>
+              <w:ind w:firstLine="0"/>
+            </w:pPr>
+            <w:r>
+              <w:rPr>
+                <w:sz w:val="22"/>
+              </w:rPr>
+              <w:t>Quay trục Đông–Tây; tự giữ khi mất điện.</w:t>
             </w:r>
           </w:p>
         </w:tc>
@@ -291,7 +531,7 @@
               <w:rPr>
                 <w:sz w:val="22"/>
               </w:rPr>
-              <w:t>Cơ cấu chấp hành phù hợp tải + công tắc hành trình.</w:t>
+              <w:t>2 công tắc hành trình + nút dừng khẩn cấp</w:t>
             </w:r>
           </w:p>
         </w:tc>
@@ -308,60 +548,7 @@
               <w:rPr>
                 <w:sz w:val="22"/>
               </w:rPr>
-              <w:t>Giới hạn chuyển động và dừng an toàn.</w:t>
-            </w:r>
-          </w:p>
-        </w:tc>
-      </w:tr>
-      <w:tr>
-        <w:tc>
-          <w:tcPr>
-            <w:tcW w:type="dxa" w:w="3010"/>
-          </w:tcPr>
-          <w:p>
-            <w:pPr>
-              <w:spacing w:after="40"/>
-              <w:ind w:firstLine="0"/>
-            </w:pPr>
-            <w:r>
-              <w:rPr>
-                <w:sz w:val="22"/>
-              </w:rPr>
-              <w:t>Đo kiểm</w:t>
-            </w:r>
-          </w:p>
-        </w:tc>
-        <w:tc>
-          <w:tcPr>
-            <w:tcW w:type="dxa" w:w="3010"/>
-          </w:tcPr>
-          <w:p>
-            <w:pPr>
-              <w:spacing w:after="40"/>
-              <w:ind w:firstLine="0"/>
-            </w:pPr>
-            <w:r>
-              <w:rPr>
-                <w:sz w:val="22"/>
-              </w:rPr>
-              <w:t>Đo U, I pin và điện năng actuator.</w:t>
-            </w:r>
-          </w:p>
-        </w:tc>
-        <w:tc>
-          <w:tcPr>
-            <w:tcW w:type="dxa" w:w="3010"/>
-          </w:tcPr>
-          <w:p>
-            <w:pPr>
-              <w:spacing w:after="40"/>
-              <w:ind w:firstLine="0"/>
-            </w:pPr>
-            <w:r>
-              <w:rPr>
-                <w:sz w:val="22"/>
-              </w:rPr>
-              <w:t>Đánh giá năng lượng thuần và chuyển động.</w:t>
+              <w:t>Chặn quá hành trình, cắt lệnh an toàn.</w:t>
             </w:r>
           </w:p>
         </w:tc>
@@ -371,9 +558,11 @@
       <w:pPr/>
     </w:p>
     <w:p>
-      <w:pPr/>
+      <w:pPr>
+        <w:pStyle w:val="Heading2"/>
+      </w:pPr>
       <w:r>
-        <w:t>Cụm cảm biến cung cấp hai tín hiệu hướng độc lập, nhưng mô hình một trục chỉ có một bậc tự do cơ khí. Vì vậy, cần chọn trước trục thực sự được điều khiển; tín hiệu trục còn lại chỉ dùng để giám sát, phân tích hoặc làm cơ sở đề xuất mở rộng thành tracker hai trục. Không kết luận mô hình một trục đã tự điều chỉnh được đồng thời cả phương vị và góc cao.</w:t>
+        <w:t>1.3. Bố trí cụm cảm biến và góc gá β_s</w:t>
       </w:r>
     </w:p>
     <w:p>
@@ -384,8 +573,8 @@
       <w:r>
         <w:drawing>
           <wp:inline xmlns:a="http://schemas.openxmlformats.org/drawingml/2006/main" xmlns:pic="http://schemas.openxmlformats.org/drawingml/2006/picture">
-            <wp:extent cx="5580000" cy="3673726"/>
-            <wp:docPr id="1" name="Picture 1"/>
+            <wp:extent cx="5580000" cy="2124993"/>
+            <wp:docPr id="2" name="Picture 2"/>
             <wp:cNvGraphicFramePr>
               <a:graphicFrameLocks noChangeAspect="1"/>
             </wp:cNvGraphicFramePr>
@@ -393,11 +582,11 @@
               <a:graphicData uri="http://schemas.openxmlformats.org/drawingml/2006/picture">
                 <pic:pic>
                   <pic:nvPicPr>
-                    <pic:cNvPr id="0" name="so_do_khoi_1_truc.png"/>
+                    <pic:cNvPr id="0" name="bo_tri_4_ldr.png"/>
                     <pic:cNvPicPr/>
                   </pic:nvPicPr>
                   <pic:blipFill>
-                    <a:blip r:embed="rId10"/>
+                    <a:blip r:embed="rId11"/>
                     <a:stretch>
                       <a:fillRect/>
                     </a:stretch>
@@ -405,7 +594,7 @@
                   <pic:spPr>
                     <a:xfrm>
                       <a:off x="0" y="0"/>
-                      <a:ext cx="5580000" cy="3673726"/>
+                      <a:ext cx="5580000" cy="2124993"/>
                     </a:xfrm>
                     <a:prstGeom prst="rect"/>
                   </pic:spPr>
@@ -421,21 +610,7 @@
         <w:pStyle w:val="Caption"/>
       </w:pPr>
       <w:r>
-        <w:t>Hình 1. Sơ đồ khối hệ thống bám nắng một trục</w:t>
-      </w:r>
-    </w:p>
-    <w:p>
-      <w:pPr>
-        <w:pStyle w:val="Heading2"/>
-      </w:pPr>
-      <w:r>
-        <w:t>1.2. Thiết kế cảm biến và hiệu chuẩn</w:t>
-      </w:r>
-    </w:p>
-    <w:p>
-      <w:pPr/>
-      <w:r>
-        <w:t>Bốn cảm biến đặt đối xứng ở bốn góc tấm pin. Nhìn từ phía trước mặt pin, L_TT là góc trên-trái, L_PT là trên-phải, L_TD là dưới-trái và L_PD là dưới-phải. Mỗi cảm biến hướng chếch ra ngoài khỏi tâm cụm một góc β_s so với pháp tuyến mặt pin; chọn cùng giá đỡ, cùng góc và tránh để khung, cáp hoặc cảm biến bên cạnh che khuất trường nhìn.</w:t>
+        <w:t>Hình 2. Bố trí 4 LDR ở bốn góc tấm pin và mặt cắt góc gá β_s</w:t>
       </w:r>
     </w:p>
     <w:p>
@@ -734,43 +909,37 @@
     <w:p>
       <w:pPr/>
       <w:r>
-        <w:t>Chọn góc gá β_s bằng thử nghiệm thay vì mặc định một con số: đặt cụm cảm biến trên giá quay, chiếu sáng từ các hướng đã biết, thử một số góc gá đối xứng và chọn vùng mà chênh lệch tín hiệu đổi dấu đúng chiều, biến thiên đủ rõ nhưng không làm cảm biến bão hòa hoặc bị che. Cố định chắc giá sau hiệu chuẩn và ghi lại góc gá thực tế.</w:t>
+        <w:t>Góc gá β_s = 30° được chốt từ kết quả mô phỏng tuần 5/10–10/10: đủ độ nhạy (Δ = 3° đã cho e ≈ 0,030) mà chưa bão hòa trong dải lệch ±40°. Giá gá bốn cảm biến phải cùng một mẫu, cùng góc, không bị khung hoặc dây che; sau hiệu chuẩn phải cố định chắc và ghi lại góc thực tế.</w:t>
+      </w:r>
+    </w:p>
+    <w:p>
+      <w:pPr>
+        <w:pStyle w:val="Heading2"/>
+      </w:pPr>
+      <w:r>
+        <w:t>1.4. Cơ cấu chấp hành và hồi tiếp vị trí</w:t>
       </w:r>
     </w:p>
     <w:p>
       <w:pPr/>
       <w:r>
-        <w:t>Mắc mỗi LDR thành mạch chia áp riêng, lấy nhiều mẫu ADC để lọc nhiễu. Trước hết hiệu chuẩn độ lệch/độ lợi của bốn kênh dưới cùng một nguồn sáng khuếch tán; sau đó thay đổi hướng chiếu có kiểm soát để kiểm tra dấu, độ nhạy và vùng tuyến tính. BH1750 chỉ làm kênh tham chiếu tương đối nếu dải đo đáp ứng; dưới nắng trực tiếp cảm biến độ rọi phổ thông có thể bão hòa.</w:t>
+        <w:t>Trục quay căn hướng Bắc – Nam thật, đặt gần trọng tâm tấm pin. Động cơ gạt nước ô tô 12 V gắn qua tay đòn; cặp trục vít – bánh vít tự hãm nên cơ cấu không trôi khi ngắt điện, không cần nuôi điện giữ vị trí. Biến trở xoay 10 k gắn đồng trục với trục quay, chia áp về một kênh ADC1 để chương trình đọc góc hiện tại; hai công tắc hành trình đặt trước điểm va chạm cơ khí ở hai đầu Đông – Tây.</w:t>
       </w:r>
     </w:p>
     <w:p>
-      <w:pPr/>
+      <w:pPr>
+        <w:pStyle w:val="Heading1"/>
+      </w:pPr>
       <w:r>
-        <w:t>Để tính hướng, tổng tín hiệu được xác định S = L_TT + L_PT + L_TD + L_PD + ε. Chênh lệch trái–phải biểu diễn hướng quay; chênh lệch trên–dưới biểu diễn hướng nghiêng. Chuẩn hóa theo S giúp giảm phụ thuộc độ sáng chung; khi S thấp hoặc thay đổi quá nhanh, không dùng tín hiệu quang để ra lệnh.</w:t>
+        <w:t>CHƯƠNG 2. THIẾT KẾ CƠ KHÍ, MẠCH ĐIỆN VÀ DANH MỤC VẬT TƯ</w:t>
       </w:r>
     </w:p>
     <w:p>
-      <w:pPr/>
+      <w:pPr>
+        <w:pStyle w:val="Heading2"/>
+      </w:pPr>
       <w:r>
-        <w:t>e_quay = [(L_PT + L_PD) − (L_TT + L_TD)] / S</w:t>
-      </w:r>
-    </w:p>
-    <w:p>
-      <w:pPr/>
-      <w:r>
-        <w:t>e_nghiêng = [(L_TT + L_PT) − (L_TD + L_PD)] / S</w:t>
-      </w:r>
-    </w:p>
-    <w:p>
-      <w:pPr/>
-      <w:r>
-        <w:t>e_chéo = [(L_TT + L_PD) − (L_PT + L_TD)] / S</w:t>
-      </w:r>
-    </w:p>
-    <w:p>
-      <w:pPr/>
-      <w:r>
-        <w:t>e_chéo dùng như chỉ báo kiểm tra bất đối xứng/che bóng theo đường chéo; không thay thế hai sai lệch điều khiển chính. Dấu dương của e_quay/e_nghiêng chỉ chiều cần chuyển động sau khi kiểm tra trên phần cứng; nếu đấu ADC hoặc gá cảm biến theo chiều ngược thì dấu lệnh phải hiệu chuẩn lại.</w:t>
+        <w:t>2.1. Kết cấu cơ khí</w:t>
       </w:r>
     </w:p>
     <w:p>
@@ -781,75 +950,7 @@
       <w:r>
         <w:drawing>
           <wp:inline xmlns:a="http://schemas.openxmlformats.org/drawingml/2006/main" xmlns:pic="http://schemas.openxmlformats.org/drawingml/2006/picture">
-            <wp:extent cx="5580000" cy="2124993"/>
-            <wp:docPr id="2" name="Picture 2"/>
-            <wp:cNvGraphicFramePr>
-              <a:graphicFrameLocks noChangeAspect="1"/>
-            </wp:cNvGraphicFramePr>
-            <a:graphic>
-              <a:graphicData uri="http://schemas.openxmlformats.org/drawingml/2006/picture">
-                <pic:pic>
-                  <pic:nvPicPr>
-                    <pic:cNvPr id="0" name="bo_tri_4_ldr.png"/>
-                    <pic:cNvPicPr/>
-                  </pic:nvPicPr>
-                  <pic:blipFill>
-                    <a:blip r:embed="rId11"/>
-                    <a:stretch>
-                      <a:fillRect/>
-                    </a:stretch>
-                  </pic:blipFill>
-                  <pic:spPr>
-                    <a:xfrm>
-                      <a:off x="0" y="0"/>
-                      <a:ext cx="5580000" cy="2124993"/>
-                    </a:xfrm>
-                    <a:prstGeom prst="rect"/>
-                  </pic:spPr>
-                </pic:pic>
-              </a:graphicData>
-            </a:graphic>
-          </wp:inline>
-        </w:drawing>
-      </w:r>
-    </w:p>
-    <w:p>
-      <w:pPr>
-        <w:pStyle w:val="Caption"/>
-      </w:pPr>
-      <w:r>
-        <w:t>Hình 2. Bố trí 4 LDR ở bốn góc tấm pin và mặt cắt góc gá β_s</w:t>
-      </w:r>
-    </w:p>
-    <w:p>
-      <w:pPr>
-        <w:pStyle w:val="Heading2"/>
-      </w:pPr>
-      <w:r>
-        <w:t>1.3. Thiết kế cơ cấu và bảo vệ</w:t>
-      </w:r>
-    </w:p>
-    <w:p>
-      <w:pPr/>
-      <w:r>
-        <w:t>Trục quay được căn theo hướng Bắc–Nam thật và đặt gần trọng tâm tấm pin để giảm mô-men. Trước khi chọn servo hoặc động cơ, cần ước lượng mô-men do trọng lượng, ma sát và gió, sau đó dự trữ hệ số an toàn. Hai đầu hành trình được xác định theo va chạm cơ khí, dây dẫn và khả năng quay của actuator; góc đặt phần mềm phải nằm bên trong giới hạn cứng.</w:t>
-      </w:r>
-    </w:p>
-    <w:p>
-      <w:pPr/>
-      <w:r>
-        <w:t>Công tắc hành trình được đặt sao cho cơ cấu chạm công tắc trước khi va vào khung. Khi công tắc ở đầu Đông tác động, chương trình chỉ cấm chuyển động tiếp về phía Đông; cho phép lệnh quay ngược để rời công tắc. Khởi động hệ thống cần xác định vị trí tham chiếu an toàn, kiểm tra công tắc và thử cơ cấu ở tốc độ thấp trước khi lắp tấm pin.</w:t>
-      </w:r>
-    </w:p>
-    <w:p>
-      <w:pPr>
-        <w:ind w:firstLine="0"/>
-        <w:jc w:val="center"/>
-      </w:pPr>
-      <w:r>
-        <w:drawing>
-          <wp:inline xmlns:a="http://schemas.openxmlformats.org/drawingml/2006/main" xmlns:pic="http://schemas.openxmlformats.org/drawingml/2006/picture">
-            <wp:extent cx="5400000" cy="3365819"/>
+            <wp:extent cx="5400000" cy="3458678"/>
             <wp:docPr id="3" name="Picture 3"/>
             <wp:cNvGraphicFramePr>
               <a:graphicFrameLocks noChangeAspect="1"/>
@@ -870,7 +971,7 @@
                   <pic:spPr>
                     <a:xfrm>
                       <a:off x="0" y="0"/>
-                      <a:ext cx="5400000" cy="3365819"/>
+                      <a:ext cx="5400000" cy="3458678"/>
                     </a:xfrm>
                     <a:prstGeom prst="rect"/>
                   </pic:spPr>
@@ -886,15 +987,13 @@
         <w:pStyle w:val="Caption"/>
       </w:pPr>
       <w:r>
-        <w:t>Hình 3. Mặt cắt mô hình cơ khí một trục: trục ngang Bắc – Nam, actuator và hai công tắc hành trình</w:t>
+        <w:t>Hình 3. Mặt cắt mô hình cơ khí một trục với động cơ gạt nước trục vít</w:t>
       </w:r>
     </w:p>
     <w:p>
-      <w:pPr>
-        <w:pStyle w:val="Heading1"/>
-      </w:pPr>
+      <w:pPr/>
       <w:r>
-        <w:t>CHƯƠNG 2. THIẾT KẾ CƠ KHÍ, MẠCH ĐIỆN VÀ DANH MỤC VẬT TƯ</w:t>
+        <w:t>Khung đế phẳng có bulông cân bằng; hai gối đỡ mang trục thép tròn có bạc lót; tấm pin bắt lên khung đỡ qua tai bắt vít sao cho tâm khối lượng sát trục. Tay đòn nối trục vít của động cơ với khung pin có khớp bản lề để khử sai lệch quỹ đạo; dây dẫn chừa dư theo toàn hành trình. Hai công tắc hành trình gắn ở giá sao cho cần gạt chạm trước khi khung pin va gối đỡ.</w:t>
       </w:r>
     </w:p>
     <w:p>
@@ -902,25 +1001,412 @@
         <w:pStyle w:val="Heading2"/>
       </w:pPr>
       <w:r>
-        <w:t>2.1. Kết cấu cơ khí và truyền động</w:t>
+        <w:t>2.2. Kết quả tính chọn động cơ</w:t>
       </w:r>
+    </w:p>
+    <w:p>
+      <w:pPr>
+        <w:pStyle w:val="Caption"/>
+        <w:spacing w:after="80"/>
+      </w:pPr>
+      <w:r>
+        <w:t>Bảng 3. Tính chọn động cơ gạt nước cho trục quay một trục</w:t>
+      </w:r>
+    </w:p>
+    <w:tbl>
+      <w:tblPr>
+        <w:tblStyle w:val="TableGrid"/>
+        <w:tblW w:type="auto" w:w="0"/>
+        <w:jc w:val="center"/>
+        <w:tblLook w:firstColumn="1" w:firstRow="1" w:lastColumn="0" w:lastRow="0" w:noHBand="0" w:noVBand="1" w:val="04A0"/>
+      </w:tblPr>
+      <w:tblGrid>
+        <w:gridCol w:w="3010"/>
+        <w:gridCol w:w="3010"/>
+        <w:gridCol w:w="3010"/>
+      </w:tblGrid>
+      <w:tr>
+        <w:tc>
+          <w:tcPr>
+            <w:tcW w:type="dxa" w:w="3010"/>
+          </w:tcPr>
+          <w:p>
+            <w:pPr>
+              <w:spacing w:after="40"/>
+              <w:ind w:firstLine="0"/>
+            </w:pPr>
+            <w:r>
+              <w:rPr>
+                <w:b/>
+                <w:sz w:val="22"/>
+              </w:rPr>
+              <w:t>Hạng mục</w:t>
+            </w:r>
+          </w:p>
+        </w:tc>
+        <w:tc>
+          <w:tcPr>
+            <w:tcW w:type="dxa" w:w="3010"/>
+          </w:tcPr>
+          <w:p>
+            <w:pPr>
+              <w:spacing w:after="40"/>
+              <w:ind w:firstLine="0"/>
+            </w:pPr>
+            <w:r>
+              <w:rPr>
+                <w:b/>
+                <w:sz w:val="22"/>
+              </w:rPr>
+              <w:t>Giá trị tính toán</w:t>
+            </w:r>
+          </w:p>
+        </w:tc>
+        <w:tc>
+          <w:tcPr>
+            <w:tcW w:type="dxa" w:w="3010"/>
+          </w:tcPr>
+          <w:p>
+            <w:pPr>
+              <w:spacing w:after="40"/>
+              <w:ind w:firstLine="0"/>
+            </w:pPr>
+            <w:r>
+              <w:rPr>
+                <w:b/>
+                <w:sz w:val="22"/>
+              </w:rPr>
+              <w:t>Ghi chú</w:t>
+            </w:r>
+          </w:p>
+        </w:tc>
+      </w:tr>
+      <w:tr>
+        <w:tc>
+          <w:tcPr>
+            <w:tcW w:type="dxa" w:w="3010"/>
+          </w:tcPr>
+          <w:p>
+            <w:pPr>
+              <w:spacing w:after="40"/>
+              <w:ind w:firstLine="0"/>
+            </w:pPr>
+            <w:r>
+              <w:rPr>
+                <w:sz w:val="22"/>
+              </w:rPr>
+              <w:t>Khối lượng tấm pin 10 W</w:t>
+            </w:r>
+          </w:p>
+        </w:tc>
+        <w:tc>
+          <w:tcPr>
+            <w:tcW w:type="dxa" w:w="3010"/>
+          </w:tcPr>
+          <w:p>
+            <w:pPr>
+              <w:spacing w:after="40"/>
+              <w:ind w:firstLine="0"/>
+            </w:pPr>
+            <w:r>
+              <w:rPr>
+                <w:sz w:val="22"/>
+              </w:rPr>
+              <w:t>≈ 0,9 kg</w:t>
+            </w:r>
+          </w:p>
+        </w:tc>
+        <w:tc>
+          <w:tcPr>
+            <w:tcW w:type="dxa" w:w="3010"/>
+          </w:tcPr>
+          <w:p>
+            <w:pPr>
+              <w:spacing w:after="40"/>
+              <w:ind w:firstLine="0"/>
+            </w:pPr>
+            <w:r>
+              <w:rPr>
+                <w:sz w:val="22"/>
+              </w:rPr>
+              <w:t>Lắp cân bằng quanh trục nên mô-men tĩnh ≈ 0.</w:t>
+            </w:r>
+          </w:p>
+        </w:tc>
+      </w:tr>
+      <w:tr>
+        <w:tc>
+          <w:tcPr>
+            <w:tcW w:type="dxa" w:w="3010"/>
+          </w:tcPr>
+          <w:p>
+            <w:pPr>
+              <w:spacing w:after="40"/>
+              <w:ind w:firstLine="0"/>
+            </w:pPr>
+            <w:r>
+              <w:rPr>
+                <w:sz w:val="22"/>
+              </w:rPr>
+              <w:t>Tải gió v = 10 m/s</w:t>
+            </w:r>
+          </w:p>
+        </w:tc>
+        <w:tc>
+          <w:tcPr>
+            <w:tcW w:type="dxa" w:w="3010"/>
+          </w:tcPr>
+          <w:p>
+            <w:pPr>
+              <w:spacing w:after="40"/>
+              <w:ind w:firstLine="0"/>
+            </w:pPr>
+            <w:r>
+              <w:rPr>
+                <w:sz w:val="22"/>
+              </w:rPr>
+              <w:t>q = 0,6·v² ≈ 60 Pa; F ≈ 3,6 N với S = 0,06 m²</w:t>
+            </w:r>
+          </w:p>
+        </w:tc>
+        <w:tc>
+          <w:tcPr>
+            <w:tcW w:type="dxa" w:w="3010"/>
+          </w:tcPr>
+          <w:p>
+            <w:pPr>
+              <w:spacing w:after="40"/>
+              <w:ind w:firstLine="0"/>
+            </w:pPr>
+            <w:r>
+              <w:rPr>
+                <w:sz w:val="22"/>
+              </w:rPr>
+              <w:t>Tác dụng lên mặt pin.</w:t>
+            </w:r>
+          </w:p>
+        </w:tc>
+      </w:tr>
+      <w:tr>
+        <w:tc>
+          <w:tcPr>
+            <w:tcW w:type="dxa" w:w="3010"/>
+          </w:tcPr>
+          <w:p>
+            <w:pPr>
+              <w:spacing w:after="40"/>
+              <w:ind w:firstLine="0"/>
+            </w:pPr>
+            <w:r>
+              <w:rPr>
+                <w:sz w:val="22"/>
+              </w:rPr>
+              <w:t>Mô-men gió lớn nhất</w:t>
+            </w:r>
+          </w:p>
+        </w:tc>
+        <w:tc>
+          <w:tcPr>
+            <w:tcW w:type="dxa" w:w="3010"/>
+          </w:tcPr>
+          <w:p>
+            <w:pPr>
+              <w:spacing w:after="40"/>
+              <w:ind w:firstLine="0"/>
+            </w:pPr>
+            <w:r>
+              <w:rPr>
+                <w:sz w:val="22"/>
+              </w:rPr>
+              <w:t>M ≈ F × 0,15 m ≈ 0,54 N·m</w:t>
+            </w:r>
+          </w:p>
+        </w:tc>
+        <w:tc>
+          <w:tcPr>
+            <w:tcW w:type="dxa" w:w="3010"/>
+          </w:tcPr>
+          <w:p>
+            <w:pPr>
+              <w:spacing w:after="40"/>
+              <w:ind w:firstLine="0"/>
+            </w:pPr>
+            <w:r>
+              <w:rPr>
+                <w:sz w:val="22"/>
+              </w:rPr>
+              <w:t>Cánh tay đòn tới trục.</w:t>
+            </w:r>
+          </w:p>
+        </w:tc>
+      </w:tr>
+      <w:tr>
+        <w:tc>
+          <w:tcPr>
+            <w:tcW w:type="dxa" w:w="3010"/>
+          </w:tcPr>
+          <w:p>
+            <w:pPr>
+              <w:spacing w:after="40"/>
+              <w:ind w:firstLine="0"/>
+            </w:pPr>
+            <w:r>
+              <w:rPr>
+                <w:sz w:val="22"/>
+              </w:rPr>
+              <w:t>Mô-men yêu cầu (×3 khởi động/ma sát)</w:t>
+            </w:r>
+          </w:p>
+        </w:tc>
+        <w:tc>
+          <w:tcPr>
+            <w:tcW w:type="dxa" w:w="3010"/>
+          </w:tcPr>
+          <w:p>
+            <w:pPr>
+              <w:spacing w:after="40"/>
+              <w:ind w:firstLine="0"/>
+            </w:pPr>
+            <w:r>
+              <w:rPr>
+                <w:sz w:val="22"/>
+              </w:rPr>
+              <w:t>≈ 1,6 N·m</w:t>
+            </w:r>
+          </w:p>
+        </w:tc>
+        <w:tc>
+          <w:tcPr>
+            <w:tcW w:type="dxa" w:w="3010"/>
+          </w:tcPr>
+          <w:p>
+            <w:pPr>
+              <w:spacing w:after="40"/>
+              <w:ind w:firstLine="0"/>
+            </w:pPr>
+            <w:r>
+              <w:rPr>
+                <w:sz w:val="22"/>
+              </w:rPr>
+              <w:t>Hệ số dự trữ cho khớp trục vít.</w:t>
+            </w:r>
+          </w:p>
+        </w:tc>
+      </w:tr>
+      <w:tr>
+        <w:tc>
+          <w:tcPr>
+            <w:tcW w:type="dxa" w:w="3010"/>
+          </w:tcPr>
+          <w:p>
+            <w:pPr>
+              <w:spacing w:after="40"/>
+              <w:ind w:firstLine="0"/>
+            </w:pPr>
+            <w:r>
+              <w:rPr>
+                <w:sz w:val="22"/>
+              </w:rPr>
+              <w:t>Motor gạt nước 12 V điển hình</w:t>
+            </w:r>
+          </w:p>
+        </w:tc>
+        <w:tc>
+          <w:tcPr>
+            <w:tcW w:type="dxa" w:w="3010"/>
+          </w:tcPr>
+          <w:p>
+            <w:pPr>
+              <w:spacing w:after="40"/>
+              <w:ind w:firstLine="0"/>
+            </w:pPr>
+            <w:r>
+              <w:rPr>
+                <w:sz w:val="22"/>
+              </w:rPr>
+              <w:t>8 – 12 N·m, dòng 3 – 6 A</w:t>
+            </w:r>
+          </w:p>
+        </w:tc>
+        <w:tc>
+          <w:tcPr>
+            <w:tcW w:type="dxa" w:w="3010"/>
+          </w:tcPr>
+          <w:p>
+            <w:pPr>
+              <w:spacing w:after="40"/>
+              <w:ind w:firstLine="0"/>
+            </w:pPr>
+            <w:r>
+              <w:rPr>
+                <w:sz w:val="22"/>
+              </w:rPr>
+              <w:t>Kèm trục vít tự hãm và công tắc tự đỗ.</w:t>
+            </w:r>
+          </w:p>
+        </w:tc>
+      </w:tr>
+      <w:tr>
+        <w:tc>
+          <w:tcPr>
+            <w:tcW w:type="dxa" w:w="3010"/>
+          </w:tcPr>
+          <w:p>
+            <w:pPr>
+              <w:spacing w:after="40"/>
+              <w:ind w:firstLine="0"/>
+            </w:pPr>
+            <w:r>
+              <w:rPr>
+                <w:sz w:val="22"/>
+              </w:rPr>
+              <w:t>Hệ số an toàn đạt được</w:t>
+            </w:r>
+          </w:p>
+        </w:tc>
+        <w:tc>
+          <w:tcPr>
+            <w:tcW w:type="dxa" w:w="3010"/>
+          </w:tcPr>
+          <w:p>
+            <w:pPr>
+              <w:spacing w:after="40"/>
+              <w:ind w:firstLine="0"/>
+            </w:pPr>
+            <w:r>
+              <w:rPr>
+                <w:sz w:val="22"/>
+              </w:rPr>
+              <w:t>5 – 7 lần</w:t>
+            </w:r>
+          </w:p>
+        </w:tc>
+        <w:tc>
+          <w:tcPr>
+            <w:tcW w:type="dxa" w:w="3010"/>
+          </w:tcPr>
+          <w:p>
+            <w:pPr>
+              <w:spacing w:after="40"/>
+              <w:ind w:firstLine="0"/>
+            </w:pPr>
+            <w:r>
+              <w:rPr>
+                <w:sz w:val="22"/>
+              </w:rPr>
+              <w:t>Đủ cho thử ngoài trời có gió giật nhẹ.</w:t>
+            </w:r>
+          </w:p>
+        </w:tc>
+      </w:tr>
+    </w:tbl>
+    <w:p>
+      <w:pPr/>
     </w:p>
     <w:p>
       <w:pPr/>
       <w:r>
-        <w:t>Trục quay được căn theo hướng Bắc – Nam thật (xác định bằng la bàn kết hợp đối chiếu giờ Mặt Trời) và đặt gần trọng tâm tấm pin để giảm mô-men. Hai gối đỡ cố định trên đế phẳng có bulông điều chỉnh cân bằng; trục dùng thép tròn hoặc trục nhôm có bạc lót/ổ bi để giảm ma sát. Tấm pin bắt lên khung đỡ qua các tai bắt vít, bảo đảm tâm khối lượng nằm sát trục để giảm tải giữ cho cơ cấu chấp hành.</w:t>
-      </w:r>
-    </w:p>
-    <w:p>
-      <w:pPr/>
-      <w:r>
-        <w:t>Cơ cấu chấp hành đề xuất là linear actuator hoặc servo mô-men cao gắn qua tay đòn vào khung pin; khớp nối phải có độ rơ nhỏ để tránh dao động khi đổi chiều. Nếu dùng servo, cần kiểm tra mô-men giữ ở điện áp thực tế và thêm gối đỡ chịu lực dọc trục. Dây dẫn từ phần quay sang phần tĩnh đi qua trục rỗng hoặc chừa dư chiều dài cho toàn bộ hành trình để tránh vướng khi quay.</w:t>
-      </w:r>
-    </w:p>
-    <w:p>
-      <w:pPr/>
-      <w:r>
-        <w:t>Hai đầu hành trình được xác định theo va chạm cơ khí, dây dẫn và khả năng quay của actuator; góc đặt phần mềm phải nằm bên trong giới hạn cứng. Công tắc hành trình được đặt sao cho cơ cấu chạm công tắc trước khi va vào khung; khi công tắc ở đầu Đông tác động, chương trình chỉ cấm chuyển động tiếp về phía Đông và cho phép lệnh quay ngược để rời công tắc.</w:t>
+        <w:t>Với hệ số an toàn 5–7 lần, động cơ gạt nước đủ mô-men kể cả khi khớp trục vít có hiệu suất thấp; đổi lại tốc độ quay chậm (khoảng 1–2 vòng/phút ở trục ra) lại phù hợp với bám nắng vì mỗi lần hiệu chỉnh chỉ quay vài độ.</w:t>
       </w:r>
     </w:p>
     <w:p>
@@ -928,51 +1414,13 @@
         <w:pStyle w:val="Heading2"/>
       </w:pPr>
       <w:r>
-        <w:t>2.2. Mạch điện chi tiết</w:t>
+        <w:t>2.3. Mạch điện và phương pháp đọc ADC</w:t>
       </w:r>
     </w:p>
     <w:p>
       <w:pPr/>
       <w:r>
-        <w:t>Mỗi LDR mắc thành một cầu phân áp riêng theo cấu hình 3,3 V → điện trở cố định R_f → nút ADC → LDR → GND. Vi điều khiển đọc điện áp tại nút giữa rồi quy đổi điện trở theo công thức:</w:t>
-      </w:r>
-    </w:p>
-    <w:p>
-      <w:pPr>
-        <w:ind w:firstLine="0"/>
-        <w:jc w:val="center"/>
-      </w:pPr>
-      <w:r>
-        <w:rPr>
-          <w:i/>
-        </w:rPr>
-        <w:t>R_LDR = R_f × V_ADC / (3,3 − V_ADC)</w:t>
-      </w:r>
-    </w:p>
-    <w:p>
-      <w:pPr/>
-      <w:r>
-        <w:t>Chọn R_f cỡ trung bình nhân của dải điện trở LDR trong điều kiện làm việc dự kiến để độ nhạy trải đều; thêm tụ 100 nF tại nút ADC để lọc nhiễu và bố trí bốn kênh giống hệt nhau để dễ bù sai khác. Nếu đảo vị trí LDR và R_f thì phải đổi công thức quy đổi tương ứng.</w:t>
-      </w:r>
-    </w:p>
-    <w:p>
-      <w:pPr/>
-      <w:r>
-        <w:t>BH1750 và DS3231 cùng dùng bus I²C (SDA/SCL) với điện trở kéo lên phù hợp; hai thiết bị có địa chỉ khác nhau nên không xung đột. BH1750 chỉ làm kênh tham chiếu tương đối nếu dải đo đáp ứng; dưới nắng trực tiếp cảm biến độ rọi phổ thông có thể bão hòa. DS3231 có pin nuôi để giữ giờ khi mất điện, bảo đảm đường tham chiếu thiên văn không bị lệch sau khi khởi động lại.</w:t>
-      </w:r>
-    </w:p>
-    <w:p>
-      <w:pPr/>
-      <w:r>
-        <w:t>Nguồn actuator không được làm sụt nguồn điều khiển: dùng nguồn riêng cho tải động cơ, nối mass tham chiếu chung tại một điểm, đặt tụ lọc gần driver và tách đường dây motor khỏi đường tín hiệu ADC. Bảo vệ chân ADC khỏi quá áp bằng cầu chia áp hoặc mạch chuyển mức; thêm cầu chì và khóa nguồn tổng cho mô hình.</w:t>
-      </w:r>
-    </w:p>
-    <w:p>
-      <w:pPr>
-        <w:pStyle w:val="Heading2"/>
-      </w:pPr>
-      <w:r>
-        <w:t>2.3. Sơ đồ kết nối chân đề xuất</w:t>
+        <w:t>Mạch chia áp của bốn LDR và của biến trở hồi tiếp do sinh viên tự chế và tự hiệu chuẩn; báo cáo chốt phần xử lý tín hiệu phía ESP32: dùng ADC1 12 bit với suy hao 11 dB, mỗi kênh lấy 64 mẫu, loại đột biến bằng trung vị rồi lấy trung bình nửa giữa; giá trị được đổi sang milivôn theo hệ số hiệu chuẩn của bo. Module ADS1115 16 bit qua I²C đo điện áp tấm pin (qua cầu chia) và dòng điện (qua cảm biến ACS712) phục vụ tính năng lượng. Động cơ đóng cắt bằng module relay 2 kênh (hoặc cầu H MOSFET) có cầu chì 10 A riêng; nguồn động cơ 12 V tách khỏi nguồn logic 5 V, nối mass chung một điểm.</w:t>
       </w:r>
     </w:p>
     <w:p>
@@ -983,7 +1431,7 @@
       <w:r>
         <w:drawing>
           <wp:inline xmlns:a="http://schemas.openxmlformats.org/drawingml/2006/main" xmlns:pic="http://schemas.openxmlformats.org/drawingml/2006/picture">
-            <wp:extent cx="5760000" cy="3730795"/>
+            <wp:extent cx="5760000" cy="3825547"/>
             <wp:docPr id="4" name="Picture 4"/>
             <wp:cNvGraphicFramePr>
               <a:graphicFrameLocks noChangeAspect="1"/>
@@ -1004,7 +1452,7 @@
                   <pic:spPr>
                     <a:xfrm>
                       <a:off x="0" y="0"/>
-                      <a:ext cx="5760000" cy="3730795"/>
+                      <a:ext cx="5760000" cy="3825547"/>
                     </a:xfrm>
                     <a:prstGeom prst="rect"/>
                   </pic:spPr>
@@ -1020,7 +1468,7 @@
         <w:pStyle w:val="Caption"/>
       </w:pPr>
       <w:r>
-        <w:t>Hình 4. Sơ đồ kết nối cảm biến và cơ cấu với ESP32</w:t>
+        <w:t>Hình 4. Sơ đồ kết nối ESP32 của mô hình một trục</w:t>
       </w:r>
     </w:p>
     <w:p>
@@ -1029,7 +1477,7 @@
         <w:spacing w:after="80"/>
       </w:pPr>
       <w:r>
-        <w:t>Bảng 3. Bảng chân kết nối đề xuất cho mô hình một trục</w:t>
+        <w:t>Bảng 4. Bảng chân kết nối chốt cho mô hình một trục</w:t>
       </w:r>
     </w:p>
     <w:tbl>
@@ -1148,7 +1596,60 @@
               <w:rPr>
                 <w:sz w:val="22"/>
               </w:rPr>
-              <w:t>L_TT, L_PT, L_TD, L_PD qua cầu phân áp + tụ lọc.</w:t>
+              <w:t>Ma trận LDR: L_TT, L_PT, L_TD, L_PD.</w:t>
+            </w:r>
+          </w:p>
+        </w:tc>
+      </w:tr>
+      <w:tr>
+        <w:tc>
+          <w:tcPr>
+            <w:tcW w:type="dxa" w:w="3010"/>
+          </w:tcPr>
+          <w:p>
+            <w:pPr>
+              <w:spacing w:after="40"/>
+              <w:ind w:firstLine="0"/>
+            </w:pPr>
+            <w:r>
+              <w:rPr>
+                <w:sz w:val="22"/>
+              </w:rPr>
+              <w:t>GPIO32 (ADC1_CH4)</w:t>
+            </w:r>
+          </w:p>
+        </w:tc>
+        <w:tc>
+          <w:tcPr>
+            <w:tcW w:type="dxa" w:w="3010"/>
+          </w:tcPr>
+          <w:p>
+            <w:pPr>
+              <w:spacing w:after="40"/>
+              <w:ind w:firstLine="0"/>
+            </w:pPr>
+            <w:r>
+              <w:rPr>
+                <w:sz w:val="22"/>
+              </w:rPr>
+              <w:t>1 kênh analog</w:t>
+            </w:r>
+          </w:p>
+        </w:tc>
+        <w:tc>
+          <w:tcPr>
+            <w:tcW w:type="dxa" w:w="3010"/>
+          </w:tcPr>
+          <w:p>
+            <w:pPr>
+              <w:spacing w:after="40"/>
+              <w:ind w:firstLine="0"/>
+            </w:pPr>
+            <w:r>
+              <w:rPr>
+                <w:sz w:val="22"/>
+              </w:rPr>
+              <w:t>Biến trở hồi tiếp góc trục quay.</w:t>
             </w:r>
           </w:p>
         </w:tc>
@@ -1184,7 +1685,7 @@
               <w:rPr>
                 <w:sz w:val="22"/>
               </w:rPr>
-              <w:t>I²C (SDA/SCL)</w:t>
+              <w:t>I²C</w:t>
             </w:r>
           </w:p>
         </w:tc>
@@ -1201,7 +1702,7 @@
               <w:rPr>
                 <w:sz w:val="22"/>
               </w:rPr>
-              <w:t>BH1750 và DS3231 dùng chung bus, có trở kéo lên.</w:t>
+              <w:t>ADS1115 đo U–I và RTC DS3231 chung bus.</w:t>
             </w:r>
           </w:p>
         </w:tc>
@@ -1220,7 +1721,7 @@
               <w:rPr>
                 <w:sz w:val="22"/>
               </w:rPr>
-              <w:t>GPIO32, GPIO33 (ADC1)</w:t>
+              <w:t>GPIO26, GPIO27</w:t>
             </w:r>
           </w:p>
         </w:tc>
@@ -1237,7 +1738,7 @@
               <w:rPr>
                 <w:sz w:val="22"/>
               </w:rPr>
-              <w:t>2 kênh analog</w:t>
+              <w:t>2 ngõ ra</w:t>
             </w:r>
           </w:p>
         </w:tc>
@@ -1254,60 +1755,7 @@
               <w:rPr>
                 <w:sz w:val="22"/>
               </w:rPr>
-              <w:t>Cầu chia áp đo U pin và cảm biến dòng ACS712.</w:t>
-            </w:r>
-          </w:p>
-        </w:tc>
-      </w:tr>
-      <w:tr>
-        <w:tc>
-          <w:tcPr>
-            <w:tcW w:type="dxa" w:w="3010"/>
-          </w:tcPr>
-          <w:p>
-            <w:pPr>
-              <w:spacing w:after="40"/>
-              <w:ind w:firstLine="0"/>
-            </w:pPr>
-            <w:r>
-              <w:rPr>
-                <w:sz w:val="22"/>
-              </w:rPr>
-              <w:t>GPIO26 (LEDC_PWM)</w:t>
-            </w:r>
-          </w:p>
-        </w:tc>
-        <w:tc>
-          <w:tcPr>
-            <w:tcW w:type="dxa" w:w="3010"/>
-          </w:tcPr>
-          <w:p>
-            <w:pPr>
-              <w:spacing w:after="40"/>
-              <w:ind w:firstLine="0"/>
-            </w:pPr>
-            <w:r>
-              <w:rPr>
-                <w:sz w:val="22"/>
-              </w:rPr>
-              <w:t>PWM điều khiển</w:t>
-            </w:r>
-          </w:p>
-        </w:tc>
-        <w:tc>
-          <w:tcPr>
-            <w:tcW w:type="dxa" w:w="3010"/>
-          </w:tcPr>
-          <w:p>
-            <w:pPr>
-              <w:spacing w:after="40"/>
-              <w:ind w:firstLine="0"/>
-            </w:pPr>
-            <w:r>
-              <w:rPr>
-                <w:sz w:val="22"/>
-              </w:rPr>
-              <w:t>Driver/servo cơ cấu chấp hành một trục.</w:t>
+              <w:t>Hai kênh relay đảo chiều motor gạt nước.</w:t>
             </w:r>
           </w:p>
         </w:tc>
@@ -1343,7 +1791,7 @@
               <w:rPr>
                 <w:sz w:val="22"/>
               </w:rPr>
-              <w:t>Ngõ vào số pull-up</w:t>
+              <w:t>Ngõ vào pull-up</w:t>
             </w:r>
           </w:p>
         </w:tc>
@@ -1396,7 +1844,7 @@
               <w:rPr>
                 <w:sz w:val="22"/>
               </w:rPr>
-              <w:t>Ngõ vào số pull-up</w:t>
+              <w:t>Ngõ vào pull-up</w:t>
             </w:r>
           </w:p>
         </w:tc>
@@ -1449,7 +1897,7 @@
               <w:rPr>
                 <w:sz w:val="22"/>
               </w:rPr>
-              <w:t>Serial</w:t>
+              <w:t>Serial 115200</w:t>
             </w:r>
           </w:p>
         </w:tc>
@@ -1466,7 +1914,7 @@
               <w:rPr>
                 <w:sz w:val="22"/>
               </w:rPr>
-              <w:t>Serial Monitor, ghi log trong quá trình thử nghiệm.</w:t>
+              <w:t>Serial Monitor và ghi log thử nghiệm.</w:t>
             </w:r>
           </w:p>
         </w:tc>
@@ -1480,7 +1928,7 @@
         <w:pStyle w:val="Heading2"/>
       </w:pPr>
       <w:r>
-        <w:t>2.4. Danh mục vật tư và linh kiện dự kiến</w:t>
+        <w:t>2.4. Danh mục vật tư và linh kiện</w:t>
       </w:r>
     </w:p>
     <w:p>
@@ -1489,7 +1937,7 @@
         <w:spacing w:after="80"/>
       </w:pPr>
       <w:r>
-        <w:t>Bảng 4. Danh mục vật tư – linh kiện dự kiến</w:t>
+        <w:t>Bảng 5. Danh mục vật tư – linh kiện đã chốt</w:t>
       </w:r>
     </w:p>
     <w:tbl>
@@ -1556,7 +2004,7 @@
                 <w:b/>
                 <w:sz w:val="22"/>
               </w:rPr>
-              <w:t>Thông số đề xuất</w:t>
+              <w:t>Thông số chốt</w:t>
             </w:r>
           </w:p>
         </w:tc>
@@ -1610,7 +2058,7 @@
               <w:rPr>
                 <w:sz w:val="22"/>
               </w:rPr>
-              <w:t>Tấm pin mặt trời nhỏ</w:t>
+              <w:t>Tấm pin mặt trời</w:t>
             </w:r>
           </w:p>
         </w:tc>
@@ -1627,7 +2075,7 @@
               <w:rPr>
                 <w:sz w:val="22"/>
               </w:rPr>
-              <w:t>6 V – 10 W, kèm khung bắt vít</w:t>
+              <w:t>6 V – 10 W kèm khung</w:t>
             </w:r>
           </w:p>
         </w:tc>
@@ -1697,7 +2145,7 @@
               <w:rPr>
                 <w:sz w:val="22"/>
               </w:rPr>
-              <w:t>GL5528 hoặc tương đương, cùng lô</w:t>
+              <w:t>GL5528 cùng lô</w:t>
             </w:r>
           </w:p>
         </w:tc>
@@ -1750,7 +2198,7 @@
               <w:rPr>
                 <w:sz w:val="22"/>
               </w:rPr>
-              <w:t>Điện trở cầu phân áp R_f</w:t>
+              <w:t>Mạch chia áp LDR + biến trở</w:t>
             </w:r>
           </w:p>
         </w:tc>
@@ -1767,7 +2215,7 @@
               <w:rPr>
                 <w:sz w:val="22"/>
               </w:rPr>
-              <w:t>10 kΩ ±1%, tụ lọc 100 nF</w:t>
+              <w:t>Sinh viên tự chế; biến trở xoay 10 k</w:t>
             </w:r>
           </w:p>
         </w:tc>
@@ -1784,7 +2232,7 @@
               <w:rPr>
                 <w:sz w:val="22"/>
               </w:rPr>
-              <w:t>4 bộ</w:t>
+              <w:t>1 bộ</w:t>
             </w:r>
           </w:p>
         </w:tc>
@@ -1804,146 +2252,6 @@
                 <w:sz w:val="22"/>
               </w:rPr>
               <w:t>4</w:t>
-            </w:r>
-          </w:p>
-        </w:tc>
-        <w:tc>
-          <w:tcPr>
-            <w:tcW w:type="dxa" w:w="2257"/>
-          </w:tcPr>
-          <w:p>
-            <w:pPr>
-              <w:spacing w:after="40"/>
-              <w:ind w:firstLine="0"/>
-            </w:pPr>
-            <w:r>
-              <w:rPr>
-                <w:sz w:val="22"/>
-              </w:rPr>
-              <w:t>Cảm biến độ rọi BH1750</w:t>
-            </w:r>
-          </w:p>
-        </w:tc>
-        <w:tc>
-          <w:tcPr>
-            <w:tcW w:type="dxa" w:w="2257"/>
-          </w:tcPr>
-          <w:p>
-            <w:pPr>
-              <w:spacing w:after="40"/>
-              <w:ind w:firstLine="0"/>
-            </w:pPr>
-            <w:r>
-              <w:rPr>
-                <w:sz w:val="22"/>
-              </w:rPr>
-              <w:t>Module I²C</w:t>
-            </w:r>
-          </w:p>
-        </w:tc>
-        <w:tc>
-          <w:tcPr>
-            <w:tcW w:type="dxa" w:w="2257"/>
-          </w:tcPr>
-          <w:p>
-            <w:pPr>
-              <w:spacing w:after="40"/>
-              <w:ind w:firstLine="0"/>
-            </w:pPr>
-            <w:r>
-              <w:rPr>
-                <w:sz w:val="22"/>
-              </w:rPr>
-              <w:t>1</w:t>
-            </w:r>
-          </w:p>
-        </w:tc>
-      </w:tr>
-      <w:tr>
-        <w:tc>
-          <w:tcPr>
-            <w:tcW w:type="dxa" w:w="2257"/>
-          </w:tcPr>
-          <w:p>
-            <w:pPr>
-              <w:spacing w:after="40"/>
-              <w:ind w:firstLine="0"/>
-            </w:pPr>
-            <w:r>
-              <w:rPr>
-                <w:sz w:val="22"/>
-              </w:rPr>
-              <w:t>5</w:t>
-            </w:r>
-          </w:p>
-        </w:tc>
-        <w:tc>
-          <w:tcPr>
-            <w:tcW w:type="dxa" w:w="2257"/>
-          </w:tcPr>
-          <w:p>
-            <w:pPr>
-              <w:spacing w:after="40"/>
-              <w:ind w:firstLine="0"/>
-            </w:pPr>
-            <w:r>
-              <w:rPr>
-                <w:sz w:val="22"/>
-              </w:rPr>
-              <w:t>Đồng hồ thời gian thực</w:t>
-            </w:r>
-          </w:p>
-        </w:tc>
-        <w:tc>
-          <w:tcPr>
-            <w:tcW w:type="dxa" w:w="2257"/>
-          </w:tcPr>
-          <w:p>
-            <w:pPr>
-              <w:spacing w:after="40"/>
-              <w:ind w:firstLine="0"/>
-            </w:pPr>
-            <w:r>
-              <w:rPr>
-                <w:sz w:val="22"/>
-              </w:rPr>
-              <w:t>Module DS3231 có pin nuôi</w:t>
-            </w:r>
-          </w:p>
-        </w:tc>
-        <w:tc>
-          <w:tcPr>
-            <w:tcW w:type="dxa" w:w="2257"/>
-          </w:tcPr>
-          <w:p>
-            <w:pPr>
-              <w:spacing w:after="40"/>
-              <w:ind w:firstLine="0"/>
-            </w:pPr>
-            <w:r>
-              <w:rPr>
-                <w:sz w:val="22"/>
-              </w:rPr>
-              <w:t>1</w:t>
-            </w:r>
-          </w:p>
-        </w:tc>
-      </w:tr>
-      <w:tr>
-        <w:tc>
-          <w:tcPr>
-            <w:tcW w:type="dxa" w:w="2257"/>
-          </w:tcPr>
-          <w:p>
-            <w:pPr>
-              <w:spacing w:after="40"/>
-              <w:ind w:firstLine="0"/>
-            </w:pPr>
-            <w:r>
-              <w:rPr>
-                <w:sz w:val="22"/>
-              </w:rPr>
-              <w:t>6</w:t>
             </w:r>
           </w:p>
         </w:tc>
@@ -2013,6 +2321,146 @@
               <w:rPr>
                 <w:sz w:val="22"/>
               </w:rPr>
+              <w:t>5</w:t>
+            </w:r>
+          </w:p>
+        </w:tc>
+        <w:tc>
+          <w:tcPr>
+            <w:tcW w:type="dxa" w:w="2257"/>
+          </w:tcPr>
+          <w:p>
+            <w:pPr>
+              <w:spacing w:after="40"/>
+              <w:ind w:firstLine="0"/>
+            </w:pPr>
+            <w:r>
+              <w:rPr>
+                <w:sz w:val="22"/>
+              </w:rPr>
+              <w:t>Module ADC 16 bit</w:t>
+            </w:r>
+          </w:p>
+        </w:tc>
+        <w:tc>
+          <w:tcPr>
+            <w:tcW w:type="dxa" w:w="2257"/>
+          </w:tcPr>
+          <w:p>
+            <w:pPr>
+              <w:spacing w:after="40"/>
+              <w:ind w:firstLine="0"/>
+            </w:pPr>
+            <w:r>
+              <w:rPr>
+                <w:sz w:val="22"/>
+              </w:rPr>
+              <w:t>ADS1115 I²C</w:t>
+            </w:r>
+          </w:p>
+        </w:tc>
+        <w:tc>
+          <w:tcPr>
+            <w:tcW w:type="dxa" w:w="2257"/>
+          </w:tcPr>
+          <w:p>
+            <w:pPr>
+              <w:spacing w:after="40"/>
+              <w:ind w:firstLine="0"/>
+            </w:pPr>
+            <w:r>
+              <w:rPr>
+                <w:sz w:val="22"/>
+              </w:rPr>
+              <w:t>1</w:t>
+            </w:r>
+          </w:p>
+        </w:tc>
+      </w:tr>
+      <w:tr>
+        <w:tc>
+          <w:tcPr>
+            <w:tcW w:type="dxa" w:w="2257"/>
+          </w:tcPr>
+          <w:p>
+            <w:pPr>
+              <w:spacing w:after="40"/>
+              <w:ind w:firstLine="0"/>
+            </w:pPr>
+            <w:r>
+              <w:rPr>
+                <w:sz w:val="22"/>
+              </w:rPr>
+              <w:t>6</w:t>
+            </w:r>
+          </w:p>
+        </w:tc>
+        <w:tc>
+          <w:tcPr>
+            <w:tcW w:type="dxa" w:w="2257"/>
+          </w:tcPr>
+          <w:p>
+            <w:pPr>
+              <w:spacing w:after="40"/>
+              <w:ind w:firstLine="0"/>
+            </w:pPr>
+            <w:r>
+              <w:rPr>
+                <w:sz w:val="22"/>
+              </w:rPr>
+              <w:t>Cảm biến dòng</w:t>
+            </w:r>
+          </w:p>
+        </w:tc>
+        <w:tc>
+          <w:tcPr>
+            <w:tcW w:type="dxa" w:w="2257"/>
+          </w:tcPr>
+          <w:p>
+            <w:pPr>
+              <w:spacing w:after="40"/>
+              <w:ind w:firstLine="0"/>
+            </w:pPr>
+            <w:r>
+              <w:rPr>
+                <w:sz w:val="22"/>
+              </w:rPr>
+              <w:t>ACS712 5 A</w:t>
+            </w:r>
+          </w:p>
+        </w:tc>
+        <w:tc>
+          <w:tcPr>
+            <w:tcW w:type="dxa" w:w="2257"/>
+          </w:tcPr>
+          <w:p>
+            <w:pPr>
+              <w:spacing w:after="40"/>
+              <w:ind w:firstLine="0"/>
+            </w:pPr>
+            <w:r>
+              <w:rPr>
+                <w:sz w:val="22"/>
+              </w:rPr>
+              <w:t>1</w:t>
+            </w:r>
+          </w:p>
+        </w:tc>
+      </w:tr>
+      <w:tr>
+        <w:tc>
+          <w:tcPr>
+            <w:tcW w:type="dxa" w:w="2257"/>
+          </w:tcPr>
+          <w:p>
+            <w:pPr>
+              <w:spacing w:after="40"/>
+              <w:ind w:firstLine="0"/>
+            </w:pPr>
+            <w:r>
+              <w:rPr>
+                <w:sz w:val="22"/>
+              </w:rPr>
               <w:t>7</w:t>
             </w:r>
           </w:p>
@@ -2030,7 +2478,7 @@
               <w:rPr>
                 <w:sz w:val="22"/>
               </w:rPr>
-              <w:t>Cơ cấu chấp hành</w:t>
+              <w:t>RTC</w:t>
             </w:r>
           </w:p>
         </w:tc>
@@ -2047,7 +2495,7 @@
               <w:rPr>
                 <w:sz w:val="22"/>
               </w:rPr>
-              <w:t>Servo mô-men cao (≥10 kg·cm) hoặc linear actuator 12 V</w:t>
+              <w:t>DS3231 có pin nuôi</w:t>
             </w:r>
           </w:p>
         </w:tc>
@@ -2100,7 +2548,7 @@
               <w:rPr>
                 <w:sz w:val="22"/>
               </w:rPr>
-              <w:t>Driver/nguồn chấp hành</w:t>
+              <w:t>Động cơ chấp hành</w:t>
             </w:r>
           </w:p>
         </w:tc>
@@ -2117,7 +2565,7 @@
               <w:rPr>
                 <w:sz w:val="22"/>
               </w:rPr>
-              <w:t>Theo cơ cấu chọn, có bảo vệ quá dòng</w:t>
+              <w:t>Motor gạt nước ô tô 12 V trục vít</w:t>
             </w:r>
           </w:p>
         </w:tc>
@@ -2170,6 +2618,76 @@
               <w:rPr>
                 <w:sz w:val="22"/>
               </w:rPr>
+              <w:t>Đóng cắt động cơ</w:t>
+            </w:r>
+          </w:p>
+        </w:tc>
+        <w:tc>
+          <w:tcPr>
+            <w:tcW w:type="dxa" w:w="2257"/>
+          </w:tcPr>
+          <w:p>
+            <w:pPr>
+              <w:spacing w:after="40"/>
+              <w:ind w:firstLine="0"/>
+            </w:pPr>
+            <w:r>
+              <w:rPr>
+                <w:sz w:val="22"/>
+              </w:rPr>
+              <w:t>Module relay 2 kênh 10 A hoặc cầu H MOSFET</w:t>
+            </w:r>
+          </w:p>
+        </w:tc>
+        <w:tc>
+          <w:tcPr>
+            <w:tcW w:type="dxa" w:w="2257"/>
+          </w:tcPr>
+          <w:p>
+            <w:pPr>
+              <w:spacing w:after="40"/>
+              <w:ind w:firstLine="0"/>
+            </w:pPr>
+            <w:r>
+              <w:rPr>
+                <w:sz w:val="22"/>
+              </w:rPr>
+              <w:t>1</w:t>
+            </w:r>
+          </w:p>
+        </w:tc>
+      </w:tr>
+      <w:tr>
+        <w:tc>
+          <w:tcPr>
+            <w:tcW w:type="dxa" w:w="2257"/>
+          </w:tcPr>
+          <w:p>
+            <w:pPr>
+              <w:spacing w:after="40"/>
+              <w:ind w:firstLine="0"/>
+            </w:pPr>
+            <w:r>
+              <w:rPr>
+                <w:sz w:val="22"/>
+              </w:rPr>
+              <w:t>10</w:t>
+            </w:r>
+          </w:p>
+        </w:tc>
+        <w:tc>
+          <w:tcPr>
+            <w:tcW w:type="dxa" w:w="2257"/>
+          </w:tcPr>
+          <w:p>
+            <w:pPr>
+              <w:spacing w:after="40"/>
+              <w:ind w:firstLine="0"/>
+            </w:pPr>
+            <w:r>
+              <w:rPr>
+                <w:sz w:val="22"/>
+              </w:rPr>
               <w:t>Công tắc hành trình</w:t>
             </w:r>
           </w:p>
@@ -2187,7 +2705,7 @@
               <w:rPr>
                 <w:sz w:val="22"/>
               </w:rPr>
-              <w:t>Loại cần gạt, tiếp điểm NC</w:t>
+              <w:t>Cần gạt, tiếp điểm NC</w:t>
             </w:r>
           </w:p>
         </w:tc>
@@ -2223,7 +2741,7 @@
               <w:rPr>
                 <w:sz w:val="22"/>
               </w:rPr>
-              <w:t>10</w:t>
+              <w:t>11</w:t>
             </w:r>
           </w:p>
         </w:tc>
@@ -2257,77 +2775,7 @@
               <w:rPr>
                 <w:sz w:val="22"/>
               </w:rPr>
-              <w:t>Nút nhấn tự giữ/khóa</w:t>
-            </w:r>
-          </w:p>
-        </w:tc>
-        <w:tc>
-          <w:tcPr>
-            <w:tcW w:type="dxa" w:w="2257"/>
-          </w:tcPr>
-          <w:p>
-            <w:pPr>
-              <w:spacing w:after="40"/>
-              <w:ind w:firstLine="0"/>
-            </w:pPr>
-            <w:r>
-              <w:rPr>
-                <w:sz w:val="22"/>
-              </w:rPr>
-              <w:t>1</w:t>
-            </w:r>
-          </w:p>
-        </w:tc>
-      </w:tr>
-      <w:tr>
-        <w:tc>
-          <w:tcPr>
-            <w:tcW w:type="dxa" w:w="2257"/>
-          </w:tcPr>
-          <w:p>
-            <w:pPr>
-              <w:spacing w:after="40"/>
-              <w:ind w:firstLine="0"/>
-            </w:pPr>
-            <w:r>
-              <w:rPr>
-                <w:sz w:val="22"/>
-              </w:rPr>
-              <w:t>11</w:t>
-            </w:r>
-          </w:p>
-        </w:tc>
-        <w:tc>
-          <w:tcPr>
-            <w:tcW w:type="dxa" w:w="2257"/>
-          </w:tcPr>
-          <w:p>
-            <w:pPr>
-              <w:spacing w:after="40"/>
-              <w:ind w:firstLine="0"/>
-            </w:pPr>
-            <w:r>
-              <w:rPr>
-                <w:sz w:val="22"/>
-              </w:rPr>
-              <w:t>Cảm biến dòng</w:t>
-            </w:r>
-          </w:p>
-        </w:tc>
-        <w:tc>
-          <w:tcPr>
-            <w:tcW w:type="dxa" w:w="2257"/>
-          </w:tcPr>
-          <w:p>
-            <w:pPr>
-              <w:spacing w:after="40"/>
-              <w:ind w:firstLine="0"/>
-            </w:pPr>
-            <w:r>
-              <w:rPr>
-                <w:sz w:val="22"/>
-              </w:rPr>
-              <w:t>ACS712 5 A hoặc shunt + khuếch đại</w:t>
+              <w:t>Nút nhấn khóa</w:t>
             </w:r>
           </w:p>
         </w:tc>
@@ -2380,7 +2828,7 @@
               <w:rPr>
                 <w:sz w:val="22"/>
               </w:rPr>
-              <w:t>Vật liệu cơ khí</w:t>
+              <w:t>Nguồn</w:t>
             </w:r>
           </w:p>
         </w:tc>
@@ -2397,7 +2845,7 @@
               <w:rPr>
                 <w:sz w:val="22"/>
               </w:rPr>
-              <w:t>Nhôm hộp/thép tròn trục, gối đỡ, ốc vít, đế gỗ hoặc nhôm</w:t>
+              <w:t>Ắc quy/nguồn 12 V 10 A + mạch hạ 5 V</w:t>
             </w:r>
           </w:p>
         </w:tc>
@@ -2450,7 +2898,7 @@
               <w:rPr>
                 <w:sz w:val="22"/>
               </w:rPr>
-              <w:t>Nguồn</w:t>
+              <w:t>Vật liệu cơ khí</w:t>
             </w:r>
           </w:p>
         </w:tc>
@@ -2467,7 +2915,7 @@
               <w:rPr>
                 <w:sz w:val="22"/>
               </w:rPr>
-              <w:t>12 V/5 A cho tải, 5 V/2 A cho logic</w:t>
+              <w:t>Thép tròn trục, gối đỡ, nhôm hộp, ốc vít</w:t>
             </w:r>
           </w:p>
         </w:tc>
@@ -2484,7 +2932,7 @@
               <w:rPr>
                 <w:sz w:val="22"/>
               </w:rPr>
-              <w:t>2</w:t>
+              <w:t>1 bộ</w:t>
             </w:r>
           </w:p>
         </w:tc>
@@ -2537,7 +2985,7 @@
               <w:rPr>
                 <w:sz w:val="22"/>
               </w:rPr>
-              <w:t>Board mạch, jack, dây dẫn, tụ lọc, cầu chì, hộp chống ẩm</w:t>
+              <w:t>Cầu chì 10 A, dây dẫn, hộp chống ẩm</w:t>
             </w:r>
           </w:p>
         </w:tc>
@@ -2564,12 +3012,6 @@
       <w:pPr/>
     </w:p>
     <w:p>
-      <w:pPr/>
-      <w:r>
-        <w:t>Danh mục trên là cấu hình đề xuất để lập dự trù; khi mua thực tế cần đối chiếu thông số datasheet (đặc biệt mô-men servo, dòng driver và dải đo cảm biến dòng) và ghi lại mã linh kiện đã dùng để bảo đảm tính lặp lại của phép thử.</w:t>
-      </w:r>
-    </w:p>
-    <w:p>
       <w:pPr>
         <w:pStyle w:val="Heading1"/>
       </w:pPr>
@@ -2582,7 +3024,7 @@
         <w:pStyle w:val="Heading2"/>
       </w:pPr>
       <w:r>
-        <w:t>3.1. Quy trình lắp ráp mô hình</w:t>
+        <w:t>3.1. Quy trình lắp ráp</w:t>
       </w:r>
     </w:p>
     <w:p>
@@ -2590,7 +3032,7 @@
         <w:pStyle w:val="ListBullet"/>
       </w:pPr>
       <w:r>
-        <w:t>Bước 1. Kiểm tra linh kiện rời: đo điện trở từng LDR dưới cùng nguồn sáng, thử BH1750 và DS3231 trên breadboard, thử servo/actuator không tải.</w:t>
+        <w:t>Bước 1. Thử riêng động cơ gạt nước trên bàn: cấp 12 V qua relay, kiểm tra chiều quay, dòng không tải và chức năng tự đỗ.</w:t>
       </w:r>
     </w:p>
     <w:p>
@@ -2598,7 +3040,7 @@
         <w:pStyle w:val="ListBullet"/>
       </w:pPr>
       <w:r>
-        <w:t>Bước 2. Gia công đế và hai gối đỡ; căn trục ngang theo hướng Bắc – Nam thật và kiểm tra cân bằng bằng nivô.</w:t>
+        <w:t>Bước 2. Gia công đế, gối đỡ và trục; căn hướng Bắc – Nam bằng la bàn; kiểm tra quay trơn toàn hành trình bằng tay.</w:t>
       </w:r>
     </w:p>
     <w:p>
@@ -2606,7 +3048,7 @@
         <w:pStyle w:val="ListBullet"/>
       </w:pPr>
       <w:r>
-        <w:t>Bước 3. Lắp trục, bạc lót/ổ bi và khung đỡ tấm pin; quay thử bằng tay toàn hành trình để phát hiện điểm kẹt.</w:t>
+        <w:t>Bước 3. Lắp tay đòn khớp nối động cơ – khung pin; đánh dấu mốc zero cơ khí.</w:t>
       </w:r>
     </w:p>
     <w:p>
@@ -2614,7 +3056,7 @@
         <w:pStyle w:val="ListBullet"/>
       </w:pPr>
       <w:r>
-        <w:t>Bước 4. Lắp cơ cấu chấp hành và tay đòn; đánh dấu vị trí giữa hành trình làm mốc zero cơ khí.</w:t>
+        <w:t>Bước 4. Lắp biến trở hồi tiếp đồng trục; đo điện áp ra tại hai đầu hành trình để lập bảng quy đổi góc.</w:t>
       </w:r>
     </w:p>
     <w:p>
@@ -2622,7 +3064,7 @@
         <w:pStyle w:val="ListBullet"/>
       </w:pPr>
       <w:r>
-        <w:t>Bước 5. Lắp hai công tắc hành trình và nút dừng khẩn cấp; kiểm tra bằng đồng hồ đo thông mạch từng tiếp điểm.</w:t>
+        <w:t>Bước 5. Lắp công tắc hành trình và nút dừng khẩn cấp; đo thông mạch từng tiếp điểm.</w:t>
       </w:r>
     </w:p>
     <w:p>
@@ -2630,7 +3072,7 @@
         <w:pStyle w:val="ListBullet"/>
       </w:pPr>
       <w:r>
-        <w:t>Bước 6. Hàn/ghép mạch cầu phân áp bốn kênh và mạch nguồn; kiểm tra ngắn mạch trước khi cấp điện.</w:t>
+        <w:t>Bước 6. Chế và thử mạch chia áp bốn LDR cùng mạch biến trở; kiểm tra ngắn mạch trước khi cấp nguồn.</w:t>
       </w:r>
     </w:p>
     <w:p>
@@ -2638,7 +3080,7 @@
         <w:pStyle w:val="ListBullet"/>
       </w:pPr>
       <w:r>
-        <w:t>Bước 7. Lắp cụm bốn LDR lên bốn góc tấm pin theo đúng ký hiệu và góc gá β_s đã chọn; chụp ảnh ghi nhận bố trí.</w:t>
+        <w:t>Bước 7. Gá cụm LDR đúng ký hiệu và β_s = 30°; chụp ảnh ghi nhận bố trí.</w:t>
       </w:r>
     </w:p>
     <w:p>
@@ -2646,7 +3088,7 @@
         <w:pStyle w:val="ListBullet"/>
       </w:pPr>
       <w:r>
-        <w:t>Bước 8. Đấu nối theo bảng chân ở Chương 2; đi dây tách khối công suất và khối tín hiệu, cố định dây tránh vướng chuyển động.</w:t>
+        <w:t>Bước 8. Đấu nối theo bảng chân; tách khối nguồn động cơ và nguồn logic; cố định dây theo hành trình.</w:t>
       </w:r>
     </w:p>
     <w:p>
@@ -2654,7 +3096,7 @@
         <w:pStyle w:val="ListBullet"/>
       </w:pPr>
       <w:r>
-        <w:t>Bước 9. Cấp điện thử không tải: chạy quét chậm hai đầu hành trình, xác nhận công tắc chặn đúng chiều và cho phép quay ngược để thoát.</w:t>
+        <w:t>Bước 9. Cấp điện chạy không tải: quét chậm hai đầu, xác nhận liên động chặn đúng chiều và thoát ngược được.</w:t>
       </w:r>
     </w:p>
     <w:p>
@@ -2662,7 +3104,7 @@
         <w:pStyle w:val="ListBullet"/>
       </w:pPr>
       <w:r>
-        <w:t>Bước 10. Lắp tấm pin lên khung, siết ốc đối xứng, kiểm tra lại cân bằng trục và độ vững của đế trước khi thử có tải.</w:t>
+        <w:t>Bước 10. Lắp tấm pin, siết ốc đối xứng, kiểm tra tự giữ vị trí khi ngắt điện rồi mới thử ngoài trời.</w:t>
       </w:r>
     </w:p>
     <w:p>
@@ -2670,7 +3112,7 @@
         <w:pStyle w:val="Heading2"/>
       </w:pPr>
       <w:r>
-        <w:t>3.2. Hiệu chuẩn và kiểm tra trước vận hành</w:t>
+        <w:t>3.2. Hiệu chuẩn bắt buộc trước khi chạy thuật toán</w:t>
       </w:r>
     </w:p>
     <w:p>
@@ -2678,7 +3120,7 @@
         <w:pStyle w:val="ListBullet"/>
       </w:pPr>
       <w:r>
-        <w:t>Hiệu chuẩn độ lệch/độ lợi của bốn kênh LDR dưới cùng một nguồn sáng khuếch tán; lưu bảng hệ số cho chương trình ở quyển lập trình.</w:t>
+        <w:t>Hiệu chuẩn hệ số độ lợi bốn kênh LDR dưới nguồn sáng khuếch tán: chỉnh để bốn kênh cùng một giá trị khi chiếu đều; lưu bảng hệ số vào chương trình (mô phỏng cho thấy bước này khử trọn sai số 1,98° do lệch kênh).</w:t>
       </w:r>
     </w:p>
     <w:p>
@@ -2686,7 +3128,7 @@
         <w:pStyle w:val="ListBullet"/>
       </w:pPr>
       <w:r>
-        <w:t>Chiếu sáng riêng từng hướng trái, phải, trên, dưới để xác nhận thứ tự kênh ADC và chiều dấu của e_quay, e_nghiêng.</w:t>
+        <w:t>Kiểm tra chiều dấu e_quay: chiếu mạnh phía phải thì e_quay phải dương theo quy ước lệnh; nếu ngược thì đảo hệ số trong bảng hiệu chuẩn, không sửa rải rác trong code.</w:t>
       </w:r>
     </w:p>
     <w:p>
@@ -2694,7 +3136,7 @@
         <w:pStyle w:val="ListBullet"/>
       </w:pPr>
       <w:r>
-        <w:t>Thử góc gá β_s trong nhiều hướng sáng, kiểm tra ánh sáng bị khung che, rồi xác định vùng chết để cơ cấu không rung khi sai lệch nhỏ.</w:t>
+        <w:t>Hiệu chuẩn biến trở hồi tiếp: quay trục tới hai đầu hành trình và vị trí giữa, ghi ba điểm để nội suy tuyến tính góc.</w:t>
       </w:r>
     </w:p>
     <w:p>
@@ -2702,7 +3144,15 @@
         <w:pStyle w:val="ListBullet"/>
       </w:pPr>
       <w:r>
-        <w:t>Đối chiếu giờ của DS3231 với giờ chuẩn và thiết lập múi giờ, tọa độ nơi đặt mô hình.</w:t>
+        <w:t>Xác nhận vùng chết δ = 3°: che mờ đều cụm cảm biến, bảo đảm lệnh không phát khi |Δ| tính ra dưới ngưỡng.</w:t>
+      </w:r>
+    </w:p>
+    <w:p>
+      <w:pPr>
+        <w:pStyle w:val="Heading2"/>
+      </w:pPr>
+      <w:r>
+        <w:t>3.3. An toàn</w:t>
       </w:r>
     </w:p>
     <w:p>
@@ -2710,7 +3160,7 @@
         <w:pStyle w:val="ListBullet"/>
       </w:pPr>
       <w:r>
-        <w:t>Chạy thử chế độ an toàn: tốc độ thấp, có người giám sát, nút dừng khẩn cấp luôn ở trạng thái sẵn sàng tác động.</w:t>
+        <w:t>Cầu chì 10 A ngay đầu nguồn 12 V; không chạm cụm trục khi đang cấp điện.</w:t>
       </w:r>
     </w:p>
     <w:p>
@@ -2718,7 +3168,23 @@
         <w:pStyle w:val="ListBullet"/>
       </w:pPr>
       <w:r>
-        <w:t>Ghi một phiên log ngắn (tín hiệu bốn kênh, S, e, góc đặt) để làm dữ liệu nền trước khi thử thuật toán.</w:t>
+        <w:t>Kiểm tra chức năng tự giữ của trục vít trước khi lắp pin: ngắt điện đột ngột khi trục đang nghiêng, trục không được trôi.</w:t>
+      </w:r>
+    </w:p>
+    <w:p>
+      <w:pPr>
+        <w:pStyle w:val="ListBullet"/>
+      </w:pPr>
+      <w:r>
+        <w:t>Ngoài trời phải có hộp chống ẩm; ngắt nguồn và đặt tấm pin về vị trí nghỉ khi gió mạnh.</w:t>
+      </w:r>
+    </w:p>
+    <w:p>
+      <w:pPr>
+        <w:pStyle w:val="Heading1"/>
+      </w:pPr>
+      <w:r>
+        <w:t>CHƯƠNG 4. TIẾN ĐỘ THỰC HIỆN VÀ KẾ HOẠCH TUẦN NÀY</w:t>
       </w:r>
     </w:p>
     <w:p>
@@ -2726,7 +3192,7 @@
         <w:pStyle w:val="Heading2"/>
       </w:pPr>
       <w:r>
-        <w:t>3.3. An toàn khi chế tạo và vận hành</w:t>
+        <w:t>4.1. Kết quả đạt được trong tuần 5/10 – 10/10/2026</w:t>
       </w:r>
     </w:p>
     <w:p>
@@ -2734,7 +3200,7 @@
         <w:pStyle w:val="ListBullet"/>
       </w:pPr>
       <w:r>
-        <w:t>Không cấp nguồn công suất cho cơ cấu khi chưa kiểm tra ngắn mạch và chiều phân cực nguồn.</w:t>
+        <w:t>Chốt cơ cấu chấp hành là động cơ gạt nước ô tô trục vít; tính toán mô-men tải gió và hệ số an toàn 5–7 lần (Bảng chương 2).</w:t>
       </w:r>
     </w:p>
     <w:p>
@@ -2742,7 +3208,7 @@
         <w:pStyle w:val="ListBullet"/>
       </w:pPr>
       <w:r>
-        <w:t>Không chạm tay vào cụm trục đang chạy; tháo tấm pin trước khi chỉnh cơ khí.</w:t>
+        <w:t>Chốt sơ đồ khối, sơ đồ kết nối ESP32 và bảng chân cho mô hình một trục; chốt danh mục vật tư 14 hạng mục.</w:t>
       </w:r>
     </w:p>
     <w:p>
@@ -2750,7 +3216,7 @@
         <w:pStyle w:val="ListBullet"/>
       </w:pPr>
       <w:r>
-        <w:t>Giữ khu vực thử khô ráo; nếu thử ngoài trời phải có hộp chống ẩm cho mạch và ngắt nguồn khi mưa.</w:t>
+        <w:t>Chốt phương án hồi tiếp vị trí bằng biến trở xoay đồng trục để dừng đúng góc đích, thay cho việc canh thời gian chạy motor.</w:t>
       </w:r>
     </w:p>
     <w:p>
@@ -2758,7 +3224,7 @@
         <w:pStyle w:val="ListBullet"/>
       </w:pPr>
       <w:r>
-        <w:t>Mọi thay đổi kết cấu, thay linh kiện hoặc đổi chân đều phải ghi vào nhật ký chế tạo để bảo đảm lặp lại được.</w:t>
+        <w:t>Lập quy trình lắp ráp 10 bước và danh mục hiệu chuẩn bắt buộc, kèm phép thử tự giữ vị trí khi ngắt điện.</w:t>
       </w:r>
     </w:p>
     <w:p>
@@ -2766,35 +3232,7 @@
         <w:pStyle w:val="Heading2"/>
       </w:pPr>
       <w:r>
-        <w:t>3.4. Phương án mô phỏng và kiểm chứng</w:t>
-      </w:r>
-    </w:p>
-    <w:p>
-      <w:pPr/>
-      <w:r>
-        <w:t>Trước khi chạy tự động, kiểm tra từng LDR bằng cách chiếu sáng riêng từng hướng; xác nhận thứ tự bốn kênh, chiều dấu e_quay/e_nghiêng và độ lặp lại của các lần đo. Thử góc gá β_s trong nhiều hướng sáng, kiểm tra ánh sáng bị khung che, rồi xác định vùng chết để cơ cấu không rung khi sai lệch nhỏ.</w:t>
-      </w:r>
-    </w:p>
-    <w:p>
-      <w:pPr/>
-      <w:r>
-        <w:t>Khi thử mô hình một trục, ghi cả bốn tín hiệu nhưng chỉ điều khiển một sai lệch tương ứng với trục có thật. So sánh tấm pin cố định với các thuật toán A1–A4 trong cùng thời gian/tải; ghi góc, tín hiệu cảm biến, độ sáng tham chiếu, điện áp–dòng pin, điện năng actuator và thời tiết. Tính sai số góc, số/quãng chuyển động và năng lượng thuần; không suy ra kết quả hai trục từ phép đo một trục.</w:t>
-      </w:r>
-    </w:p>
-    <w:p>
-      <w:pPr>
-        <w:pStyle w:val="Heading1"/>
-      </w:pPr>
-      <w:r>
-        <w:t>CHƯƠNG 4. TIẾN ĐỘ THỰC HIỆN VÀ KẾ HOẠCH TUẦN TỚI</w:t>
-      </w:r>
-    </w:p>
-    <w:p>
-      <w:pPr>
-        <w:pStyle w:val="Heading2"/>
-      </w:pPr>
-      <w:r>
-        <w:t>4.1. Các công việc đã làm được</w:t>
+        <w:t>4.2. Các công việc còn lại của tuần này (5/10 – 10/10/2026)</w:t>
       </w:r>
     </w:p>
     <w:p>
@@ -2802,7 +3240,7 @@
         <w:pStyle w:val="ListBullet"/>
       </w:pPr>
       <w:r>
-        <w:t>Xây dựng chỉ tiêu kỹ thuật và cấu trúc tổng thể mô hình một trục (Chương 1).</w:t>
+        <w:t>Mua động cơ gạt nước, relay 2 kênh, biến trở xoay và ADS1115 theo danh mục.</w:t>
       </w:r>
     </w:p>
     <w:p>
@@ -2810,7 +3248,7 @@
         <w:pStyle w:val="ListBullet"/>
       </w:pPr>
       <w:r>
-        <w:t>Thiết kế phương án cơ khí: trục ngang Bắc – Nam, gối đỡ, tay đòn, giới hạn hành trình và vị trí công tắc (Chương 1, Chương 2).</w:t>
+        <w:t>Gia công khung, gối đỡ và trục; thử bench động cơ kèm relay trước khi lắp tải.</w:t>
       </w:r>
     </w:p>
     <w:p>
@@ -2818,7 +3256,7 @@
         <w:pStyle w:val="ListBullet"/>
       </w:pPr>
       <w:r>
-        <w:t>Thiết kế mạch cảm biến bốn kênh, mạch tham chiếu I²C, phương án nguồn – chống nhiễu và bảng chân kết nối (Chương 2).</w:t>
+        <w:t>Chế mạch chia áp bốn LDR và đo đặc tuyến từng kênh dưới đèn kiểm soát.</w:t>
       </w:r>
     </w:p>
     <w:p>
@@ -2826,55 +3264,7 @@
         <w:pStyle w:val="ListBullet"/>
       </w:pPr>
       <w:r>
-        <w:t>Lập danh mục vật tư dự kiến, quy trình lắp ráp 10 bước và danh mục hiệu chuẩn, kiểm tra an toàn (Chương 2, Chương 3).</w:t>
-      </w:r>
-    </w:p>
-    <w:p>
-      <w:pPr>
-        <w:pStyle w:val="Heading2"/>
-      </w:pPr>
-      <w:r>
-        <w:t>4.2. Các công việc sẽ làm trong tuần tới (12/10 – 18/10/2026)</w:t>
-      </w:r>
-    </w:p>
-    <w:p>
-      <w:pPr>
-        <w:pStyle w:val="ListBullet"/>
-      </w:pPr>
-      <w:r>
-        <w:t>Mua/chuẩn bị linh kiện theo danh mục vật tư; đo kiểm từng LDR và cầu phân áp trước khi hàn mạch chính thức.</w:t>
-      </w:r>
-    </w:p>
-    <w:p>
-      <w:pPr>
-        <w:pStyle w:val="ListBullet"/>
-      </w:pPr>
-      <w:r>
-        <w:t>Gia công đế, gối đỡ và trục quay; lắp khung pin và quay thử không tải toàn hành trình.</w:t>
-      </w:r>
-    </w:p>
-    <w:p>
-      <w:pPr>
-        <w:pStyle w:val="ListBullet"/>
-      </w:pPr>
-      <w:r>
-        <w:t>Lắp mạch cảm biến, đọc thử bốn kênh ADC và kiểm tra chiều dấu e_quay trên giá quay có chiếu sáng kiểm soát.</w:t>
-      </w:r>
-    </w:p>
-    <w:p>
-      <w:pPr>
-        <w:pStyle w:val="ListBullet"/>
-      </w:pPr>
-      <w:r>
-        <w:t>Hiệu chuẩn góc gá β_s và vùng chết sơ bộ; lắp công tắc hành trình và thử liên động chặn/quay ngược.</w:t>
-      </w:r>
-    </w:p>
-    <w:p>
-      <w:pPr>
-        <w:pStyle w:val="ListBullet"/>
-      </w:pPr>
-      <w:r>
-        <w:t>Ghi nhật ký chế tạo và chụp ảnh các bước để bổ sung vào báo cáo hoàn chỉnh.</w:t>
+        <w:t>Lắp biến trở hồi tiếp và lập bảng quy đổi góc ba điểm.</w:t>
       </w:r>
     </w:p>
     <w:p>
@@ -2894,7 +3284,7 @@
     <w:p>
       <w:pPr/>
       <w:r>
-        <w:t>[2] I. Reda and A. Andreas, “Solar position algorithm for solar radiation applications,” Solar Energy, vol. 76, no. 5, pp. 577–589, 2004.</w:t>
+        <w:t>[2] I. Reda and A. Andreas, “Solar position algorithm for solar radiation applications,” Solar Energy, vol. 76, no. 5, pp. 577-589, 2004.</w:t>
       </w:r>
     </w:p>
     <w:p>
@@ -2906,19 +3296,19 @@
     <w:p>
       <w:pPr/>
       <w:r>
-        <w:t>[4] H. Mousazadeh et al., “A review of principle and sun-tracking methods for maximizing solar systems output,” Renewable and Sustainable Energy Reviews, vol. 13, no. 8, pp. 1800–1818, 2009.</w:t>
+        <w:t>[4] H. Mousazadeh et al., “A review of principle and sun-tracking methods for maximizing solar systems output,” Renewable and Sustainable Energy Reviews, vol. 13, no. 8, pp. 1800-1818, 2009.</w:t>
       </w:r>
     </w:p>
     <w:p>
       <w:pPr/>
       <w:r>
-        <w:t>[5] A. Awasthi et al., “Review on sun tracking technology in solar PV system,” Energy Reports, vol. 6, pp. 392–405, 2020.</w:t>
+        <w:t>[5] A. Awasthi et al., “Review on sun tracking technology in solar PV system,” Energy Reports, vol. 6, pp. 392-405, 2020.</w:t>
       </w:r>
     </w:p>
     <w:p>
       <w:pPr/>
       <w:r>
-        <w:t>[6] R. F. Fuentes-Morales et al., “Control algorithms applied to active solar tracking systems: A review,” Solar Energy, vol. 212, pp. 203–219, 2020. https://doi.org/10.1016/j.solener.2020.10.071</w:t>
+        <w:t>[6] R. F. Fuentes-Morales et al., “Control algorithms applied to active solar tracking systems: A review,” Solar Energy, vol. 212, pp. 203-219, 2020. https://doi.org/10.1016/j.solener.2020.10.071</w:t>
       </w:r>
     </w:p>
     <w:p>
@@ -2936,13 +3326,13 @@
     <w:p>
       <w:pPr/>
       <w:r>
-        <w:t>[9] Arduino, Arduino Mega 2560 Rev3 — Technical Specifications. https://docs.arduino.cc/hardware/mega-2560/</w:t>
+        <w:t>[9] Espressif Systems, ESP32-DevKitC General Purpose Development Board User Guide. https://docs.espressif.com/projects/esp-dev-kits/en/latest/esp32/esp32-devkitc/index.html</w:t>
       </w:r>
     </w:p>
     <w:p>
       <w:pPr/>
       <w:r>
-        <w:t>[10] ROHM Semiconductor, BH1750FVI Digital 16-bit Serial Output Type Ambient Light Sensor IC, Datasheet.</w:t>
+        <w:t>[10] Texas Instruments, ADS1115 Ultra-Small, Low-Power, I2C-Based, 860-SPS, 16-Bit ADC, Datasheet. https://www.ti.com/lit/ds/symlink/ads1115.pdf</w:t>
       </w:r>
     </w:p>
     <w:p>
@@ -2956,6 +3346,1354 @@
       <w:r>
         <w:t>[12] W. F. Holmgren, C. W. Hansen, and M. A. Mikofski, “pvlib python: a python package for modeling solar energy systems,” Journal of Open Source Software, vol. 3, no. 29, p. 884, 2018.</w:t>
       </w:r>
+    </w:p>
+    <w:tbl>
+      <w:tblPr>
+        <w:tblStyle w:val="TableGrid"/>
+        <w:tblW w:type="auto" w:w="0"/>
+        <w:jc w:val="center"/>
+        <w:tblLook w:firstColumn="1" w:firstRow="1" w:lastColumn="0" w:lastRow="0" w:noHBand="0" w:noVBand="1" w:val="04A0"/>
+      </w:tblPr>
+      <w:tblGrid>
+        <w:gridCol w:w="3010"/>
+        <w:gridCol w:w="3010"/>
+        <w:gridCol w:w="3010"/>
+      </w:tblGrid>
+      <w:tr>
+        <w:tc>
+          <w:tcPr>
+            <w:tcW w:type="dxa" w:w="3010"/>
+          </w:tcPr>
+          <w:p>
+            <w:pPr>
+              <w:spacing w:after="40"/>
+              <w:ind w:firstLine="0"/>
+            </w:pPr>
+            <w:r>
+              <w:rPr>
+                <w:b/>
+                <w:sz w:val="22"/>
+              </w:rPr>
+              <w:t>Giai đoạn thiên văn ở Bắc bán cầu</w:t>
+            </w:r>
+          </w:p>
+        </w:tc>
+        <w:tc>
+          <w:tcPr>
+            <w:tcW w:type="dxa" w:w="3010"/>
+          </w:tcPr>
+          <w:p>
+            <w:pPr>
+              <w:spacing w:after="40"/>
+              <w:ind w:firstLine="0"/>
+            </w:pPr>
+            <w:r>
+              <w:rPr>
+                <w:b/>
+                <w:sz w:val="22"/>
+              </w:rPr>
+              <w:t>Xích vĩ Mặt Trời (xấp xỉ)</w:t>
+            </w:r>
+          </w:p>
+        </w:tc>
+        <w:tc>
+          <w:tcPr>
+            <w:tcW w:type="dxa" w:w="3010"/>
+          </w:tcPr>
+          <w:p>
+            <w:pPr>
+              <w:spacing w:after="40"/>
+              <w:ind w:firstLine="0"/>
+            </w:pPr>
+            <w:r>
+              <w:rPr>
+                <w:b/>
+                <w:sz w:val="22"/>
+              </w:rPr>
+              <w:t>Đặc điểm đường đi biểu kiến</w:t>
+            </w:r>
+          </w:p>
+        </w:tc>
+      </w:tr>
+      <w:tr>
+        <w:tc>
+          <w:tcPr>
+            <w:tcW w:type="dxa" w:w="3010"/>
+          </w:tcPr>
+          <w:p>
+            <w:pPr>
+              <w:spacing w:after="40"/>
+              <w:ind w:firstLine="0"/>
+            </w:pPr>
+            <w:r>
+              <w:rPr>
+                <w:sz w:val="22"/>
+              </w:rPr>
+              <w:t>Xuân: điểm phân tháng 3 đến chí tháng 6</w:t>
+            </w:r>
+          </w:p>
+        </w:tc>
+        <w:tc>
+          <w:tcPr>
+            <w:tcW w:type="dxa" w:w="3010"/>
+          </w:tcPr>
+          <w:p>
+            <w:pPr>
+              <w:spacing w:after="40"/>
+              <w:ind w:firstLine="0"/>
+            </w:pPr>
+            <w:r>
+              <w:rPr>
+                <w:sz w:val="22"/>
+              </w:rPr>
+              <w:t>0° → +23,44°</w:t>
+            </w:r>
+          </w:p>
+        </w:tc>
+        <w:tc>
+          <w:tcPr>
+            <w:tcW w:type="dxa" w:w="3010"/>
+          </w:tcPr>
+          <w:p>
+            <w:pPr>
+              <w:spacing w:after="40"/>
+              <w:ind w:firstLine="0"/>
+            </w:pPr>
+            <w:r>
+              <w:rPr>
+                <w:sz w:val="22"/>
+              </w:rPr>
+              <w:t>Độ cao Mặt Trời giữa trưa tăng; ngày dài dần.</w:t>
+            </w:r>
+          </w:p>
+        </w:tc>
+      </w:tr>
+      <w:tr>
+        <w:tc>
+          <w:tcPr>
+            <w:tcW w:type="dxa" w:w="3010"/>
+          </w:tcPr>
+          <w:p>
+            <w:pPr>
+              <w:spacing w:after="40"/>
+              <w:ind w:firstLine="0"/>
+            </w:pPr>
+            <w:r>
+              <w:rPr>
+                <w:sz w:val="22"/>
+              </w:rPr>
+              <w:t>Hạ: chí tháng 6 đến điểm phân tháng 9</w:t>
+            </w:r>
+          </w:p>
+        </w:tc>
+        <w:tc>
+          <w:tcPr>
+            <w:tcW w:type="dxa" w:w="3010"/>
+          </w:tcPr>
+          <w:p>
+            <w:pPr>
+              <w:spacing w:after="40"/>
+              <w:ind w:firstLine="0"/>
+            </w:pPr>
+            <w:r>
+              <w:rPr>
+                <w:sz w:val="22"/>
+              </w:rPr>
+              <w:t>+23,44° → 0°</w:t>
+            </w:r>
+          </w:p>
+        </w:tc>
+        <w:tc>
+          <w:tcPr>
+            <w:tcW w:type="dxa" w:w="3010"/>
+          </w:tcPr>
+          <w:p>
+            <w:pPr>
+              <w:spacing w:after="40"/>
+              <w:ind w:firstLine="0"/>
+            </w:pPr>
+            <w:r>
+              <w:rPr>
+                <w:sz w:val="22"/>
+              </w:rPr>
+              <w:t>Mặt Trời đi cao; ngày dài rồi giảm dần.</w:t>
+            </w:r>
+          </w:p>
+        </w:tc>
+      </w:tr>
+      <w:tr>
+        <w:tc>
+          <w:tcPr>
+            <w:tcW w:type="dxa" w:w="3010"/>
+          </w:tcPr>
+          <w:p>
+            <w:pPr>
+              <w:spacing w:after="40"/>
+              <w:ind w:firstLine="0"/>
+            </w:pPr>
+            <w:r>
+              <w:rPr>
+                <w:sz w:val="22"/>
+              </w:rPr>
+              <w:t>Thu: điểm phân tháng 9 đến chí tháng 12</w:t>
+            </w:r>
+          </w:p>
+        </w:tc>
+        <w:tc>
+          <w:tcPr>
+            <w:tcW w:type="dxa" w:w="3010"/>
+          </w:tcPr>
+          <w:p>
+            <w:pPr>
+              <w:spacing w:after="40"/>
+              <w:ind w:firstLine="0"/>
+            </w:pPr>
+            <w:r>
+              <w:rPr>
+                <w:sz w:val="22"/>
+              </w:rPr>
+              <w:t>0° → −23,44°</w:t>
+            </w:r>
+          </w:p>
+        </w:tc>
+        <w:tc>
+          <w:tcPr>
+            <w:tcW w:type="dxa" w:w="3010"/>
+          </w:tcPr>
+          <w:p>
+            <w:pPr>
+              <w:spacing w:after="40"/>
+              <w:ind w:firstLine="0"/>
+            </w:pPr>
+            <w:r>
+              <w:rPr>
+                <w:sz w:val="22"/>
+              </w:rPr>
+              <w:t>Quỹ đạo hạ thấp; ngày ngắn dần.</w:t>
+            </w:r>
+          </w:p>
+        </w:tc>
+      </w:tr>
+      <w:tr>
+        <w:tc>
+          <w:tcPr>
+            <w:tcW w:type="dxa" w:w="3010"/>
+          </w:tcPr>
+          <w:p>
+            <w:pPr>
+              <w:spacing w:after="40"/>
+              <w:ind w:firstLine="0"/>
+            </w:pPr>
+            <w:r>
+              <w:rPr>
+                <w:sz w:val="22"/>
+              </w:rPr>
+              <w:t>Đông: chí tháng 12 đến điểm phân tháng 3</w:t>
+            </w:r>
+          </w:p>
+        </w:tc>
+        <w:tc>
+          <w:tcPr>
+            <w:tcW w:type="dxa" w:w="3010"/>
+          </w:tcPr>
+          <w:p>
+            <w:pPr>
+              <w:spacing w:after="40"/>
+              <w:ind w:firstLine="0"/>
+            </w:pPr>
+            <w:r>
+              <w:rPr>
+                <w:sz w:val="22"/>
+              </w:rPr>
+              <w:t>−23,44° → 0°</w:t>
+            </w:r>
+          </w:p>
+        </w:tc>
+        <w:tc>
+          <w:tcPr>
+            <w:tcW w:type="dxa" w:w="3010"/>
+          </w:tcPr>
+          <w:p>
+            <w:pPr>
+              <w:spacing w:after="40"/>
+              <w:ind w:firstLine="0"/>
+            </w:pPr>
+            <w:r>
+              <w:rPr>
+                <w:sz w:val="22"/>
+              </w:rPr>
+              <w:t>Mặt Trời đi thấp; ngày ngắn rồi dài dần.</w:t>
+            </w:r>
+          </w:p>
+        </w:tc>
+      </w:tr>
+    </w:tbl>
+    <w:p>
+      <w:pPr/>
+    </w:p>
+    <w:tbl>
+      <w:tblPr>
+        <w:tblStyle w:val="TableGrid"/>
+        <w:tblW w:type="auto" w:w="0"/>
+        <w:jc w:val="center"/>
+        <w:tblLook w:firstColumn="1" w:firstRow="1" w:lastColumn="0" w:lastRow="0" w:noHBand="0" w:noVBand="1" w:val="04A0"/>
+      </w:tblPr>
+      <w:tblGrid>
+        <w:gridCol w:w="3010"/>
+        <w:gridCol w:w="3010"/>
+        <w:gridCol w:w="3010"/>
+      </w:tblGrid>
+      <w:tr>
+        <w:tc>
+          <w:tcPr>
+            <w:tcW w:type="dxa" w:w="3010"/>
+          </w:tcPr>
+          <w:p>
+            <w:pPr>
+              <w:spacing w:after="40"/>
+              <w:ind w:firstLine="0"/>
+            </w:pPr>
+            <w:r>
+              <w:rPr>
+                <w:b/>
+                <w:sz w:val="22"/>
+              </w:rPr>
+              <w:t>Phương pháp</w:t>
+            </w:r>
+          </w:p>
+        </w:tc>
+        <w:tc>
+          <w:tcPr>
+            <w:tcW w:type="dxa" w:w="3010"/>
+          </w:tcPr>
+          <w:p>
+            <w:pPr>
+              <w:spacing w:after="40"/>
+              <w:ind w:firstLine="0"/>
+            </w:pPr>
+            <w:r>
+              <w:rPr>
+                <w:b/>
+                <w:sz w:val="22"/>
+              </w:rPr>
+              <w:t>Ưu điểm chính</w:t>
+            </w:r>
+          </w:p>
+        </w:tc>
+        <w:tc>
+          <w:tcPr>
+            <w:tcW w:type="dxa" w:w="3010"/>
+          </w:tcPr>
+          <w:p>
+            <w:pPr>
+              <w:spacing w:after="40"/>
+              <w:ind w:firstLine="0"/>
+            </w:pPr>
+            <w:r>
+              <w:rPr>
+                <w:b/>
+                <w:sz w:val="22"/>
+              </w:rPr>
+              <w:t>Hạn chế / điều kiện áp dụng</w:t>
+            </w:r>
+          </w:p>
+        </w:tc>
+      </w:tr>
+      <w:tr>
+        <w:tc>
+          <w:tcPr>
+            <w:tcW w:type="dxa" w:w="3010"/>
+          </w:tcPr>
+          <w:p>
+            <w:pPr>
+              <w:spacing w:after="40"/>
+              <w:ind w:firstLine="0"/>
+            </w:pPr>
+            <w:r>
+              <w:rPr>
+                <w:sz w:val="22"/>
+              </w:rPr>
+              <w:t>Cố định / chỉnh nghiêng theo mùa</w:t>
+            </w:r>
+          </w:p>
+        </w:tc>
+        <w:tc>
+          <w:tcPr>
+            <w:tcW w:type="dxa" w:w="3010"/>
+          </w:tcPr>
+          <w:p>
+            <w:pPr>
+              <w:spacing w:after="40"/>
+              <w:ind w:firstLine="0"/>
+            </w:pPr>
+            <w:r>
+              <w:rPr>
+                <w:sz w:val="22"/>
+              </w:rPr>
+              <w:t>Đơn giản, bền, không tốn điện cho chuyển động.</w:t>
+            </w:r>
+          </w:p>
+        </w:tc>
+        <w:tc>
+          <w:tcPr>
+            <w:tcW w:type="dxa" w:w="3010"/>
+          </w:tcPr>
+          <w:p>
+            <w:pPr>
+              <w:spacing w:after="40"/>
+              <w:ind w:firstLine="0"/>
+            </w:pPr>
+            <w:r>
+              <w:rPr>
+                <w:sz w:val="22"/>
+              </w:rPr>
+              <w:t>Không bám trong ngày; cần chọn góc lắp và đối chứng.</w:t>
+            </w:r>
+          </w:p>
+        </w:tc>
+      </w:tr>
+      <w:tr>
+        <w:tc>
+          <w:tcPr>
+            <w:tcW w:type="dxa" w:w="3010"/>
+          </w:tcPr>
+          <w:p>
+            <w:pPr>
+              <w:spacing w:after="40"/>
+              <w:ind w:firstLine="0"/>
+            </w:pPr>
+            <w:r>
+              <w:rPr>
+                <w:sz w:val="22"/>
+              </w:rPr>
+              <w:t>Vòng hở thiên văn</w:t>
+            </w:r>
+          </w:p>
+        </w:tc>
+        <w:tc>
+          <w:tcPr>
+            <w:tcW w:type="dxa" w:w="3010"/>
+          </w:tcPr>
+          <w:p>
+            <w:pPr>
+              <w:spacing w:after="40"/>
+              <w:ind w:firstLine="0"/>
+            </w:pPr>
+            <w:r>
+              <w:rPr>
+                <w:sz w:val="22"/>
+              </w:rPr>
+              <w:t>Không phụ thuộc tín hiệu quang; làm việc được khi có mây.</w:t>
+            </w:r>
+          </w:p>
+        </w:tc>
+        <w:tc>
+          <w:tcPr>
+            <w:tcW w:type="dxa" w:w="3010"/>
+          </w:tcPr>
+          <w:p>
+            <w:pPr>
+              <w:spacing w:after="40"/>
+              <w:ind w:firstLine="0"/>
+            </w:pPr>
+            <w:r>
+              <w:rPr>
+                <w:sz w:val="22"/>
+              </w:rPr>
+              <w:t>Cần RTC, tọa độ, lắp đặt và hiệu chuẩn đúng.</w:t>
+            </w:r>
+          </w:p>
+        </w:tc>
+      </w:tr>
+      <w:tr>
+        <w:tc>
+          <w:tcPr>
+            <w:tcW w:type="dxa" w:w="3010"/>
+          </w:tcPr>
+          <w:p>
+            <w:pPr>
+              <w:spacing w:after="40"/>
+              <w:ind w:firstLine="0"/>
+            </w:pPr>
+            <w:r>
+              <w:rPr>
+                <w:sz w:val="22"/>
+              </w:rPr>
+              <w:t>Vòng kín LDR / photodiode</w:t>
+            </w:r>
+          </w:p>
+        </w:tc>
+        <w:tc>
+          <w:tcPr>
+            <w:tcW w:type="dxa" w:w="3010"/>
+          </w:tcPr>
+          <w:p>
+            <w:pPr>
+              <w:spacing w:after="40"/>
+              <w:ind w:firstLine="0"/>
+            </w:pPr>
+            <w:r>
+              <w:rPr>
+                <w:sz w:val="22"/>
+              </w:rPr>
+              <w:t>Tự dò hướng sáng, cấu hình phần cứng gọn.</w:t>
+            </w:r>
+          </w:p>
+        </w:tc>
+        <w:tc>
+          <w:tcPr>
+            <w:tcW w:type="dxa" w:w="3010"/>
+          </w:tcPr>
+          <w:p>
+            <w:pPr>
+              <w:spacing w:after="40"/>
+              <w:ind w:firstLine="0"/>
+            </w:pPr>
+            <w:r>
+              <w:rPr>
+                <w:sz w:val="22"/>
+              </w:rPr>
+              <w:t>Mây, bóng, bụi và sai lệch cảm biến gây lệnh sai.</w:t>
+            </w:r>
+          </w:p>
+        </w:tc>
+      </w:tr>
+      <w:tr>
+        <w:tc>
+          <w:tcPr>
+            <w:tcW w:type="dxa" w:w="3010"/>
+          </w:tcPr>
+          <w:p>
+            <w:pPr>
+              <w:spacing w:after="40"/>
+              <w:ind w:firstLine="0"/>
+            </w:pPr>
+            <w:r>
+              <w:rPr>
+                <w:sz w:val="22"/>
+              </w:rPr>
+              <w:t>Lai thiên văn + quang</w:t>
+            </w:r>
+          </w:p>
+        </w:tc>
+        <w:tc>
+          <w:tcPr>
+            <w:tcW w:type="dxa" w:w="3010"/>
+          </w:tcPr>
+          <w:p>
+            <w:pPr>
+              <w:spacing w:after="40"/>
+              <w:ind w:firstLine="0"/>
+            </w:pPr>
+            <w:r>
+              <w:rPr>
+                <w:sz w:val="22"/>
+              </w:rPr>
+              <w:t>Có góc tham chiếu và hiệu chỉnh thực tế; có thể dự phòng cảm biến.</w:t>
+            </w:r>
+          </w:p>
+        </w:tc>
+        <w:tc>
+          <w:tcPr>
+            <w:tcW w:type="dxa" w:w="3010"/>
+          </w:tcPr>
+          <w:p>
+            <w:pPr>
+              <w:spacing w:after="40"/>
+              <w:ind w:firstLine="0"/>
+            </w:pPr>
+            <w:r>
+              <w:rPr>
+                <w:sz w:val="22"/>
+              </w:rPr>
+              <w:t>Cần logic chất lượng tín hiệu và hiệu chuẩn.</w:t>
+            </w:r>
+          </w:p>
+        </w:tc>
+      </w:tr>
+      <w:tr>
+        <w:tc>
+          <w:tcPr>
+            <w:tcW w:type="dxa" w:w="3010"/>
+          </w:tcPr>
+          <w:p>
+            <w:pPr>
+              <w:spacing w:after="40"/>
+              <w:ind w:firstLine="0"/>
+            </w:pPr>
+            <w:r>
+              <w:rPr>
+                <w:sz w:val="22"/>
+              </w:rPr>
+              <w:t>Tối ưu theo công suất PV</w:t>
+            </w:r>
+          </w:p>
+        </w:tc>
+        <w:tc>
+          <w:tcPr>
+            <w:tcW w:type="dxa" w:w="3010"/>
+          </w:tcPr>
+          <w:p>
+            <w:pPr>
+              <w:spacing w:after="40"/>
+              <w:ind w:firstLine="0"/>
+            </w:pPr>
+            <w:r>
+              <w:rPr>
+                <w:sz w:val="22"/>
+              </w:rPr>
+              <w:t>Đánh giá trực tiếp đầu ra điện của hệ thống.</w:t>
+            </w:r>
+          </w:p>
+        </w:tc>
+        <w:tc>
+          <w:tcPr>
+            <w:tcW w:type="dxa" w:w="3010"/>
+          </w:tcPr>
+          <w:p>
+            <w:pPr>
+              <w:spacing w:after="40"/>
+              <w:ind w:firstLine="0"/>
+            </w:pPr>
+            <w:r>
+              <w:rPr>
+                <w:sz w:val="22"/>
+              </w:rPr>
+              <w:t>Mây gây dao động; đo và tìm kiếm có thể chậm.</w:t>
+            </w:r>
+          </w:p>
+        </w:tc>
+      </w:tr>
+      <w:tr>
+        <w:tc>
+          <w:tcPr>
+            <w:tcW w:type="dxa" w:w="3010"/>
+          </w:tcPr>
+          <w:p>
+            <w:pPr>
+              <w:spacing w:after="40"/>
+              <w:ind w:firstLine="0"/>
+            </w:pPr>
+            <w:r>
+              <w:rPr>
+                <w:sz w:val="22"/>
+              </w:rPr>
+              <w:t>Camera / tracker thụ động</w:t>
+            </w:r>
+          </w:p>
+        </w:tc>
+        <w:tc>
+          <w:tcPr>
+            <w:tcW w:type="dxa" w:w="3010"/>
+          </w:tcPr>
+          <w:p>
+            <w:pPr>
+              <w:spacing w:after="40"/>
+              <w:ind w:firstLine="0"/>
+            </w:pPr>
+            <w:r>
+              <w:rPr>
+                <w:sz w:val="22"/>
+              </w:rPr>
+              <w:t>Camera có thể nhận dạng hướng; thụ động giảm mạch điện.</w:t>
+            </w:r>
+          </w:p>
+        </w:tc>
+        <w:tc>
+          <w:tcPr>
+            <w:tcW w:type="dxa" w:w="3010"/>
+          </w:tcPr>
+          <w:p>
+            <w:pPr>
+              <w:spacing w:after="40"/>
+              <w:ind w:firstLine="0"/>
+            </w:pPr>
+            <w:r>
+              <w:rPr>
+                <w:sz w:val="22"/>
+              </w:rPr>
+              <w:t>Camera đắt và tính toán lớn; thụ động phụ thuộc môi trường.</w:t>
+            </w:r>
+          </w:p>
+        </w:tc>
+      </w:tr>
+      <w:tr>
+        <w:tc>
+          <w:tcPr>
+            <w:tcW w:type="dxa" w:w="3010"/>
+          </w:tcPr>
+          <w:p>
+            <w:pPr>
+              <w:spacing w:after="40"/>
+              <w:ind w:firstLine="0"/>
+            </w:pPr>
+            <w:r>
+              <w:rPr>
+                <w:sz w:val="22"/>
+              </w:rPr>
+              <w:t>Backtracking giàn nhiều hàng</w:t>
+            </w:r>
+          </w:p>
+        </w:tc>
+        <w:tc>
+          <w:tcPr>
+            <w:tcW w:type="dxa" w:w="3010"/>
+          </w:tcPr>
+          <w:p>
+            <w:pPr>
+              <w:spacing w:after="40"/>
+              <w:ind w:firstLine="0"/>
+            </w:pPr>
+            <w:r>
+              <w:rPr>
+                <w:sz w:val="22"/>
+              </w:rPr>
+              <w:t>Giảm che bóng giữa các hàng pin.</w:t>
+            </w:r>
+          </w:p>
+        </w:tc>
+        <w:tc>
+          <w:tcPr>
+            <w:tcW w:type="dxa" w:w="3010"/>
+          </w:tcPr>
+          <w:p>
+            <w:pPr>
+              <w:spacing w:after="40"/>
+              <w:ind w:firstLine="0"/>
+            </w:pPr>
+            <w:r>
+              <w:rPr>
+                <w:sz w:val="22"/>
+              </w:rPr>
+              <w:t>Chủ yếu phù hợp giàn nhiều hàng, không cần cho mô hình đơn.</w:t>
+            </w:r>
+          </w:p>
+        </w:tc>
+      </w:tr>
+    </w:tbl>
+    <w:p>
+      <w:pPr/>
+    </w:p>
+    <w:tbl>
+      <w:tblPr>
+        <w:tblStyle w:val="TableGrid"/>
+        <w:tblW w:type="auto" w:w="0"/>
+        <w:jc w:val="center"/>
+        <w:tblLook w:firstColumn="1" w:firstRow="1" w:lastColumn="0" w:lastRow="0" w:noHBand="0" w:noVBand="1" w:val="04A0"/>
+      </w:tblPr>
+      <w:tblGrid>
+        <w:gridCol w:w="3010"/>
+        <w:gridCol w:w="3010"/>
+        <w:gridCol w:w="3010"/>
+      </w:tblGrid>
+      <w:tr>
+        <w:tc>
+          <w:tcPr>
+            <w:tcW w:type="dxa" w:w="3010"/>
+          </w:tcPr>
+          <w:p>
+            <w:pPr>
+              <w:spacing w:after="40"/>
+              <w:ind w:firstLine="0"/>
+            </w:pPr>
+            <w:r>
+              <w:rPr>
+                <w:b/>
+                <w:sz w:val="22"/>
+              </w:rPr>
+              <w:t>Khối</w:t>
+            </w:r>
+          </w:p>
+        </w:tc>
+        <w:tc>
+          <w:tcPr>
+            <w:tcW w:type="dxa" w:w="3010"/>
+          </w:tcPr>
+          <w:p>
+            <w:pPr>
+              <w:spacing w:after="40"/>
+              <w:ind w:firstLine="0"/>
+            </w:pPr>
+            <w:r>
+              <w:rPr>
+                <w:b/>
+                <w:sz w:val="22"/>
+              </w:rPr>
+              <w:t>Cấu hình đề xuất</w:t>
+            </w:r>
+          </w:p>
+        </w:tc>
+        <w:tc>
+          <w:tcPr>
+            <w:tcW w:type="dxa" w:w="3010"/>
+          </w:tcPr>
+          <w:p>
+            <w:pPr>
+              <w:spacing w:after="40"/>
+              <w:ind w:firstLine="0"/>
+            </w:pPr>
+            <w:r>
+              <w:rPr>
+                <w:b/>
+                <w:sz w:val="22"/>
+              </w:rPr>
+              <w:t>Nhiệm vụ</w:t>
+            </w:r>
+          </w:p>
+        </w:tc>
+      </w:tr>
+      <w:tr>
+        <w:tc>
+          <w:tcPr>
+            <w:tcW w:type="dxa" w:w="3010"/>
+          </w:tcPr>
+          <w:p>
+            <w:pPr>
+              <w:spacing w:after="40"/>
+              <w:ind w:firstLine="0"/>
+            </w:pPr>
+            <w:r>
+              <w:rPr>
+                <w:sz w:val="22"/>
+              </w:rPr>
+              <w:t>Cảm biến</w:t>
+            </w:r>
+          </w:p>
+        </w:tc>
+        <w:tc>
+          <w:tcPr>
+            <w:tcW w:type="dxa" w:w="3010"/>
+          </w:tcPr>
+          <w:p>
+            <w:pPr>
+              <w:spacing w:after="40"/>
+              <w:ind w:firstLine="0"/>
+            </w:pPr>
+            <w:r>
+              <w:rPr>
+                <w:sz w:val="22"/>
+              </w:rPr>
+              <w:t>4 LDR tại 4 góc, gá nghiêng β_s = 30° hướng ra ngoài; ADS1115 đo U–I.</w:t>
+            </w:r>
+          </w:p>
+        </w:tc>
+        <w:tc>
+          <w:tcPr>
+            <w:tcW w:type="dxa" w:w="3010"/>
+          </w:tcPr>
+          <w:p>
+            <w:pPr>
+              <w:spacing w:after="40"/>
+              <w:ind w:firstLine="0"/>
+            </w:pPr>
+            <w:r>
+              <w:rPr>
+                <w:sz w:val="22"/>
+              </w:rPr>
+              <w:t>Đo bốn mức sáng; tạo sai lệch quay và nghiêng.</w:t>
+            </w:r>
+          </w:p>
+        </w:tc>
+      </w:tr>
+      <w:tr>
+        <w:tc>
+          <w:tcPr>
+            <w:tcW w:type="dxa" w:w="3010"/>
+          </w:tcPr>
+          <w:p>
+            <w:pPr>
+              <w:spacing w:after="40"/>
+              <w:ind w:firstLine="0"/>
+            </w:pPr>
+            <w:r>
+              <w:rPr>
+                <w:sz w:val="22"/>
+              </w:rPr>
+              <w:t>Điều khiển</w:t>
+            </w:r>
+          </w:p>
+        </w:tc>
+        <w:tc>
+          <w:tcPr>
+            <w:tcW w:type="dxa" w:w="3010"/>
+          </w:tcPr>
+          <w:p>
+            <w:pPr>
+              <w:spacing w:after="40"/>
+              <w:ind w:firstLine="0"/>
+            </w:pPr>
+            <w:r>
+              <w:rPr>
+                <w:sz w:val="22"/>
+              </w:rPr>
+              <w:t>ESP32 + RTC DS3231.</w:t>
+            </w:r>
+          </w:p>
+        </w:tc>
+        <w:tc>
+          <w:tcPr>
+            <w:tcW w:type="dxa" w:w="3010"/>
+          </w:tcPr>
+          <w:p>
+            <w:pPr>
+              <w:spacing w:after="40"/>
+              <w:ind w:firstLine="0"/>
+            </w:pPr>
+            <w:r>
+              <w:rPr>
+                <w:sz w:val="22"/>
+              </w:rPr>
+              <w:t>Lọc tín hiệu, tính sai lệch, chạy thuật toán và ghi dữ liệu.</w:t>
+            </w:r>
+          </w:p>
+        </w:tc>
+      </w:tr>
+      <w:tr>
+        <w:tc>
+          <w:tcPr>
+            <w:tcW w:type="dxa" w:w="3010"/>
+          </w:tcPr>
+          <w:p>
+            <w:pPr>
+              <w:spacing w:after="40"/>
+              <w:ind w:firstLine="0"/>
+            </w:pPr>
+            <w:r>
+              <w:rPr>
+                <w:sz w:val="22"/>
+              </w:rPr>
+              <w:t>Cơ khí</w:t>
+            </w:r>
+          </w:p>
+        </w:tc>
+        <w:tc>
+          <w:tcPr>
+            <w:tcW w:type="dxa" w:w="3010"/>
+          </w:tcPr>
+          <w:p>
+            <w:pPr>
+              <w:spacing w:after="40"/>
+              <w:ind w:firstLine="0"/>
+            </w:pPr>
+            <w:r>
+              <w:rPr>
+                <w:sz w:val="22"/>
+              </w:rPr>
+              <w:t>Mô hình trong phạm vi đề tài có một trục quay.</w:t>
+            </w:r>
+          </w:p>
+        </w:tc>
+        <w:tc>
+          <w:tcPr>
+            <w:tcW w:type="dxa" w:w="3010"/>
+          </w:tcPr>
+          <w:p>
+            <w:pPr>
+              <w:spacing w:after="40"/>
+              <w:ind w:firstLine="0"/>
+            </w:pPr>
+            <w:r>
+              <w:rPr>
+                <w:sz w:val="22"/>
+              </w:rPr>
+              <w:t>Dùng sai lệch ứng với trục lắp; thành phần còn lại được ghi nhận.</w:t>
+            </w:r>
+          </w:p>
+        </w:tc>
+      </w:tr>
+      <w:tr>
+        <w:tc>
+          <w:tcPr>
+            <w:tcW w:type="dxa" w:w="3010"/>
+          </w:tcPr>
+          <w:p>
+            <w:pPr>
+              <w:spacing w:after="40"/>
+              <w:ind w:firstLine="0"/>
+            </w:pPr>
+            <w:r>
+              <w:rPr>
+                <w:sz w:val="22"/>
+              </w:rPr>
+              <w:t>Bảo vệ</w:t>
+            </w:r>
+          </w:p>
+        </w:tc>
+        <w:tc>
+          <w:tcPr>
+            <w:tcW w:type="dxa" w:w="3010"/>
+          </w:tcPr>
+          <w:p>
+            <w:pPr>
+              <w:spacing w:after="40"/>
+              <w:ind w:firstLine="0"/>
+            </w:pPr>
+            <w:r>
+              <w:rPr>
+                <w:sz w:val="22"/>
+              </w:rPr>
+              <w:t>Động cơ gạt nước trục vít phù hợp tải + công tắc hành trình.</w:t>
+            </w:r>
+          </w:p>
+        </w:tc>
+        <w:tc>
+          <w:tcPr>
+            <w:tcW w:type="dxa" w:w="3010"/>
+          </w:tcPr>
+          <w:p>
+            <w:pPr>
+              <w:spacing w:after="40"/>
+              <w:ind w:firstLine="0"/>
+            </w:pPr>
+            <w:r>
+              <w:rPr>
+                <w:sz w:val="22"/>
+              </w:rPr>
+              <w:t>Giới hạn chuyển động và dừng an toàn.</w:t>
+            </w:r>
+          </w:p>
+        </w:tc>
+      </w:tr>
+      <w:tr>
+        <w:tc>
+          <w:tcPr>
+            <w:tcW w:type="dxa" w:w="3010"/>
+          </w:tcPr>
+          <w:p>
+            <w:pPr>
+              <w:spacing w:after="40"/>
+              <w:ind w:firstLine="0"/>
+            </w:pPr>
+            <w:r>
+              <w:rPr>
+                <w:sz w:val="22"/>
+              </w:rPr>
+              <w:t>Đo kiểm</w:t>
+            </w:r>
+          </w:p>
+        </w:tc>
+        <w:tc>
+          <w:tcPr>
+            <w:tcW w:type="dxa" w:w="3010"/>
+          </w:tcPr>
+          <w:p>
+            <w:pPr>
+              <w:spacing w:after="40"/>
+              <w:ind w:firstLine="0"/>
+            </w:pPr>
+            <w:r>
+              <w:rPr>
+                <w:sz w:val="22"/>
+              </w:rPr>
+              <w:t>Đo U, I pin và điện năng động cơ gạt nước.</w:t>
+            </w:r>
+          </w:p>
+        </w:tc>
+        <w:tc>
+          <w:tcPr>
+            <w:tcW w:type="dxa" w:w="3010"/>
+          </w:tcPr>
+          <w:p>
+            <w:pPr>
+              <w:spacing w:after="40"/>
+              <w:ind w:firstLine="0"/>
+            </w:pPr>
+            <w:r>
+              <w:rPr>
+                <w:sz w:val="22"/>
+              </w:rPr>
+              <w:t>Đánh giá năng lượng thuần và chuyển động.</w:t>
+            </w:r>
+          </w:p>
+        </w:tc>
+      </w:tr>
+    </w:tbl>
+    <w:p>
+      <w:pPr/>
+    </w:p>
+    <w:tbl>
+      <w:tblPr>
+        <w:tblStyle w:val="TableGrid"/>
+        <w:tblW w:type="auto" w:w="0"/>
+        <w:jc w:val="center"/>
+        <w:tblLook w:firstColumn="1" w:firstRow="1" w:lastColumn="0" w:lastRow="0" w:noHBand="0" w:noVBand="1" w:val="04A0"/>
+      </w:tblPr>
+      <w:tblGrid>
+        <w:gridCol w:w="3010"/>
+        <w:gridCol w:w="3010"/>
+        <w:gridCol w:w="3010"/>
+      </w:tblGrid>
+      <w:tr>
+        <w:tc>
+          <w:tcPr>
+            <w:tcW w:type="dxa" w:w="3010"/>
+          </w:tcPr>
+          <w:p>
+            <w:pPr>
+              <w:spacing w:after="40"/>
+              <w:ind w:firstLine="0"/>
+            </w:pPr>
+            <w:r>
+              <w:rPr>
+                <w:b/>
+                <w:sz w:val="22"/>
+              </w:rPr>
+              <w:t>Vị trí</w:t>
+            </w:r>
+          </w:p>
+        </w:tc>
+        <w:tc>
+          <w:tcPr>
+            <w:tcW w:type="dxa" w:w="3010"/>
+          </w:tcPr>
+          <w:p>
+            <w:pPr>
+              <w:spacing w:after="40"/>
+              <w:ind w:firstLine="0"/>
+            </w:pPr>
+            <w:r>
+              <w:rPr>
+                <w:b/>
+                <w:sz w:val="22"/>
+              </w:rPr>
+              <w:t>Ký hiệu</w:t>
+            </w:r>
+          </w:p>
+        </w:tc>
+        <w:tc>
+          <w:tcPr>
+            <w:tcW w:type="dxa" w:w="3010"/>
+          </w:tcPr>
+          <w:p>
+            <w:pPr>
+              <w:spacing w:after="40"/>
+              <w:ind w:firstLine="0"/>
+            </w:pPr>
+            <w:r>
+              <w:rPr>
+                <w:b/>
+                <w:sz w:val="22"/>
+              </w:rPr>
+              <w:t>Hướng gá</w:t>
+            </w:r>
+          </w:p>
+        </w:tc>
+      </w:tr>
+      <w:tr>
+        <w:tc>
+          <w:tcPr>
+            <w:tcW w:type="dxa" w:w="3010"/>
+          </w:tcPr>
+          <w:p>
+            <w:pPr>
+              <w:spacing w:after="40"/>
+              <w:ind w:firstLine="0"/>
+            </w:pPr>
+            <w:r>
+              <w:rPr>
+                <w:sz w:val="22"/>
+              </w:rPr>
+              <w:t>Trên - trái</w:t>
+            </w:r>
+          </w:p>
+        </w:tc>
+        <w:tc>
+          <w:tcPr>
+            <w:tcW w:type="dxa" w:w="3010"/>
+          </w:tcPr>
+          <w:p>
+            <w:pPr>
+              <w:spacing w:after="40"/>
+              <w:ind w:firstLine="0"/>
+            </w:pPr>
+            <w:r>
+              <w:rPr>
+                <w:sz w:val="22"/>
+              </w:rPr>
+              <w:t>L_TT</w:t>
+            </w:r>
+          </w:p>
+        </w:tc>
+        <w:tc>
+          <w:tcPr>
+            <w:tcW w:type="dxa" w:w="3010"/>
+          </w:tcPr>
+          <w:p>
+            <w:pPr>
+              <w:spacing w:after="40"/>
+              <w:ind w:firstLine="0"/>
+            </w:pPr>
+            <w:r>
+              <w:rPr>
+                <w:sz w:val="22"/>
+              </w:rPr>
+              <w:t>Chếch ra ngoài về phía trên-trái.</w:t>
+            </w:r>
+          </w:p>
+        </w:tc>
+      </w:tr>
+      <w:tr>
+        <w:tc>
+          <w:tcPr>
+            <w:tcW w:type="dxa" w:w="3010"/>
+          </w:tcPr>
+          <w:p>
+            <w:pPr>
+              <w:spacing w:after="40"/>
+              <w:ind w:firstLine="0"/>
+            </w:pPr>
+            <w:r>
+              <w:rPr>
+                <w:sz w:val="22"/>
+              </w:rPr>
+              <w:t>Trên - phải</w:t>
+            </w:r>
+          </w:p>
+        </w:tc>
+        <w:tc>
+          <w:tcPr>
+            <w:tcW w:type="dxa" w:w="3010"/>
+          </w:tcPr>
+          <w:p>
+            <w:pPr>
+              <w:spacing w:after="40"/>
+              <w:ind w:firstLine="0"/>
+            </w:pPr>
+            <w:r>
+              <w:rPr>
+                <w:sz w:val="22"/>
+              </w:rPr>
+              <w:t>L_PT</w:t>
+            </w:r>
+          </w:p>
+        </w:tc>
+        <w:tc>
+          <w:tcPr>
+            <w:tcW w:type="dxa" w:w="3010"/>
+          </w:tcPr>
+          <w:p>
+            <w:pPr>
+              <w:spacing w:after="40"/>
+              <w:ind w:firstLine="0"/>
+            </w:pPr>
+            <w:r>
+              <w:rPr>
+                <w:sz w:val="22"/>
+              </w:rPr>
+              <w:t>Chếch ra ngoài về phía trên-phải.</w:t>
+            </w:r>
+          </w:p>
+        </w:tc>
+      </w:tr>
+      <w:tr>
+        <w:tc>
+          <w:tcPr>
+            <w:tcW w:type="dxa" w:w="3010"/>
+          </w:tcPr>
+          <w:p>
+            <w:pPr>
+              <w:spacing w:after="40"/>
+              <w:ind w:firstLine="0"/>
+            </w:pPr>
+            <w:r>
+              <w:rPr>
+                <w:sz w:val="22"/>
+              </w:rPr>
+              <w:t>Dưới - trái</w:t>
+            </w:r>
+          </w:p>
+        </w:tc>
+        <w:tc>
+          <w:tcPr>
+            <w:tcW w:type="dxa" w:w="3010"/>
+          </w:tcPr>
+          <w:p>
+            <w:pPr>
+              <w:spacing w:after="40"/>
+              <w:ind w:firstLine="0"/>
+            </w:pPr>
+            <w:r>
+              <w:rPr>
+                <w:sz w:val="22"/>
+              </w:rPr>
+              <w:t>L_TD</w:t>
+            </w:r>
+          </w:p>
+        </w:tc>
+        <w:tc>
+          <w:tcPr>
+            <w:tcW w:type="dxa" w:w="3010"/>
+          </w:tcPr>
+          <w:p>
+            <w:pPr>
+              <w:spacing w:after="40"/>
+              <w:ind w:firstLine="0"/>
+            </w:pPr>
+            <w:r>
+              <w:rPr>
+                <w:sz w:val="22"/>
+              </w:rPr>
+              <w:t>Chếch ra ngoài về phía dưới-trái.</w:t>
+            </w:r>
+          </w:p>
+        </w:tc>
+      </w:tr>
+      <w:tr>
+        <w:tc>
+          <w:tcPr>
+            <w:tcW w:type="dxa" w:w="3010"/>
+          </w:tcPr>
+          <w:p>
+            <w:pPr>
+              <w:spacing w:after="40"/>
+              <w:ind w:firstLine="0"/>
+            </w:pPr>
+            <w:r>
+              <w:rPr>
+                <w:sz w:val="22"/>
+              </w:rPr>
+              <w:t>Dưới - phải</w:t>
+            </w:r>
+          </w:p>
+        </w:tc>
+        <w:tc>
+          <w:tcPr>
+            <w:tcW w:type="dxa" w:w="3010"/>
+          </w:tcPr>
+          <w:p>
+            <w:pPr>
+              <w:spacing w:after="40"/>
+              <w:ind w:firstLine="0"/>
+            </w:pPr>
+            <w:r>
+              <w:rPr>
+                <w:sz w:val="22"/>
+              </w:rPr>
+              <w:t>L_PD</w:t>
+            </w:r>
+          </w:p>
+        </w:tc>
+        <w:tc>
+          <w:tcPr>
+            <w:tcW w:type="dxa" w:w="3010"/>
+          </w:tcPr>
+          <w:p>
+            <w:pPr>
+              <w:spacing w:after="40"/>
+              <w:ind w:firstLine="0"/>
+            </w:pPr>
+            <w:r>
+              <w:rPr>
+                <w:sz w:val="22"/>
+              </w:rPr>
+              <w:t>Chếch ra ngoài về phía dưới-phải.</w:t>
+            </w:r>
+          </w:p>
+        </w:tc>
+      </w:tr>
+    </w:tbl>
+    <w:p>
+      <w:pPr/>
     </w:p>
     <w:sectPr>
       <w:footerReference w:type="default" r:id="rId9"/>

</xml_diff>

<commit_message>
Chuyen 6 bao cao sang phuong phap LAI thien van + LDR theo mach EasyEDA thuc te
- Phuong phap lai: thien van tu DS1307 dinh vi tho + LDR tinh chinh, giu lich khi may
- Bao cao 1/4: Chuong 2 con 3 phuong phap; Chuong 3 viet lai truc quan (ma tran tinh
  toan LDR, sai so ngay nang/ngay may, nang luong so tam co dinh); bo bang 3.2 cu
- Bao cao 2/5: xoa hinh co khi loi, tinh lai dong co cho tam 4 kg-100 W, so do khoi va
  ket noi ve lai thoang; Chuong 3 = che tao mach EasyEDA (7 so do), hieu chuan, do dac
- Bao cao 3/6: Chuong 1 tong quan he + Arduino IDE + ESP32 DevKit; Chuong 3 doc ADC,
  dieu khien dong co qua opto-cau H, DS1307, LCD I2C, bien tro goc, 5 luu do, code mau
- Mach dung thuc te: cau H 4 TIP41C, opto PC817, LM2596/7805, 1N4007, qt1-4, LCD 1602
- ADC chi do dien ap; bo 'sinh vien tu thiet ke'; ket qua ghi 'hoan thanh' thay 'chot'
- Moi bao cao xuat 1 PDF rieng + 1 PDF gop 6 quyen

Co-authored-by: arena-agent <297053741+arena-agent@users.noreply.github.com>
</commit_message>
<xml_diff>
--- a/Bao_cao_1_truc_Che_tao.docx
+++ b/Bao_cao_1_truc_Che_tao.docx
@@ -7,7 +7,7 @@
         <w:pStyle w:val="Heading1"/>
       </w:pPr>
       <w:r>
-        <w:t>CHƯƠNG 1. PHƯƠNG ÁN THIẾT KẾ HỆ THỐNG ĐÃ CHỐT</w:t>
+        <w:t>CHƯƠNG 1. PHƯƠNG ÁN THIẾT KẾ HỆ THỐNG</w:t>
       </w:r>
     </w:p>
     <w:p>
@@ -15,13 +15,13 @@
         <w:pStyle w:val="Heading2"/>
       </w:pPr>
       <w:r>
-        <w:t>1.1. Phương pháp điều khiển chốt: ma trận LDR suy ra góc quay</w:t>
+        <w:t>1.1. Phương pháp điều khiển của hệ</w:t>
       </w:r>
     </w:p>
     <w:p>
       <w:pPr/>
       <w:r>
-        <w:t>Bốn LDR gắn ở bốn góc tấm pin, ký hiệu trên-trái (L_TT), trên-phải (L_PT), dưới-trái (L_TD), dưới-phải (L_PD), mỗi cảm biến gá chếch ra ngoài một góc β_s = 30° như nhau. Tổng và các sai lệch chuẩn hóa của ma trận được tính:</w:t>
+        <w:t>Hệ dùng phương pháp lai trình bày ở quyển nghiên cứu: góc thiên văn tính từ ngày–giờ đọc ở DS1307 theo các công thức δ, H, α, γ; góc hiện tại đọc từ biến trở hồi tiếp; lệch thô quá 5° thì chạy motor theo lịch; khi nắng đẹp sai lệch ma trận LDR e1 = (trái − phải)/tổng được dùng tinh chỉnh motor với ngưỡng chết 3°; trời mây thì giữ vị trí theo lịch.</w:t>
       </w:r>
     </w:p>
     <w:p>
@@ -33,73 +33,13 @@
         <w:rPr>
           <w:i/>
         </w:rPr>
-        <w:t>S = L_TT + L_PT + L_TD + L_PD</w:t>
-      </w:r>
-    </w:p>
-    <w:p>
-      <w:pPr>
-        <w:ind w:firstLine="0"/>
-        <w:jc w:val="center"/>
-      </w:pPr>
-      <w:r>
-        <w:rPr>
-          <w:i/>
-        </w:rPr>
-        <w:t>e_quay = [(L_PT + L_PD) − (L_TT + L_TD)] / S</w:t>
-      </w:r>
-    </w:p>
-    <w:p>
-      <w:pPr>
-        <w:ind w:firstLine="0"/>
-        <w:jc w:val="center"/>
-      </w:pPr>
-      <w:r>
-        <w:rPr>
-          <w:i/>
-        </w:rPr>
-        <w:t>e_nghiêng = [(L_TT + L_PT) − (L_TD + L_PD)] / S</w:t>
+        <w:t>e1 = [(L_TT + L_TD) − (L_PT + L_PD)] / S;   S = L_TT + L_PT + L_TD + L_PD</w:t>
       </w:r>
     </w:p>
     <w:p>
       <w:pPr/>
       <w:r>
-        <w:t>Vì đáp ứng mỗi kênh tỉ lệ với cos(Δ ∓ β_s) trong mặt phẳng tương ứng, sai lệch chuẩn hóa liên hệ trực tiếp với góc lệch Δ giữa hướng Mặt Trời và pháp tuyến tấm pin:</w:t>
-      </w:r>
-    </w:p>
-    <w:p>
-      <w:pPr>
-        <w:ind w:firstLine="0"/>
-        <w:jc w:val="center"/>
-      </w:pPr>
-      <w:r>
-        <w:rPr>
-          <w:i/>
-        </w:rPr>
-        <w:t>Δ_quay = atan(e_quay / tan β_s);   Δ_nghiêng = atan(e_nghiêng / tan β_s)</w:t>
-      </w:r>
-    </w:p>
-    <w:p>
-      <w:pPr/>
-      <w:r>
-        <w:t>Như vậy mỗi lần đọc ma trận cho ngay góc cần quay, không phải dò bước theo thời gian. Góc đích được tính từ hồi tiếp vị trí và giới hạn trong hành trình:</w:t>
-      </w:r>
-    </w:p>
-    <w:p>
-      <w:pPr>
-        <w:ind w:firstLine="0"/>
-        <w:jc w:val="center"/>
-      </w:pPr>
-      <w:r>
-        <w:rPr>
-          <w:i/>
-        </w:rPr>
-        <w:t>θ_đích = sat(θ_hiện tại + Δ, θ_min, θ_max)</w:t>
-      </w:r>
-    </w:p>
-    <w:p>
-      <w:pPr/>
-      <w:r>
-        <w:t>Động cơ chỉ chạy khi |Δ| &gt; δ = 3° và dừng khi biến trở hồi tiếp báo θ đạt θ_đích; nhờ hộp giảm tốc trục vít tự hãm, tấm pin giữ nguyên vị trí khi dừng hoặc mất điện. Sai lệch chéo e_chéo = [(L_TT + L_PD) − (L_PT + L_TD)]/S chỉ dùng kiểm tra che bóng bất đối xứng, không tham gia phát lệnh.</w:t>
+        <w:t>Động cơ chỉ nhận lệnh xung ngắn rồi dừng; hộp giảm tốc trục vít tự hãm giữ tấm pin đứng yên giữa hai lần chạy nên hệ không tốn điện giữ vị trí và không trôi khi mất điện.</w:t>
       </w:r>
     </w:p>
     <w:p>
@@ -107,7 +47,7 @@
         <w:pStyle w:val="Heading2"/>
       </w:pPr>
       <w:r>
-        <w:t>1.2. Cấu trúc tổng thể hệ thống</w:t>
+        <w:t>1.2. Cấu trúc tổng thể</w:t>
       </w:r>
     </w:p>
     <w:p>
@@ -118,7 +58,7 @@
       <w:r>
         <w:drawing>
           <wp:inline xmlns:a="http://schemas.openxmlformats.org/drawingml/2006/main" xmlns:pic="http://schemas.openxmlformats.org/drawingml/2006/picture">
-            <wp:extent cx="5580000" cy="3776295"/>
+            <wp:extent cx="5580000" cy="3381915"/>
             <wp:docPr id="1" name="Picture 1"/>
             <wp:cNvGraphicFramePr>
               <a:graphicFrameLocks noChangeAspect="1"/>
@@ -139,7 +79,7 @@
                   <pic:spPr>
                     <a:xfrm>
                       <a:off x="0" y="0"/>
-                      <a:ext cx="5580000" cy="3776295"/>
+                      <a:ext cx="5580000" cy="3381915"/>
                     </a:xfrm>
                     <a:prstGeom prst="rect"/>
                   </pic:spPr>
@@ -155,7 +95,7 @@
         <w:pStyle w:val="Caption"/>
       </w:pPr>
       <w:r>
-        <w:t>Hình 1. Sơ đồ khối hệ thống bám nắng một trục dùng ESP32</w:t>
+        <w:t>Hình 1. Sơ đồ khối hệ thống bám nắng một trục điều khiển lai</w:t>
       </w:r>
     </w:p>
     <w:p>
@@ -212,7 +152,7 @@
                 <w:b/>
                 <w:sz w:val="22"/>
               </w:rPr>
-              <w:t>Cấu hình chốt</w:t>
+              <w:t>Cấu hình</w:t>
             </w:r>
           </w:p>
         </w:tc>
@@ -266,7 +206,7 @@
               <w:rPr>
                 <w:sz w:val="22"/>
               </w:rPr>
-              <w:t>4 LDR gá β_s = 30° ở 4 góc</w:t>
+              <w:t>4 LDR có vách che chữ thập</w:t>
             </w:r>
           </w:p>
         </w:tc>
@@ -283,7 +223,7 @@
               <w:rPr>
                 <w:sz w:val="22"/>
               </w:rPr>
-              <w:t>Lập ma trận sáng, tạo e_quay.</w:t>
+              <w:t>Tạo sai lệch e1 để tinh chỉnh.</w:t>
             </w:r>
           </w:p>
         </w:tc>
@@ -302,7 +242,7 @@
               <w:rPr>
                 <w:sz w:val="22"/>
               </w:rPr>
-              <w:t>Hồi tiếp vị trí</w:t>
+              <w:t>Hồi tiếp góc</w:t>
             </w:r>
           </w:p>
         </w:tc>
@@ -319,7 +259,7 @@
               <w:rPr>
                 <w:sz w:val="22"/>
               </w:rPr>
-              <w:t>Biến trở xoay 10 k đồng trục</w:t>
+              <w:t>Biến trở xoay đồng trục</w:t>
             </w:r>
           </w:p>
         </w:tc>
@@ -336,7 +276,166 @@
               <w:rPr>
                 <w:sz w:val="22"/>
               </w:rPr>
-              <w:t>Báo góc hiện tại để dừng đúng góc đích.</w:t>
+              <w:t>Báo góc hiện tại của tấm pin.</w:t>
+            </w:r>
+          </w:p>
+        </w:tc>
+      </w:tr>
+      <w:tr>
+        <w:tc>
+          <w:tcPr>
+            <w:tcW w:type="dxa" w:w="3010"/>
+          </w:tcPr>
+          <w:p>
+            <w:pPr>
+              <w:spacing w:after="40"/>
+              <w:ind w:firstLine="0"/>
+            </w:pPr>
+            <w:r>
+              <w:rPr>
+                <w:sz w:val="22"/>
+              </w:rPr>
+              <w:t>Đo kiểm</w:t>
+            </w:r>
+          </w:p>
+        </w:tc>
+        <w:tc>
+          <w:tcPr>
+            <w:tcW w:type="dxa" w:w="3010"/>
+          </w:tcPr>
+          <w:p>
+            <w:pPr>
+              <w:spacing w:after="40"/>
+              <w:ind w:firstLine="0"/>
+            </w:pPr>
+            <w:r>
+              <w:rPr>
+                <w:sz w:val="22"/>
+              </w:rPr>
+              <w:t>Cầu chia áp vào ADC</w:t>
+            </w:r>
+          </w:p>
+        </w:tc>
+        <w:tc>
+          <w:tcPr>
+            <w:tcW w:type="dxa" w:w="3010"/>
+          </w:tcPr>
+          <w:p>
+            <w:pPr>
+              <w:spacing w:after="40"/>
+              <w:ind w:firstLine="0"/>
+            </w:pPr>
+            <w:r>
+              <w:rPr>
+                <w:sz w:val="22"/>
+              </w:rPr>
+              <w:t>Theo dõi điện áp tấm pin (chỉ đo áp).</w:t>
+            </w:r>
+          </w:p>
+        </w:tc>
+      </w:tr>
+      <w:tr>
+        <w:tc>
+          <w:tcPr>
+            <w:tcW w:type="dxa" w:w="3010"/>
+          </w:tcPr>
+          <w:p>
+            <w:pPr>
+              <w:spacing w:after="40"/>
+              <w:ind w:firstLine="0"/>
+            </w:pPr>
+            <w:r>
+              <w:rPr>
+                <w:sz w:val="22"/>
+              </w:rPr>
+              <w:t>Thời gian</w:t>
+            </w:r>
+          </w:p>
+        </w:tc>
+        <w:tc>
+          <w:tcPr>
+            <w:tcW w:type="dxa" w:w="3010"/>
+          </w:tcPr>
+          <w:p>
+            <w:pPr>
+              <w:spacing w:after="40"/>
+              <w:ind w:firstLine="0"/>
+            </w:pPr>
+            <w:r>
+              <w:rPr>
+                <w:sz w:val="22"/>
+              </w:rPr>
+              <w:t>Module DS1307 (I²C 0x68)</w:t>
+            </w:r>
+          </w:p>
+        </w:tc>
+        <w:tc>
+          <w:tcPr>
+            <w:tcW w:type="dxa" w:w="3010"/>
+          </w:tcPr>
+          <w:p>
+            <w:pPr>
+              <w:spacing w:after="40"/>
+              <w:ind w:firstLine="0"/>
+            </w:pPr>
+            <w:r>
+              <w:rPr>
+                <w:sz w:val="22"/>
+              </w:rPr>
+              <w:t>Cấp ngày–giờ cho nhánh thiên văn.</w:t>
+            </w:r>
+          </w:p>
+        </w:tc>
+      </w:tr>
+      <w:tr>
+        <w:tc>
+          <w:tcPr>
+            <w:tcW w:type="dxa" w:w="3010"/>
+          </w:tcPr>
+          <w:p>
+            <w:pPr>
+              <w:spacing w:after="40"/>
+              <w:ind w:firstLine="0"/>
+            </w:pPr>
+            <w:r>
+              <w:rPr>
+                <w:sz w:val="22"/>
+              </w:rPr>
+              <w:t>Hiển thị</w:t>
+            </w:r>
+          </w:p>
+        </w:tc>
+        <w:tc>
+          <w:tcPr>
+            <w:tcW w:type="dxa" w:w="3010"/>
+          </w:tcPr>
+          <w:p>
+            <w:pPr>
+              <w:spacing w:after="40"/>
+              <w:ind w:firstLine="0"/>
+            </w:pPr>
+            <w:r>
+              <w:rPr>
+                <w:sz w:val="22"/>
+              </w:rPr>
+              <w:t>LCD I²C 1602 (0x27)</w:t>
+            </w:r>
+          </w:p>
+        </w:tc>
+        <w:tc>
+          <w:tcPr>
+            <w:tcW w:type="dxa" w:w="3010"/>
+          </w:tcPr>
+          <w:p>
+            <w:pPr>
+              <w:spacing w:after="40"/>
+              <w:ind w:firstLine="0"/>
+            </w:pPr>
+            <w:r>
+              <w:rPr>
+                <w:sz w:val="22"/>
+              </w:rPr>
+              <w:t>Hiện giờ, góc, e1, chế độ.</w:t>
             </w:r>
           </w:p>
         </w:tc>
@@ -372,7 +471,7 @@
               <w:rPr>
                 <w:sz w:val="22"/>
               </w:rPr>
-              <w:t>ESP32 DevKit + RTC DS3231</w:t>
+              <w:t>ESP32 DevKit</w:t>
             </w:r>
           </w:p>
         </w:tc>
@@ -389,7 +488,7 @@
               <w:rPr>
                 <w:sz w:val="22"/>
               </w:rPr>
-              <w:t>ADC 12 bit, lọc trung vị, suy góc, liên động, ghi log.</w:t>
+              <w:t>Chạy luật lai, liên động, ghi log.</w:t>
             </w:r>
           </w:p>
         </w:tc>
@@ -408,7 +507,7 @@
               <w:rPr>
                 <w:sz w:val="22"/>
               </w:rPr>
-              <w:t>Đo kiểm</w:t>
+              <w:t>Cách ly – công suất</w:t>
             </w:r>
           </w:p>
         </w:tc>
@@ -425,7 +524,7 @@
               <w:rPr>
                 <w:sz w:val="22"/>
               </w:rPr>
-              <w:t>ADS1115 (I²C, 16 bit)</w:t>
+              <w:t>2 opto PC817 + cầu H 4 TIP41C</w:t>
             </w:r>
           </w:p>
         </w:tc>
@@ -442,7 +541,7 @@
               <w:rPr>
                 <w:sz w:val="22"/>
               </w:rPr>
-              <w:t>Đo U, I tấm pin phục vụ tính năng lượng.</w:t>
+              <w:t>Đảo chiều động cơ 12 V an toàn.</w:t>
             </w:r>
           </w:p>
         </w:tc>
@@ -478,7 +577,7 @@
               <w:rPr>
                 <w:sz w:val="22"/>
               </w:rPr>
-              <w:t>Motor gạt nước 12 V trục vít + relay 2 kênh</w:t>
+              <w:t>Motor gạt nước trục vít 12 V</w:t>
             </w:r>
           </w:p>
         </w:tc>
@@ -495,7 +594,7 @@
               <w:rPr>
                 <w:sz w:val="22"/>
               </w:rPr>
-              <w:t>Quay trục Đông–Tây; tự giữ khi mất điện.</w:t>
+              <w:t>Quay trục Đông–Tây, tự giữ vị trí.</w:t>
             </w:r>
           </w:p>
         </w:tc>
@@ -531,7 +630,7 @@
               <w:rPr>
                 <w:sz w:val="22"/>
               </w:rPr>
-              <w:t>2 công tắc hành trình + nút dừng khẩn cấp</w:t>
+              <w:t>qt1, qt2 + diode cầu H + 1N4007</w:t>
             </w:r>
           </w:p>
         </w:tc>
@@ -548,7 +647,7 @@
               <w:rPr>
                 <w:sz w:val="22"/>
               </w:rPr>
-              <w:t>Chặn quá hành trình, cắt lệnh an toàn.</w:t>
+              <w:t>Chặn quá hành trình, chống ngược cực.</w:t>
             </w:r>
           </w:p>
         </w:tc>
@@ -562,7 +661,7 @@
         <w:pStyle w:val="Heading2"/>
       </w:pPr>
       <w:r>
-        <w:t>1.3. Bố trí cụm cảm biến và góc gá β_s</w:t>
+        <w:t>1.3. Cụm cảm biến LDR và vách che</w:t>
       </w:r>
     </w:p>
     <w:p>
@@ -573,7 +672,7 @@
       <w:r>
         <w:drawing>
           <wp:inline xmlns:a="http://schemas.openxmlformats.org/drawingml/2006/main" xmlns:pic="http://schemas.openxmlformats.org/drawingml/2006/picture">
-            <wp:extent cx="5580000" cy="2124993"/>
+            <wp:extent cx="5580000" cy="2131716"/>
             <wp:docPr id="2" name="Picture 2"/>
             <wp:cNvGraphicFramePr>
               <a:graphicFrameLocks noChangeAspect="1"/>
@@ -594,7 +693,7 @@
                   <pic:spPr>
                     <a:xfrm>
                       <a:off x="0" y="0"/>
-                      <a:ext cx="5580000" cy="2124993"/>
+                      <a:ext cx="5580000" cy="2131716"/>
                     </a:xfrm>
                     <a:prstGeom prst="rect"/>
                   </pic:spPr>
@@ -610,306 +709,13 @@
         <w:pStyle w:val="Caption"/>
       </w:pPr>
       <w:r>
-        <w:t>Hình 2. Bố trí 4 LDR ở bốn góc tấm pin và mặt cắt góc gá β_s</w:t>
+        <w:t>Hình 2. Bố trí 4 LDR ở bốn góc và vách che chữ thập giữa cụm</w:t>
       </w:r>
-    </w:p>
-    <w:p>
-      <w:pPr>
-        <w:pStyle w:val="Caption"/>
-        <w:spacing w:after="80"/>
-      </w:pPr>
-      <w:r>
-        <w:t>Bảng 2. Ký hiệu và hướng gá của bốn cảm biến</w:t>
-      </w:r>
-    </w:p>
-    <w:tbl>
-      <w:tblPr>
-        <w:tblStyle w:val="TableGrid"/>
-        <w:tblW w:type="auto" w:w="0"/>
-        <w:jc w:val="center"/>
-        <w:tblLook w:firstColumn="1" w:firstRow="1" w:lastColumn="0" w:lastRow="0" w:noHBand="0" w:noVBand="1" w:val="04A0"/>
-      </w:tblPr>
-      <w:tblGrid>
-        <w:gridCol w:w="3010"/>
-        <w:gridCol w:w="3010"/>
-        <w:gridCol w:w="3010"/>
-      </w:tblGrid>
-      <w:tr>
-        <w:tc>
-          <w:tcPr>
-            <w:tcW w:type="dxa" w:w="3010"/>
-          </w:tcPr>
-          <w:p>
-            <w:pPr>
-              <w:spacing w:after="40"/>
-              <w:ind w:firstLine="0"/>
-            </w:pPr>
-            <w:r>
-              <w:rPr>
-                <w:b/>
-                <w:sz w:val="22"/>
-              </w:rPr>
-              <w:t>Vị trí</w:t>
-            </w:r>
-          </w:p>
-        </w:tc>
-        <w:tc>
-          <w:tcPr>
-            <w:tcW w:type="dxa" w:w="3010"/>
-          </w:tcPr>
-          <w:p>
-            <w:pPr>
-              <w:spacing w:after="40"/>
-              <w:ind w:firstLine="0"/>
-            </w:pPr>
-            <w:r>
-              <w:rPr>
-                <w:b/>
-                <w:sz w:val="22"/>
-              </w:rPr>
-              <w:t>Ký hiệu</w:t>
-            </w:r>
-          </w:p>
-        </w:tc>
-        <w:tc>
-          <w:tcPr>
-            <w:tcW w:type="dxa" w:w="3010"/>
-          </w:tcPr>
-          <w:p>
-            <w:pPr>
-              <w:spacing w:after="40"/>
-              <w:ind w:firstLine="0"/>
-            </w:pPr>
-            <w:r>
-              <w:rPr>
-                <w:b/>
-                <w:sz w:val="22"/>
-              </w:rPr>
-              <w:t>Hướng gá</w:t>
-            </w:r>
-          </w:p>
-        </w:tc>
-      </w:tr>
-      <w:tr>
-        <w:tc>
-          <w:tcPr>
-            <w:tcW w:type="dxa" w:w="3010"/>
-          </w:tcPr>
-          <w:p>
-            <w:pPr>
-              <w:spacing w:after="40"/>
-              <w:ind w:firstLine="0"/>
-            </w:pPr>
-            <w:r>
-              <w:rPr>
-                <w:sz w:val="22"/>
-              </w:rPr>
-              <w:t>Trên – trái</w:t>
-            </w:r>
-          </w:p>
-        </w:tc>
-        <w:tc>
-          <w:tcPr>
-            <w:tcW w:type="dxa" w:w="3010"/>
-          </w:tcPr>
-          <w:p>
-            <w:pPr>
-              <w:spacing w:after="40"/>
-              <w:ind w:firstLine="0"/>
-            </w:pPr>
-            <w:r>
-              <w:rPr>
-                <w:sz w:val="22"/>
-              </w:rPr>
-              <w:t>L_TT</w:t>
-            </w:r>
-          </w:p>
-        </w:tc>
-        <w:tc>
-          <w:tcPr>
-            <w:tcW w:type="dxa" w:w="3010"/>
-          </w:tcPr>
-          <w:p>
-            <w:pPr>
-              <w:spacing w:after="40"/>
-              <w:ind w:firstLine="0"/>
-            </w:pPr>
-            <w:r>
-              <w:rPr>
-                <w:sz w:val="22"/>
-              </w:rPr>
-              <w:t>Chếch ra ngoài về phía trên-trái.</w:t>
-            </w:r>
-          </w:p>
-        </w:tc>
-      </w:tr>
-      <w:tr>
-        <w:tc>
-          <w:tcPr>
-            <w:tcW w:type="dxa" w:w="3010"/>
-          </w:tcPr>
-          <w:p>
-            <w:pPr>
-              <w:spacing w:after="40"/>
-              <w:ind w:firstLine="0"/>
-            </w:pPr>
-            <w:r>
-              <w:rPr>
-                <w:sz w:val="22"/>
-              </w:rPr>
-              <w:t>Trên – phải</w:t>
-            </w:r>
-          </w:p>
-        </w:tc>
-        <w:tc>
-          <w:tcPr>
-            <w:tcW w:type="dxa" w:w="3010"/>
-          </w:tcPr>
-          <w:p>
-            <w:pPr>
-              <w:spacing w:after="40"/>
-              <w:ind w:firstLine="0"/>
-            </w:pPr>
-            <w:r>
-              <w:rPr>
-                <w:sz w:val="22"/>
-              </w:rPr>
-              <w:t>L_PT</w:t>
-            </w:r>
-          </w:p>
-        </w:tc>
-        <w:tc>
-          <w:tcPr>
-            <w:tcW w:type="dxa" w:w="3010"/>
-          </w:tcPr>
-          <w:p>
-            <w:pPr>
-              <w:spacing w:after="40"/>
-              <w:ind w:firstLine="0"/>
-            </w:pPr>
-            <w:r>
-              <w:rPr>
-                <w:sz w:val="22"/>
-              </w:rPr>
-              <w:t>Chếch ra ngoài về phía trên-phải.</w:t>
-            </w:r>
-          </w:p>
-        </w:tc>
-      </w:tr>
-      <w:tr>
-        <w:tc>
-          <w:tcPr>
-            <w:tcW w:type="dxa" w:w="3010"/>
-          </w:tcPr>
-          <w:p>
-            <w:pPr>
-              <w:spacing w:after="40"/>
-              <w:ind w:firstLine="0"/>
-            </w:pPr>
-            <w:r>
-              <w:rPr>
-                <w:sz w:val="22"/>
-              </w:rPr>
-              <w:t>Dưới – trái</w:t>
-            </w:r>
-          </w:p>
-        </w:tc>
-        <w:tc>
-          <w:tcPr>
-            <w:tcW w:type="dxa" w:w="3010"/>
-          </w:tcPr>
-          <w:p>
-            <w:pPr>
-              <w:spacing w:after="40"/>
-              <w:ind w:firstLine="0"/>
-            </w:pPr>
-            <w:r>
-              <w:rPr>
-                <w:sz w:val="22"/>
-              </w:rPr>
-              <w:t>L_TD</w:t>
-            </w:r>
-          </w:p>
-        </w:tc>
-        <w:tc>
-          <w:tcPr>
-            <w:tcW w:type="dxa" w:w="3010"/>
-          </w:tcPr>
-          <w:p>
-            <w:pPr>
-              <w:spacing w:after="40"/>
-              <w:ind w:firstLine="0"/>
-            </w:pPr>
-            <w:r>
-              <w:rPr>
-                <w:sz w:val="22"/>
-              </w:rPr>
-              <w:t>Chếch ra ngoài về phía dưới-trái.</w:t>
-            </w:r>
-          </w:p>
-        </w:tc>
-      </w:tr>
-      <w:tr>
-        <w:tc>
-          <w:tcPr>
-            <w:tcW w:type="dxa" w:w="3010"/>
-          </w:tcPr>
-          <w:p>
-            <w:pPr>
-              <w:spacing w:after="40"/>
-              <w:ind w:firstLine="0"/>
-            </w:pPr>
-            <w:r>
-              <w:rPr>
-                <w:sz w:val="22"/>
-              </w:rPr>
-              <w:t>Dưới – phải</w:t>
-            </w:r>
-          </w:p>
-        </w:tc>
-        <w:tc>
-          <w:tcPr>
-            <w:tcW w:type="dxa" w:w="3010"/>
-          </w:tcPr>
-          <w:p>
-            <w:pPr>
-              <w:spacing w:after="40"/>
-              <w:ind w:firstLine="0"/>
-            </w:pPr>
-            <w:r>
-              <w:rPr>
-                <w:sz w:val="22"/>
-              </w:rPr>
-              <w:t>L_PD</w:t>
-            </w:r>
-          </w:p>
-        </w:tc>
-        <w:tc>
-          <w:tcPr>
-            <w:tcW w:type="dxa" w:w="3010"/>
-          </w:tcPr>
-          <w:p>
-            <w:pPr>
-              <w:spacing w:after="40"/>
-              <w:ind w:firstLine="0"/>
-            </w:pPr>
-            <w:r>
-              <w:rPr>
-                <w:sz w:val="22"/>
-              </w:rPr>
-              <w:t>Chếch ra ngoài về phía dưới-phải.</w:t>
-            </w:r>
-          </w:p>
-        </w:tc>
-      </w:tr>
-    </w:tbl>
-    <w:p>
-      <w:pPr/>
     </w:p>
     <w:p>
       <w:pPr/>
       <w:r>
-        <w:t>Góc gá β_s = 30° được chốt từ kết quả mô phỏng tuần 5/10–10/10: đủ độ nhạy (Δ = 3° đã cho e ≈ 0,030) mà chưa bão hòa trong dải lệch ±40°. Giá gá bốn cảm biến phải cùng một mẫu, cùng góc, không bị khung hoặc dây che; sau hiệu chuẩn phải cố định chắc và ghi lại góc thực tế.</w:t>
+        <w:t>Bốn LDR gá chếch ra ngoài 30° như nhau, vách che chữ thập cao 3 cm đặt giữa cụm để khi lệch hướng, bóng che làm một phía tối hơn rõ rệt, tăng độ chênh lệch tín hiệu. Giá gá in cùng một mẫu để bốn góc β_s đồng đều; sau hiệu chuẩn phải cố định chắc và tránh bóng của khung pin đổ lên cụm.</w:t>
       </w:r>
     </w:p>
     <w:p>
@@ -923,7 +729,7 @@
     <w:p>
       <w:pPr/>
       <w:r>
-        <w:t>Trục quay căn hướng Bắc – Nam thật, đặt gần trọng tâm tấm pin. Động cơ gạt nước ô tô 12 V gắn qua tay đòn; cặp trục vít – bánh vít tự hãm nên cơ cấu không trôi khi ngắt điện, không cần nuôi điện giữ vị trí. Biến trở xoay 10 k gắn đồng trục với trục quay, chia áp về một kênh ADC1 để chương trình đọc góc hiện tại; hai công tắc hành trình đặt trước điểm va chạm cơ khí ở hai đầu Đông – Tây.</w:t>
+        <w:t>Trục quay căn hướng Bắc–Nam, đặt gần trọng tâm tấm pin. Động cơ gạt nước 12 V nối tay đòn khớp bản lề; biến trở xoay 10 k đồng trục chia áp về GPIO36 để chương trình đọc góc hiện tại; hai công tắc hành trình qt1, qt2 đặt trước điểm va chạm cơ khí ở đầu Đông và đầu Tây. Lệnh quay đi qua opto PC817 xuống cầu H TIP41C nên khối công suất 12 V tách điện hoàn toàn khỏi khối logic 3,3 V.</w:t>
       </w:r>
     </w:p>
     <w:p>
@@ -931,7 +737,7 @@
         <w:pStyle w:val="Heading1"/>
       </w:pPr>
       <w:r>
-        <w:t>CHƯƠNG 2. THIẾT KẾ CƠ KHÍ, MẠCH ĐIỆN VÀ DANH MỤC VẬT TƯ</w:t>
+        <w:t>CHƯƠNG 2. THIẾT KẾ CƠ KHÍ, MẠCH ĐIỆN VÀ VẬT TƯ</w:t>
       </w:r>
     </w:p>
     <w:p>
@@ -943,57 +749,15 @@
       </w:r>
     </w:p>
     <w:p>
-      <w:pPr>
-        <w:ind w:firstLine="0"/>
-        <w:jc w:val="center"/>
-      </w:pPr>
+      <w:pPr/>
       <w:r>
-        <w:drawing>
-          <wp:inline xmlns:a="http://schemas.openxmlformats.org/drawingml/2006/main" xmlns:pic="http://schemas.openxmlformats.org/drawingml/2006/picture">
-            <wp:extent cx="5400000" cy="3458678"/>
-            <wp:docPr id="3" name="Picture 3"/>
-            <wp:cNvGraphicFramePr>
-              <a:graphicFrameLocks noChangeAspect="1"/>
-            </wp:cNvGraphicFramePr>
-            <a:graphic>
-              <a:graphicData uri="http://schemas.openxmlformats.org/drawingml/2006/picture">
-                <pic:pic>
-                  <pic:nvPicPr>
-                    <pic:cNvPr id="0" name="mo_hinh_co_khi_1_truc.png"/>
-                    <pic:cNvPicPr/>
-                  </pic:nvPicPr>
-                  <pic:blipFill>
-                    <a:blip r:embed="rId12"/>
-                    <a:stretch>
-                      <a:fillRect/>
-                    </a:stretch>
-                  </pic:blipFill>
-                  <pic:spPr>
-                    <a:xfrm>
-                      <a:off x="0" y="0"/>
-                      <a:ext cx="5400000" cy="3458678"/>
-                    </a:xfrm>
-                    <a:prstGeom prst="rect"/>
-                  </pic:spPr>
-                </pic:pic>
-              </a:graphicData>
-            </a:graphic>
-          </wp:inline>
-        </w:drawing>
-      </w:r>
-    </w:p>
-    <w:p>
-      <w:pPr>
-        <w:pStyle w:val="Caption"/>
-      </w:pPr>
-      <w:r>
-        <w:t>Hình 3. Mặt cắt mô hình cơ khí một trục với động cơ gạt nước trục vít</w:t>
+        <w:t>Khung đế thép phẳng có bulông cân bằng; hai gối đỡ mang trục thép tròn có bạc lót; tấm pin 100 W khối lượng khoảng 4 kg bắt lên khung đỡ nhôm qua tám tai bắt vít, tâm khối lượng đặt sát trục để giảm mô-men trọng lượng. Tay đòn nối trục ra hộp giảm tốc với khung pin có khớp bản lề khử sai lệch quỹ đạo; dây dẫn chừa dư theo toàn hành trình và buộc vào giá cố định. Hai công tắc hành trình gá sao cho cần gạt chạm trước khi khung pin va gối đỡ khoảng 2°.</w:t>
       </w:r>
     </w:p>
     <w:p>
       <w:pPr/>
       <w:r>
-        <w:t>Khung đế phẳng có bulông cân bằng; hai gối đỡ mang trục thép tròn có bạc lót; tấm pin bắt lên khung đỡ qua tai bắt vít sao cho tâm khối lượng sát trục. Tay đòn nối trục vít của động cơ với khung pin có khớp bản lề để khử sai lệch quỹ đạo; dây dẫn chừa dư theo toàn hành trình. Hai công tắc hành trình gắn ở giá sao cho cần gạt chạm trước khi khung pin va gối đỡ.</w:t>
+        <w:t>Hình vẽ chi tiết cơ khí sẽ được bổ sung bằng bản vẽ tay ở phiên bản sau; bản này mô tả kết cấu bằng lời và bảng tính chọn bên dưới.</w:t>
       </w:r>
     </w:p>
     <w:p>
@@ -1001,7 +765,7 @@
         <w:pStyle w:val="Heading2"/>
       </w:pPr>
       <w:r>
-        <w:t>2.2. Kết quả tính chọn động cơ</w:t>
+        <w:t>2.2. Tính chọn động cơ cho tấm pin 4 kg – 100 W</w:t>
       </w:r>
     </w:p>
     <w:p>
@@ -1010,7 +774,7 @@
         <w:spacing w:after="80"/>
       </w:pPr>
       <w:r>
-        <w:t>Bảng 3. Tính chọn động cơ gạt nước cho trục quay một trục</w:t>
+        <w:t>Bảng 2. Tính chọn động cơ cho tấm pin 4 kg – 100 W</w:t>
       </w:r>
     </w:p>
     <w:tbl>
@@ -1058,7 +822,7 @@
                 <w:b/>
                 <w:sz w:val="22"/>
               </w:rPr>
-              <w:t>Giá trị tính toán</w:t>
+              <w:t>Giá trị</w:t>
             </w:r>
           </w:p>
         </w:tc>
@@ -1095,7 +859,7 @@
               <w:rPr>
                 <w:sz w:val="22"/>
               </w:rPr>
-              <w:t>Khối lượng tấm pin 10 W</w:t>
+              <w:t>Tấm pin</w:t>
             </w:r>
           </w:p>
         </w:tc>
@@ -1112,7 +876,7 @@
               <w:rPr>
                 <w:sz w:val="22"/>
               </w:rPr>
-              <w:t>≈ 0,9 kg</w:t>
+              <w:t>100 W, khoảng 4 kg, diện tích ≈ 0,65 m²</w:t>
             </w:r>
           </w:p>
         </w:tc>
@@ -1129,7 +893,7 @@
               <w:rPr>
                 <w:sz w:val="22"/>
               </w:rPr>
-              <w:t>Lắp cân bằng quanh trục nên mô-men tĩnh ≈ 0.</w:t>
+              <w:t>Lắp cân bằng quanh trục.</w:t>
             </w:r>
           </w:p>
         </w:tc>
@@ -1148,7 +912,7 @@
               <w:rPr>
                 <w:sz w:val="22"/>
               </w:rPr>
-              <w:t>Tải gió v = 10 m/s</w:t>
+              <w:t>Mô-men trọng lượng (lệch tâm 5 cm)</w:t>
             </w:r>
           </w:p>
         </w:tc>
@@ -1165,7 +929,7 @@
               <w:rPr>
                 <w:sz w:val="22"/>
               </w:rPr>
-              <w:t>q = 0,6·v² ≈ 60 Pa; F ≈ 3,6 N với S = 0,06 m²</w:t>
+              <w:t>≈ 2,0 N·m</w:t>
             </w:r>
           </w:p>
         </w:tc>
@@ -1182,7 +946,7 @@
               <w:rPr>
                 <w:sz w:val="22"/>
               </w:rPr>
-              <w:t>Tác dụng lên mặt pin.</w:t>
+              <w:t>4 kg × 9,81 × 0,05 m.</w:t>
             </w:r>
           </w:p>
         </w:tc>
@@ -1201,7 +965,7 @@
               <w:rPr>
                 <w:sz w:val="22"/>
               </w:rPr>
-              <w:t>Mô-men gió lớn nhất</w:t>
+              <w:t>Tải gió làm việc v = 8 m/s</w:t>
             </w:r>
           </w:p>
         </w:tc>
@@ -1218,7 +982,7 @@
               <w:rPr>
                 <w:sz w:val="22"/>
               </w:rPr>
-              <w:t>M ≈ F × 0,15 m ≈ 0,54 N·m</w:t>
+              <w:t>q = 0,6·v² ≈ 38 Pa; F ≈ 25 N</w:t>
             </w:r>
           </w:p>
         </w:tc>
@@ -1235,7 +999,7 @@
               <w:rPr>
                 <w:sz w:val="22"/>
               </w:rPr>
-              <w:t>Cánh tay đòn tới trục.</w:t>
+              <w:t>Đẩy lên mặt pin 0,65 m².</w:t>
             </w:r>
           </w:p>
         </w:tc>
@@ -1254,7 +1018,7 @@
               <w:rPr>
                 <w:sz w:val="22"/>
               </w:rPr>
-              <w:t>Mô-men yêu cầu (×3 khởi động/ma sát)</w:t>
+              <w:t>Mô-men gió (tay đòn 0,3 m)</w:t>
             </w:r>
           </w:p>
         </w:tc>
@@ -1271,7 +1035,7 @@
               <w:rPr>
                 <w:sz w:val="22"/>
               </w:rPr>
-              <w:t>≈ 1,6 N·m</w:t>
+              <w:t>≈ 7,5 N·m</w:t>
             </w:r>
           </w:p>
         </w:tc>
@@ -1288,7 +1052,7 @@
               <w:rPr>
                 <w:sz w:val="22"/>
               </w:rPr>
-              <w:t>Hệ số dự trữ cho khớp trục vít.</w:t>
+              <w:t>Trường hợp gió ngang mặt pin.</w:t>
             </w:r>
           </w:p>
         </w:tc>
@@ -1307,7 +1071,7 @@
               <w:rPr>
                 <w:sz w:val="22"/>
               </w:rPr>
-              <w:t>Motor gạt nước 12 V điển hình</w:t>
+              <w:t>Mô-men yêu cầu (×2 khởi động, ma sát)</w:t>
             </w:r>
           </w:p>
         </w:tc>
@@ -1324,7 +1088,7 @@
               <w:rPr>
                 <w:sz w:val="22"/>
               </w:rPr>
-              <w:t>8 – 12 N·m, dòng 3 – 6 A</w:t>
+              <w:t>≈ 19 N·m</w:t>
             </w:r>
           </w:p>
         </w:tc>
@@ -1341,7 +1105,7 @@
               <w:rPr>
                 <w:sz w:val="22"/>
               </w:rPr>
-              <w:t>Kèm trục vít tự hãm và công tắc tự đỗ.</w:t>
+              <w:t>Tổng hai thành phần nhân hệ số.</w:t>
             </w:r>
           </w:p>
         </w:tc>
@@ -1360,7 +1124,7 @@
               <w:rPr>
                 <w:sz w:val="22"/>
               </w:rPr>
-              <w:t>Hệ số an toàn đạt được</w:t>
+              <w:t>Motor gạt nước 12 V + giảm tốc ngoài 1:3</w:t>
             </w:r>
           </w:p>
         </w:tc>
@@ -1377,7 +1141,7 @@
               <w:rPr>
                 <w:sz w:val="22"/>
               </w:rPr>
-              <w:t>5 – 7 lần</w:t>
+              <w:t>24 – 36 N·m ở trục ra</w:t>
             </w:r>
           </w:p>
         </w:tc>
@@ -1394,7 +1158,113 @@
               <w:rPr>
                 <w:sz w:val="22"/>
               </w:rPr>
-              <w:t>Đủ cho thử ngoài trời có gió giật nhẹ.</w:t>
+              <w:t>Bản thân motor 8 – 12 N·m.</w:t>
+            </w:r>
+          </w:p>
+        </w:tc>
+      </w:tr>
+      <w:tr>
+        <w:tc>
+          <w:tcPr>
+            <w:tcW w:type="dxa" w:w="3010"/>
+          </w:tcPr>
+          <w:p>
+            <w:pPr>
+              <w:spacing w:after="40"/>
+              <w:ind w:firstLine="0"/>
+            </w:pPr>
+            <w:r>
+              <w:rPr>
+                <w:sz w:val="22"/>
+              </w:rPr>
+              <w:t>Hệ số an toàn</w:t>
+            </w:r>
+          </w:p>
+        </w:tc>
+        <w:tc>
+          <w:tcPr>
+            <w:tcW w:type="dxa" w:w="3010"/>
+          </w:tcPr>
+          <w:p>
+            <w:pPr>
+              <w:spacing w:after="40"/>
+              <w:ind w:firstLine="0"/>
+            </w:pPr>
+            <w:r>
+              <w:rPr>
+                <w:sz w:val="22"/>
+              </w:rPr>
+              <w:t>1,3 – 1,9 lần</w:t>
+            </w:r>
+          </w:p>
+        </w:tc>
+        <w:tc>
+          <w:tcPr>
+            <w:tcW w:type="dxa" w:w="3010"/>
+          </w:tcPr>
+          <w:p>
+            <w:pPr>
+              <w:spacing w:after="40"/>
+              <w:ind w:firstLine="0"/>
+            </w:pPr>
+            <w:r>
+              <w:rPr>
+                <w:sz w:val="22"/>
+              </w:rPr>
+              <w:t>Đủ cho gió tới 8 m/s.</w:t>
+            </w:r>
+          </w:p>
+        </w:tc>
+      </w:tr>
+      <w:tr>
+        <w:tc>
+          <w:tcPr>
+            <w:tcW w:type="dxa" w:w="3010"/>
+          </w:tcPr>
+          <w:p>
+            <w:pPr>
+              <w:spacing w:after="40"/>
+              <w:ind w:firstLine="0"/>
+            </w:pPr>
+            <w:r>
+              <w:rPr>
+                <w:sz w:val="22"/>
+              </w:rPr>
+              <w:t>Chế độ gió lớn</w:t>
+            </w:r>
+          </w:p>
+        </w:tc>
+        <w:tc>
+          <w:tcPr>
+            <w:tcW w:type="dxa" w:w="3010"/>
+          </w:tcPr>
+          <w:p>
+            <w:pPr>
+              <w:spacing w:after="40"/>
+              <w:ind w:firstLine="0"/>
+            </w:pPr>
+            <w:r>
+              <w:rPr>
+                <w:sz w:val="22"/>
+              </w:rPr>
+              <w:t>Trên 10 m/s: hạ tấm pin nằm ngang</w:t>
+            </w:r>
+          </w:p>
+        </w:tc>
+        <w:tc>
+          <w:tcPr>
+            <w:tcW w:type="dxa" w:w="3010"/>
+          </w:tcPr>
+          <w:p>
+            <w:pPr>
+              <w:spacing w:after="40"/>
+              <w:ind w:firstLine="0"/>
+            </w:pPr>
+            <w:r>
+              <w:rPr>
+                <w:sz w:val="22"/>
+              </w:rPr>
+              <w:t>Giảm tay đòn gió về gần 0.</w:t>
             </w:r>
           </w:p>
         </w:tc>
@@ -1406,7 +1276,7 @@
     <w:p>
       <w:pPr/>
       <w:r>
-        <w:t>Với hệ số an toàn 5–7 lần, động cơ gạt nước đủ mô-men kể cả khi khớp trục vít có hiệu suất thấp; đổi lại tốc độ quay chậm (khoảng 1–2 vòng/phút ở trục ra) lại phù hợp với bám nắng vì mỗi lần hiệu chỉnh chỉ quay vài độ.</w:t>
+        <w:t>Với tấm pin 4 kg, mô-men gió chiếm phần lớn tải; cặp trục vít của motor gạt nước cộng giảm tốc ngoài 1:3 cho mô-men trục ra 24–36 N·m, đủ hệ số an toàn 1,3–1,9 lần ở gió 8 m/s. Đổi lại tốc độ trục ra chậm (khoảng 0,5 vòng/phút) lại phù hợp vì mỗi lần hiệu chỉnh chỉ quay vài độ.</w:t>
       </w:r>
     </w:p>
     <w:p>
@@ -1414,13 +1284,13 @@
         <w:pStyle w:val="Heading2"/>
       </w:pPr>
       <w:r>
-        <w:t>2.3. Mạch điện và phương pháp đọc ADC</w:t>
+        <w:t>2.3. Mạch điện: nguồn, cách ly, động lực và đo lường</w:t>
       </w:r>
     </w:p>
     <w:p>
       <w:pPr/>
       <w:r>
-        <w:t>Mạch chia áp của bốn LDR và của biến trở hồi tiếp do sinh viên tự chế và tự hiệu chuẩn; báo cáo chốt phần xử lý tín hiệu phía ESP32: dùng ADC1 12 bit với suy hao 11 dB, mỗi kênh lấy 64 mẫu, loại đột biến bằng trung vị rồi lấy trung bình nửa giữa; giá trị được đổi sang milivôn theo hệ số hiệu chuẩn của bo. Module ADS1115 16 bit qua I²C đo điện áp tấm pin (qua cầu chia) và dòng điện (qua cảm biến ACS712) phục vụ tính năng lượng. Động cơ đóng cắt bằng module relay 2 kênh (hoặc cầu H MOSFET) có cầu chì 10 A riêng; nguồn động cơ 12 V tách khỏi nguồn logic 5 V, nối mass chung một điểm.</w:t>
+        <w:t>Nguồn 12 V vào qua đầu nối X1 và diode 1N4007 chống ngược cực; nhánh LM2596 hạ áp xuống 3,3 V nuôi ESP32, nhánh 7805 kèm tụ 220 µF hai đầu hạ xuống 5 V nuôi LCD I²C 1602 và module DS1307. Tín hiệu lệnh th_thuan/th_nguoc từ GPIO19/GPIO18 qua opto PC817 và điện trở 220 Ω xuống cầu H bốn TIP41C điều khiển động cơ; bốn công tắc hành trình qt1…qt4 kéo xuống 1k nên mức 0 là an toàn, mức 1 là chạm hành trình. Bốn kênh LDR, biến trở hồi tiếp và cầu chia áp điện áp tấm pin đưa thẳng vào các chân ADC; hệ chỉ đo điện áp, chưa đo dòng điện.</w:t>
       </w:r>
     </w:p>
     <w:p>
@@ -1431,8 +1301,8 @@
       <w:r>
         <w:drawing>
           <wp:inline xmlns:a="http://schemas.openxmlformats.org/drawingml/2006/main" xmlns:pic="http://schemas.openxmlformats.org/drawingml/2006/picture">
-            <wp:extent cx="5760000" cy="3825547"/>
-            <wp:docPr id="4" name="Picture 4"/>
+            <wp:extent cx="5760000" cy="3851662"/>
+            <wp:docPr id="3" name="Picture 3"/>
             <wp:cNvGraphicFramePr>
               <a:graphicFrameLocks noChangeAspect="1"/>
             </wp:cNvGraphicFramePr>
@@ -1444,7 +1314,7 @@
                     <pic:cNvPicPr/>
                   </pic:nvPicPr>
                   <pic:blipFill>
-                    <a:blip r:embed="rId13"/>
+                    <a:blip r:embed="rId12"/>
                     <a:stretch>
                       <a:fillRect/>
                     </a:stretch>
@@ -1452,7 +1322,7 @@
                   <pic:spPr>
                     <a:xfrm>
                       <a:off x="0" y="0"/>
-                      <a:ext cx="5760000" cy="3825547"/>
+                      <a:ext cx="5760000" cy="3851662"/>
                     </a:xfrm>
                     <a:prstGeom prst="rect"/>
                   </pic:spPr>
@@ -1468,7 +1338,7 @@
         <w:pStyle w:val="Caption"/>
       </w:pPr>
       <w:r>
-        <w:t>Hình 4. Sơ đồ kết nối ESP32 của mô hình một trục</w:t>
+        <w:t>Hình 3. Sơ đồ kết nối ESP32 DevKit của mô hình một trục</w:t>
       </w:r>
     </w:p>
     <w:p>
@@ -1477,7 +1347,7 @@
         <w:spacing w:after="80"/>
       </w:pPr>
       <w:r>
-        <w:t>Bảng 4. Bảng chân kết nối chốt cho mô hình một trục</w:t>
+        <w:t>Bảng 3. Bảng chân kết nối của mô hình một trục</w:t>
       </w:r>
     </w:p>
     <w:tbl>
@@ -1525,7 +1395,7 @@
                 <w:b/>
                 <w:sz w:val="22"/>
               </w:rPr>
-              <w:t>Tín hiệu</w:t>
+              <w:t>Mạng tín hiệu</w:t>
             </w:r>
           </w:p>
         </w:tc>
@@ -1543,7 +1413,7 @@
                 <w:b/>
                 <w:sz w:val="22"/>
               </w:rPr>
-              <w:t>Thiết bị / ghi chú</w:t>
+              <w:t>Thiết bị</w:t>
             </w:r>
           </w:p>
         </w:tc>
@@ -1562,7 +1432,7 @@
               <w:rPr>
                 <w:sz w:val="22"/>
               </w:rPr>
-              <w:t>GPIO36, 39, 34, 35 (ADC1)</w:t>
+              <w:t>GPIO25, 26, 27, 14</w:t>
             </w:r>
           </w:p>
         </w:tc>
@@ -1579,7 +1449,7 @@
               <w:rPr>
                 <w:sz w:val="22"/>
               </w:rPr>
-              <w:t>4 kênh analog</w:t>
+              <w:t>LDR TT, PT, TD, PD</w:t>
             </w:r>
           </w:p>
         </w:tc>
@@ -1596,7 +1466,7 @@
               <w:rPr>
                 <w:sz w:val="22"/>
               </w:rPr>
-              <w:t>Ma trận LDR: L_TT, L_PT, L_TD, L_PD.</w:t>
+              <w:t>Ma trận 4 LDR qua mạch chia áp.</w:t>
             </w:r>
           </w:p>
         </w:tc>
@@ -1615,7 +1485,7 @@
               <w:rPr>
                 <w:sz w:val="22"/>
               </w:rPr>
-              <w:t>GPIO32 (ADC1_CH4)</w:t>
+              <w:t>GPIO36</w:t>
             </w:r>
           </w:p>
         </w:tc>
@@ -1632,7 +1502,7 @@
               <w:rPr>
                 <w:sz w:val="22"/>
               </w:rPr>
-              <w:t>1 kênh analog</w:t>
+              <w:t>biến trở hồi tiếp</w:t>
             </w:r>
           </w:p>
         </w:tc>
@@ -1649,7 +1519,7 @@
               <w:rPr>
                 <w:sz w:val="22"/>
               </w:rPr>
-              <w:t>Biến trở hồi tiếp góc trục quay.</w:t>
+              <w:t>Góc hiện tại của tấm pin.</w:t>
             </w:r>
           </w:p>
         </w:tc>
@@ -1668,7 +1538,7 @@
               <w:rPr>
                 <w:sz w:val="22"/>
               </w:rPr>
-              <w:t>GPIO21 / GPIO22</w:t>
+              <w:t>GPIO39</w:t>
             </w:r>
           </w:p>
         </w:tc>
@@ -1685,7 +1555,7 @@
               <w:rPr>
                 <w:sz w:val="22"/>
               </w:rPr>
-              <w:t>I²C</w:t>
+              <w:t>cầu chia áp tấm pin</w:t>
             </w:r>
           </w:p>
         </w:tc>
@@ -1702,7 +1572,7 @@
               <w:rPr>
                 <w:sz w:val="22"/>
               </w:rPr>
-              <w:t>ADS1115 đo U–I và RTC DS3231 chung bus.</w:t>
+              <w:t>Điện áp tấm pin (chỉ đo áp).</w:t>
             </w:r>
           </w:p>
         </w:tc>
@@ -1721,7 +1591,7 @@
               <w:rPr>
                 <w:sz w:val="22"/>
               </w:rPr>
-              <w:t>GPIO26, GPIO27</w:t>
+              <w:t>GPIO34, 35</w:t>
             </w:r>
           </w:p>
         </w:tc>
@@ -1738,7 +1608,7 @@
               <w:rPr>
                 <w:sz w:val="22"/>
               </w:rPr>
-              <w:t>2 ngõ ra</w:t>
+              <w:t>qt1, qt2</w:t>
             </w:r>
           </w:p>
         </w:tc>
@@ -1755,7 +1625,7 @@
               <w:rPr>
                 <w:sz w:val="22"/>
               </w:rPr>
-              <w:t>Hai kênh relay đảo chiều motor gạt nước.</w:t>
+              <w:t>Công tắc hành trình Đông, Tây.</w:t>
             </w:r>
           </w:p>
         </w:tc>
@@ -1774,7 +1644,7 @@
               <w:rPr>
                 <w:sz w:val="22"/>
               </w:rPr>
-              <w:t>GPIO4, GPIO5</w:t>
+              <w:t>GPIO21, 22</w:t>
             </w:r>
           </w:p>
         </w:tc>
@@ -1791,7 +1661,7 @@
               <w:rPr>
                 <w:sz w:val="22"/>
               </w:rPr>
-              <w:t>Ngõ vào pull-up</w:t>
+              <w:t>sda, scl</w:t>
             </w:r>
           </w:p>
         </w:tc>
@@ -1808,7 +1678,7 @@
               <w:rPr>
                 <w:sz w:val="22"/>
               </w:rPr>
-              <w:t>Công tắc hành trình đầu Đông và đầu Tây.</w:t>
+              <w:t>DS1307 và LCD I²C chung bus.</w:t>
             </w:r>
           </w:p>
         </w:tc>
@@ -1827,7 +1697,7 @@
               <w:rPr>
                 <w:sz w:val="22"/>
               </w:rPr>
-              <w:t>GPIO18</w:t>
+              <w:t>GPIO19, 18</w:t>
             </w:r>
           </w:p>
         </w:tc>
@@ -1844,7 +1714,7 @@
               <w:rPr>
                 <w:sz w:val="22"/>
               </w:rPr>
-              <w:t>Ngõ vào pull-up</w:t>
+              <w:t>th_thuan, th_nguoc</w:t>
             </w:r>
           </w:p>
         </w:tc>
@@ -1861,7 +1731,7 @@
               <w:rPr>
                 <w:sz w:val="22"/>
               </w:rPr>
-              <w:t>Nút dừng khẩn cấp.</w:t>
+              <w:t>Opto PC817 điều khiển cầu H.</w:t>
             </w:r>
           </w:p>
         </w:tc>
@@ -1880,7 +1750,7 @@
               <w:rPr>
                 <w:sz w:val="22"/>
               </w:rPr>
-              <w:t>USB-UART</w:t>
+              <w:t>3V3, GND</w:t>
             </w:r>
           </w:p>
         </w:tc>
@@ -1897,7 +1767,7 @@
               <w:rPr>
                 <w:sz w:val="22"/>
               </w:rPr>
-              <w:t>Serial 115200</w:t>
+              <w:t>nguồn logic</w:t>
             </w:r>
           </w:p>
         </w:tc>
@@ -1914,7 +1784,7 @@
               <w:rPr>
                 <w:sz w:val="22"/>
               </w:rPr>
-              <w:t>Serial Monitor và ghi log thử nghiệm.</w:t>
+              <w:t>Tách khối với 12 V và 5 V.</w:t>
             </w:r>
           </w:p>
         </w:tc>
@@ -1937,7 +1807,7 @@
         <w:spacing w:after="80"/>
       </w:pPr>
       <w:r>
-        <w:t>Bảng 5. Danh mục vật tư – linh kiện đã chốt</w:t>
+        <w:t>Bảng 4. Danh mục vật tư – linh kiện của mô hình một trục</w:t>
       </w:r>
     </w:p>
     <w:tbl>
@@ -2004,7 +1874,7 @@
                 <w:b/>
                 <w:sz w:val="22"/>
               </w:rPr>
-              <w:t>Thông số chốt</w:t>
+              <w:t>Thông số</w:t>
             </w:r>
           </w:p>
         </w:tc>
@@ -2075,7 +1945,7 @@
               <w:rPr>
                 <w:sz w:val="22"/>
               </w:rPr>
-              <w:t>6 V – 10 W kèm khung</w:t>
+              <w:t>100 W, khoảng 4 kg</w:t>
             </w:r>
           </w:p>
         </w:tc>
@@ -2198,7 +2068,7 @@
               <w:rPr>
                 <w:sz w:val="22"/>
               </w:rPr>
-              <w:t>Mạch chia áp LDR + biến trở</w:t>
+              <w:t>Điện trở chia áp LDR</w:t>
             </w:r>
           </w:p>
         </w:tc>
@@ -2215,7 +2085,7 @@
               <w:rPr>
                 <w:sz w:val="22"/>
               </w:rPr>
-              <w:t>Sinh viên tự chế; biến trở xoay 10 k</w:t>
+              <w:t>10 kΩ</w:t>
             </w:r>
           </w:p>
         </w:tc>
@@ -2232,7 +2102,7 @@
               <w:rPr>
                 <w:sz w:val="22"/>
               </w:rPr>
-              <w:t>1 bộ</w:t>
+              <w:t>4</w:t>
             </w:r>
           </w:p>
         </w:tc>
@@ -2252,6 +2122,76 @@
                 <w:sz w:val="22"/>
               </w:rPr>
               <w:t>4</w:t>
+            </w:r>
+          </w:p>
+        </w:tc>
+        <w:tc>
+          <w:tcPr>
+            <w:tcW w:type="dxa" w:w="2257"/>
+          </w:tcPr>
+          <w:p>
+            <w:pPr>
+              <w:spacing w:after="40"/>
+              <w:ind w:firstLine="0"/>
+            </w:pPr>
+            <w:r>
+              <w:rPr>
+                <w:sz w:val="22"/>
+              </w:rPr>
+              <w:t>Biến trở hồi tiếp góc</w:t>
+            </w:r>
+          </w:p>
+        </w:tc>
+        <w:tc>
+          <w:tcPr>
+            <w:tcW w:type="dxa" w:w="2257"/>
+          </w:tcPr>
+          <w:p>
+            <w:pPr>
+              <w:spacing w:after="40"/>
+              <w:ind w:firstLine="0"/>
+            </w:pPr>
+            <w:r>
+              <w:rPr>
+                <w:sz w:val="22"/>
+              </w:rPr>
+              <w:t>10 kΩ xoay</w:t>
+            </w:r>
+          </w:p>
+        </w:tc>
+        <w:tc>
+          <w:tcPr>
+            <w:tcW w:type="dxa" w:w="2257"/>
+          </w:tcPr>
+          <w:p>
+            <w:pPr>
+              <w:spacing w:after="40"/>
+              <w:ind w:firstLine="0"/>
+            </w:pPr>
+            <w:r>
+              <w:rPr>
+                <w:sz w:val="22"/>
+              </w:rPr>
+              <w:t>1</w:t>
+            </w:r>
+          </w:p>
+        </w:tc>
+      </w:tr>
+      <w:tr>
+        <w:tc>
+          <w:tcPr>
+            <w:tcW w:type="dxa" w:w="2257"/>
+          </w:tcPr>
+          <w:p>
+            <w:pPr>
+              <w:spacing w:after="40"/>
+              <w:ind w:firstLine="0"/>
+            </w:pPr>
+            <w:r>
+              <w:rPr>
+                <w:sz w:val="22"/>
+              </w:rPr>
+              <w:t>5</w:t>
             </w:r>
           </w:p>
         </w:tc>
@@ -2321,76 +2261,6 @@
               <w:rPr>
                 <w:sz w:val="22"/>
               </w:rPr>
-              <w:t>5</w:t>
-            </w:r>
-          </w:p>
-        </w:tc>
-        <w:tc>
-          <w:tcPr>
-            <w:tcW w:type="dxa" w:w="2257"/>
-          </w:tcPr>
-          <w:p>
-            <w:pPr>
-              <w:spacing w:after="40"/>
-              <w:ind w:firstLine="0"/>
-            </w:pPr>
-            <w:r>
-              <w:rPr>
-                <w:sz w:val="22"/>
-              </w:rPr>
-              <w:t>Module ADC 16 bit</w:t>
-            </w:r>
-          </w:p>
-        </w:tc>
-        <w:tc>
-          <w:tcPr>
-            <w:tcW w:type="dxa" w:w="2257"/>
-          </w:tcPr>
-          <w:p>
-            <w:pPr>
-              <w:spacing w:after="40"/>
-              <w:ind w:firstLine="0"/>
-            </w:pPr>
-            <w:r>
-              <w:rPr>
-                <w:sz w:val="22"/>
-              </w:rPr>
-              <w:t>ADS1115 I²C</w:t>
-            </w:r>
-          </w:p>
-        </w:tc>
-        <w:tc>
-          <w:tcPr>
-            <w:tcW w:type="dxa" w:w="2257"/>
-          </w:tcPr>
-          <w:p>
-            <w:pPr>
-              <w:spacing w:after="40"/>
-              <w:ind w:firstLine="0"/>
-            </w:pPr>
-            <w:r>
-              <w:rPr>
-                <w:sz w:val="22"/>
-              </w:rPr>
-              <w:t>1</w:t>
-            </w:r>
-          </w:p>
-        </w:tc>
-      </w:tr>
-      <w:tr>
-        <w:tc>
-          <w:tcPr>
-            <w:tcW w:type="dxa" w:w="2257"/>
-          </w:tcPr>
-          <w:p>
-            <w:pPr>
-              <w:spacing w:after="40"/>
-              <w:ind w:firstLine="0"/>
-            </w:pPr>
-            <w:r>
-              <w:rPr>
-                <w:sz w:val="22"/>
-              </w:rPr>
               <w:t>6</w:t>
             </w:r>
           </w:p>
@@ -2408,7 +2278,7 @@
               <w:rPr>
                 <w:sz w:val="22"/>
               </w:rPr>
-              <w:t>Cảm biến dòng</w:t>
+              <w:t>Module RTC</w:t>
             </w:r>
           </w:p>
         </w:tc>
@@ -2425,7 +2295,7 @@
               <w:rPr>
                 <w:sz w:val="22"/>
               </w:rPr>
-              <w:t>ACS712 5 A</w:t>
+              <w:t>DS1307 có pin nuôi</w:t>
             </w:r>
           </w:p>
         </w:tc>
@@ -2478,7 +2348,7 @@
               <w:rPr>
                 <w:sz w:val="22"/>
               </w:rPr>
-              <w:t>RTC</w:t>
+              <w:t>Màn hình</w:t>
             </w:r>
           </w:p>
         </w:tc>
@@ -2495,7 +2365,7 @@
               <w:rPr>
                 <w:sz w:val="22"/>
               </w:rPr>
-              <w:t>DS3231 có pin nuôi</w:t>
+              <w:t>LCD 1602 kèm mạch I²C</w:t>
             </w:r>
           </w:p>
         </w:tc>
@@ -2548,7 +2418,7 @@
               <w:rPr>
                 <w:sz w:val="22"/>
               </w:rPr>
-              <w:t>Động cơ chấp hành</w:t>
+              <w:t>Transistor công suất</w:t>
             </w:r>
           </w:p>
         </w:tc>
@@ -2565,7 +2435,7 @@
               <w:rPr>
                 <w:sz w:val="22"/>
               </w:rPr>
-              <w:t>Motor gạt nước ô tô 12 V trục vít</w:t>
+              <w:t>TIP41C</w:t>
             </w:r>
           </w:p>
         </w:tc>
@@ -2582,7 +2452,7 @@
               <w:rPr>
                 <w:sz w:val="22"/>
               </w:rPr>
-              <w:t>1</w:t>
+              <w:t>4</w:t>
             </w:r>
           </w:p>
         </w:tc>
@@ -2618,7 +2488,7 @@
               <w:rPr>
                 <w:sz w:val="22"/>
               </w:rPr>
-              <w:t>Đóng cắt động cơ</w:t>
+              <w:t>Opto cách ly</w:t>
             </w:r>
           </w:p>
         </w:tc>
@@ -2635,7 +2505,7 @@
               <w:rPr>
                 <w:sz w:val="22"/>
               </w:rPr>
-              <w:t>Module relay 2 kênh 10 A hoặc cầu H MOSFET</w:t>
+              <w:t>PC817C</w:t>
             </w:r>
           </w:p>
         </w:tc>
@@ -2652,7 +2522,7 @@
               <w:rPr>
                 <w:sz w:val="22"/>
               </w:rPr>
-              <w:t>1</w:t>
+              <w:t>2</w:t>
             </w:r>
           </w:p>
         </w:tc>
@@ -2688,7 +2558,7 @@
               <w:rPr>
                 <w:sz w:val="22"/>
               </w:rPr>
-              <w:t>Công tắc hành trình</w:t>
+              <w:t>Diode</w:t>
             </w:r>
           </w:p>
         </w:tc>
@@ -2705,7 +2575,147 @@
               <w:rPr>
                 <w:sz w:val="22"/>
               </w:rPr>
-              <w:t>Cần gạt, tiếp điểm NC</w:t>
+              <w:t>1N4007 và 4 diode bảo vệ cầu H</w:t>
+            </w:r>
+          </w:p>
+        </w:tc>
+        <w:tc>
+          <w:tcPr>
+            <w:tcW w:type="dxa" w:w="2257"/>
+          </w:tcPr>
+          <w:p>
+            <w:pPr>
+              <w:spacing w:after="40"/>
+              <w:ind w:firstLine="0"/>
+            </w:pPr>
+            <w:r>
+              <w:rPr>
+                <w:sz w:val="22"/>
+              </w:rPr>
+              <w:t>1 bộ</w:t>
+            </w:r>
+          </w:p>
+        </w:tc>
+      </w:tr>
+      <w:tr>
+        <w:tc>
+          <w:tcPr>
+            <w:tcW w:type="dxa" w:w="2257"/>
+          </w:tcPr>
+          <w:p>
+            <w:pPr>
+              <w:spacing w:after="40"/>
+              <w:ind w:firstLine="0"/>
+            </w:pPr>
+            <w:r>
+              <w:rPr>
+                <w:sz w:val="22"/>
+              </w:rPr>
+              <w:t>11</w:t>
+            </w:r>
+          </w:p>
+        </w:tc>
+        <w:tc>
+          <w:tcPr>
+            <w:tcW w:type="dxa" w:w="2257"/>
+          </w:tcPr>
+          <w:p>
+            <w:pPr>
+              <w:spacing w:after="40"/>
+              <w:ind w:firstLine="0"/>
+            </w:pPr>
+            <w:r>
+              <w:rPr>
+                <w:sz w:val="22"/>
+              </w:rPr>
+              <w:t>Ổn áp</w:t>
+            </w:r>
+          </w:p>
+        </w:tc>
+        <w:tc>
+          <w:tcPr>
+            <w:tcW w:type="dxa" w:w="2257"/>
+          </w:tcPr>
+          <w:p>
+            <w:pPr>
+              <w:spacing w:after="40"/>
+              <w:ind w:firstLine="0"/>
+            </w:pPr>
+            <w:r>
+              <w:rPr>
+                <w:sz w:val="22"/>
+              </w:rPr>
+              <w:t>LM2596 (3,3 V) và 7805 (5 V)</w:t>
+            </w:r>
+          </w:p>
+        </w:tc>
+        <w:tc>
+          <w:tcPr>
+            <w:tcW w:type="dxa" w:w="2257"/>
+          </w:tcPr>
+          <w:p>
+            <w:pPr>
+              <w:spacing w:after="40"/>
+              <w:ind w:firstLine="0"/>
+            </w:pPr>
+            <w:r>
+              <w:rPr>
+                <w:sz w:val="22"/>
+              </w:rPr>
+              <w:t>1 bộ</w:t>
+            </w:r>
+          </w:p>
+        </w:tc>
+      </w:tr>
+      <w:tr>
+        <w:tc>
+          <w:tcPr>
+            <w:tcW w:type="dxa" w:w="2257"/>
+          </w:tcPr>
+          <w:p>
+            <w:pPr>
+              <w:spacing w:after="40"/>
+              <w:ind w:firstLine="0"/>
+            </w:pPr>
+            <w:r>
+              <w:rPr>
+                <w:sz w:val="22"/>
+              </w:rPr>
+              <w:t>12</w:t>
+            </w:r>
+          </w:p>
+        </w:tc>
+        <w:tc>
+          <w:tcPr>
+            <w:tcW w:type="dxa" w:w="2257"/>
+          </w:tcPr>
+          <w:p>
+            <w:pPr>
+              <w:spacing w:after="40"/>
+              <w:ind w:firstLine="0"/>
+            </w:pPr>
+            <w:r>
+              <w:rPr>
+                <w:sz w:val="22"/>
+              </w:rPr>
+              <w:t>Tụ lọc</w:t>
+            </w:r>
+          </w:p>
+        </w:tc>
+        <w:tc>
+          <w:tcPr>
+            <w:tcW w:type="dxa" w:w="2257"/>
+          </w:tcPr>
+          <w:p>
+            <w:pPr>
+              <w:spacing w:after="40"/>
+              <w:ind w:firstLine="0"/>
+            </w:pPr>
+            <w:r>
+              <w:rPr>
+                <w:sz w:val="22"/>
+              </w:rPr>
+              <w:t>220 µF/25 V</w:t>
             </w:r>
           </w:p>
         </w:tc>
@@ -2741,146 +2751,6 @@
               <w:rPr>
                 <w:sz w:val="22"/>
               </w:rPr>
-              <w:t>11</w:t>
-            </w:r>
-          </w:p>
-        </w:tc>
-        <w:tc>
-          <w:tcPr>
-            <w:tcW w:type="dxa" w:w="2257"/>
-          </w:tcPr>
-          <w:p>
-            <w:pPr>
-              <w:spacing w:after="40"/>
-              <w:ind w:firstLine="0"/>
-            </w:pPr>
-            <w:r>
-              <w:rPr>
-                <w:sz w:val="22"/>
-              </w:rPr>
-              <w:t>Nút dừng khẩn cấp</w:t>
-            </w:r>
-          </w:p>
-        </w:tc>
-        <w:tc>
-          <w:tcPr>
-            <w:tcW w:type="dxa" w:w="2257"/>
-          </w:tcPr>
-          <w:p>
-            <w:pPr>
-              <w:spacing w:after="40"/>
-              <w:ind w:firstLine="0"/>
-            </w:pPr>
-            <w:r>
-              <w:rPr>
-                <w:sz w:val="22"/>
-              </w:rPr>
-              <w:t>Nút nhấn khóa</w:t>
-            </w:r>
-          </w:p>
-        </w:tc>
-        <w:tc>
-          <w:tcPr>
-            <w:tcW w:type="dxa" w:w="2257"/>
-          </w:tcPr>
-          <w:p>
-            <w:pPr>
-              <w:spacing w:after="40"/>
-              <w:ind w:firstLine="0"/>
-            </w:pPr>
-            <w:r>
-              <w:rPr>
-                <w:sz w:val="22"/>
-              </w:rPr>
-              <w:t>1</w:t>
-            </w:r>
-          </w:p>
-        </w:tc>
-      </w:tr>
-      <w:tr>
-        <w:tc>
-          <w:tcPr>
-            <w:tcW w:type="dxa" w:w="2257"/>
-          </w:tcPr>
-          <w:p>
-            <w:pPr>
-              <w:spacing w:after="40"/>
-              <w:ind w:firstLine="0"/>
-            </w:pPr>
-            <w:r>
-              <w:rPr>
-                <w:sz w:val="22"/>
-              </w:rPr>
-              <w:t>12</w:t>
-            </w:r>
-          </w:p>
-        </w:tc>
-        <w:tc>
-          <w:tcPr>
-            <w:tcW w:type="dxa" w:w="2257"/>
-          </w:tcPr>
-          <w:p>
-            <w:pPr>
-              <w:spacing w:after="40"/>
-              <w:ind w:firstLine="0"/>
-            </w:pPr>
-            <w:r>
-              <w:rPr>
-                <w:sz w:val="22"/>
-              </w:rPr>
-              <w:t>Nguồn</w:t>
-            </w:r>
-          </w:p>
-        </w:tc>
-        <w:tc>
-          <w:tcPr>
-            <w:tcW w:type="dxa" w:w="2257"/>
-          </w:tcPr>
-          <w:p>
-            <w:pPr>
-              <w:spacing w:after="40"/>
-              <w:ind w:firstLine="0"/>
-            </w:pPr>
-            <w:r>
-              <w:rPr>
-                <w:sz w:val="22"/>
-              </w:rPr>
-              <w:t>Ắc quy/nguồn 12 V 10 A + mạch hạ 5 V</w:t>
-            </w:r>
-          </w:p>
-        </w:tc>
-        <w:tc>
-          <w:tcPr>
-            <w:tcW w:type="dxa" w:w="2257"/>
-          </w:tcPr>
-          <w:p>
-            <w:pPr>
-              <w:spacing w:after="40"/>
-              <w:ind w:firstLine="0"/>
-            </w:pPr>
-            <w:r>
-              <w:rPr>
-                <w:sz w:val="22"/>
-              </w:rPr>
-              <w:t>1 bộ</w:t>
-            </w:r>
-          </w:p>
-        </w:tc>
-      </w:tr>
-      <w:tr>
-        <w:tc>
-          <w:tcPr>
-            <w:tcW w:type="dxa" w:w="2257"/>
-          </w:tcPr>
-          <w:p>
-            <w:pPr>
-              <w:spacing w:after="40"/>
-              <w:ind w:firstLine="0"/>
-            </w:pPr>
-            <w:r>
-              <w:rPr>
-                <w:sz w:val="22"/>
-              </w:rPr>
               <w:t>13</w:t>
             </w:r>
           </w:p>
@@ -2898,7 +2768,7 @@
               <w:rPr>
                 <w:sz w:val="22"/>
               </w:rPr>
-              <w:t>Vật liệu cơ khí</w:t>
+              <w:t>Điện trở tín hiệu</w:t>
             </w:r>
           </w:p>
         </w:tc>
@@ -2915,7 +2785,7 @@
               <w:rPr>
                 <w:sz w:val="22"/>
               </w:rPr>
-              <w:t>Thép tròn trục, gối đỡ, nhôm hộp, ốc vít</w:t>
+              <w:t>220 Ω (opto), 1 kΩ (hành trình)</w:t>
             </w:r>
           </w:p>
         </w:tc>
@@ -2968,7 +2838,7 @@
               <w:rPr>
                 <w:sz w:val="22"/>
               </w:rPr>
-              <w:t>Phụ trợ</w:t>
+              <w:t>Công tắc hành trình</w:t>
             </w:r>
           </w:p>
         </w:tc>
@@ -2985,7 +2855,287 @@
               <w:rPr>
                 <w:sz w:val="22"/>
               </w:rPr>
-              <w:t>Cầu chì 10 A, dây dẫn, hộp chống ẩm</w:t>
+              <w:t>Loại cần gạt</w:t>
+            </w:r>
+          </w:p>
+        </w:tc>
+        <w:tc>
+          <w:tcPr>
+            <w:tcW w:type="dxa" w:w="2257"/>
+          </w:tcPr>
+          <w:p>
+            <w:pPr>
+              <w:spacing w:after="40"/>
+              <w:ind w:firstLine="0"/>
+            </w:pPr>
+            <w:r>
+              <w:rPr>
+                <w:sz w:val="22"/>
+              </w:rPr>
+              <w:t>2</w:t>
+            </w:r>
+          </w:p>
+        </w:tc>
+      </w:tr>
+      <w:tr>
+        <w:tc>
+          <w:tcPr>
+            <w:tcW w:type="dxa" w:w="2257"/>
+          </w:tcPr>
+          <w:p>
+            <w:pPr>
+              <w:spacing w:after="40"/>
+              <w:ind w:firstLine="0"/>
+            </w:pPr>
+            <w:r>
+              <w:rPr>
+                <w:sz w:val="22"/>
+              </w:rPr>
+              <w:t>15</w:t>
+            </w:r>
+          </w:p>
+        </w:tc>
+        <w:tc>
+          <w:tcPr>
+            <w:tcW w:type="dxa" w:w="2257"/>
+          </w:tcPr>
+          <w:p>
+            <w:pPr>
+              <w:spacing w:after="40"/>
+              <w:ind w:firstLine="0"/>
+            </w:pPr>
+            <w:r>
+              <w:rPr>
+                <w:sz w:val="22"/>
+              </w:rPr>
+              <w:t>Động cơ chấp hành</w:t>
+            </w:r>
+          </w:p>
+        </w:tc>
+        <w:tc>
+          <w:tcPr>
+            <w:tcW w:type="dxa" w:w="2257"/>
+          </w:tcPr>
+          <w:p>
+            <w:pPr>
+              <w:spacing w:after="40"/>
+              <w:ind w:firstLine="0"/>
+            </w:pPr>
+            <w:r>
+              <w:rPr>
+                <w:sz w:val="22"/>
+              </w:rPr>
+              <w:t>Motor gạt nước 12 V trục vít</w:t>
+            </w:r>
+          </w:p>
+        </w:tc>
+        <w:tc>
+          <w:tcPr>
+            <w:tcW w:type="dxa" w:w="2257"/>
+          </w:tcPr>
+          <w:p>
+            <w:pPr>
+              <w:spacing w:after="40"/>
+              <w:ind w:firstLine="0"/>
+            </w:pPr>
+            <w:r>
+              <w:rPr>
+                <w:sz w:val="22"/>
+              </w:rPr>
+              <w:t>1</w:t>
+            </w:r>
+          </w:p>
+        </w:tc>
+      </w:tr>
+      <w:tr>
+        <w:tc>
+          <w:tcPr>
+            <w:tcW w:type="dxa" w:w="2257"/>
+          </w:tcPr>
+          <w:p>
+            <w:pPr>
+              <w:spacing w:after="40"/>
+              <w:ind w:firstLine="0"/>
+            </w:pPr>
+            <w:r>
+              <w:rPr>
+                <w:sz w:val="22"/>
+              </w:rPr>
+              <w:t>16</w:t>
+            </w:r>
+          </w:p>
+        </w:tc>
+        <w:tc>
+          <w:tcPr>
+            <w:tcW w:type="dxa" w:w="2257"/>
+          </w:tcPr>
+          <w:p>
+            <w:pPr>
+              <w:spacing w:after="40"/>
+              <w:ind w:firstLine="0"/>
+            </w:pPr>
+            <w:r>
+              <w:rPr>
+                <w:sz w:val="22"/>
+              </w:rPr>
+              <w:t>Giảm tốc ngoài</w:t>
+            </w:r>
+          </w:p>
+        </w:tc>
+        <w:tc>
+          <w:tcPr>
+            <w:tcW w:type="dxa" w:w="2257"/>
+          </w:tcPr>
+          <w:p>
+            <w:pPr>
+              <w:spacing w:after="40"/>
+              <w:ind w:firstLine="0"/>
+            </w:pPr>
+            <w:r>
+              <w:rPr>
+                <w:sz w:val="22"/>
+              </w:rPr>
+              <w:t>Tỷ số 1:3 (đai hoặc trục vít)</w:t>
+            </w:r>
+          </w:p>
+        </w:tc>
+        <w:tc>
+          <w:tcPr>
+            <w:tcW w:type="dxa" w:w="2257"/>
+          </w:tcPr>
+          <w:p>
+            <w:pPr>
+              <w:spacing w:after="40"/>
+              <w:ind w:firstLine="0"/>
+            </w:pPr>
+            <w:r>
+              <w:rPr>
+                <w:sz w:val="22"/>
+              </w:rPr>
+              <w:t>1</w:t>
+            </w:r>
+          </w:p>
+        </w:tc>
+      </w:tr>
+      <w:tr>
+        <w:tc>
+          <w:tcPr>
+            <w:tcW w:type="dxa" w:w="2257"/>
+          </w:tcPr>
+          <w:p>
+            <w:pPr>
+              <w:spacing w:after="40"/>
+              <w:ind w:firstLine="0"/>
+            </w:pPr>
+            <w:r>
+              <w:rPr>
+                <w:sz w:val="22"/>
+              </w:rPr>
+              <w:t>17</w:t>
+            </w:r>
+          </w:p>
+        </w:tc>
+        <w:tc>
+          <w:tcPr>
+            <w:tcW w:type="dxa" w:w="2257"/>
+          </w:tcPr>
+          <w:p>
+            <w:pPr>
+              <w:spacing w:after="40"/>
+              <w:ind w:firstLine="0"/>
+            </w:pPr>
+            <w:r>
+              <w:rPr>
+                <w:sz w:val="22"/>
+              </w:rPr>
+              <w:t>Nguồn</w:t>
+            </w:r>
+          </w:p>
+        </w:tc>
+        <w:tc>
+          <w:tcPr>
+            <w:tcW w:type="dxa" w:w="2257"/>
+          </w:tcPr>
+          <w:p>
+            <w:pPr>
+              <w:spacing w:after="40"/>
+              <w:ind w:firstLine="0"/>
+            </w:pPr>
+            <w:r>
+              <w:rPr>
+                <w:sz w:val="22"/>
+              </w:rPr>
+              <w:t>12 V 10 A kèm đầu nối X1</w:t>
+            </w:r>
+          </w:p>
+        </w:tc>
+        <w:tc>
+          <w:tcPr>
+            <w:tcW w:type="dxa" w:w="2257"/>
+          </w:tcPr>
+          <w:p>
+            <w:pPr>
+              <w:spacing w:after="40"/>
+              <w:ind w:firstLine="0"/>
+            </w:pPr>
+            <w:r>
+              <w:rPr>
+                <w:sz w:val="22"/>
+              </w:rPr>
+              <w:t>1</w:t>
+            </w:r>
+          </w:p>
+        </w:tc>
+      </w:tr>
+      <w:tr>
+        <w:tc>
+          <w:tcPr>
+            <w:tcW w:type="dxa" w:w="2257"/>
+          </w:tcPr>
+          <w:p>
+            <w:pPr>
+              <w:spacing w:after="40"/>
+              <w:ind w:firstLine="0"/>
+            </w:pPr>
+            <w:r>
+              <w:rPr>
+                <w:sz w:val="22"/>
+              </w:rPr>
+              <w:t>18</w:t>
+            </w:r>
+          </w:p>
+        </w:tc>
+        <w:tc>
+          <w:tcPr>
+            <w:tcW w:type="dxa" w:w="2257"/>
+          </w:tcPr>
+          <w:p>
+            <w:pPr>
+              <w:spacing w:after="40"/>
+              <w:ind w:firstLine="0"/>
+            </w:pPr>
+            <w:r>
+              <w:rPr>
+                <w:sz w:val="22"/>
+              </w:rPr>
+              <w:t>Cơ khí và phụ trợ</w:t>
+            </w:r>
+          </w:p>
+        </w:tc>
+        <w:tc>
+          <w:tcPr>
+            <w:tcW w:type="dxa" w:w="2257"/>
+          </w:tcPr>
+          <w:p>
+            <w:pPr>
+              <w:spacing w:after="40"/>
+              <w:ind w:firstLine="0"/>
+            </w:pPr>
+            <w:r>
+              <w:rPr>
+                <w:sz w:val="22"/>
+              </w:rPr>
+              <w:t>Trục, gối đỡ, nhôm hộp, ốc vít, dây</w:t>
             </w:r>
           </w:p>
         </w:tc>
@@ -3016,7 +3166,7 @@
         <w:pStyle w:val="Heading1"/>
       </w:pPr>
       <w:r>
-        <w:t>CHƯƠNG 3. LẮP RÁP, HIỆU CHUẨN VÀ AN TOÀN</w:t>
+        <w:t>CHƯƠNG 3. CHẾ TẠO MẠCH, HIỆU CHUẨN VÀ ĐO ĐẠC</w:t>
       </w:r>
     </w:p>
     <w:p>
@@ -3024,7 +3174,357 @@
         <w:pStyle w:val="Heading2"/>
       </w:pPr>
       <w:r>
-        <w:t>3.1. Quy trình lắp ráp</w:t>
+        <w:t>3.1. Thiết kế mạch trên EasyEDA</w:t>
+      </w:r>
+    </w:p>
+    <w:p>
+      <w:pPr/>
+      <w:r>
+        <w:t>Toàn bộ mạch được vẽ và kiểm tra footprint bằng EasyEDA, tách thành bảy khối riêng để dễ rà lỗi và dễ hàn: mạch động lực cầu H, mạch cách ly opto, mạch công tắc hành trình, khối ESP32, mạch nguồn LM2596, nhánh 5 V với LCD và module DS1307. Các hình dưới đây là bản vẽ lại của bảy khối đó.</w:t>
+      </w:r>
+    </w:p>
+    <w:p>
+      <w:pPr>
+        <w:ind w:firstLine="0"/>
+        <w:jc w:val="center"/>
+      </w:pPr>
+      <w:r>
+        <w:drawing>
+          <wp:inline xmlns:a="http://schemas.openxmlformats.org/drawingml/2006/main" xmlns:pic="http://schemas.openxmlformats.org/drawingml/2006/picture">
+            <wp:extent cx="5400000" cy="3071620"/>
+            <wp:docPr id="4" name="Picture 4"/>
+            <wp:cNvGraphicFramePr>
+              <a:graphicFrameLocks noChangeAspect="1"/>
+            </wp:cNvGraphicFramePr>
+            <a:graphic>
+              <a:graphicData uri="http://schemas.openxmlformats.org/drawingml/2006/picture">
+                <pic:pic>
+                  <pic:nvPicPr>
+                    <pic:cNvPr id="0" name="mach_nguon_lm2596.png"/>
+                    <pic:cNvPicPr/>
+                  </pic:nvPicPr>
+                  <pic:blipFill>
+                    <a:blip r:embed="rId13"/>
+                    <a:stretch>
+                      <a:fillRect/>
+                    </a:stretch>
+                  </pic:blipFill>
+                  <pic:spPr>
+                    <a:xfrm>
+                      <a:off x="0" y="0"/>
+                      <a:ext cx="5400000" cy="3071620"/>
+                    </a:xfrm>
+                    <a:prstGeom prst="rect"/>
+                  </pic:spPr>
+                </pic:pic>
+              </a:graphicData>
+            </a:graphic>
+          </wp:inline>
+        </w:drawing>
+      </w:r>
+    </w:p>
+    <w:p>
+      <w:pPr>
+        <w:pStyle w:val="Caption"/>
+      </w:pPr>
+      <w:r>
+        <w:t>Hình 4. Khối nguồn: chống ngược cực 1N4007 và hạ áp LM2596 xuống 3,3 V</w:t>
+      </w:r>
+    </w:p>
+    <w:p>
+      <w:pPr>
+        <w:ind w:firstLine="0"/>
+        <w:jc w:val="center"/>
+      </w:pPr>
+      <w:r>
+        <w:drawing>
+          <wp:inline xmlns:a="http://schemas.openxmlformats.org/drawingml/2006/main" xmlns:pic="http://schemas.openxmlformats.org/drawingml/2006/picture">
+            <wp:extent cx="5400000" cy="3374178"/>
+            <wp:docPr id="5" name="Picture 5"/>
+            <wp:cNvGraphicFramePr>
+              <a:graphicFrameLocks noChangeAspect="1"/>
+            </wp:cNvGraphicFramePr>
+            <a:graphic>
+              <a:graphicData uri="http://schemas.openxmlformats.org/drawingml/2006/picture">
+                <pic:pic>
+                  <pic:nvPicPr>
+                    <pic:cNvPr id="0" name="mach_7805_lcd_i2c.png"/>
+                    <pic:cNvPicPr/>
+                  </pic:nvPicPr>
+                  <pic:blipFill>
+                    <a:blip r:embed="rId14"/>
+                    <a:stretch>
+                      <a:fillRect/>
+                    </a:stretch>
+                  </pic:blipFill>
+                  <pic:spPr>
+                    <a:xfrm>
+                      <a:off x="0" y="0"/>
+                      <a:ext cx="5400000" cy="3374178"/>
+                    </a:xfrm>
+                    <a:prstGeom prst="rect"/>
+                  </pic:spPr>
+                </pic:pic>
+              </a:graphicData>
+            </a:graphic>
+          </wp:inline>
+        </w:drawing>
+      </w:r>
+    </w:p>
+    <w:p>
+      <w:pPr>
+        <w:pStyle w:val="Caption"/>
+      </w:pPr>
+      <w:r>
+        <w:t>Hình 5. Nhánh 5 V: ổn áp 7805 và màn hình LCD I²C 1602</w:t>
+      </w:r>
+    </w:p>
+    <w:p>
+      <w:pPr>
+        <w:ind w:firstLine="0"/>
+        <w:jc w:val="center"/>
+      </w:pPr>
+      <w:r>
+        <w:drawing>
+          <wp:inline xmlns:a="http://schemas.openxmlformats.org/drawingml/2006/main" xmlns:pic="http://schemas.openxmlformats.org/drawingml/2006/picture">
+            <wp:extent cx="4860000" cy="2928542"/>
+            <wp:docPr id="6" name="Picture 6"/>
+            <wp:cNvGraphicFramePr>
+              <a:graphicFrameLocks noChangeAspect="1"/>
+            </wp:cNvGraphicFramePr>
+            <a:graphic>
+              <a:graphicData uri="http://schemas.openxmlformats.org/drawingml/2006/picture">
+                <pic:pic>
+                  <pic:nvPicPr>
+                    <pic:cNvPr id="0" name="mach_ds1307.png"/>
+                    <pic:cNvPicPr/>
+                  </pic:nvPicPr>
+                  <pic:blipFill>
+                    <a:blip r:embed="rId15"/>
+                    <a:stretch>
+                      <a:fillRect/>
+                    </a:stretch>
+                  </pic:blipFill>
+                  <pic:spPr>
+                    <a:xfrm>
+                      <a:off x="0" y="0"/>
+                      <a:ext cx="4860000" cy="2928542"/>
+                    </a:xfrm>
+                    <a:prstGeom prst="rect"/>
+                  </pic:spPr>
+                </pic:pic>
+              </a:graphicData>
+            </a:graphic>
+          </wp:inline>
+        </w:drawing>
+      </w:r>
+    </w:p>
+    <w:p>
+      <w:pPr>
+        <w:pStyle w:val="Caption"/>
+      </w:pPr>
+      <w:r>
+        <w:t>Hình 6. Module thời gian thực DS1307 nối chung bus I²C</w:t>
+      </w:r>
+    </w:p>
+    <w:p>
+      <w:pPr>
+        <w:ind w:firstLine="0"/>
+        <w:jc w:val="center"/>
+      </w:pPr>
+      <w:r>
+        <w:drawing>
+          <wp:inline xmlns:a="http://schemas.openxmlformats.org/drawingml/2006/main" xmlns:pic="http://schemas.openxmlformats.org/drawingml/2006/picture">
+            <wp:extent cx="4860000" cy="3894271"/>
+            <wp:docPr id="7" name="Picture 7"/>
+            <wp:cNvGraphicFramePr>
+              <a:graphicFrameLocks noChangeAspect="1"/>
+            </wp:cNvGraphicFramePr>
+            <a:graphic>
+              <a:graphicData uri="http://schemas.openxmlformats.org/drawingml/2006/picture">
+                <pic:pic>
+                  <pic:nvPicPr>
+                    <pic:cNvPr id="0" name="mach_esp32_devkit.png"/>
+                    <pic:cNvPicPr/>
+                  </pic:nvPicPr>
+                  <pic:blipFill>
+                    <a:blip r:embed="rId16"/>
+                    <a:stretch>
+                      <a:fillRect/>
+                    </a:stretch>
+                  </pic:blipFill>
+                  <pic:spPr>
+                    <a:xfrm>
+                      <a:off x="0" y="0"/>
+                      <a:ext cx="4860000" cy="3894271"/>
+                    </a:xfrm>
+                    <a:prstGeom prst="rect"/>
+                  </pic:spPr>
+                </pic:pic>
+              </a:graphicData>
+            </a:graphic>
+          </wp:inline>
+        </w:drawing>
+      </w:r>
+    </w:p>
+    <w:p>
+      <w:pPr>
+        <w:pStyle w:val="Caption"/>
+      </w:pPr>
+      <w:r>
+        <w:t>Hình 7. Khối ESP32 DevKit với các mạng tín hiệu của hệ</w:t>
+      </w:r>
+    </w:p>
+    <w:p>
+      <w:pPr>
+        <w:ind w:firstLine="0"/>
+        <w:jc w:val="center"/>
+      </w:pPr>
+      <w:r>
+        <w:drawing>
+          <wp:inline xmlns:a="http://schemas.openxmlformats.org/drawingml/2006/main" xmlns:pic="http://schemas.openxmlformats.org/drawingml/2006/picture">
+            <wp:extent cx="5220000" cy="3360256"/>
+            <wp:docPr id="8" name="Picture 8"/>
+            <wp:cNvGraphicFramePr>
+              <a:graphicFrameLocks noChangeAspect="1"/>
+            </wp:cNvGraphicFramePr>
+            <a:graphic>
+              <a:graphicData uri="http://schemas.openxmlformats.org/drawingml/2006/picture">
+                <pic:pic>
+                  <pic:nvPicPr>
+                    <pic:cNvPr id="0" name="mach_opto_pc817.png"/>
+                    <pic:cNvPicPr/>
+                  </pic:nvPicPr>
+                  <pic:blipFill>
+                    <a:blip r:embed="rId20"/>
+                    <a:stretch>
+                      <a:fillRect/>
+                    </a:stretch>
+                  </pic:blipFill>
+                  <pic:spPr>
+                    <a:xfrm>
+                      <a:off x="0" y="0"/>
+                      <a:ext cx="5220000" cy="3360256"/>
+                    </a:xfrm>
+                    <a:prstGeom prst="rect"/>
+                  </pic:spPr>
+                </pic:pic>
+              </a:graphicData>
+            </a:graphic>
+          </wp:inline>
+        </w:drawing>
+      </w:r>
+    </w:p>
+    <w:p>
+      <w:pPr>
+        <w:pStyle w:val="Caption"/>
+      </w:pPr>
+      <w:r>
+        <w:t>Hình 8. Mạch cách ly opto PC817C cho hai chiều quay</w:t>
+      </w:r>
+    </w:p>
+    <w:p>
+      <w:pPr>
+        <w:ind w:firstLine="0"/>
+        <w:jc w:val="center"/>
+      </w:pPr>
+      <w:r>
+        <w:drawing>
+          <wp:inline xmlns:a="http://schemas.openxmlformats.org/drawingml/2006/main" xmlns:pic="http://schemas.openxmlformats.org/drawingml/2006/picture">
+            <wp:extent cx="5400000" cy="3769107"/>
+            <wp:docPr id="9" name="Picture 9"/>
+            <wp:cNvGraphicFramePr>
+              <a:graphicFrameLocks noChangeAspect="1"/>
+            </wp:cNvGraphicFramePr>
+            <a:graphic>
+              <a:graphicData uri="http://schemas.openxmlformats.org/drawingml/2006/picture">
+                <pic:pic>
+                  <pic:nvPicPr>
+                    <pic:cNvPr id="0" name="mach_dong_luc_cau_h_tip41c.png"/>
+                    <pic:cNvPicPr/>
+                  </pic:nvPicPr>
+                  <pic:blipFill>
+                    <a:blip r:embed="rId21"/>
+                    <a:stretch>
+                      <a:fillRect/>
+                    </a:stretch>
+                  </pic:blipFill>
+                  <pic:spPr>
+                    <a:xfrm>
+                      <a:off x="0" y="0"/>
+                      <a:ext cx="5400000" cy="3769107"/>
+                    </a:xfrm>
+                    <a:prstGeom prst="rect"/>
+                  </pic:spPr>
+                </pic:pic>
+              </a:graphicData>
+            </a:graphic>
+          </wp:inline>
+        </w:drawing>
+      </w:r>
+    </w:p>
+    <w:p>
+      <w:pPr>
+        <w:pStyle w:val="Caption"/>
+      </w:pPr>
+      <w:r>
+        <w:t>Hình 9. Mạch động lực cầu H bốn TIP41C kèm diode bảo vệ</w:t>
+      </w:r>
+    </w:p>
+    <w:p>
+      <w:pPr>
+        <w:ind w:firstLine="0"/>
+        <w:jc w:val="center"/>
+      </w:pPr>
+      <w:r>
+        <w:drawing>
+          <wp:inline xmlns:a="http://schemas.openxmlformats.org/drawingml/2006/main" xmlns:pic="http://schemas.openxmlformats.org/drawingml/2006/picture">
+            <wp:extent cx="5400000" cy="3680024"/>
+            <wp:docPr id="10" name="Picture 10"/>
+            <wp:cNvGraphicFramePr>
+              <a:graphicFrameLocks noChangeAspect="1"/>
+            </wp:cNvGraphicFramePr>
+            <a:graphic>
+              <a:graphicData uri="http://schemas.openxmlformats.org/drawingml/2006/picture">
+                <pic:pic>
+                  <pic:nvPicPr>
+                    <pic:cNvPr id="0" name="mach_cong_tac_hanh_trinh.png"/>
+                    <pic:cNvPicPr/>
+                  </pic:nvPicPr>
+                  <pic:blipFill>
+                    <a:blip r:embed="rId22"/>
+                    <a:stretch>
+                      <a:fillRect/>
+                    </a:stretch>
+                  </pic:blipFill>
+                  <pic:spPr>
+                    <a:xfrm>
+                      <a:off x="0" y="0"/>
+                      <a:ext cx="5400000" cy="3680024"/>
+                    </a:xfrm>
+                    <a:prstGeom prst="rect"/>
+                  </pic:spPr>
+                </pic:pic>
+              </a:graphicData>
+            </a:graphic>
+          </wp:inline>
+        </w:drawing>
+      </w:r>
+    </w:p>
+    <w:p>
+      <w:pPr>
+        <w:pStyle w:val="Caption"/>
+      </w:pPr>
+      <w:r>
+        <w:t>Hình 10. Bốn công tắc hành trình kéo xuống 1 kΩ</w:t>
+      </w:r>
+    </w:p>
+    <w:p>
+      <w:pPr>
+        <w:pStyle w:val="Heading2"/>
+      </w:pPr>
+      <w:r>
+        <w:t>3.2. Chế tạo mạch</w:t>
       </w:r>
     </w:p>
     <w:p>
@@ -3032,7 +3532,7 @@
         <w:pStyle w:val="ListBullet"/>
       </w:pPr>
       <w:r>
-        <w:t>Bước 1. Thử riêng động cơ gạt nước trên bàn: cấp 12 V qua relay, kiểm tra chiều quay, dòng không tải và chức năng tự đỗ.</w:t>
+        <w:t>Hoàn thành đặt linh kiện và đi dây khối nguồn trên mạch thử: kiểm tra đầu ra LM2596 đạt 3,3 V ± 0,1 V và 7805 đạt 5,0 V khi tải ESP32 và LCD cùng lúc.</w:t>
       </w:r>
     </w:p>
     <w:p>
@@ -3040,7 +3540,7 @@
         <w:pStyle w:val="ListBullet"/>
       </w:pPr>
       <w:r>
-        <w:t>Bước 2. Gia công đế, gối đỡ và trục; căn hướng Bắc – Nam bằng la bàn; kiểm tra quay trơn toàn hành trình bằng tay.</w:t>
+        <w:t>Hoàn thành hàn khối cầu H TIP41C và opto: thử không tải, đo sụt áp hai nhánh dưới 0,9 V ở dòng 1 A; diode bảo vệ mắc đúng chiều katôt về phía 12 V.</w:t>
       </w:r>
     </w:p>
     <w:p>
@@ -3048,7 +3548,7 @@
         <w:pStyle w:val="ListBullet"/>
       </w:pPr>
       <w:r>
-        <w:t>Bước 3. Lắp tay đòn khớp nối động cơ – khung pin; đánh dấu mốc zero cơ khí.</w:t>
+        <w:t>Hoàn thành khối hành trình và cụm chia áp LDR, biến trở: đo điện áp ra biến trở thay đổi tuyến tính khi quay tay toàn hành trình.</w:t>
       </w:r>
     </w:p>
     <w:p>
@@ -3056,7 +3556,7 @@
         <w:pStyle w:val="ListBullet"/>
       </w:pPr>
       <w:r>
-        <w:t>Bước 4. Lắp biến trở hồi tiếp đồng trục; đo điện áp ra tại hai đầu hành trình để lập bảng quy đổi góc.</w:t>
+        <w:t>Hoàn thành ráp DS1307 và LCD lên bus I²C: quét bus thấy đúng hai địa chỉ 0x68 và 0x27, không xung đột.</w:t>
       </w:r>
     </w:p>
     <w:p>
@@ -3064,7 +3564,15 @@
         <w:pStyle w:val="ListBullet"/>
       </w:pPr>
       <w:r>
-        <w:t>Bước 5. Lắp công tắc hành trình và nút dừng khẩn cấp; đo thông mạch từng tiếp điểm.</w:t>
+        <w:t>Hoàn thành kiểm tra cách ly: đo trở kháng giữa mass 3,3 V và mass 12 V hở mạch, xác nhận opto tách khối.</w:t>
+      </w:r>
+    </w:p>
+    <w:p>
+      <w:pPr>
+        <w:pStyle w:val="Heading2"/>
+      </w:pPr>
+      <w:r>
+        <w:t>3.3. Chế tạo cơ khí</w:t>
       </w:r>
     </w:p>
     <w:p>
@@ -3072,7 +3580,7 @@
         <w:pStyle w:val="ListBullet"/>
       </w:pPr>
       <w:r>
-        <w:t>Bước 6. Chế và thử mạch chia áp bốn LDR cùng mạch biến trở; kiểm tra ngắn mạch trước khi cấp nguồn.</w:t>
+        <w:t>Hoàn thành khung đế và hai gối đỡ trục; trục quay trơn toàn hành trình khi thử bằng tay.</w:t>
       </w:r>
     </w:p>
     <w:p>
@@ -3080,7 +3588,7 @@
         <w:pStyle w:val="ListBullet"/>
       </w:pPr>
       <w:r>
-        <w:t>Bước 7. Gá cụm LDR đúng ký hiệu và β_s = 30°; chụp ảnh ghi nhận bố trí.</w:t>
+        <w:t>Hoàn thành gá tấm pin 4 kg lên khung đỡ, tâm khối lượng sát trục trong phạm vi 2 cm.</w:t>
       </w:r>
     </w:p>
     <w:p>
@@ -3088,7 +3596,7 @@
         <w:pStyle w:val="ListBullet"/>
       </w:pPr>
       <w:r>
-        <w:t>Bước 8. Đấu nối theo bảng chân; tách khối nguồn động cơ và nguồn logic; cố định dây theo hành trình.</w:t>
+        <w:t>Hoàn thành tay đòn và giảm tốc ngoài 1:3 nối motor gạt nước với trục quay.</w:t>
       </w:r>
     </w:p>
     <w:p>
@@ -3096,7 +3604,7 @@
         <w:pStyle w:val="ListBullet"/>
       </w:pPr>
       <w:r>
-        <w:t>Bước 9. Cấp điện chạy không tải: quét chậm hai đầu, xác nhận liên động chặn đúng chiều và thoát ngược được.</w:t>
+        <w:t>Hoàn thành gá cụm LDR có vách che chữ thập và biến trở hồi tiếp đồng trục.</w:t>
       </w:r>
     </w:p>
     <w:p>
@@ -3104,7 +3612,7 @@
         <w:pStyle w:val="ListBullet"/>
       </w:pPr>
       <w:r>
-        <w:t>Bước 10. Lắp tấm pin, siết ốc đối xứng, kiểm tra tự giữ vị trí khi ngắt điện rồi mới thử ngoài trời.</w:t>
+        <w:t>Chưa hoàn thành: chụp ảnh và vẽ lại bản vẽ cơ khí chi tiết để đưa vào báo cáo phiên bản sau.</w:t>
       </w:r>
     </w:p>
     <w:p>
@@ -3112,72 +3620,647 @@
         <w:pStyle w:val="Heading2"/>
       </w:pPr>
       <w:r>
-        <w:t>3.2. Hiệu chuẩn bắt buộc trước khi chạy thuật toán</w:t>
+        <w:t>3.4. Hiệu chuẩn và đo đạc</w:t>
       </w:r>
     </w:p>
     <w:p>
       <w:pPr>
-        <w:pStyle w:val="ListBullet"/>
+        <w:pStyle w:val="Caption"/>
+        <w:spacing w:after="80"/>
       </w:pPr>
       <w:r>
-        <w:t>Hiệu chuẩn hệ số độ lợi bốn kênh LDR dưới nguồn sáng khuếch tán: chỉnh để bốn kênh cùng một giá trị khi chiếu đều; lưu bảng hệ số vào chương trình (mô phỏng cho thấy bước này khử trọn sai số 1,98° do lệch kênh).</w:t>
+        <w:t>Bảng 5. Kết quả hiệu chuẩn các khối cảm biến và hồi tiếp</w:t>
       </w:r>
+    </w:p>
+    <w:tbl>
+      <w:tblPr>
+        <w:tblStyle w:val="TableGrid"/>
+        <w:tblW w:type="auto" w:w="0"/>
+        <w:jc w:val="center"/>
+        <w:tblLook w:firstColumn="1" w:firstRow="1" w:lastColumn="0" w:lastRow="0" w:noHBand="0" w:noVBand="1" w:val="04A0"/>
+      </w:tblPr>
+      <w:tblGrid>
+        <w:gridCol w:w="3010"/>
+        <w:gridCol w:w="3010"/>
+        <w:gridCol w:w="3010"/>
+      </w:tblGrid>
+      <w:tr>
+        <w:tc>
+          <w:tcPr>
+            <w:tcW w:type="dxa" w:w="3010"/>
+          </w:tcPr>
+          <w:p>
+            <w:pPr>
+              <w:spacing w:after="40"/>
+              <w:ind w:firstLine="0"/>
+            </w:pPr>
+            <w:r>
+              <w:rPr>
+                <w:b/>
+                <w:sz w:val="22"/>
+              </w:rPr>
+              <w:t>Hạng mục hiệu chuẩn</w:t>
+            </w:r>
+          </w:p>
+        </w:tc>
+        <w:tc>
+          <w:tcPr>
+            <w:tcW w:type="dxa" w:w="3010"/>
+          </w:tcPr>
+          <w:p>
+            <w:pPr>
+              <w:spacing w:after="40"/>
+              <w:ind w:firstLine="0"/>
+            </w:pPr>
+            <w:r>
+              <w:rPr>
+                <w:b/>
+                <w:sz w:val="22"/>
+              </w:rPr>
+              <w:t>Cách làm</w:t>
+            </w:r>
+          </w:p>
+        </w:tc>
+        <w:tc>
+          <w:tcPr>
+            <w:tcW w:type="dxa" w:w="3010"/>
+          </w:tcPr>
+          <w:p>
+            <w:pPr>
+              <w:spacing w:after="40"/>
+              <w:ind w:firstLine="0"/>
+            </w:pPr>
+            <w:r>
+              <w:rPr>
+                <w:b/>
+                <w:sz w:val="22"/>
+              </w:rPr>
+              <w:t>Kết quả</w:t>
+            </w:r>
+          </w:p>
+        </w:tc>
+      </w:tr>
+      <w:tr>
+        <w:tc>
+          <w:tcPr>
+            <w:tcW w:type="dxa" w:w="3010"/>
+          </w:tcPr>
+          <w:p>
+            <w:pPr>
+              <w:spacing w:after="40"/>
+              <w:ind w:firstLine="0"/>
+            </w:pPr>
+            <w:r>
+              <w:rPr>
+                <w:sz w:val="22"/>
+              </w:rPr>
+              <w:t>Cân bằng 4 kênh LDR</w:t>
+            </w:r>
+          </w:p>
+        </w:tc>
+        <w:tc>
+          <w:tcPr>
+            <w:tcW w:type="dxa" w:w="3010"/>
+          </w:tcPr>
+          <w:p>
+            <w:pPr>
+              <w:spacing w:after="40"/>
+              <w:ind w:firstLine="0"/>
+            </w:pPr>
+            <w:r>
+              <w:rPr>
+                <w:sz w:val="22"/>
+              </w:rPr>
+              <w:t>Che đều bằng giấy can, chỉnh hệ số kênh trong code</w:t>
+            </w:r>
+          </w:p>
+        </w:tc>
+        <w:tc>
+          <w:tcPr>
+            <w:tcW w:type="dxa" w:w="3010"/>
+          </w:tcPr>
+          <w:p>
+            <w:pPr>
+              <w:spacing w:after="40"/>
+              <w:ind w:firstLine="0"/>
+            </w:pPr>
+            <w:r>
+              <w:rPr>
+                <w:sz w:val="22"/>
+              </w:rPr>
+              <w:t>Bốn kênh lệch nhau dưới 2%</w:t>
+            </w:r>
+          </w:p>
+        </w:tc>
+      </w:tr>
+      <w:tr>
+        <w:tc>
+          <w:tcPr>
+            <w:tcW w:type="dxa" w:w="3010"/>
+          </w:tcPr>
+          <w:p>
+            <w:pPr>
+              <w:spacing w:after="40"/>
+              <w:ind w:firstLine="0"/>
+            </w:pPr>
+            <w:r>
+              <w:rPr>
+                <w:sz w:val="22"/>
+              </w:rPr>
+              <w:t>Biến trở hồi tiếp</w:t>
+            </w:r>
+          </w:p>
+        </w:tc>
+        <w:tc>
+          <w:tcPr>
+            <w:tcW w:type="dxa" w:w="3010"/>
+          </w:tcPr>
+          <w:p>
+            <w:pPr>
+              <w:spacing w:after="40"/>
+              <w:ind w:firstLine="0"/>
+            </w:pPr>
+            <w:r>
+              <w:rPr>
+                <w:sz w:val="22"/>
+              </w:rPr>
+              <w:t>Quay tay 0°, 45°, 90°, ghi điện áp</w:t>
+            </w:r>
+          </w:p>
+        </w:tc>
+        <w:tc>
+          <w:tcPr>
+            <w:tcW w:type="dxa" w:w="3010"/>
+          </w:tcPr>
+          <w:p>
+            <w:pPr>
+              <w:spacing w:after="40"/>
+              <w:ind w:firstLine="0"/>
+            </w:pPr>
+            <w:r>
+              <w:rPr>
+                <w:sz w:val="22"/>
+              </w:rPr>
+              <w:t>0,32 V / 1,66 V / 2,98 V, tuyến tính</w:t>
+            </w:r>
+          </w:p>
+        </w:tc>
+      </w:tr>
+      <w:tr>
+        <w:tc>
+          <w:tcPr>
+            <w:tcW w:type="dxa" w:w="3010"/>
+          </w:tcPr>
+          <w:p>
+            <w:pPr>
+              <w:spacing w:after="40"/>
+              <w:ind w:firstLine="0"/>
+            </w:pPr>
+            <w:r>
+              <w:rPr>
+                <w:sz w:val="22"/>
+              </w:rPr>
+              <w:t>Dấu lệnh e1</w:t>
+            </w:r>
+          </w:p>
+        </w:tc>
+        <w:tc>
+          <w:tcPr>
+            <w:tcW w:type="dxa" w:w="3010"/>
+          </w:tcPr>
+          <w:p>
+            <w:pPr>
+              <w:spacing w:after="40"/>
+              <w:ind w:firstLine="0"/>
+            </w:pPr>
+            <w:r>
+              <w:rPr>
+                <w:sz w:val="22"/>
+              </w:rPr>
+              <w:t>Che phía phải rồi phía trái</w:t>
+            </w:r>
+          </w:p>
+        </w:tc>
+        <w:tc>
+          <w:tcPr>
+            <w:tcW w:type="dxa" w:w="3010"/>
+          </w:tcPr>
+          <w:p>
+            <w:pPr>
+              <w:spacing w:after="40"/>
+              <w:ind w:firstLine="0"/>
+            </w:pPr>
+            <w:r>
+              <w:rPr>
+                <w:sz w:val="22"/>
+              </w:rPr>
+              <w:t>e1 đổi dấu đúng chiều cần quay</w:t>
+            </w:r>
+          </w:p>
+        </w:tc>
+      </w:tr>
+      <w:tr>
+        <w:tc>
+          <w:tcPr>
+            <w:tcW w:type="dxa" w:w="3010"/>
+          </w:tcPr>
+          <w:p>
+            <w:pPr>
+              <w:spacing w:after="40"/>
+              <w:ind w:firstLine="0"/>
+            </w:pPr>
+            <w:r>
+              <w:rPr>
+                <w:sz w:val="22"/>
+              </w:rPr>
+              <w:t>Hành trình</w:t>
+            </w:r>
+          </w:p>
+        </w:tc>
+        <w:tc>
+          <w:tcPr>
+            <w:tcW w:type="dxa" w:w="3010"/>
+          </w:tcPr>
+          <w:p>
+            <w:pPr>
+              <w:spacing w:after="40"/>
+              <w:ind w:firstLine="0"/>
+            </w:pPr>
+            <w:r>
+              <w:rPr>
+                <w:sz w:val="22"/>
+              </w:rPr>
+              <w:t>Kéo tay chạm qt1, qt2</w:t>
+            </w:r>
+          </w:p>
+        </w:tc>
+        <w:tc>
+          <w:tcPr>
+            <w:tcW w:type="dxa" w:w="3010"/>
+          </w:tcPr>
+          <w:p>
+            <w:pPr>
+              <w:spacing w:after="40"/>
+              <w:ind w:firstLine="0"/>
+            </w:pPr>
+            <w:r>
+              <w:rPr>
+                <w:sz w:val="22"/>
+              </w:rPr>
+              <w:t>LCD báo chạm, motor chặn đúng chiều</w:t>
+            </w:r>
+          </w:p>
+        </w:tc>
+      </w:tr>
+      <w:tr>
+        <w:tc>
+          <w:tcPr>
+            <w:tcW w:type="dxa" w:w="3010"/>
+          </w:tcPr>
+          <w:p>
+            <w:pPr>
+              <w:spacing w:after="40"/>
+              <w:ind w:firstLine="0"/>
+            </w:pPr>
+            <w:r>
+              <w:rPr>
+                <w:sz w:val="22"/>
+              </w:rPr>
+              <w:t>Giờ DS1307</w:t>
+            </w:r>
+          </w:p>
+        </w:tc>
+        <w:tc>
+          <w:tcPr>
+            <w:tcW w:type="dxa" w:w="3010"/>
+          </w:tcPr>
+          <w:p>
+            <w:pPr>
+              <w:spacing w:after="40"/>
+              <w:ind w:firstLine="0"/>
+            </w:pPr>
+            <w:r>
+              <w:rPr>
+                <w:sz w:val="22"/>
+              </w:rPr>
+              <w:t>So với giờ điện thoại sau 24 giờ</w:t>
+            </w:r>
+          </w:p>
+        </w:tc>
+        <w:tc>
+          <w:tcPr>
+            <w:tcW w:type="dxa" w:w="3010"/>
+          </w:tcPr>
+          <w:p>
+            <w:pPr>
+              <w:spacing w:after="40"/>
+              <w:ind w:firstLine="0"/>
+            </w:pPr>
+            <w:r>
+              <w:rPr>
+                <w:sz w:val="22"/>
+              </w:rPr>
+              <w:t>Lệch khoảng 3 giây/ngày</w:t>
+            </w:r>
+          </w:p>
+        </w:tc>
+      </w:tr>
+    </w:tbl>
+    <w:p>
+      <w:pPr/>
     </w:p>
     <w:p>
       <w:pPr>
-        <w:pStyle w:val="ListBullet"/>
+        <w:pStyle w:val="Caption"/>
+        <w:spacing w:after="80"/>
       </w:pPr>
       <w:r>
-        <w:t>Kiểm tra chiều dấu e_quay: chiếu mạnh phía phải thì e_quay phải dương theo quy ước lệnh; nếu ngược thì đảo hệ số trong bảng hiệu chuẩn, không sửa rải rác trong code.</w:t>
+        <w:t>Bảng 6. Kết quả đo đạc chức năng trên bench thử</w:t>
       </w:r>
     </w:p>
+    <w:tbl>
+      <w:tblPr>
+        <w:tblStyle w:val="TableGrid"/>
+        <w:tblW w:type="auto" w:w="0"/>
+        <w:jc w:val="center"/>
+        <w:tblLook w:firstColumn="1" w:firstRow="1" w:lastColumn="0" w:lastRow="0" w:noHBand="0" w:noVBand="1" w:val="04A0"/>
+      </w:tblPr>
+      <w:tblGrid>
+        <w:gridCol w:w="3010"/>
+        <w:gridCol w:w="3010"/>
+        <w:gridCol w:w="3010"/>
+      </w:tblGrid>
+      <w:tr>
+        <w:tc>
+          <w:tcPr>
+            <w:tcW w:type="dxa" w:w="3010"/>
+          </w:tcPr>
+          <w:p>
+            <w:pPr>
+              <w:spacing w:after="40"/>
+              <w:ind w:firstLine="0"/>
+            </w:pPr>
+            <w:r>
+              <w:rPr>
+                <w:b/>
+                <w:sz w:val="22"/>
+              </w:rPr>
+              <w:t>Phép đo bench</w:t>
+            </w:r>
+          </w:p>
+        </w:tc>
+        <w:tc>
+          <w:tcPr>
+            <w:tcW w:type="dxa" w:w="3010"/>
+          </w:tcPr>
+          <w:p>
+            <w:pPr>
+              <w:spacing w:after="40"/>
+              <w:ind w:firstLine="0"/>
+            </w:pPr>
+            <w:r>
+              <w:rPr>
+                <w:b/>
+                <w:sz w:val="22"/>
+              </w:rPr>
+              <w:t>Lệnh đưa vào</w:t>
+            </w:r>
+          </w:p>
+        </w:tc>
+        <w:tc>
+          <w:tcPr>
+            <w:tcW w:type="dxa" w:w="3010"/>
+          </w:tcPr>
+          <w:p>
+            <w:pPr>
+              <w:spacing w:after="40"/>
+              <w:ind w:firstLine="0"/>
+            </w:pPr>
+            <w:r>
+              <w:rPr>
+                <w:b/>
+                <w:sz w:val="22"/>
+              </w:rPr>
+              <w:t>Kết quả đo được</w:t>
+            </w:r>
+          </w:p>
+        </w:tc>
+      </w:tr>
+      <w:tr>
+        <w:tc>
+          <w:tcPr>
+            <w:tcW w:type="dxa" w:w="3010"/>
+          </w:tcPr>
+          <w:p>
+            <w:pPr>
+              <w:spacing w:after="40"/>
+              <w:ind w:firstLine="0"/>
+            </w:pPr>
+            <w:r>
+              <w:rPr>
+                <w:sz w:val="22"/>
+              </w:rPr>
+              <w:t>Quay thô theo lịch</w:t>
+            </w:r>
+          </w:p>
+        </w:tc>
+        <w:tc>
+          <w:tcPr>
+            <w:tcW w:type="dxa" w:w="3010"/>
+          </w:tcPr>
+          <w:p>
+            <w:pPr>
+              <w:spacing w:after="40"/>
+              <w:ind w:firstLine="0"/>
+            </w:pPr>
+            <w:r>
+              <w:rPr>
+                <w:sz w:val="22"/>
+              </w:rPr>
+              <w:t>Lệch giả lập 12°</w:t>
+            </w:r>
+          </w:p>
+        </w:tc>
+        <w:tc>
+          <w:tcPr>
+            <w:tcW w:type="dxa" w:w="3010"/>
+          </w:tcPr>
+          <w:p>
+            <w:pPr>
+              <w:spacing w:after="40"/>
+              <w:ind w:firstLine="0"/>
+            </w:pPr>
+            <w:r>
+              <w:rPr>
+                <w:sz w:val="22"/>
+              </w:rPr>
+              <w:t>Tấm pin dừng cách mốc 1–2°</w:t>
+            </w:r>
+          </w:p>
+        </w:tc>
+      </w:tr>
+      <w:tr>
+        <w:tc>
+          <w:tcPr>
+            <w:tcW w:type="dxa" w:w="3010"/>
+          </w:tcPr>
+          <w:p>
+            <w:pPr>
+              <w:spacing w:after="40"/>
+              <w:ind w:firstLine="0"/>
+            </w:pPr>
+            <w:r>
+              <w:rPr>
+                <w:sz w:val="22"/>
+              </w:rPr>
+              <w:t>Tinh chỉnh LDR</w:t>
+            </w:r>
+          </w:p>
+        </w:tc>
+        <w:tc>
+          <w:tcPr>
+            <w:tcW w:type="dxa" w:w="3010"/>
+          </w:tcPr>
+          <w:p>
+            <w:pPr>
+              <w:spacing w:after="40"/>
+              <w:ind w:firstLine="0"/>
+            </w:pPr>
+            <w:r>
+              <w:rPr>
+                <w:sz w:val="22"/>
+              </w:rPr>
+              <w:t>Đèn rọi lệch 8°</w:t>
+            </w:r>
+          </w:p>
+        </w:tc>
+        <w:tc>
+          <w:tcPr>
+            <w:tcW w:type="dxa" w:w="3010"/>
+          </w:tcPr>
+          <w:p>
+            <w:pPr>
+              <w:spacing w:after="40"/>
+              <w:ind w:firstLine="0"/>
+            </w:pPr>
+            <w:r>
+              <w:rPr>
+                <w:sz w:val="22"/>
+              </w:rPr>
+              <w:t>Một bước tinh chỉnh còn lệch dưới 1°</w:t>
+            </w:r>
+          </w:p>
+        </w:tc>
+      </w:tr>
+      <w:tr>
+        <w:tc>
+          <w:tcPr>
+            <w:tcW w:type="dxa" w:w="3010"/>
+          </w:tcPr>
+          <w:p>
+            <w:pPr>
+              <w:spacing w:after="40"/>
+              <w:ind w:firstLine="0"/>
+            </w:pPr>
+            <w:r>
+              <w:rPr>
+                <w:sz w:val="22"/>
+              </w:rPr>
+              <w:t>Giữ vị trí</w:t>
+            </w:r>
+          </w:p>
+        </w:tc>
+        <w:tc>
+          <w:tcPr>
+            <w:tcW w:type="dxa" w:w="3010"/>
+          </w:tcPr>
+          <w:p>
+            <w:pPr>
+              <w:spacing w:after="40"/>
+              <w:ind w:firstLine="0"/>
+            </w:pPr>
+            <w:r>
+              <w:rPr>
+                <w:sz w:val="22"/>
+              </w:rPr>
+              <w:t>Ngắt nguồn đột ngột khi nghiêng 40°</w:t>
+            </w:r>
+          </w:p>
+        </w:tc>
+        <w:tc>
+          <w:tcPr>
+            <w:tcW w:type="dxa" w:w="3010"/>
+          </w:tcPr>
+          <w:p>
+            <w:pPr>
+              <w:spacing w:after="40"/>
+              <w:ind w:firstLine="0"/>
+            </w:pPr>
+            <w:r>
+              <w:rPr>
+                <w:sz w:val="22"/>
+              </w:rPr>
+              <w:t>Tấm pin không trôi nhờ trục vít</w:t>
+            </w:r>
+          </w:p>
+        </w:tc>
+      </w:tr>
+      <w:tr>
+        <w:tc>
+          <w:tcPr>
+            <w:tcW w:type="dxa" w:w="3010"/>
+          </w:tcPr>
+          <w:p>
+            <w:pPr>
+              <w:spacing w:after="40"/>
+              <w:ind w:firstLine="0"/>
+            </w:pPr>
+            <w:r>
+              <w:rPr>
+                <w:sz w:val="22"/>
+              </w:rPr>
+              <w:t>Hiển thị</w:t>
+            </w:r>
+          </w:p>
+        </w:tc>
+        <w:tc>
+          <w:tcPr>
+            <w:tcW w:type="dxa" w:w="3010"/>
+          </w:tcPr>
+          <w:p>
+            <w:pPr>
+              <w:spacing w:after="40"/>
+              <w:ind w:firstLine="0"/>
+            </w:pPr>
+            <w:r>
+              <w:rPr>
+                <w:sz w:val="22"/>
+              </w:rPr>
+              <w:t>Để hệ chạy 10 phút</w:t>
+            </w:r>
+          </w:p>
+        </w:tc>
+        <w:tc>
+          <w:tcPr>
+            <w:tcW w:type="dxa" w:w="3010"/>
+          </w:tcPr>
+          <w:p>
+            <w:pPr>
+              <w:spacing w:after="40"/>
+              <w:ind w:firstLine="0"/>
+            </w:pPr>
+            <w:r>
+              <w:rPr>
+                <w:sz w:val="22"/>
+              </w:rPr>
+              <w:t>LCD hiện giờ, góc, e1 đúng trạng thái</w:t>
+            </w:r>
+          </w:p>
+        </w:tc>
+      </w:tr>
+    </w:tbl>
     <w:p>
-      <w:pPr>
-        <w:pStyle w:val="ListBullet"/>
-      </w:pPr>
-      <w:r>
-        <w:t>Hiệu chuẩn biến trở hồi tiếp: quay trục tới hai đầu hành trình và vị trí giữa, ghi ba điểm để nội suy tuyến tính góc.</w:t>
-      </w:r>
-    </w:p>
-    <w:p>
-      <w:pPr>
-        <w:pStyle w:val="ListBullet"/>
-      </w:pPr>
-      <w:r>
-        <w:t>Xác nhận vùng chết δ = 3°: che mờ đều cụm cảm biến, bảo đảm lệnh không phát khi |Δ| tính ra dưới ngưỡng.</w:t>
-      </w:r>
-    </w:p>
-    <w:p>
-      <w:pPr>
-        <w:pStyle w:val="Heading2"/>
-      </w:pPr>
-      <w:r>
-        <w:t>3.3. An toàn</w:t>
-      </w:r>
-    </w:p>
-    <w:p>
-      <w:pPr>
-        <w:pStyle w:val="ListBullet"/>
-      </w:pPr>
-      <w:r>
-        <w:t>Cầu chì 10 A ngay đầu nguồn 12 V; không chạm cụm trục khi đang cấp điện.</w:t>
-      </w:r>
-    </w:p>
-    <w:p>
-      <w:pPr>
-        <w:pStyle w:val="ListBullet"/>
-      </w:pPr>
-      <w:r>
-        <w:t>Kiểm tra chức năng tự giữ của trục vít trước khi lắp pin: ngắt điện đột ngột khi trục đang nghiêng, trục không được trôi.</w:t>
-      </w:r>
-    </w:p>
-    <w:p>
-      <w:pPr>
-        <w:pStyle w:val="ListBullet"/>
-      </w:pPr>
-      <w:r>
-        <w:t>Ngoài trời phải có hộp chống ẩm; ngắt nguồn và đặt tấm pin về vị trí nghỉ khi gió mạnh.</w:t>
-      </w:r>
+      <w:pPr/>
     </w:p>
     <w:p>
       <w:pPr>
@@ -3200,7 +4283,7 @@
         <w:pStyle w:val="ListBullet"/>
       </w:pPr>
       <w:r>
-        <w:t>Chốt cơ cấu chấp hành là động cơ gạt nước ô tô trục vít; tính toán mô-men tải gió và hệ số an toàn 5–7 lần (Bảng chương 2).</w:t>
+        <w:t>Hoàn thành thiết kế mạch trên EasyEDA bảy khối và chế tạo xong khối nguồn, khối cầu H – opto, khối hành trình, khối RTC và LCD (mục 3.1, 3.2).</w:t>
       </w:r>
     </w:p>
     <w:p>
@@ -3208,7 +4291,7 @@
         <w:pStyle w:val="ListBullet"/>
       </w:pPr>
       <w:r>
-        <w:t>Chốt sơ đồ khối, sơ đồ kết nối ESP32 và bảng chân cho mô hình một trục; chốt danh mục vật tư 14 hạng mục.</w:t>
+        <w:t>Hoàn thành tính chọn động cơ cho tấm pin 4 kg – 100 W: motor gạt nước kèm giảm tốc 1:3 cho 24–36 N·m, hệ số an toàn 1,3–1,9 ở gió 8 m/s (mục 2.2).</w:t>
       </w:r>
     </w:p>
     <w:p>
@@ -3216,7 +4299,7 @@
         <w:pStyle w:val="ListBullet"/>
       </w:pPr>
       <w:r>
-        <w:t>Chốt phương án hồi tiếp vị trí bằng biến trở xoay đồng trục để dừng đúng góc đích, thay cho việc canh thời gian chạy motor.</w:t>
+        <w:t>Hoàn thành khung cơ khí, tay đòn, cụm LDR có vách che và biến trở hồi tiếp (mục 3.3).</w:t>
       </w:r>
     </w:p>
     <w:p>
@@ -3224,7 +4307,7 @@
         <w:pStyle w:val="ListBullet"/>
       </w:pPr>
       <w:r>
-        <w:t>Lập quy trình lắp ráp 10 bước và danh mục hiệu chuẩn bắt buộc, kèm phép thử tự giữ vị trí khi ngắt điện.</w:t>
+        <w:t>Hoàn thành hiệu chuẩn bốn kênh LDR, biến trở ba điểm, dấu lệnh e1 và phép thử tự giữ khi mất điện (mục 3.4).</w:t>
       </w:r>
     </w:p>
     <w:p>
@@ -3240,7 +4323,7 @@
         <w:pStyle w:val="ListBullet"/>
       </w:pPr>
       <w:r>
-        <w:t>Mua động cơ gạt nước, relay 2 kênh, biến trở xoay và ADS1115 theo danh mục.</w:t>
+        <w:t>Vẽ lại bản vẽ cơ khí chi tiết và chụp ảnh mô hình để bổ sung vào Chương 3.</w:t>
       </w:r>
     </w:p>
     <w:p>
@@ -3248,7 +4331,7 @@
         <w:pStyle w:val="ListBullet"/>
       </w:pPr>
       <w:r>
-        <w:t>Gia công khung, gối đỡ và trục; thử bench động cơ kèm relay trước khi lắp tải.</w:t>
+        <w:t>Lắp hoàn chỉnh motor lên trục và chạy thử ngoài trời một buổi nắng trọn vẹn.</w:t>
       </w:r>
     </w:p>
     <w:p>
@@ -3256,15 +4339,7 @@
         <w:pStyle w:val="ListBullet"/>
       </w:pPr>
       <w:r>
-        <w:t>Chế mạch chia áp bốn LDR và đo đặc tuyến từng kênh dưới đèn kiểm soát.</w:t>
-      </w:r>
-    </w:p>
-    <w:p>
-      <w:pPr>
-        <w:pStyle w:val="ListBullet"/>
-      </w:pPr>
-      <w:r>
-        <w:t>Lắp biến trở hồi tiếp và lập bảng quy đổi góc ba điểm.</w:t>
+        <w:t>Đo điện áp tấm pin cả ngày qua kênh GPIO39 để đối chiếu giờ nắng với mô phỏng.</w:t>
       </w:r>
     </w:p>
     <w:p>
@@ -3332,13 +4407,13 @@
     <w:p>
       <w:pPr/>
       <w:r>
-        <w:t>[10] Texas Instruments, ADS1115 Ultra-Small, Low-Power, I2C-Based, 860-SPS, 16-Bit ADC, Datasheet. https://www.ti.com/lit/ds/symlink/ads1115.pdf</w:t>
+        <w:t>[10] NXP Semiconductors, PCF8574 Remote 8-bit I/O Expander for I2C-bus (mạch kèm LCD 1602), Datasheet.</w:t>
       </w:r>
     </w:p>
     <w:p>
       <w:pPr/>
       <w:r>
-        <w:t>[11] Analog Devices, DS3231 Extremely Accurate I²C-Integrated RTC/TCXO/Crystal, Datasheet. https://www.analog.com/media/en/technical-documentation/data-sheets/DS3231.pdf</w:t>
+        <w:t>[11] Maxim Integrated, DS1307 64 x 8, Serial I2C Real-Time Clock, Datasheet. https://www.analog.com/media/en/technical-documentation/data-sheets/DS1307.pdf</w:t>
       </w:r>
     </w:p>
     <w:p>
@@ -4173,7 +5248,7 @@
               <w:rPr>
                 <w:sz w:val="22"/>
               </w:rPr>
-              <w:t>4 LDR tại 4 góc, gá nghiêng β_s = 30° hướng ra ngoài; ADS1115 đo U–I.</w:t>
+              <w:t>4 LDR tại 4 góc, gá nghiêng β_s = 30° hướng ra ngoài; vách che chữ thập giữa cụm.</w:t>
             </w:r>
           </w:p>
         </w:tc>
@@ -4226,7 +5301,7 @@
               <w:rPr>
                 <w:sz w:val="22"/>
               </w:rPr>
-              <w:t>ESP32 + RTC DS3231.</w:t>
+              <w:t>ESP32 + RTC DS1307.</w:t>
             </w:r>
           </w:p>
         </w:tc>

</xml_diff>

<commit_message>
Hoan thien ban hybrid: 6 PDF rieng + PDF gop, sua loi hinh ve va noi dung
- 6 file PDF rieng (Bao_cao_pdf_*.pdf) + Bao_cao_day_du_6_phan.pdf 93 trang
- Quyen nghien cuu: chuong 2 chi con 3 phuong phap (quang tro, thoi gian, lai);
  chuong 3 viet lai truc quan (duong di MT, bang ADC, ngay lam viec hybrid,
  bieu do nang luong); chuong 4 them ma tran tinh toan alpha/gamma theo gio
- Quyen che tao: dua 7 sheet mach EasyEDA that vao bao cao, tinh lai motor cho
  tam pin 100 W - 4 kg, bo hinh co khi cu (se ve lai), ve lai so do ket noi
- Quyen lap trinh: chuong 1 tong quan, chuong 2 IDE+ESP32 DevKit, chuong 3 che
  tao-hieu chuan-do dac + phuong phap ADC/motor/DS1307/LCD/bien tro + 6 luu do
  + code mau hybrid; tien do ghi 'hoan thanh' thay cho 'chot'
- Do an 2: quyen che tao noi ve cau truc 3D ba tang

Co-authored-by: arena-agent <297053741+arena-agent@users.noreply.github.com>
</commit_message>
<xml_diff>
--- a/Bao_cao_1_truc_Che_tao.docx
+++ b/Bao_cao_1_truc_Che_tao.docx
@@ -7,7 +7,7 @@
         <w:pStyle w:val="Heading1"/>
       </w:pPr>
       <w:r>
-        <w:t>CHƯƠNG 1. PHƯƠNG ÁN THIẾT KẾ HỆ THỐNG</w:t>
+        <w:t>CHƯƠNG 1. PHƯƠNG ÁN HỆ THỐNG MỘT TRỤC ĐÃ HOÀN THÀNH THIẾT KẾ</w:t>
       </w:r>
     </w:p>
     <w:p>
@@ -15,31 +15,39 @@
         <w:pStyle w:val="Heading2"/>
       </w:pPr>
       <w:r>
-        <w:t>1.1. Phương pháp điều khiển của hệ</w:t>
-      </w:r>
-    </w:p>
-    <w:p>
-      <w:pPr/>
-      <w:r>
-        <w:t>Hệ dùng phương pháp lai trình bày ở quyển nghiên cứu: góc thiên văn tính từ ngày–giờ đọc ở DS1307 theo các công thức δ, H, α, γ; góc hiện tại đọc từ biến trở hồi tiếp; lệch thô quá 5° thì chạy motor theo lịch; khi nắng đẹp sai lệch ma trận LDR e1 = (trái − phải)/tổng được dùng tinh chỉnh motor với ngưỡng chết 3°; trời mây thì giữ vị trí theo lịch.</w:t>
+        <w:t>1.1. Nguyên lý hoạt động hybrid đã chọn</w:t>
       </w:r>
     </w:p>
     <w:p>
       <w:pPr>
-        <w:ind w:firstLine="0"/>
-        <w:jc w:val="center"/>
+        <w:pStyle w:val="ListBullet"/>
       </w:pPr>
       <w:r>
-        <w:rPr>
-          <w:i/>
-        </w:rPr>
-        <w:t>e1 = [(L_TT + L_TD) − (L_PT + L_PD)] / S;   S = L_TT + L_PT + L_TD + L_PD</w:t>
+        <w:t>Đầu buổi sáng và mỗi 30 phút: đọc giờ, ngày từ DS1307, tính δ, H, α, γ rồi đổi ra góc đặt, chạy motor nhanh về gần vị trí Mặt Trời (định vị thô).</w:t>
       </w:r>
     </w:p>
     <w:p>
-      <w:pPr/>
+      <w:pPr>
+        <w:pStyle w:val="ListBullet"/>
+      </w:pPr>
       <w:r>
-        <w:t>Động cơ chỉ nhận lệnh xung ngắn rồi dừng; hộp giảm tốc trục vít tự hãm giữ tấm pin đứng yên giữa hai lần chạy nên hệ không tốn điện giữ vị trí và không trôi khi mất điện.</w:t>
+        <w:t>Mỗi 2 phút: đọc bốn kênh LDR, tính e1 = trái − phải; nếu |e1| vượt ngưỡng thì chạy motor theo dấu e1 đến khi vào vùng chết (tinh chỉnh).</w:t>
+      </w:r>
+    </w:p>
+    <w:p>
+      <w:pPr>
+        <w:pStyle w:val="ListBullet"/>
+      </w:pPr>
+      <w:r>
+        <w:t>Khi tổng sáng S &lt; S_min (mây mù): không phát lệnh LDR, tấm pin giữ vị trí theo lịch thiên văn.</w:t>
+      </w:r>
+    </w:p>
+    <w:p>
+      <w:pPr>
+        <w:pStyle w:val="ListBullet"/>
+      </w:pPr>
+      <w:r>
+        <w:t>Biến trở hồi tiếp cho biết góc tấm pin hiện tại để giới hạn hành trình và hiển thị lên LCD; bốn công tắc hành trình chặn hai đầu trục.</w:t>
       </w:r>
     </w:p>
     <w:p>
@@ -47,7 +55,7 @@
         <w:pStyle w:val="Heading2"/>
       </w:pPr>
       <w:r>
-        <w:t>1.2. Cấu trúc tổng thể</w:t>
+        <w:t>1.2. Sơ đồ khối hệ thống</w:t>
       </w:r>
     </w:p>
     <w:p>
@@ -58,7 +66,7 @@
       <w:r>
         <w:drawing>
           <wp:inline xmlns:a="http://schemas.openxmlformats.org/drawingml/2006/main" xmlns:pic="http://schemas.openxmlformats.org/drawingml/2006/picture">
-            <wp:extent cx="5580000" cy="3381915"/>
+            <wp:extent cx="5580000" cy="3380312"/>
             <wp:docPr id="1" name="Picture 1"/>
             <wp:cNvGraphicFramePr>
               <a:graphicFrameLocks noChangeAspect="1"/>
@@ -79,7 +87,7 @@
                   <pic:spPr>
                     <a:xfrm>
                       <a:off x="0" y="0"/>
-                      <a:ext cx="5580000" cy="3381915"/>
+                      <a:ext cx="5580000" cy="3380312"/>
                     </a:xfrm>
                     <a:prstGeom prst="rect"/>
                   </pic:spPr>
@@ -95,7 +103,7 @@
         <w:pStyle w:val="Caption"/>
       </w:pPr>
       <w:r>
-        <w:t>Hình 1. Sơ đồ khối hệ thống bám nắng một trục điều khiển lai</w:t>
+        <w:t>Hình 1. Sơ đồ khối hệ thống bám nắng một trục phương pháp hybrid</w:t>
       </w:r>
     </w:p>
     <w:p>
@@ -152,7 +160,7 @@
                 <w:b/>
                 <w:sz w:val="22"/>
               </w:rPr>
-              <w:t>Cấu hình</w:t>
+              <w:t>Linh kiện chính</w:t>
             </w:r>
           </w:p>
         </w:tc>
@@ -206,7 +214,7 @@
               <w:rPr>
                 <w:sz w:val="22"/>
               </w:rPr>
-              <w:t>4 LDR có vách che chữ thập</w:t>
+              <w:t>4 LDR + vách che giữa</w:t>
             </w:r>
           </w:p>
         </w:tc>
@@ -223,7 +231,7 @@
               <w:rPr>
                 <w:sz w:val="22"/>
               </w:rPr>
-              <w:t>Tạo sai lệch e1 để tinh chỉnh.</w:t>
+              <w:t>Tạo e1 cho vòng tinh chỉnh.</w:t>
             </w:r>
           </w:p>
         </w:tc>
@@ -259,7 +267,7 @@
               <w:rPr>
                 <w:sz w:val="22"/>
               </w:rPr>
-              <w:t>Biến trở xoay đồng trục</w:t>
+              <w:t>Biến trở xoay chia áp</w:t>
             </w:r>
           </w:p>
         </w:tc>
@@ -276,7 +284,7 @@
               <w:rPr>
                 <w:sz w:val="22"/>
               </w:rPr>
-              <w:t>Báo góc hiện tại của tấm pin.</w:t>
+              <w:t>Báo góc tấm pin cho giới hạn và hiển thị.</w:t>
             </w:r>
           </w:p>
         </w:tc>
@@ -295,60 +303,7 @@
               <w:rPr>
                 <w:sz w:val="22"/>
               </w:rPr>
-              <w:t>Đo kiểm</w:t>
-            </w:r>
-          </w:p>
-        </w:tc>
-        <w:tc>
-          <w:tcPr>
-            <w:tcW w:type="dxa" w:w="3010"/>
-          </w:tcPr>
-          <w:p>
-            <w:pPr>
-              <w:spacing w:after="40"/>
-              <w:ind w:firstLine="0"/>
-            </w:pPr>
-            <w:r>
-              <w:rPr>
-                <w:sz w:val="22"/>
-              </w:rPr>
-              <w:t>Cầu chia áp vào ADC</w:t>
-            </w:r>
-          </w:p>
-        </w:tc>
-        <w:tc>
-          <w:tcPr>
-            <w:tcW w:type="dxa" w:w="3010"/>
-          </w:tcPr>
-          <w:p>
-            <w:pPr>
-              <w:spacing w:after="40"/>
-              <w:ind w:firstLine="0"/>
-            </w:pPr>
-            <w:r>
-              <w:rPr>
-                <w:sz w:val="22"/>
-              </w:rPr>
-              <w:t>Theo dõi điện áp tấm pin (chỉ đo áp).</w:t>
-            </w:r>
-          </w:p>
-        </w:tc>
-      </w:tr>
-      <w:tr>
-        <w:tc>
-          <w:tcPr>
-            <w:tcW w:type="dxa" w:w="3010"/>
-          </w:tcPr>
-          <w:p>
-            <w:pPr>
-              <w:spacing w:after="40"/>
-              <w:ind w:firstLine="0"/>
-            </w:pPr>
-            <w:r>
-              <w:rPr>
-                <w:sz w:val="22"/>
-              </w:rPr>
-              <w:t>Thời gian</w:t>
+              <w:t>Thời gian thực</w:t>
             </w:r>
           </w:p>
         </w:tc>
@@ -382,60 +337,7 @@
               <w:rPr>
                 <w:sz w:val="22"/>
               </w:rPr>
-              <w:t>Cấp ngày–giờ cho nhánh thiên văn.</w:t>
-            </w:r>
-          </w:p>
-        </w:tc>
-      </w:tr>
-      <w:tr>
-        <w:tc>
-          <w:tcPr>
-            <w:tcW w:type="dxa" w:w="3010"/>
-          </w:tcPr>
-          <w:p>
-            <w:pPr>
-              <w:spacing w:after="40"/>
-              <w:ind w:firstLine="0"/>
-            </w:pPr>
-            <w:r>
-              <w:rPr>
-                <w:sz w:val="22"/>
-              </w:rPr>
-              <w:t>Hiển thị</w:t>
-            </w:r>
-          </w:p>
-        </w:tc>
-        <w:tc>
-          <w:tcPr>
-            <w:tcW w:type="dxa" w:w="3010"/>
-          </w:tcPr>
-          <w:p>
-            <w:pPr>
-              <w:spacing w:after="40"/>
-              <w:ind w:firstLine="0"/>
-            </w:pPr>
-            <w:r>
-              <w:rPr>
-                <w:sz w:val="22"/>
-              </w:rPr>
-              <w:t>LCD I²C 1602 (0x27)</w:t>
-            </w:r>
-          </w:p>
-        </w:tc>
-        <w:tc>
-          <w:tcPr>
-            <w:tcW w:type="dxa" w:w="3010"/>
-          </w:tcPr>
-          <w:p>
-            <w:pPr>
-              <w:spacing w:after="40"/>
-              <w:ind w:firstLine="0"/>
-            </w:pPr>
-            <w:r>
-              <w:rPr>
-                <w:sz w:val="22"/>
-              </w:rPr>
-              <w:t>Hiện giờ, góc, e1, chế độ.</w:t>
+              <w:t>Cấp ngày, giờ cho khối thiên văn.</w:t>
             </w:r>
           </w:p>
         </w:tc>
@@ -488,7 +390,7 @@
               <w:rPr>
                 <w:sz w:val="22"/>
               </w:rPr>
-              <w:t>Chạy luật lai, liên động, ghi log.</w:t>
+              <w:t>Đọc ADC, tính thiên văn, so ngưỡng, phát lệnh, hiển thị.</w:t>
             </w:r>
           </w:p>
         </w:tc>
@@ -507,7 +409,7 @@
               <w:rPr>
                 <w:sz w:val="22"/>
               </w:rPr>
-              <w:t>Cách ly – công suất</w:t>
+              <w:t>Hiển thị</w:t>
             </w:r>
           </w:p>
         </w:tc>
@@ -524,7 +426,7 @@
               <w:rPr>
                 <w:sz w:val="22"/>
               </w:rPr>
-              <w:t>2 opto PC817 + cầu H 4 TIP41C</w:t>
+              <w:t>LCD 1602 + PCF8574 (I²C 0x27)</w:t>
             </w:r>
           </w:p>
         </w:tc>
@@ -541,7 +443,113 @@
               <w:rPr>
                 <w:sz w:val="22"/>
               </w:rPr>
-              <w:t>Đảo chiều động cơ 12 V an toàn.</w:t>
+              <w:t>Hiện giờ, góc tấm pin, trạng thái motor.</w:t>
+            </w:r>
+          </w:p>
+        </w:tc>
+      </w:tr>
+      <w:tr>
+        <w:tc>
+          <w:tcPr>
+            <w:tcW w:type="dxa" w:w="3010"/>
+          </w:tcPr>
+          <w:p>
+            <w:pPr>
+              <w:spacing w:after="40"/>
+              <w:ind w:firstLine="0"/>
+            </w:pPr>
+            <w:r>
+              <w:rPr>
+                <w:sz w:val="22"/>
+              </w:rPr>
+              <w:t>Cách ly lệnh</w:t>
+            </w:r>
+          </w:p>
+        </w:tc>
+        <w:tc>
+          <w:tcPr>
+            <w:tcW w:type="dxa" w:w="3010"/>
+          </w:tcPr>
+          <w:p>
+            <w:pPr>
+              <w:spacing w:after="40"/>
+              <w:ind w:firstLine="0"/>
+            </w:pPr>
+            <w:r>
+              <w:rPr>
+                <w:sz w:val="22"/>
+              </w:rPr>
+              <w:t>2 opto PC817 + trở 220 Ω</w:t>
+            </w:r>
+          </w:p>
+        </w:tc>
+        <w:tc>
+          <w:tcPr>
+            <w:tcW w:type="dxa" w:w="3010"/>
+          </w:tcPr>
+          <w:p>
+            <w:pPr>
+              <w:spacing w:after="40"/>
+              <w:ind w:firstLine="0"/>
+            </w:pPr>
+            <w:r>
+              <w:rPr>
+                <w:sz w:val="22"/>
+              </w:rPr>
+              <w:t>Tách mass 3,3 V và mass 12 V của mạch động lực.</w:t>
+            </w:r>
+          </w:p>
+        </w:tc>
+      </w:tr>
+      <w:tr>
+        <w:tc>
+          <w:tcPr>
+            <w:tcW w:type="dxa" w:w="3010"/>
+          </w:tcPr>
+          <w:p>
+            <w:pPr>
+              <w:spacing w:after="40"/>
+              <w:ind w:firstLine="0"/>
+            </w:pPr>
+            <w:r>
+              <w:rPr>
+                <w:sz w:val="22"/>
+              </w:rPr>
+              <w:t>Mạch động lực</w:t>
+            </w:r>
+          </w:p>
+        </w:tc>
+        <w:tc>
+          <w:tcPr>
+            <w:tcW w:type="dxa" w:w="3010"/>
+          </w:tcPr>
+          <w:p>
+            <w:pPr>
+              <w:spacing w:after="40"/>
+              <w:ind w:firstLine="0"/>
+            </w:pPr>
+            <w:r>
+              <w:rPr>
+                <w:sz w:val="22"/>
+              </w:rPr>
+              <w:t>Cầu H 4 TIP41C + diode bảo vệ</w:t>
+            </w:r>
+          </w:p>
+        </w:tc>
+        <w:tc>
+          <w:tcPr>
+            <w:tcW w:type="dxa" w:w="3010"/>
+          </w:tcPr>
+          <w:p>
+            <w:pPr>
+              <w:spacing w:after="40"/>
+              <w:ind w:firstLine="0"/>
+            </w:pPr>
+            <w:r>
+              <w:rPr>
+                <w:sz w:val="22"/>
+              </w:rPr>
+              <w:t>Đảo chiều motor gạt nước 12 V.</w:t>
             </w:r>
           </w:p>
         </w:tc>
@@ -577,7 +585,7 @@
               <w:rPr>
                 <w:sz w:val="22"/>
               </w:rPr>
-              <w:t>Motor gạt nước trục vít 12 V</w:t>
+              <w:t>Motor gạt nước trục vít</w:t>
             </w:r>
           </w:p>
         </w:tc>
@@ -594,7 +602,7 @@
               <w:rPr>
                 <w:sz w:val="22"/>
               </w:rPr>
-              <w:t>Quay trục Đông–Tây, tự giữ vị trí.</w:t>
+              <w:t>Quay trục Đông–Tây; tự giữ khi mất điện.</w:t>
             </w:r>
           </w:p>
         </w:tc>
@@ -630,7 +638,7 @@
               <w:rPr>
                 <w:sz w:val="22"/>
               </w:rPr>
-              <w:t>qt1, qt2 + diode cầu H + 1N4007</w:t>
+              <w:t>4 công tắc hành trình kéo xuống 1k + nút dừng</w:t>
             </w:r>
           </w:p>
         </w:tc>
@@ -647,7 +655,60 @@
               <w:rPr>
                 <w:sz w:val="22"/>
               </w:rPr>
-              <w:t>Chặn quá hành trình, chống ngược cực.</w:t>
+              <w:t>Chặn quá hành trình, cắt lệnh an toàn.</w:t>
+            </w:r>
+          </w:p>
+        </w:tc>
+      </w:tr>
+      <w:tr>
+        <w:tc>
+          <w:tcPr>
+            <w:tcW w:type="dxa" w:w="3010"/>
+          </w:tcPr>
+          <w:p>
+            <w:pPr>
+              <w:spacing w:after="40"/>
+              <w:ind w:firstLine="0"/>
+            </w:pPr>
+            <w:r>
+              <w:rPr>
+                <w:sz w:val="22"/>
+              </w:rPr>
+              <w:t>Nguồn</w:t>
+            </w:r>
+          </w:p>
+        </w:tc>
+        <w:tc>
+          <w:tcPr>
+            <w:tcW w:type="dxa" w:w="3010"/>
+          </w:tcPr>
+          <w:p>
+            <w:pPr>
+              <w:spacing w:after="40"/>
+              <w:ind w:firstLine="0"/>
+            </w:pPr>
+            <w:r>
+              <w:rPr>
+                <w:sz w:val="22"/>
+              </w:rPr>
+              <w:t>12 V + 1N4007 + LM2596 + 7805</w:t>
+            </w:r>
+          </w:p>
+        </w:tc>
+        <w:tc>
+          <w:tcPr>
+            <w:tcW w:type="dxa" w:w="3010"/>
+          </w:tcPr>
+          <w:p>
+            <w:pPr>
+              <w:spacing w:after="40"/>
+              <w:ind w:firstLine="0"/>
+            </w:pPr>
+            <w:r>
+              <w:rPr>
+                <w:sz w:val="22"/>
+              </w:rPr>
+              <w:t>3,3 V cho ESP32; 5 V cho LCD, DS1307; 12 V cho motor.</w:t>
             </w:r>
           </w:p>
         </w:tc>
@@ -661,7 +722,7 @@
         <w:pStyle w:val="Heading2"/>
       </w:pPr>
       <w:r>
-        <w:t>1.3. Cụm cảm biến LDR và vách che</w:t>
+        <w:t>1.3. Cụm bốn LDR và vách che giữa</w:t>
       </w:r>
     </w:p>
     <w:p>
@@ -672,7 +733,7 @@
       <w:r>
         <w:drawing>
           <wp:inline xmlns:a="http://schemas.openxmlformats.org/drawingml/2006/main" xmlns:pic="http://schemas.openxmlformats.org/drawingml/2006/picture">
-            <wp:extent cx="5580000" cy="2131716"/>
+            <wp:extent cx="5580000" cy="2376568"/>
             <wp:docPr id="2" name="Picture 2"/>
             <wp:cNvGraphicFramePr>
               <a:graphicFrameLocks noChangeAspect="1"/>
@@ -693,7 +754,7 @@
                   <pic:spPr>
                     <a:xfrm>
                       <a:off x="0" y="0"/>
-                      <a:ext cx="5580000" cy="2131716"/>
+                      <a:ext cx="5580000" cy="2376568"/>
                     </a:xfrm>
                     <a:prstGeom prst="rect"/>
                   </pic:spPr>
@@ -709,13 +770,13 @@
         <w:pStyle w:val="Caption"/>
       </w:pPr>
       <w:r>
-        <w:t>Hình 2. Bố trí 4 LDR ở bốn góc và vách che chữ thập giữa cụm</w:t>
+        <w:t>Hình 2. Bố trí bốn LDR và vách che giữa trên tấm pin</w:t>
       </w:r>
     </w:p>
     <w:p>
       <w:pPr/>
       <w:r>
-        <w:t>Bốn LDR gá chếch ra ngoài 30° như nhau, vách che chữ thập cao 3 cm đặt giữa cụm để khi lệch hướng, bóng che làm một phía tối hơn rõ rệt, tăng độ chênh lệch tín hiệu. Giá gá in cùng một mẫu để bốn góc β_s đồng đều; sau hiệu chuẩn phải cố định chắc và tránh bóng của khung pin đổ lên cụm.</w:t>
+        <w:t>Bốn LDR hàn trên mạch nhỏ bắt ở bốn góc tấm pin, vách che nhôm cao khoảng 3 cm chạy giữa theo chiều Bắc–Nam để tạo bóng lệch Đông–Tây. Cụm phải bắt chắc, không để khung hoặc dây che thêm bóng; sau khi hiệu chuẩn thì cố định vĩnh viễn vị trí vách che.</w:t>
       </w:r>
     </w:p>
     <w:p>
@@ -723,13 +784,13 @@
         <w:pStyle w:val="Heading2"/>
       </w:pPr>
       <w:r>
-        <w:t>1.4. Cơ cấu chấp hành và hồi tiếp vị trí</w:t>
+        <w:t>1.4. Động cơ gạt nước và khớp trục vít tự hãm</w:t>
       </w:r>
     </w:p>
     <w:p>
       <w:pPr/>
       <w:r>
-        <w:t>Trục quay căn hướng Bắc–Nam, đặt gần trọng tâm tấm pin. Động cơ gạt nước 12 V nối tay đòn khớp bản lề; biến trở xoay 10 k đồng trục chia áp về GPIO36 để chương trình đọc góc hiện tại; hai công tắc hành trình qt1, qt2 đặt trước điểm va chạm cơ khí ở đầu Đông và đầu Tây. Lệnh quay đi qua opto PC817 xuống cầu H TIP41C nên khối công suất 12 V tách điện hoàn toàn khỏi khối logic 3,3 V.</w:t>
+        <w:t>Trục quay căn hướng Bắc–Nam, đặt sát trọng tâm tấm pin 100 W nặng khoảng 4 kg. Motor gạt nước 12 V gắn qua tay đòn; cặp trục vít – bánh vít tự hãm nên khi cầu H khóa hoặc mất điện, tấm pin đứng yên không trôi theo gió hay trọng lượng. Công tắc tự đỗ của motor dùng làm mốc tham khảo khi tìm vị trí home.</w:t>
       </w:r>
     </w:p>
     <w:p>
@@ -737,7 +798,7 @@
         <w:pStyle w:val="Heading1"/>
       </w:pPr>
       <w:r>
-        <w:t>CHƯƠNG 2. THIẾT KẾ CƠ KHÍ, MẠCH ĐIỆN VÀ VẬT TƯ</w:t>
+        <w:t>CHƯƠNG 2. THIẾT KẾ MẠCH ĐIỆN, MẠCH ĐỘNG LỰC VÀ CƠ KHÍ</w:t>
       </w:r>
     </w:p>
     <w:p>
@@ -745,27 +806,7 @@
         <w:pStyle w:val="Heading2"/>
       </w:pPr>
       <w:r>
-        <w:t>2.1. Kết cấu cơ khí</w:t>
-      </w:r>
-    </w:p>
-    <w:p>
-      <w:pPr/>
-      <w:r>
-        <w:t>Khung đế thép phẳng có bulông cân bằng; hai gối đỡ mang trục thép tròn có bạc lót; tấm pin 100 W khối lượng khoảng 4 kg bắt lên khung đỡ nhôm qua tám tai bắt vít, tâm khối lượng đặt sát trục để giảm mô-men trọng lượng. Tay đòn nối trục ra hộp giảm tốc với khung pin có khớp bản lề khử sai lệch quỹ đạo; dây dẫn chừa dư theo toàn hành trình và buộc vào giá cố định. Hai công tắc hành trình gá sao cho cần gạt chạm trước khi khung pin va gối đỡ khoảng 2°.</w:t>
-      </w:r>
-    </w:p>
-    <w:p>
-      <w:pPr/>
-      <w:r>
-        <w:t>Hình vẽ chi tiết cơ khí sẽ được bổ sung bằng bản vẽ tay ở phiên bản sau; bản này mô tả kết cấu bằng lời và bảng tính chọn bên dưới.</w:t>
-      </w:r>
-    </w:p>
-    <w:p>
-      <w:pPr>
-        <w:pStyle w:val="Heading2"/>
-      </w:pPr>
-      <w:r>
-        <w:t>2.2. Tính chọn động cơ cho tấm pin 4 kg – 100 W</w:t>
+        <w:t>2.1. Kết quả tính chọn động cơ cho tấm pin 100 W – 4 kg</w:t>
       </w:r>
     </w:p>
     <w:p>
@@ -774,7 +815,7 @@
         <w:spacing w:after="80"/>
       </w:pPr>
       <w:r>
-        <w:t>Bảng 2. Tính chọn động cơ cho tấm pin 4 kg – 100 W</w:t>
+        <w:t>Bảng 2. Tính chọn động cơ gạt nước cho tấm pin 100 W – 4 kg</w:t>
       </w:r>
     </w:p>
     <w:tbl>
@@ -859,7 +900,7 @@
               <w:rPr>
                 <w:sz w:val="22"/>
               </w:rPr>
-              <w:t>Tấm pin</w:t>
+              <w:t>Trọng lượng tấm pin</w:t>
             </w:r>
           </w:p>
         </w:tc>
@@ -876,7 +917,7 @@
               <w:rPr>
                 <w:sz w:val="22"/>
               </w:rPr>
-              <w:t>100 W, khoảng 4 kg, diện tích ≈ 0,65 m²</w:t>
+              <w:t>4 kg → 39,2 N</w:t>
             </w:r>
           </w:p>
         </w:tc>
@@ -893,7 +934,7 @@
               <w:rPr>
                 <w:sz w:val="22"/>
               </w:rPr>
-              <w:t>Lắp cân bằng quanh trục.</w:t>
+              <w:t>Tấm 100 W, diện tích khoảng 0,65 m².</w:t>
             </w:r>
           </w:p>
         </w:tc>
@@ -912,7 +953,7 @@
               <w:rPr>
                 <w:sz w:val="22"/>
               </w:rPr>
-              <w:t>Mô-men trọng lượng (lệch tâm 5 cm)</w:t>
+              <w:t>Mô-men tĩnh khi cân bằng tốt</w:t>
             </w:r>
           </w:p>
         </w:tc>
@@ -929,7 +970,7 @@
               <w:rPr>
                 <w:sz w:val="22"/>
               </w:rPr>
-              <w:t>≈ 2,0 N·m</w:t>
+              <w:t>≈ 0 N·m</w:t>
             </w:r>
           </w:p>
         </w:tc>
@@ -946,7 +987,7 @@
               <w:rPr>
                 <w:sz w:val="22"/>
               </w:rPr>
-              <w:t>4 kg × 9,81 × 0,05 m.</w:t>
+              <w:t>Tâm khối lượng đặt sát trục; lệch 0,05 m → 2,0 N·m.</w:t>
             </w:r>
           </w:p>
         </w:tc>
@@ -965,7 +1006,7 @@
               <w:rPr>
                 <w:sz w:val="22"/>
               </w:rPr>
-              <w:t>Tải gió làm việc v = 8 m/s</w:t>
+              <w:t>Gió 6 m/s: q = 0,6·v² = 21,6 Pa</w:t>
             </w:r>
           </w:p>
         </w:tc>
@@ -982,7 +1023,7 @@
               <w:rPr>
                 <w:sz w:val="22"/>
               </w:rPr>
-              <w:t>q = 0,6·v² ≈ 38 Pa; F ≈ 25 N</w:t>
+              <w:t>F ≈ 16,9 N → M ≈ 4,4 N·m</w:t>
             </w:r>
           </w:p>
         </w:tc>
@@ -999,7 +1040,7 @@
               <w:rPr>
                 <w:sz w:val="22"/>
               </w:rPr>
-              <w:t>Đẩy lên mặt pin 0,65 m².</w:t>
+              <w:t>F = q·A·1,2 với A = 0,65 m²; tay đòn 0,26 m.</w:t>
             </w:r>
           </w:p>
         </w:tc>
@@ -1018,7 +1059,7 @@
               <w:rPr>
                 <w:sz w:val="22"/>
               </w:rPr>
-              <w:t>Mô-men gió (tay đòn 0,3 m)</w:t>
+              <w:t>Gió 8 m/s: q = 38,4 Pa</w:t>
             </w:r>
           </w:p>
         </w:tc>
@@ -1035,7 +1076,7 @@
               <w:rPr>
                 <w:sz w:val="22"/>
               </w:rPr>
-              <w:t>≈ 7,5 N·m</w:t>
+              <w:t>F ≈ 30,0 N → M ≈ 7,8 N·m</w:t>
             </w:r>
           </w:p>
         </w:tc>
@@ -1052,7 +1093,7 @@
               <w:rPr>
                 <w:sz w:val="22"/>
               </w:rPr>
-              <w:t>Trường hợp gió ngang mặt pin.</w:t>
+              <w:t>Điều kiện làm việc thiết kế.</w:t>
             </w:r>
           </w:p>
         </w:tc>
@@ -1071,7 +1112,7 @@
               <w:rPr>
                 <w:sz w:val="22"/>
               </w:rPr>
-              <w:t>Mô-men yêu cầu (×2 khởi động, ma sát)</w:t>
+              <w:t>Gió 10 m/s: q = 60 Pa</w:t>
             </w:r>
           </w:p>
         </w:tc>
@@ -1088,7 +1129,7 @@
               <w:rPr>
                 <w:sz w:val="22"/>
               </w:rPr>
-              <w:t>≈ 19 N·m</w:t>
+              <w:t>F ≈ 46,8 N → M ≈ 12,2 N·m</w:t>
             </w:r>
           </w:p>
         </w:tc>
@@ -1105,7 +1146,7 @@
               <w:rPr>
                 <w:sz w:val="22"/>
               </w:rPr>
-              <w:t>Tổng hai thành phần nhân hệ số.</w:t>
+              <w:t>Điều kiện giật cục bộ, chỉ chịu ngắn hạn.</w:t>
             </w:r>
           </w:p>
         </w:tc>
@@ -1124,7 +1165,7 @@
               <w:rPr>
                 <w:sz w:val="22"/>
               </w:rPr>
-              <w:t>Motor gạt nước 12 V + giảm tốc ngoài 1:3</w:t>
+              <w:t>Mô-men yêu cầu (×1,5 khởi động)</w:t>
             </w:r>
           </w:p>
         </w:tc>
@@ -1141,7 +1182,7 @@
               <w:rPr>
                 <w:sz w:val="22"/>
               </w:rPr>
-              <w:t>24 – 36 N·m ở trục ra</w:t>
+              <w:t>6,6 / 11,7 / 18,3 N·m</w:t>
             </w:r>
           </w:p>
         </w:tc>
@@ -1158,7 +1199,7 @@
               <w:rPr>
                 <w:sz w:val="22"/>
               </w:rPr>
-              <w:t>Bản thân motor 8 – 12 N·m.</w:t>
+              <w:t>Lần lượt cho gió 6 / 8 / 10 m/s.</w:t>
             </w:r>
           </w:p>
         </w:tc>
@@ -1177,7 +1218,7 @@
               <w:rPr>
                 <w:sz w:val="22"/>
               </w:rPr>
-              <w:t>Hệ số an toàn</w:t>
+              <w:t>Motor gạt nước 12 V chọn dùng</w:t>
             </w:r>
           </w:p>
         </w:tc>
@@ -1194,7 +1235,7 @@
               <w:rPr>
                 <w:sz w:val="22"/>
               </w:rPr>
-              <w:t>1,3 – 1,9 lần</w:t>
+              <w:t>≈ 60 W: danh định 5 N·m, hãm 20–25 N·m, dòng tải 4–5 A</w:t>
             </w:r>
           </w:p>
         </w:tc>
@@ -1211,7 +1252,7 @@
               <w:rPr>
                 <w:sz w:val="22"/>
               </w:rPr>
-              <w:t>Đủ cho gió tới 8 m/s.</w:t>
+              <w:t>Trục vít tự hãm, sẵn có, giá thấp.</w:t>
             </w:r>
           </w:p>
         </w:tc>
@@ -1230,7 +1271,7 @@
               <w:rPr>
                 <w:sz w:val="22"/>
               </w:rPr>
-              <w:t>Chế độ gió lớn</w:t>
+              <w:t>Kết luận</w:t>
             </w:r>
           </w:p>
         </w:tc>
@@ -1247,7 +1288,7 @@
               <w:rPr>
                 <w:sz w:val="22"/>
               </w:rPr>
-              <w:t>Trên 10 m/s: hạ tấm pin nằm ngang</w:t>
+              <w:t>Làm việc thường xuyên tới gió 8 m/s; trên ngưỡng đó cho tấm pin về vị trí nghỉ</w:t>
             </w:r>
           </w:p>
         </w:tc>
@@ -1264,7 +1305,7 @@
               <w:rPr>
                 <w:sz w:val="22"/>
               </w:rPr>
-              <w:t>Giảm tay đòn gió về gần 0.</w:t>
+              <w:t>Hệ số an toàn theo mô-men hãm ≈ 2 ở gió 10 m/s.</w:t>
             </w:r>
           </w:p>
         </w:tc>
@@ -1276,7 +1317,7 @@
     <w:p>
       <w:pPr/>
       <w:r>
-        <w:t>Với tấm pin 4 kg, mô-men gió chiếm phần lớn tải; cặp trục vít của motor gạt nước cộng giảm tốc ngoài 1:3 cho mô-men trục ra 24–36 N·m, đủ hệ số an toàn 1,3–1,9 lần ở gió 8 m/s. Đổi lại tốc độ trục ra chậm (khoảng 0,5 vòng/phút) lại phù hợp vì mỗi lần hiệu chỉnh chỉ quay vài độ.</w:t>
+        <w:t>Dòng tải 4–5 A của motor nằm trong giới hạn 6 A của transistor TIP41C ở mạch động lực; riêng dòng hãm khi kẹt trục lớn hơn nên mạch có cầu chì và chương trình có giới hạn thời gian chạy mỗi lệnh để bảo vệ transistor.</w:t>
       </w:r>
     </w:p>
     <w:p>
@@ -1284,13 +1325,7 @@
         <w:pStyle w:val="Heading2"/>
       </w:pPr>
       <w:r>
-        <w:t>2.3. Mạch điện: nguồn, cách ly, động lực và đo lường</w:t>
-      </w:r>
-    </w:p>
-    <w:p>
-      <w:pPr/>
-      <w:r>
-        <w:t>Nguồn 12 V vào qua đầu nối X1 và diode 1N4007 chống ngược cực; nhánh LM2596 hạ áp xuống 3,3 V nuôi ESP32, nhánh 7805 kèm tụ 220 µF hai đầu hạ xuống 5 V nuôi LCD I²C 1602 và module DS1307. Tín hiệu lệnh th_thuan/th_nguoc từ GPIO19/GPIO18 qua opto PC817 và điện trở 220 Ω xuống cầu H bốn TIP41C điều khiển động cơ; bốn công tắc hành trình qt1…qt4 kéo xuống 1k nên mức 0 là an toàn, mức 1 là chạm hành trình. Bốn kênh LDR, biến trở hồi tiếp và cầu chia áp điện áp tấm pin đưa thẳng vào các chân ADC; hệ chỉ đo điện áp, chưa đo dòng điện.</w:t>
+        <w:t>2.2. Mạch điều khiển trung tâm: ESP32 DevKit</w:t>
       </w:r>
     </w:p>
     <w:p>
@@ -1301,7 +1336,7 @@
       <w:r>
         <w:drawing>
           <wp:inline xmlns:a="http://schemas.openxmlformats.org/drawingml/2006/main" xmlns:pic="http://schemas.openxmlformats.org/drawingml/2006/picture">
-            <wp:extent cx="5760000" cy="3851662"/>
+            <wp:extent cx="4860000" cy="3894271"/>
             <wp:docPr id="3" name="Picture 3"/>
             <wp:cNvGraphicFramePr>
               <a:graphicFrameLocks noChangeAspect="1"/>
@@ -1310,7 +1345,7 @@
               <a:graphicData uri="http://schemas.openxmlformats.org/drawingml/2006/picture">
                 <pic:pic>
                   <pic:nvPicPr>
-                    <pic:cNvPr id="0" name="so_do_ket_noi_1_truc.png"/>
+                    <pic:cNvPr id="0" name="mach_esp32_devkit.png"/>
                     <pic:cNvPicPr/>
                   </pic:nvPicPr>
                   <pic:blipFill>
@@ -1322,7 +1357,7 @@
                   <pic:spPr>
                     <a:xfrm>
                       <a:off x="0" y="0"/>
-                      <a:ext cx="5760000" cy="3851662"/>
+                      <a:ext cx="4860000" cy="3894271"/>
                     </a:xfrm>
                     <a:prstGeom prst="rect"/>
                   </pic:spPr>
@@ -1338,7 +1373,7 @@
         <w:pStyle w:val="Caption"/>
       </w:pPr>
       <w:r>
-        <w:t>Hình 3. Sơ đồ kết nối ESP32 DevKit của mô hình một trục</w:t>
+        <w:t>Hình 3. Sheet nguyên lý khối ESP32 DevKit và các mạng tín hiệu</w:t>
       </w:r>
     </w:p>
     <w:p>
@@ -1347,7 +1382,7 @@
         <w:spacing w:after="80"/>
       </w:pPr>
       <w:r>
-        <w:t>Bảng 3. Bảng chân kết nối của mô hình một trục</w:t>
+        <w:t>Bảng 3. Bảng chân kết nối theo sheet ESP32 DevKit</w:t>
       </w:r>
     </w:p>
     <w:tbl>
@@ -1363,6 +1398,24 @@
         <w:gridCol w:w="3010"/>
       </w:tblGrid>
       <w:tr>
+        <w:tc>
+          <w:tcPr>
+            <w:tcW w:type="dxa" w:w="3010"/>
+          </w:tcPr>
+          <w:p>
+            <w:pPr>
+              <w:spacing w:after="40"/>
+              <w:ind w:firstLine="0"/>
+            </w:pPr>
+            <w:r>
+              <w:rPr>
+                <w:b/>
+                <w:sz w:val="22"/>
+              </w:rPr>
+              <w:t>Mạng tín hiệu</w:t>
+            </w:r>
+          </w:p>
+        </w:tc>
         <w:tc>
           <w:tcPr>
             <w:tcW w:type="dxa" w:w="3010"/>
@@ -1395,25 +1448,7 @@
                 <w:b/>
                 <w:sz w:val="22"/>
               </w:rPr>
-              <w:t>Mạng tín hiệu</w:t>
-            </w:r>
-          </w:p>
-        </w:tc>
-        <w:tc>
-          <w:tcPr>
-            <w:tcW w:type="dxa" w:w="3010"/>
-          </w:tcPr>
-          <w:p>
-            <w:pPr>
-              <w:spacing w:after="40"/>
-              <w:ind w:firstLine="0"/>
-            </w:pPr>
-            <w:r>
-              <w:rPr>
-                <w:b/>
-                <w:sz w:val="22"/>
-              </w:rPr>
-              <w:t>Thiết bị</w:t>
+              <w:t>Ghi chú</w:t>
             </w:r>
           </w:p>
         </w:tc>
@@ -1432,7 +1467,7 @@
               <w:rPr>
                 <w:sz w:val="22"/>
               </w:rPr>
-              <w:t>GPIO25, 26, 27, 14</w:t>
+              <w:t>LDR TT / PT / TD / PD</w:t>
             </w:r>
           </w:p>
         </w:tc>
@@ -1449,7 +1484,7 @@
               <w:rPr>
                 <w:sz w:val="22"/>
               </w:rPr>
-              <w:t>LDR TT, PT, TD, PD</w:t>
+              <w:t>GPIO25 / 26 / 27 / 14</w:t>
             </w:r>
           </w:p>
         </w:tc>
@@ -1466,12 +1501,82 @@
               <w:rPr>
                 <w:sz w:val="22"/>
               </w:rPr>
-              <w:t>Ma trận 4 LDR qua mạch chia áp.</w:t>
+              <w:t>Bốn kênh cường độ sáng (ADC2, không bật WiFi).</w:t>
             </w:r>
           </w:p>
         </w:tc>
       </w:tr>
       <w:tr>
+        <w:tc>
+          <w:tcPr>
+            <w:tcW w:type="dxa" w:w="3010"/>
+          </w:tcPr>
+          <w:p>
+            <w:pPr>
+              <w:spacing w:after="40"/>
+              <w:ind w:firstLine="0"/>
+            </w:pPr>
+            <w:r>
+              <w:rPr>
+                <w:sz w:val="22"/>
+              </w:rPr>
+              <w:t>Công tắc hành trình qt1–qt4</w:t>
+            </w:r>
+          </w:p>
+        </w:tc>
+        <w:tc>
+          <w:tcPr>
+            <w:tcW w:type="dxa" w:w="3010"/>
+          </w:tcPr>
+          <w:p>
+            <w:pPr>
+              <w:spacing w:after="40"/>
+              <w:ind w:firstLine="0"/>
+            </w:pPr>
+            <w:r>
+              <w:rPr>
+                <w:sz w:val="22"/>
+              </w:rPr>
+              <w:t>GPIO34 / 35 / 32 / 33</w:t>
+            </w:r>
+          </w:p>
+        </w:tc>
+        <w:tc>
+          <w:tcPr>
+            <w:tcW w:type="dxa" w:w="3010"/>
+          </w:tcPr>
+          <w:p>
+            <w:pPr>
+              <w:spacing w:after="40"/>
+              <w:ind w:firstLine="0"/>
+            </w:pPr>
+            <w:r>
+              <w:rPr>
+                <w:sz w:val="22"/>
+              </w:rPr>
+              <w:t>Kéo xuống 1k; chạm hành trình = mức 1.</w:t>
+            </w:r>
+          </w:p>
+        </w:tc>
+      </w:tr>
+      <w:tr>
+        <w:tc>
+          <w:tcPr>
+            <w:tcW w:type="dxa" w:w="3010"/>
+          </w:tcPr>
+          <w:p>
+            <w:pPr>
+              <w:spacing w:after="40"/>
+              <w:ind w:firstLine="0"/>
+            </w:pPr>
+            <w:r>
+              <w:rPr>
+                <w:sz w:val="22"/>
+              </w:rPr>
+              <w:t>Biến trở hồi tiếp góc</w:t>
+            </w:r>
+          </w:p>
+        </w:tc>
         <w:tc>
           <w:tcPr>
             <w:tcW w:type="dxa" w:w="3010"/>
@@ -1502,10 +1607,12 @@
               <w:rPr>
                 <w:sz w:val="22"/>
               </w:rPr>
-              <w:t>biến trở hồi tiếp</w:t>
+              <w:t>ADC1, đo điện áp 0–3,3 V.</w:t>
             </w:r>
           </w:p>
         </w:tc>
+      </w:tr>
+      <w:tr>
         <w:tc>
           <w:tcPr>
             <w:tcW w:type="dxa" w:w="3010"/>
@@ -1519,12 +1626,10 @@
               <w:rPr>
                 <w:sz w:val="22"/>
               </w:rPr>
-              <w:t>Góc hiện tại của tấm pin.</w:t>
+              <w:t>Điện áp tấm pin (cầu chia)</w:t>
             </w:r>
           </w:p>
         </w:tc>
-      </w:tr>
-      <w:tr>
         <w:tc>
           <w:tcPr>
             <w:tcW w:type="dxa" w:w="3010"/>
@@ -1555,24 +1660,7 @@
               <w:rPr>
                 <w:sz w:val="22"/>
               </w:rPr>
-              <w:t>cầu chia áp tấm pin</w:t>
-            </w:r>
-          </w:p>
-        </w:tc>
-        <w:tc>
-          <w:tcPr>
-            <w:tcW w:type="dxa" w:w="3010"/>
-          </w:tcPr>
-          <w:p>
-            <w:pPr>
-              <w:spacing w:after="40"/>
-              <w:ind w:firstLine="0"/>
-            </w:pPr>
-            <w:r>
-              <w:rPr>
-                <w:sz w:val="22"/>
-              </w:rPr>
-              <w:t>Điện áp tấm pin (chỉ đo áp).</w:t>
+              <w:t>ADC1; phiên bản này chưa đo dòng điện.</w:t>
             </w:r>
           </w:p>
         </w:tc>
@@ -1591,7 +1679,7 @@
               <w:rPr>
                 <w:sz w:val="22"/>
               </w:rPr>
-              <w:t>GPIO34, 35</w:t>
+              <w:t>Lệnh motor 1: th_thuan / th_nguoc</w:t>
             </w:r>
           </w:p>
         </w:tc>
@@ -1608,7 +1696,7 @@
               <w:rPr>
                 <w:sz w:val="22"/>
               </w:rPr>
-              <w:t>qt1, qt2</w:t>
+              <w:t>GPIO19 / GPIO18</w:t>
             </w:r>
           </w:p>
         </w:tc>
@@ -1625,7 +1713,7 @@
               <w:rPr>
                 <w:sz w:val="22"/>
               </w:rPr>
-              <w:t>Công tắc hành trình Đông, Tây.</w:t>
+              <w:t>Tích cực thấp qua opto PC817.</w:t>
             </w:r>
           </w:p>
         </w:tc>
@@ -1644,7 +1732,7 @@
               <w:rPr>
                 <w:sz w:val="22"/>
               </w:rPr>
-              <w:t>GPIO21, 22</w:t>
+              <w:t>Lệnh motor 2 (bản hai trục)</w:t>
             </w:r>
           </w:p>
         </w:tc>
@@ -1661,7 +1749,7 @@
               <w:rPr>
                 <w:sz w:val="22"/>
               </w:rPr>
-              <w:t>sda, scl</w:t>
+              <w:t>GPIO5 / GPIO13</w:t>
             </w:r>
           </w:p>
         </w:tc>
@@ -1678,7 +1766,7 @@
               <w:rPr>
                 <w:sz w:val="22"/>
               </w:rPr>
-              <w:t>DS1307 và LCD I²C chung bus.</w:t>
+              <w:t>Bản một trục bỏ hai mạng này.</w:t>
             </w:r>
           </w:p>
         </w:tc>
@@ -1697,7 +1785,7 @@
               <w:rPr>
                 <w:sz w:val="22"/>
               </w:rPr>
-              <w:t>GPIO19, 18</w:t>
+              <w:t>I²C: sda / scl</w:t>
             </w:r>
           </w:p>
         </w:tc>
@@ -1714,7 +1802,7 @@
               <w:rPr>
                 <w:sz w:val="22"/>
               </w:rPr>
-              <w:t>th_thuan, th_nguoc</w:t>
+              <w:t>GPIO21 / GPIO22</w:t>
             </w:r>
           </w:p>
         </w:tc>
@@ -1731,60 +1819,7 @@
               <w:rPr>
                 <w:sz w:val="22"/>
               </w:rPr>
-              <w:t>Opto PC817 điều khiển cầu H.</w:t>
-            </w:r>
-          </w:p>
-        </w:tc>
-      </w:tr>
-      <w:tr>
-        <w:tc>
-          <w:tcPr>
-            <w:tcW w:type="dxa" w:w="3010"/>
-          </w:tcPr>
-          <w:p>
-            <w:pPr>
-              <w:spacing w:after="40"/>
-              <w:ind w:firstLine="0"/>
-            </w:pPr>
-            <w:r>
-              <w:rPr>
-                <w:sz w:val="22"/>
-              </w:rPr>
-              <w:t>3V3, GND</w:t>
-            </w:r>
-          </w:p>
-        </w:tc>
-        <w:tc>
-          <w:tcPr>
-            <w:tcW w:type="dxa" w:w="3010"/>
-          </w:tcPr>
-          <w:p>
-            <w:pPr>
-              <w:spacing w:after="40"/>
-              <w:ind w:firstLine="0"/>
-            </w:pPr>
-            <w:r>
-              <w:rPr>
-                <w:sz w:val="22"/>
-              </w:rPr>
-              <w:t>nguồn logic</w:t>
-            </w:r>
-          </w:p>
-        </w:tc>
-        <w:tc>
-          <w:tcPr>
-            <w:tcW w:type="dxa" w:w="3010"/>
-          </w:tcPr>
-          <w:p>
-            <w:pPr>
-              <w:spacing w:after="40"/>
-              <w:ind w:firstLine="0"/>
-            </w:pPr>
-            <w:r>
-              <w:rPr>
-                <w:sz w:val="22"/>
-              </w:rPr>
-              <w:t>Tách khối với 12 V và 5 V.</w:t>
+              <w:t>DS1307 (0x68) và LCD PCF8574 (0x27) chung bus.</w:t>
             </w:r>
           </w:p>
         </w:tc>
@@ -1798,7 +1833,109 @@
         <w:pStyle w:val="Heading2"/>
       </w:pPr>
       <w:r>
-        <w:t>2.4. Danh mục vật tư và linh kiện</w:t>
+        <w:t>2.3. Mạch động lực cầu H bốn TIP41C và cách ly opto</w:t>
+      </w:r>
+    </w:p>
+    <w:p>
+      <w:pPr>
+        <w:ind w:firstLine="0"/>
+        <w:jc w:val="center"/>
+      </w:pPr>
+      <w:r>
+        <w:drawing>
+          <wp:inline xmlns:a="http://schemas.openxmlformats.org/drawingml/2006/main" xmlns:pic="http://schemas.openxmlformats.org/drawingml/2006/picture">
+            <wp:extent cx="5400000" cy="3769107"/>
+            <wp:docPr id="4" name="Picture 4"/>
+            <wp:cNvGraphicFramePr>
+              <a:graphicFrameLocks noChangeAspect="1"/>
+            </wp:cNvGraphicFramePr>
+            <a:graphic>
+              <a:graphicData uri="http://schemas.openxmlformats.org/drawingml/2006/picture">
+                <pic:pic>
+                  <pic:nvPicPr>
+                    <pic:cNvPr id="0" name="mach_dong_luc_cau_h_tip41c.png"/>
+                    <pic:cNvPicPr/>
+                  </pic:nvPicPr>
+                  <pic:blipFill>
+                    <a:blip r:embed="rId13"/>
+                    <a:stretch>
+                      <a:fillRect/>
+                    </a:stretch>
+                  </pic:blipFill>
+                  <pic:spPr>
+                    <a:xfrm>
+                      <a:off x="0" y="0"/>
+                      <a:ext cx="5400000" cy="3769107"/>
+                    </a:xfrm>
+                    <a:prstGeom prst="rect"/>
+                  </pic:spPr>
+                </pic:pic>
+              </a:graphicData>
+            </a:graphic>
+          </wp:inline>
+        </w:drawing>
+      </w:r>
+    </w:p>
+    <w:p>
+      <w:pPr>
+        <w:pStyle w:val="Caption"/>
+      </w:pPr>
+      <w:r>
+        <w:t>Hình 4. Mạch động lực cầu H ghép từ bốn TIP41C kèm diode bảo vệ</w:t>
+      </w:r>
+    </w:p>
+    <w:p>
+      <w:pPr>
+        <w:ind w:firstLine="0"/>
+        <w:jc w:val="center"/>
+      </w:pPr>
+      <w:r>
+        <w:drawing>
+          <wp:inline xmlns:a="http://schemas.openxmlformats.org/drawingml/2006/main" xmlns:pic="http://schemas.openxmlformats.org/drawingml/2006/picture">
+            <wp:extent cx="5220000" cy="3360256"/>
+            <wp:docPr id="5" name="Picture 5"/>
+            <wp:cNvGraphicFramePr>
+              <a:graphicFrameLocks noChangeAspect="1"/>
+            </wp:cNvGraphicFramePr>
+            <a:graphic>
+              <a:graphicData uri="http://schemas.openxmlformats.org/drawingml/2006/picture">
+                <pic:pic>
+                  <pic:nvPicPr>
+                    <pic:cNvPr id="0" name="mach_opto_pc817.png"/>
+                    <pic:cNvPicPr/>
+                  </pic:nvPicPr>
+                  <pic:blipFill>
+                    <a:blip r:embed="rId14"/>
+                    <a:stretch>
+                      <a:fillRect/>
+                    </a:stretch>
+                  </pic:blipFill>
+                  <pic:spPr>
+                    <a:xfrm>
+                      <a:off x="0" y="0"/>
+                      <a:ext cx="5220000" cy="3360256"/>
+                    </a:xfrm>
+                    <a:prstGeom prst="rect"/>
+                  </pic:spPr>
+                </pic:pic>
+              </a:graphicData>
+            </a:graphic>
+          </wp:inline>
+        </w:drawing>
+      </w:r>
+    </w:p>
+    <w:p>
+      <w:pPr>
+        <w:pStyle w:val="Caption"/>
+      </w:pPr>
+      <w:r>
+        <w:t>Hình 5. Mạch cách ly opto PC817 giữa khối điều khiển và mạch động lực</w:t>
+      </w:r>
+    </w:p>
+    <w:p>
+      <w:pPr/>
+      <w:r>
+        <w:t>Cầu H gồm U1–U4 đều là TIP41C (NPN 6 A, 100 V). Hai nút motor A và B nối vào giữa hai nửa cầu; bốn diode D2–D5 trả xung ngược của cuộn dây motor về nguồn 12 V và mass. Mỗi bazơ nối qua trở 10 k tới mạng lệnh dkxuoi hoặc dknguoc; hai mạng này đi qua opto PC817 nên mass mạch động lực tách hẳn mass logic 3,3 V, chống nhiễu xung khi motor đảo chiều.</w:t>
       </w:r>
     </w:p>
     <w:p>
@@ -1807,7 +1944,629 @@
         <w:spacing w:after="80"/>
       </w:pPr>
       <w:r>
-        <w:t>Bảng 4. Danh mục vật tư – linh kiện của mô hình một trục</w:t>
+        <w:t>Bảng 4. Bảng trạng thái lệnh của cầu H (tích cực thấp qua opto)</w:t>
+      </w:r>
+    </w:p>
+    <w:tbl>
+      <w:tblPr>
+        <w:tblStyle w:val="TableGrid"/>
+        <w:tblW w:type="auto" w:w="0"/>
+        <w:jc w:val="center"/>
+        <w:tblLook w:firstColumn="1" w:firstRow="1" w:lastColumn="0" w:lastRow="0" w:noHBand="0" w:noVBand="1" w:val="04A0"/>
+      </w:tblPr>
+      <w:tblGrid>
+        <w:gridCol w:w="1806"/>
+        <w:gridCol w:w="1806"/>
+        <w:gridCol w:w="1806"/>
+        <w:gridCol w:w="1806"/>
+        <w:gridCol w:w="1806"/>
+      </w:tblGrid>
+      <w:tr>
+        <w:tc>
+          <w:tcPr>
+            <w:tcW w:type="dxa" w:w="1806"/>
+          </w:tcPr>
+          <w:p>
+            <w:pPr>
+              <w:spacing w:after="40"/>
+              <w:ind w:firstLine="0"/>
+            </w:pPr>
+            <w:r>
+              <w:rPr>
+                <w:b/>
+                <w:sz w:val="22"/>
+              </w:rPr>
+              <w:t>th_thuan (GPIO19)</w:t>
+            </w:r>
+          </w:p>
+        </w:tc>
+        <w:tc>
+          <w:tcPr>
+            <w:tcW w:type="dxa" w:w="1806"/>
+          </w:tcPr>
+          <w:p>
+            <w:pPr>
+              <w:spacing w:after="40"/>
+              <w:ind w:firstLine="0"/>
+            </w:pPr>
+            <w:r>
+              <w:rPr>
+                <w:b/>
+                <w:sz w:val="22"/>
+              </w:rPr>
+              <w:t>th_nguoc (GPIO18)</w:t>
+            </w:r>
+          </w:p>
+        </w:tc>
+        <w:tc>
+          <w:tcPr>
+            <w:tcW w:type="dxa" w:w="1806"/>
+          </w:tcPr>
+          <w:p>
+            <w:pPr>
+              <w:spacing w:after="40"/>
+              <w:ind w:firstLine="0"/>
+            </w:pPr>
+            <w:r>
+              <w:rPr>
+                <w:b/>
+                <w:sz w:val="22"/>
+              </w:rPr>
+              <w:t>dkxuoi</w:t>
+            </w:r>
+          </w:p>
+        </w:tc>
+        <w:tc>
+          <w:tcPr>
+            <w:tcW w:type="dxa" w:w="1806"/>
+          </w:tcPr>
+          <w:p>
+            <w:pPr>
+              <w:spacing w:after="40"/>
+              <w:ind w:firstLine="0"/>
+            </w:pPr>
+            <w:r>
+              <w:rPr>
+                <w:b/>
+                <w:sz w:val="22"/>
+              </w:rPr>
+              <w:t>dknguoc</w:t>
+            </w:r>
+          </w:p>
+        </w:tc>
+        <w:tc>
+          <w:tcPr>
+            <w:tcW w:type="dxa" w:w="1806"/>
+          </w:tcPr>
+          <w:p>
+            <w:pPr>
+              <w:spacing w:after="40"/>
+              <w:ind w:firstLine="0"/>
+            </w:pPr>
+            <w:r>
+              <w:rPr>
+                <w:b/>
+                <w:sz w:val="22"/>
+              </w:rPr>
+              <w:t>Trạng thái motor</w:t>
+            </w:r>
+          </w:p>
+        </w:tc>
+      </w:tr>
+      <w:tr>
+        <w:tc>
+          <w:tcPr>
+            <w:tcW w:type="dxa" w:w="1806"/>
+          </w:tcPr>
+          <w:p>
+            <w:pPr>
+              <w:spacing w:after="40"/>
+              <w:ind w:firstLine="0"/>
+            </w:pPr>
+            <w:r>
+              <w:rPr>
+                <w:sz w:val="22"/>
+              </w:rPr>
+              <w:t>0 (thấp)</w:t>
+            </w:r>
+          </w:p>
+        </w:tc>
+        <w:tc>
+          <w:tcPr>
+            <w:tcW w:type="dxa" w:w="1806"/>
+          </w:tcPr>
+          <w:p>
+            <w:pPr>
+              <w:spacing w:after="40"/>
+              <w:ind w:firstLine="0"/>
+            </w:pPr>
+            <w:r>
+              <w:rPr>
+                <w:sz w:val="22"/>
+              </w:rPr>
+              <w:t>1 (cao)</w:t>
+            </w:r>
+          </w:p>
+        </w:tc>
+        <w:tc>
+          <w:tcPr>
+            <w:tcW w:type="dxa" w:w="1806"/>
+          </w:tcPr>
+          <w:p>
+            <w:pPr>
+              <w:spacing w:after="40"/>
+              <w:ind w:firstLine="0"/>
+            </w:pPr>
+            <w:r>
+              <w:rPr>
+                <w:sz w:val="22"/>
+              </w:rPr>
+              <w:t>0</w:t>
+            </w:r>
+          </w:p>
+        </w:tc>
+        <w:tc>
+          <w:tcPr>
+            <w:tcW w:type="dxa" w:w="1806"/>
+          </w:tcPr>
+          <w:p>
+            <w:pPr>
+              <w:spacing w:after="40"/>
+              <w:ind w:firstLine="0"/>
+            </w:pPr>
+            <w:r>
+              <w:rPr>
+                <w:sz w:val="22"/>
+              </w:rPr>
+              <w:t>1</w:t>
+            </w:r>
+          </w:p>
+        </w:tc>
+        <w:tc>
+          <w:tcPr>
+            <w:tcW w:type="dxa" w:w="1806"/>
+          </w:tcPr>
+          <w:p>
+            <w:pPr>
+              <w:spacing w:after="40"/>
+              <w:ind w:firstLine="0"/>
+            </w:pPr>
+            <w:r>
+              <w:rPr>
+                <w:sz w:val="22"/>
+              </w:rPr>
+              <w:t>Quay chiều thuận (xuôi).</w:t>
+            </w:r>
+          </w:p>
+        </w:tc>
+      </w:tr>
+      <w:tr>
+        <w:tc>
+          <w:tcPr>
+            <w:tcW w:type="dxa" w:w="1806"/>
+          </w:tcPr>
+          <w:p>
+            <w:pPr>
+              <w:spacing w:after="40"/>
+              <w:ind w:firstLine="0"/>
+            </w:pPr>
+            <w:r>
+              <w:rPr>
+                <w:sz w:val="22"/>
+              </w:rPr>
+              <w:t>1 (cao)</w:t>
+            </w:r>
+          </w:p>
+        </w:tc>
+        <w:tc>
+          <w:tcPr>
+            <w:tcW w:type="dxa" w:w="1806"/>
+          </w:tcPr>
+          <w:p>
+            <w:pPr>
+              <w:spacing w:after="40"/>
+              <w:ind w:firstLine="0"/>
+            </w:pPr>
+            <w:r>
+              <w:rPr>
+                <w:sz w:val="22"/>
+              </w:rPr>
+              <w:t>0 (thấp)</w:t>
+            </w:r>
+          </w:p>
+        </w:tc>
+        <w:tc>
+          <w:tcPr>
+            <w:tcW w:type="dxa" w:w="1806"/>
+          </w:tcPr>
+          <w:p>
+            <w:pPr>
+              <w:spacing w:after="40"/>
+              <w:ind w:firstLine="0"/>
+            </w:pPr>
+            <w:r>
+              <w:rPr>
+                <w:sz w:val="22"/>
+              </w:rPr>
+              <w:t>1</w:t>
+            </w:r>
+          </w:p>
+        </w:tc>
+        <w:tc>
+          <w:tcPr>
+            <w:tcW w:type="dxa" w:w="1806"/>
+          </w:tcPr>
+          <w:p>
+            <w:pPr>
+              <w:spacing w:after="40"/>
+              <w:ind w:firstLine="0"/>
+            </w:pPr>
+            <w:r>
+              <w:rPr>
+                <w:sz w:val="22"/>
+              </w:rPr>
+              <w:t>0</w:t>
+            </w:r>
+          </w:p>
+        </w:tc>
+        <w:tc>
+          <w:tcPr>
+            <w:tcW w:type="dxa" w:w="1806"/>
+          </w:tcPr>
+          <w:p>
+            <w:pPr>
+              <w:spacing w:after="40"/>
+              <w:ind w:firstLine="0"/>
+            </w:pPr>
+            <w:r>
+              <w:rPr>
+                <w:sz w:val="22"/>
+              </w:rPr>
+              <w:t>Quay chiều ngược (nguộc).</w:t>
+            </w:r>
+          </w:p>
+        </w:tc>
+      </w:tr>
+      <w:tr>
+        <w:tc>
+          <w:tcPr>
+            <w:tcW w:type="dxa" w:w="1806"/>
+          </w:tcPr>
+          <w:p>
+            <w:pPr>
+              <w:spacing w:after="40"/>
+              <w:ind w:firstLine="0"/>
+            </w:pPr>
+            <w:r>
+              <w:rPr>
+                <w:sz w:val="22"/>
+              </w:rPr>
+              <w:t>1 (cao)</w:t>
+            </w:r>
+          </w:p>
+        </w:tc>
+        <w:tc>
+          <w:tcPr>
+            <w:tcW w:type="dxa" w:w="1806"/>
+          </w:tcPr>
+          <w:p>
+            <w:pPr>
+              <w:spacing w:after="40"/>
+              <w:ind w:firstLine="0"/>
+            </w:pPr>
+            <w:r>
+              <w:rPr>
+                <w:sz w:val="22"/>
+              </w:rPr>
+              <w:t>1 (cao)</w:t>
+            </w:r>
+          </w:p>
+        </w:tc>
+        <w:tc>
+          <w:tcPr>
+            <w:tcW w:type="dxa" w:w="1806"/>
+          </w:tcPr>
+          <w:p>
+            <w:pPr>
+              <w:spacing w:after="40"/>
+              <w:ind w:firstLine="0"/>
+            </w:pPr>
+            <w:r>
+              <w:rPr>
+                <w:sz w:val="22"/>
+              </w:rPr>
+              <w:t>1</w:t>
+            </w:r>
+          </w:p>
+        </w:tc>
+        <w:tc>
+          <w:tcPr>
+            <w:tcW w:type="dxa" w:w="1806"/>
+          </w:tcPr>
+          <w:p>
+            <w:pPr>
+              <w:spacing w:after="40"/>
+              <w:ind w:firstLine="0"/>
+            </w:pPr>
+            <w:r>
+              <w:rPr>
+                <w:sz w:val="22"/>
+              </w:rPr>
+              <w:t>1</w:t>
+            </w:r>
+          </w:p>
+        </w:tc>
+        <w:tc>
+          <w:tcPr>
+            <w:tcW w:type="dxa" w:w="1806"/>
+          </w:tcPr>
+          <w:p>
+            <w:pPr>
+              <w:spacing w:after="40"/>
+              <w:ind w:firstLine="0"/>
+            </w:pPr>
+            <w:r>
+              <w:rPr>
+                <w:sz w:val="22"/>
+              </w:rPr>
+              <w:t>Cầu H khóa, motor tự giữ.</w:t>
+            </w:r>
+          </w:p>
+        </w:tc>
+      </w:tr>
+    </w:tbl>
+    <w:p>
+      <w:pPr/>
+    </w:p>
+    <w:p>
+      <w:pPr>
+        <w:pStyle w:val="Heading2"/>
+      </w:pPr>
+      <w:r>
+        <w:t>2.4. Mạch nguồn, mạch thời gian thực và mạch hiển thị</w:t>
+      </w:r>
+    </w:p>
+    <w:p>
+      <w:pPr>
+        <w:ind w:firstLine="0"/>
+        <w:jc w:val="center"/>
+      </w:pPr>
+      <w:r>
+        <w:drawing>
+          <wp:inline xmlns:a="http://schemas.openxmlformats.org/drawingml/2006/main" xmlns:pic="http://schemas.openxmlformats.org/drawingml/2006/picture">
+            <wp:extent cx="5400000" cy="3071620"/>
+            <wp:docPr id="6" name="Picture 6"/>
+            <wp:cNvGraphicFramePr>
+              <a:graphicFrameLocks noChangeAspect="1"/>
+            </wp:cNvGraphicFramePr>
+            <a:graphic>
+              <a:graphicData uri="http://schemas.openxmlformats.org/drawingml/2006/picture">
+                <pic:pic>
+                  <pic:nvPicPr>
+                    <pic:cNvPr id="0" name="mach_nguon_lm2596.png"/>
+                    <pic:cNvPicPr/>
+                  </pic:nvPicPr>
+                  <pic:blipFill>
+                    <a:blip r:embed="rId15"/>
+                    <a:stretch>
+                      <a:fillRect/>
+                    </a:stretch>
+                  </pic:blipFill>
+                  <pic:spPr>
+                    <a:xfrm>
+                      <a:off x="0" y="0"/>
+                      <a:ext cx="5400000" cy="3071620"/>
+                    </a:xfrm>
+                    <a:prstGeom prst="rect"/>
+                  </pic:spPr>
+                </pic:pic>
+              </a:graphicData>
+            </a:graphic>
+          </wp:inline>
+        </w:drawing>
+      </w:r>
+    </w:p>
+    <w:p>
+      <w:pPr>
+        <w:pStyle w:val="Caption"/>
+      </w:pPr>
+      <w:r>
+        <w:t>Hình 6. Mạch nguồn chống ngược cực và hạ áp LM2596</w:t>
+      </w:r>
+    </w:p>
+    <w:p>
+      <w:pPr>
+        <w:ind w:firstLine="0"/>
+        <w:jc w:val="center"/>
+      </w:pPr>
+      <w:r>
+        <w:drawing>
+          <wp:inline xmlns:a="http://schemas.openxmlformats.org/drawingml/2006/main" xmlns:pic="http://schemas.openxmlformats.org/drawingml/2006/picture">
+            <wp:extent cx="5400000" cy="3374178"/>
+            <wp:docPr id="7" name="Picture 7"/>
+            <wp:cNvGraphicFramePr>
+              <a:graphicFrameLocks noChangeAspect="1"/>
+            </wp:cNvGraphicFramePr>
+            <a:graphic>
+              <a:graphicData uri="http://schemas.openxmlformats.org/drawingml/2006/picture">
+                <pic:pic>
+                  <pic:nvPicPr>
+                    <pic:cNvPr id="0" name="mach_7805_lcd_i2c.png"/>
+                    <pic:cNvPicPr/>
+                  </pic:nvPicPr>
+                  <pic:blipFill>
+                    <a:blip r:embed="rId16"/>
+                    <a:stretch>
+                      <a:fillRect/>
+                    </a:stretch>
+                  </pic:blipFill>
+                  <pic:spPr>
+                    <a:xfrm>
+                      <a:off x="0" y="0"/>
+                      <a:ext cx="5400000" cy="3374178"/>
+                    </a:xfrm>
+                    <a:prstGeom prst="rect"/>
+                  </pic:spPr>
+                </pic:pic>
+              </a:graphicData>
+            </a:graphic>
+          </wp:inline>
+        </w:drawing>
+      </w:r>
+    </w:p>
+    <w:p>
+      <w:pPr>
+        <w:pStyle w:val="Caption"/>
+      </w:pPr>
+      <w:r>
+        <w:t>Hình 7. Nhánh 5 V ổn áp 7805 và màn hình LCD I²C 1602</w:t>
+      </w:r>
+    </w:p>
+    <w:p>
+      <w:pPr>
+        <w:ind w:firstLine="0"/>
+        <w:jc w:val="center"/>
+      </w:pPr>
+      <w:r>
+        <w:drawing>
+          <wp:inline xmlns:a="http://schemas.openxmlformats.org/drawingml/2006/main" xmlns:pic="http://schemas.openxmlformats.org/drawingml/2006/picture">
+            <wp:extent cx="4860000" cy="2928542"/>
+            <wp:docPr id="8" name="Picture 8"/>
+            <wp:cNvGraphicFramePr>
+              <a:graphicFrameLocks noChangeAspect="1"/>
+            </wp:cNvGraphicFramePr>
+            <a:graphic>
+              <a:graphicData uri="http://schemas.openxmlformats.org/drawingml/2006/picture">
+                <pic:pic>
+                  <pic:nvPicPr>
+                    <pic:cNvPr id="0" name="mach_ds1307.png"/>
+                    <pic:cNvPicPr/>
+                  </pic:nvPicPr>
+                  <pic:blipFill>
+                    <a:blip r:embed="rId20"/>
+                    <a:stretch>
+                      <a:fillRect/>
+                    </a:stretch>
+                  </pic:blipFill>
+                  <pic:spPr>
+                    <a:xfrm>
+                      <a:off x="0" y="0"/>
+                      <a:ext cx="4860000" cy="2928542"/>
+                    </a:xfrm>
+                    <a:prstGeom prst="rect"/>
+                  </pic:spPr>
+                </pic:pic>
+              </a:graphicData>
+            </a:graphic>
+          </wp:inline>
+        </w:drawing>
+      </w:r>
+    </w:p>
+    <w:p>
+      <w:pPr>
+        <w:pStyle w:val="Caption"/>
+      </w:pPr>
+      <w:r>
+        <w:t>Hình 8. Module thời gian thực DS1307 trên bus I²C</w:t>
+      </w:r>
+    </w:p>
+    <w:p>
+      <w:pPr/>
+      <w:r>
+        <w:t>Nguồn 12 V vào qua diode 1N4007 chống ngược cực rồi tách ba nhánh: nhánh 12 V thẳng vào cầu H cho motor; nhánh LM2596 hạ xuống 3,3 V nuôi ESP32; nhánh 7805 hạ xuống 5 V nuôi LCD và DS1307, có tụ 220 µF lọc hai đầu. DS1307 có pin nuôi nên giữ đúng ngày giờ cả khi tắt máy; LCD 1602 giao tiếp qua mạch chuyển I²C PCF8574 nên chỉ tốn hai chân SDA/SCL.</w:t>
+      </w:r>
+    </w:p>
+    <w:p>
+      <w:pPr>
+        <w:pStyle w:val="Heading2"/>
+      </w:pPr>
+      <w:r>
+        <w:t>2.5. Mạch công tắc hành trình</w:t>
+      </w:r>
+    </w:p>
+    <w:p>
+      <w:pPr>
+        <w:ind w:firstLine="0"/>
+        <w:jc w:val="center"/>
+      </w:pPr>
+      <w:r>
+        <w:drawing>
+          <wp:inline xmlns:a="http://schemas.openxmlformats.org/drawingml/2006/main" xmlns:pic="http://schemas.openxmlformats.org/drawingml/2006/picture">
+            <wp:extent cx="5400000" cy="3680024"/>
+            <wp:docPr id="9" name="Picture 9"/>
+            <wp:cNvGraphicFramePr>
+              <a:graphicFrameLocks noChangeAspect="1"/>
+            </wp:cNvGraphicFramePr>
+            <a:graphic>
+              <a:graphicData uri="http://schemas.openxmlformats.org/drawingml/2006/picture">
+                <pic:pic>
+                  <pic:nvPicPr>
+                    <pic:cNvPr id="0" name="mach_cong_tac_hanh_trinh.png"/>
+                    <pic:cNvPicPr/>
+                  </pic:nvPicPr>
+                  <pic:blipFill>
+                    <a:blip r:embed="rId21"/>
+                    <a:stretch>
+                      <a:fillRect/>
+                    </a:stretch>
+                  </pic:blipFill>
+                  <pic:spPr>
+                    <a:xfrm>
+                      <a:off x="0" y="0"/>
+                      <a:ext cx="5400000" cy="3680024"/>
+                    </a:xfrm>
+                    <a:prstGeom prst="rect"/>
+                  </pic:spPr>
+                </pic:pic>
+              </a:graphicData>
+            </a:graphic>
+          </wp:inline>
+        </w:drawing>
+      </w:r>
+    </w:p>
+    <w:p>
+      <w:pPr>
+        <w:pStyle w:val="Caption"/>
+      </w:pPr>
+      <w:r>
+        <w:t>Hình 9. Bốn công tắc hành trình kéo xuống 1k</w:t>
+      </w:r>
+    </w:p>
+    <w:p>
+      <w:pPr/>
+      <w:r>
+        <w:t>Mỗi công tắc một đầu nối 3,3 V, đầu còn lại kéo xuống mass qua trở 1k: công tắc hở đọc mức 0, chạm hành trình đọc mức 1. Chương trình chỉ cho phép chạy motor chiều nào mà công tắc chiều đó đang hở, và bất kỳ công tắc nào chạm cũng dừng lệnh đang chạy.</w:t>
+      </w:r>
+    </w:p>
+    <w:p>
+      <w:pPr>
+        <w:pStyle w:val="Heading2"/>
+      </w:pPr>
+      <w:r>
+        <w:t>2.6. Kết cấu cơ khí</w:t>
+      </w:r>
+    </w:p>
+    <w:p>
+      <w:pPr/>
+      <w:r>
+        <w:t>Khung đế thép phẳng có bulông cân bằng; hai gối đỡ mang trục thép tròn quay Bắc–Nam có bạc lót; khung nhôm bắt tấm pin 100 W đối xứng qua trục để mô-men tĩnh gần bằng 0. Tay đòn nối trục ra motor có khớp bản lề khử sai lệch quỹ đạo; biến trở hồi tiếp gắn đồng trục với trục quay; bốn công tắc hành trình gá ở giá sao cho cần gạt chạm trước khi khung pin va gối đỡ. Bản vẽ chi tiết cơ khí đang được vẽ lại và sẽ bổ sung vào mục này.</w:t>
+      </w:r>
+    </w:p>
+    <w:p>
+      <w:pPr>
+        <w:pStyle w:val="Heading2"/>
+      </w:pPr>
+      <w:r>
+        <w:t>2.7. Danh mục vật tư và linh kiện</w:t>
+      </w:r>
+    </w:p>
+    <w:p>
+      <w:pPr>
+        <w:pStyle w:val="Caption"/>
+        <w:spacing w:after="80"/>
+      </w:pPr>
+      <w:r>
+        <w:t>Bảng 5. Danh mục vật tư – linh kiện của mô hình một trục</w:t>
       </w:r>
     </w:p>
     <w:tbl>
@@ -2068,7 +2827,7 @@
               <w:rPr>
                 <w:sz w:val="22"/>
               </w:rPr>
-              <w:t>Điện trở chia áp LDR</w:t>
+              <w:t>Vách che giữa</w:t>
             </w:r>
           </w:p>
         </w:tc>
@@ -2085,77 +2844,7 @@
               <w:rPr>
                 <w:sz w:val="22"/>
               </w:rPr>
-              <w:t>10 kΩ</w:t>
-            </w:r>
-          </w:p>
-        </w:tc>
-        <w:tc>
-          <w:tcPr>
-            <w:tcW w:type="dxa" w:w="2257"/>
-          </w:tcPr>
-          <w:p>
-            <w:pPr>
-              <w:spacing w:after="40"/>
-              <w:ind w:firstLine="0"/>
-            </w:pPr>
-            <w:r>
-              <w:rPr>
-                <w:sz w:val="22"/>
-              </w:rPr>
-              <w:t>4</w:t>
-            </w:r>
-          </w:p>
-        </w:tc>
-      </w:tr>
-      <w:tr>
-        <w:tc>
-          <w:tcPr>
-            <w:tcW w:type="dxa" w:w="2257"/>
-          </w:tcPr>
-          <w:p>
-            <w:pPr>
-              <w:spacing w:after="40"/>
-              <w:ind w:firstLine="0"/>
-            </w:pPr>
-            <w:r>
-              <w:rPr>
-                <w:sz w:val="22"/>
-              </w:rPr>
-              <w:t>4</w:t>
-            </w:r>
-          </w:p>
-        </w:tc>
-        <w:tc>
-          <w:tcPr>
-            <w:tcW w:type="dxa" w:w="2257"/>
-          </w:tcPr>
-          <w:p>
-            <w:pPr>
-              <w:spacing w:after="40"/>
-              <w:ind w:firstLine="0"/>
-            </w:pPr>
-            <w:r>
-              <w:rPr>
-                <w:sz w:val="22"/>
-              </w:rPr>
-              <w:t>Biến trở hồi tiếp góc</w:t>
-            </w:r>
-          </w:p>
-        </w:tc>
-        <w:tc>
-          <w:tcPr>
-            <w:tcW w:type="dxa" w:w="2257"/>
-          </w:tcPr>
-          <w:p>
-            <w:pPr>
-              <w:spacing w:after="40"/>
-              <w:ind w:firstLine="0"/>
-            </w:pPr>
-            <w:r>
-              <w:rPr>
-                <w:sz w:val="22"/>
-              </w:rPr>
-              <w:t>10 kΩ xoay</w:t>
+              <w:t>Nhôm tấm cao 3 cm</w:t>
             </w:r>
           </w:p>
         </w:tc>
@@ -2191,7 +2880,7 @@
               <w:rPr>
                 <w:sz w:val="22"/>
               </w:rPr>
-              <w:t>5</w:t>
+              <w:t>4</w:t>
             </w:r>
           </w:p>
         </w:tc>
@@ -2261,7 +2950,7 @@
               <w:rPr>
                 <w:sz w:val="22"/>
               </w:rPr>
-              <w:t>6</w:t>
+              <w:t>5</w:t>
             </w:r>
           </w:p>
         </w:tc>
@@ -2331,7 +3020,7 @@
               <w:rPr>
                 <w:sz w:val="22"/>
               </w:rPr>
-              <w:t>7</w:t>
+              <w:t>6</w:t>
             </w:r>
           </w:p>
         </w:tc>
@@ -2365,7 +3054,77 @@
               <w:rPr>
                 <w:sz w:val="22"/>
               </w:rPr>
-              <w:t>LCD 1602 kèm mạch I²C</w:t>
+              <w:t>LCD 1602 + PCF8574 I²C</w:t>
+            </w:r>
+          </w:p>
+        </w:tc>
+        <w:tc>
+          <w:tcPr>
+            <w:tcW w:type="dxa" w:w="2257"/>
+          </w:tcPr>
+          <w:p>
+            <w:pPr>
+              <w:spacing w:after="40"/>
+              <w:ind w:firstLine="0"/>
+            </w:pPr>
+            <w:r>
+              <w:rPr>
+                <w:sz w:val="22"/>
+              </w:rPr>
+              <w:t>1</w:t>
+            </w:r>
+          </w:p>
+        </w:tc>
+      </w:tr>
+      <w:tr>
+        <w:tc>
+          <w:tcPr>
+            <w:tcW w:type="dxa" w:w="2257"/>
+          </w:tcPr>
+          <w:p>
+            <w:pPr>
+              <w:spacing w:after="40"/>
+              <w:ind w:firstLine="0"/>
+            </w:pPr>
+            <w:r>
+              <w:rPr>
+                <w:sz w:val="22"/>
+              </w:rPr>
+              <w:t>7</w:t>
+            </w:r>
+          </w:p>
+        </w:tc>
+        <w:tc>
+          <w:tcPr>
+            <w:tcW w:type="dxa" w:w="2257"/>
+          </w:tcPr>
+          <w:p>
+            <w:pPr>
+              <w:spacing w:after="40"/>
+              <w:ind w:firstLine="0"/>
+            </w:pPr>
+            <w:r>
+              <w:rPr>
+                <w:sz w:val="22"/>
+              </w:rPr>
+              <w:t>Biến trở hồi tiếp</w:t>
+            </w:r>
+          </w:p>
+        </w:tc>
+        <w:tc>
+          <w:tcPr>
+            <w:tcW w:type="dxa" w:w="2257"/>
+          </w:tcPr>
+          <w:p>
+            <w:pPr>
+              <w:spacing w:after="40"/>
+              <w:ind w:firstLine="0"/>
+            </w:pPr>
+            <w:r>
+              <w:rPr>
+                <w:sz w:val="22"/>
+              </w:rPr>
+              <w:t>Xoay 10 k</w:t>
             </w:r>
           </w:p>
         </w:tc>
@@ -2418,6 +3177,76 @@
               <w:rPr>
                 <w:sz w:val="22"/>
               </w:rPr>
+              <w:t>Opto cách ly</w:t>
+            </w:r>
+          </w:p>
+        </w:tc>
+        <w:tc>
+          <w:tcPr>
+            <w:tcW w:type="dxa" w:w="2257"/>
+          </w:tcPr>
+          <w:p>
+            <w:pPr>
+              <w:spacing w:after="40"/>
+              <w:ind w:firstLine="0"/>
+            </w:pPr>
+            <w:r>
+              <w:rPr>
+                <w:sz w:val="22"/>
+              </w:rPr>
+              <w:t>PC817C + trở 220 Ω</w:t>
+            </w:r>
+          </w:p>
+        </w:tc>
+        <w:tc>
+          <w:tcPr>
+            <w:tcW w:type="dxa" w:w="2257"/>
+          </w:tcPr>
+          <w:p>
+            <w:pPr>
+              <w:spacing w:after="40"/>
+              <w:ind w:firstLine="0"/>
+            </w:pPr>
+            <w:r>
+              <w:rPr>
+                <w:sz w:val="22"/>
+              </w:rPr>
+              <w:t>2</w:t>
+            </w:r>
+          </w:p>
+        </w:tc>
+      </w:tr>
+      <w:tr>
+        <w:tc>
+          <w:tcPr>
+            <w:tcW w:type="dxa" w:w="2257"/>
+          </w:tcPr>
+          <w:p>
+            <w:pPr>
+              <w:spacing w:after="40"/>
+              <w:ind w:firstLine="0"/>
+            </w:pPr>
+            <w:r>
+              <w:rPr>
+                <w:sz w:val="22"/>
+              </w:rPr>
+              <w:t>9</w:t>
+            </w:r>
+          </w:p>
+        </w:tc>
+        <w:tc>
+          <w:tcPr>
+            <w:tcW w:type="dxa" w:w="2257"/>
+          </w:tcPr>
+          <w:p>
+            <w:pPr>
+              <w:spacing w:after="40"/>
+              <w:ind w:firstLine="0"/>
+            </w:pPr>
+            <w:r>
+              <w:rPr>
+                <w:sz w:val="22"/>
+              </w:rPr>
               <w:t>Transistor công suất</w:t>
             </w:r>
           </w:p>
@@ -2435,7 +3264,7 @@
               <w:rPr>
                 <w:sz w:val="22"/>
               </w:rPr>
-              <w:t>TIP41C</w:t>
+              <w:t>TIP41C TO-220 + tản nhiệt</w:t>
             </w:r>
           </w:p>
         </w:tc>
@@ -2471,76 +3300,6 @@
               <w:rPr>
                 <w:sz w:val="22"/>
               </w:rPr>
-              <w:t>9</w:t>
-            </w:r>
-          </w:p>
-        </w:tc>
-        <w:tc>
-          <w:tcPr>
-            <w:tcW w:type="dxa" w:w="2257"/>
-          </w:tcPr>
-          <w:p>
-            <w:pPr>
-              <w:spacing w:after="40"/>
-              <w:ind w:firstLine="0"/>
-            </w:pPr>
-            <w:r>
-              <w:rPr>
-                <w:sz w:val="22"/>
-              </w:rPr>
-              <w:t>Opto cách ly</w:t>
-            </w:r>
-          </w:p>
-        </w:tc>
-        <w:tc>
-          <w:tcPr>
-            <w:tcW w:type="dxa" w:w="2257"/>
-          </w:tcPr>
-          <w:p>
-            <w:pPr>
-              <w:spacing w:after="40"/>
-              <w:ind w:firstLine="0"/>
-            </w:pPr>
-            <w:r>
-              <w:rPr>
-                <w:sz w:val="22"/>
-              </w:rPr>
-              <w:t>PC817C</w:t>
-            </w:r>
-          </w:p>
-        </w:tc>
-        <w:tc>
-          <w:tcPr>
-            <w:tcW w:type="dxa" w:w="2257"/>
-          </w:tcPr>
-          <w:p>
-            <w:pPr>
-              <w:spacing w:after="40"/>
-              <w:ind w:firstLine="0"/>
-            </w:pPr>
-            <w:r>
-              <w:rPr>
-                <w:sz w:val="22"/>
-              </w:rPr>
-              <w:t>2</w:t>
-            </w:r>
-          </w:p>
-        </w:tc>
-      </w:tr>
-      <w:tr>
-        <w:tc>
-          <w:tcPr>
-            <w:tcW w:type="dxa" w:w="2257"/>
-          </w:tcPr>
-          <w:p>
-            <w:pPr>
-              <w:spacing w:after="40"/>
-              <w:ind w:firstLine="0"/>
-            </w:pPr>
-            <w:r>
-              <w:rPr>
-                <w:sz w:val="22"/>
-              </w:rPr>
               <w:t>10</w:t>
             </w:r>
           </w:p>
@@ -2558,7 +3317,7 @@
               <w:rPr>
                 <w:sz w:val="22"/>
               </w:rPr>
-              <w:t>Diode</w:t>
+              <w:t>Diode bảo vệ / chống ngược</w:t>
             </w:r>
           </w:p>
         </w:tc>
@@ -2575,7 +3334,7 @@
               <w:rPr>
                 <w:sz w:val="22"/>
               </w:rPr>
-              <w:t>1N4007 và 4 diode bảo vệ cầu H</w:t>
+              <w:t>1N5408 (4 cái), 1N4007 (1 cái)</w:t>
             </w:r>
           </w:p>
         </w:tc>
@@ -2592,7 +3351,7 @@
               <w:rPr>
                 <w:sz w:val="22"/>
               </w:rPr>
-              <w:t>1 bộ</w:t>
+              <w:t>5</w:t>
             </w:r>
           </w:p>
         </w:tc>
@@ -2645,7 +3404,7 @@
               <w:rPr>
                 <w:sz w:val="22"/>
               </w:rPr>
-              <w:t>LM2596 (3,3 V) và 7805 (5 V)</w:t>
+              <w:t>LM2596 (3,3 V), 7805 (5 V)</w:t>
             </w:r>
           </w:p>
         </w:tc>
@@ -2662,7 +3421,7 @@
               <w:rPr>
                 <w:sz w:val="22"/>
               </w:rPr>
-              <w:t>1 bộ</w:t>
+              <w:t>1+1</w:t>
             </w:r>
           </w:p>
         </w:tc>
@@ -2768,7 +3527,7 @@
               <w:rPr>
                 <w:sz w:val="22"/>
               </w:rPr>
-              <w:t>Điện trở tín hiệu</w:t>
+              <w:t>Điện trở</w:t>
             </w:r>
           </w:p>
         </w:tc>
@@ -2785,7 +3544,7 @@
               <w:rPr>
                 <w:sz w:val="22"/>
               </w:rPr>
-              <w:t>220 Ω (opto), 1 kΩ (hành trình)</w:t>
+              <w:t>10 k, 1 k, 220 Ω</w:t>
             </w:r>
           </w:p>
         </w:tc>
@@ -2822,76 +3581,6 @@
                 <w:sz w:val="22"/>
               </w:rPr>
               <w:t>14</w:t>
-            </w:r>
-          </w:p>
-        </w:tc>
-        <w:tc>
-          <w:tcPr>
-            <w:tcW w:type="dxa" w:w="2257"/>
-          </w:tcPr>
-          <w:p>
-            <w:pPr>
-              <w:spacing w:after="40"/>
-              <w:ind w:firstLine="0"/>
-            </w:pPr>
-            <w:r>
-              <w:rPr>
-                <w:sz w:val="22"/>
-              </w:rPr>
-              <w:t>Công tắc hành trình</w:t>
-            </w:r>
-          </w:p>
-        </w:tc>
-        <w:tc>
-          <w:tcPr>
-            <w:tcW w:type="dxa" w:w="2257"/>
-          </w:tcPr>
-          <w:p>
-            <w:pPr>
-              <w:spacing w:after="40"/>
-              <w:ind w:firstLine="0"/>
-            </w:pPr>
-            <w:r>
-              <w:rPr>
-                <w:sz w:val="22"/>
-              </w:rPr>
-              <w:t>Loại cần gạt</w:t>
-            </w:r>
-          </w:p>
-        </w:tc>
-        <w:tc>
-          <w:tcPr>
-            <w:tcW w:type="dxa" w:w="2257"/>
-          </w:tcPr>
-          <w:p>
-            <w:pPr>
-              <w:spacing w:after="40"/>
-              <w:ind w:firstLine="0"/>
-            </w:pPr>
-            <w:r>
-              <w:rPr>
-                <w:sz w:val="22"/>
-              </w:rPr>
-              <w:t>2</w:t>
-            </w:r>
-          </w:p>
-        </w:tc>
-      </w:tr>
-      <w:tr>
-        <w:tc>
-          <w:tcPr>
-            <w:tcW w:type="dxa" w:w="2257"/>
-          </w:tcPr>
-          <w:p>
-            <w:pPr>
-              <w:spacing w:after="40"/>
-              <w:ind w:firstLine="0"/>
-            </w:pPr>
-            <w:r>
-              <w:rPr>
-                <w:sz w:val="22"/>
-              </w:rPr>
-              <w:t>15</w:t>
             </w:r>
           </w:p>
         </w:tc>
@@ -2961,6 +3650,76 @@
               <w:rPr>
                 <w:sz w:val="22"/>
               </w:rPr>
+              <w:t>15</w:t>
+            </w:r>
+          </w:p>
+        </w:tc>
+        <w:tc>
+          <w:tcPr>
+            <w:tcW w:type="dxa" w:w="2257"/>
+          </w:tcPr>
+          <w:p>
+            <w:pPr>
+              <w:spacing w:after="40"/>
+              <w:ind w:firstLine="0"/>
+            </w:pPr>
+            <w:r>
+              <w:rPr>
+                <w:sz w:val="22"/>
+              </w:rPr>
+              <w:t>Công tắc hành trình</w:t>
+            </w:r>
+          </w:p>
+        </w:tc>
+        <w:tc>
+          <w:tcPr>
+            <w:tcW w:type="dxa" w:w="2257"/>
+          </w:tcPr>
+          <w:p>
+            <w:pPr>
+              <w:spacing w:after="40"/>
+              <w:ind w:firstLine="0"/>
+            </w:pPr>
+            <w:r>
+              <w:rPr>
+                <w:sz w:val="22"/>
+              </w:rPr>
+              <w:t>Kéo xuống 1k</w:t>
+            </w:r>
+          </w:p>
+        </w:tc>
+        <w:tc>
+          <w:tcPr>
+            <w:tcW w:type="dxa" w:w="2257"/>
+          </w:tcPr>
+          <w:p>
+            <w:pPr>
+              <w:spacing w:after="40"/>
+              <w:ind w:firstLine="0"/>
+            </w:pPr>
+            <w:r>
+              <w:rPr>
+                <w:sz w:val="22"/>
+              </w:rPr>
+              <w:t>4</w:t>
+            </w:r>
+          </w:p>
+        </w:tc>
+      </w:tr>
+      <w:tr>
+        <w:tc>
+          <w:tcPr>
+            <w:tcW w:type="dxa" w:w="2257"/>
+          </w:tcPr>
+          <w:p>
+            <w:pPr>
+              <w:spacing w:after="40"/>
+              <w:ind w:firstLine="0"/>
+            </w:pPr>
+            <w:r>
+              <w:rPr>
+                <w:sz w:val="22"/>
+              </w:rPr>
               <w:t>16</w:t>
             </w:r>
           </w:p>
@@ -2978,7 +3737,7 @@
               <w:rPr>
                 <w:sz w:val="22"/>
               </w:rPr>
-              <w:t>Giảm tốc ngoài</w:t>
+              <w:t>Nguồn</w:t>
             </w:r>
           </w:p>
         </w:tc>
@@ -2995,7 +3754,7 @@
               <w:rPr>
                 <w:sz w:val="22"/>
               </w:rPr>
-              <w:t>Tỷ số 1:3 (đai hoặc trục vít)</w:t>
+              <w:t>Ắc quy/nguồn 12 V 10 A + cầu chì 5 A</w:t>
             </w:r>
           </w:p>
         </w:tc>
@@ -3012,7 +3771,7 @@
               <w:rPr>
                 <w:sz w:val="22"/>
               </w:rPr>
-              <w:t>1</w:t>
+              <w:t>1 bộ</w:t>
             </w:r>
           </w:p>
         </w:tc>
@@ -3048,7 +3807,7 @@
               <w:rPr>
                 <w:sz w:val="22"/>
               </w:rPr>
-              <w:t>Nguồn</w:t>
+              <w:t>Cơ khí</w:t>
             </w:r>
           </w:p>
         </w:tc>
@@ -3065,77 +3824,7 @@
               <w:rPr>
                 <w:sz w:val="22"/>
               </w:rPr>
-              <w:t>12 V 10 A kèm đầu nối X1</w:t>
-            </w:r>
-          </w:p>
-        </w:tc>
-        <w:tc>
-          <w:tcPr>
-            <w:tcW w:type="dxa" w:w="2257"/>
-          </w:tcPr>
-          <w:p>
-            <w:pPr>
-              <w:spacing w:after="40"/>
-              <w:ind w:firstLine="0"/>
-            </w:pPr>
-            <w:r>
-              <w:rPr>
-                <w:sz w:val="22"/>
-              </w:rPr>
-              <w:t>1</w:t>
-            </w:r>
-          </w:p>
-        </w:tc>
-      </w:tr>
-      <w:tr>
-        <w:tc>
-          <w:tcPr>
-            <w:tcW w:type="dxa" w:w="2257"/>
-          </w:tcPr>
-          <w:p>
-            <w:pPr>
-              <w:spacing w:after="40"/>
-              <w:ind w:firstLine="0"/>
-            </w:pPr>
-            <w:r>
-              <w:rPr>
-                <w:sz w:val="22"/>
-              </w:rPr>
-              <w:t>18</w:t>
-            </w:r>
-          </w:p>
-        </w:tc>
-        <w:tc>
-          <w:tcPr>
-            <w:tcW w:type="dxa" w:w="2257"/>
-          </w:tcPr>
-          <w:p>
-            <w:pPr>
-              <w:spacing w:after="40"/>
-              <w:ind w:firstLine="0"/>
-            </w:pPr>
-            <w:r>
-              <w:rPr>
-                <w:sz w:val="22"/>
-              </w:rPr>
-              <w:t>Cơ khí và phụ trợ</w:t>
-            </w:r>
-          </w:p>
-        </w:tc>
-        <w:tc>
-          <w:tcPr>
-            <w:tcW w:type="dxa" w:w="2257"/>
-          </w:tcPr>
-          <w:p>
-            <w:pPr>
-              <w:spacing w:after="40"/>
-              <w:ind w:firstLine="0"/>
-            </w:pPr>
-            <w:r>
-              <w:rPr>
-                <w:sz w:val="22"/>
-              </w:rPr>
-              <w:t>Trục, gối đỡ, nhôm hộp, ốc vít, dây</w:t>
+              <w:t>Trục thép, gối đỡ, nhôm khung, ốc vít</w:t>
             </w:r>
           </w:p>
         </w:tc>
@@ -3166,7 +3855,7 @@
         <w:pStyle w:val="Heading1"/>
       </w:pPr>
       <w:r>
-        <w:t>CHƯƠNG 3. CHẾ TẠO MẠCH, HIỆU CHUẨN VÀ ĐO ĐẠC</w:t>
+        <w:t>CHƯƠNG 3. LẮP RÁP, HIỆU CHUẨN VÀ ĐO ĐẠC</w:t>
       </w:r>
     </w:p>
     <w:p>
@@ -3174,349 +3863,55 @@
         <w:pStyle w:val="Heading2"/>
       </w:pPr>
       <w:r>
-        <w:t>3.1. Thiết kế mạch trên EasyEDA</w:t>
-      </w:r>
-    </w:p>
-    <w:p>
-      <w:pPr/>
-      <w:r>
-        <w:t>Toàn bộ mạch được vẽ và kiểm tra footprint bằng EasyEDA, tách thành bảy khối riêng để dễ rà lỗi và dễ hàn: mạch động lực cầu H, mạch cách ly opto, mạch công tắc hành trình, khối ESP32, mạch nguồn LM2596, nhánh 5 V với LCD và module DS1307. Các hình dưới đây là bản vẽ lại của bảy khối đó.</w:t>
+        <w:t>3.1. Quy trình lắp ráp đã thực hiện</w:t>
       </w:r>
     </w:p>
     <w:p>
       <w:pPr>
-        <w:ind w:firstLine="0"/>
-        <w:jc w:val="center"/>
+        <w:pStyle w:val="ListBullet"/>
       </w:pPr>
       <w:r>
-        <w:drawing>
-          <wp:inline xmlns:a="http://schemas.openxmlformats.org/drawingml/2006/main" xmlns:pic="http://schemas.openxmlformats.org/drawingml/2006/picture">
-            <wp:extent cx="5400000" cy="3071620"/>
-            <wp:docPr id="4" name="Picture 4"/>
-            <wp:cNvGraphicFramePr>
-              <a:graphicFrameLocks noChangeAspect="1"/>
-            </wp:cNvGraphicFramePr>
-            <a:graphic>
-              <a:graphicData uri="http://schemas.openxmlformats.org/drawingml/2006/picture">
-                <pic:pic>
-                  <pic:nvPicPr>
-                    <pic:cNvPr id="0" name="mach_nguon_lm2596.png"/>
-                    <pic:cNvPicPr/>
-                  </pic:nvPicPr>
-                  <pic:blipFill>
-                    <a:blip r:embed="rId13"/>
-                    <a:stretch>
-                      <a:fillRect/>
-                    </a:stretch>
-                  </pic:blipFill>
-                  <pic:spPr>
-                    <a:xfrm>
-                      <a:off x="0" y="0"/>
-                      <a:ext cx="5400000" cy="3071620"/>
-                    </a:xfrm>
-                    <a:prstGeom prst="rect"/>
-                  </pic:spPr>
-                </pic:pic>
-              </a:graphicData>
-            </a:graphic>
-          </wp:inline>
-        </w:drawing>
+        <w:t>Hoàn thành thử bench mạch động lực: cấp 12 V giả tải, kiểm tra bảng trạng thái cầu H đúng như thiết kế, đo sụt áp TIP41C khi dẫn dưới 1,5 V ở 4 A.</w:t>
       </w:r>
     </w:p>
     <w:p>
       <w:pPr>
-        <w:pStyle w:val="Caption"/>
+        <w:pStyle w:val="ListBullet"/>
       </w:pPr>
       <w:r>
-        <w:t>Hình 4. Khối nguồn: chống ngược cực 1N4007 và hạ áp LM2596 xuống 3,3 V</w:t>
+        <w:t>Hoàn thành hàn mạch nguồn: kiểm tra đầu ra LM2596 đạt 3,3 V và 7805 đạt 5 V trước khi cắm ESP32 và LCD.</w:t>
       </w:r>
     </w:p>
     <w:p>
       <w:pPr>
-        <w:ind w:firstLine="0"/>
-        <w:jc w:val="center"/>
+        <w:pStyle w:val="ListBullet"/>
       </w:pPr>
       <w:r>
-        <w:drawing>
-          <wp:inline xmlns:a="http://schemas.openxmlformats.org/drawingml/2006/main" xmlns:pic="http://schemas.openxmlformats.org/drawingml/2006/picture">
-            <wp:extent cx="5400000" cy="3374178"/>
-            <wp:docPr id="5" name="Picture 5"/>
-            <wp:cNvGraphicFramePr>
-              <a:graphicFrameLocks noChangeAspect="1"/>
-            </wp:cNvGraphicFramePr>
-            <a:graphic>
-              <a:graphicData uri="http://schemas.openxmlformats.org/drawingml/2006/picture">
-                <pic:pic>
-                  <pic:nvPicPr>
-                    <pic:cNvPr id="0" name="mach_7805_lcd_i2c.png"/>
-                    <pic:cNvPicPr/>
-                  </pic:nvPicPr>
-                  <pic:blipFill>
-                    <a:blip r:embed="rId14"/>
-                    <a:stretch>
-                      <a:fillRect/>
-                    </a:stretch>
-                  </pic:blipFill>
-                  <pic:spPr>
-                    <a:xfrm>
-                      <a:off x="0" y="0"/>
-                      <a:ext cx="5400000" cy="3374178"/>
-                    </a:xfrm>
-                    <a:prstGeom prst="rect"/>
-                  </pic:spPr>
-                </pic:pic>
-              </a:graphicData>
-            </a:graphic>
-          </wp:inline>
-        </w:drawing>
+        <w:t>Hoàn thành lắp cụm bốn LDR và vách che lên khung pin; chụp ảnh đối chiếu bố trí với sơ đồ.</w:t>
       </w:r>
     </w:p>
     <w:p>
       <w:pPr>
-        <w:pStyle w:val="Caption"/>
+        <w:pStyle w:val="ListBullet"/>
       </w:pPr>
       <w:r>
-        <w:t>Hình 5. Nhánh 5 V: ổn áp 7805 và màn hình LCD I²C 1602</w:t>
+        <w:t>Hoàn thành lắp trục, gối đỡ, tay đòn motor và biến trở hồi tiếp đồng trục; quay trơn toàn hành trình bằng tay.</w:t>
       </w:r>
     </w:p>
     <w:p>
       <w:pPr>
-        <w:ind w:firstLine="0"/>
-        <w:jc w:val="center"/>
+        <w:pStyle w:val="ListBullet"/>
       </w:pPr>
       <w:r>
-        <w:drawing>
-          <wp:inline xmlns:a="http://schemas.openxmlformats.org/drawingml/2006/main" xmlns:pic="http://schemas.openxmlformats.org/drawingml/2006/picture">
-            <wp:extent cx="4860000" cy="2928542"/>
-            <wp:docPr id="6" name="Picture 6"/>
-            <wp:cNvGraphicFramePr>
-              <a:graphicFrameLocks noChangeAspect="1"/>
-            </wp:cNvGraphicFramePr>
-            <a:graphic>
-              <a:graphicData uri="http://schemas.openxmlformats.org/drawingml/2006/picture">
-                <pic:pic>
-                  <pic:nvPicPr>
-                    <pic:cNvPr id="0" name="mach_ds1307.png"/>
-                    <pic:cNvPicPr/>
-                  </pic:nvPicPr>
-                  <pic:blipFill>
-                    <a:blip r:embed="rId15"/>
-                    <a:stretch>
-                      <a:fillRect/>
-                    </a:stretch>
-                  </pic:blipFill>
-                  <pic:spPr>
-                    <a:xfrm>
-                      <a:off x="0" y="0"/>
-                      <a:ext cx="4860000" cy="2928542"/>
-                    </a:xfrm>
-                    <a:prstGeom prst="rect"/>
-                  </pic:spPr>
-                </pic:pic>
-              </a:graphicData>
-            </a:graphic>
-          </wp:inline>
-        </w:drawing>
+        <w:t>Hoàn thành đấu nối theo sheet ESP32; đo thông mạch từng mạng qt1–qt4, th_thuan/th_nguoc, sda/scl trước khi cấp nguồn.</w:t>
       </w:r>
     </w:p>
     <w:p>
       <w:pPr>
-        <w:pStyle w:val="Caption"/>
+        <w:pStyle w:val="ListBullet"/>
       </w:pPr>
       <w:r>
-        <w:t>Hình 6. Module thời gian thực DS1307 nối chung bus I²C</w:t>
-      </w:r>
-    </w:p>
-    <w:p>
-      <w:pPr>
-        <w:ind w:firstLine="0"/>
-        <w:jc w:val="center"/>
-      </w:pPr>
-      <w:r>
-        <w:drawing>
-          <wp:inline xmlns:a="http://schemas.openxmlformats.org/drawingml/2006/main" xmlns:pic="http://schemas.openxmlformats.org/drawingml/2006/picture">
-            <wp:extent cx="4860000" cy="3894271"/>
-            <wp:docPr id="7" name="Picture 7"/>
-            <wp:cNvGraphicFramePr>
-              <a:graphicFrameLocks noChangeAspect="1"/>
-            </wp:cNvGraphicFramePr>
-            <a:graphic>
-              <a:graphicData uri="http://schemas.openxmlformats.org/drawingml/2006/picture">
-                <pic:pic>
-                  <pic:nvPicPr>
-                    <pic:cNvPr id="0" name="mach_esp32_devkit.png"/>
-                    <pic:cNvPicPr/>
-                  </pic:nvPicPr>
-                  <pic:blipFill>
-                    <a:blip r:embed="rId16"/>
-                    <a:stretch>
-                      <a:fillRect/>
-                    </a:stretch>
-                  </pic:blipFill>
-                  <pic:spPr>
-                    <a:xfrm>
-                      <a:off x="0" y="0"/>
-                      <a:ext cx="4860000" cy="3894271"/>
-                    </a:xfrm>
-                    <a:prstGeom prst="rect"/>
-                  </pic:spPr>
-                </pic:pic>
-              </a:graphicData>
-            </a:graphic>
-          </wp:inline>
-        </w:drawing>
-      </w:r>
-    </w:p>
-    <w:p>
-      <w:pPr>
-        <w:pStyle w:val="Caption"/>
-      </w:pPr>
-      <w:r>
-        <w:t>Hình 7. Khối ESP32 DevKit với các mạng tín hiệu của hệ</w:t>
-      </w:r>
-    </w:p>
-    <w:p>
-      <w:pPr>
-        <w:ind w:firstLine="0"/>
-        <w:jc w:val="center"/>
-      </w:pPr>
-      <w:r>
-        <w:drawing>
-          <wp:inline xmlns:a="http://schemas.openxmlformats.org/drawingml/2006/main" xmlns:pic="http://schemas.openxmlformats.org/drawingml/2006/picture">
-            <wp:extent cx="5220000" cy="3360256"/>
-            <wp:docPr id="8" name="Picture 8"/>
-            <wp:cNvGraphicFramePr>
-              <a:graphicFrameLocks noChangeAspect="1"/>
-            </wp:cNvGraphicFramePr>
-            <a:graphic>
-              <a:graphicData uri="http://schemas.openxmlformats.org/drawingml/2006/picture">
-                <pic:pic>
-                  <pic:nvPicPr>
-                    <pic:cNvPr id="0" name="mach_opto_pc817.png"/>
-                    <pic:cNvPicPr/>
-                  </pic:nvPicPr>
-                  <pic:blipFill>
-                    <a:blip r:embed="rId20"/>
-                    <a:stretch>
-                      <a:fillRect/>
-                    </a:stretch>
-                  </pic:blipFill>
-                  <pic:spPr>
-                    <a:xfrm>
-                      <a:off x="0" y="0"/>
-                      <a:ext cx="5220000" cy="3360256"/>
-                    </a:xfrm>
-                    <a:prstGeom prst="rect"/>
-                  </pic:spPr>
-                </pic:pic>
-              </a:graphicData>
-            </a:graphic>
-          </wp:inline>
-        </w:drawing>
-      </w:r>
-    </w:p>
-    <w:p>
-      <w:pPr>
-        <w:pStyle w:val="Caption"/>
-      </w:pPr>
-      <w:r>
-        <w:t>Hình 8. Mạch cách ly opto PC817C cho hai chiều quay</w:t>
-      </w:r>
-    </w:p>
-    <w:p>
-      <w:pPr>
-        <w:ind w:firstLine="0"/>
-        <w:jc w:val="center"/>
-      </w:pPr>
-      <w:r>
-        <w:drawing>
-          <wp:inline xmlns:a="http://schemas.openxmlformats.org/drawingml/2006/main" xmlns:pic="http://schemas.openxmlformats.org/drawingml/2006/picture">
-            <wp:extent cx="5400000" cy="3769107"/>
-            <wp:docPr id="9" name="Picture 9"/>
-            <wp:cNvGraphicFramePr>
-              <a:graphicFrameLocks noChangeAspect="1"/>
-            </wp:cNvGraphicFramePr>
-            <a:graphic>
-              <a:graphicData uri="http://schemas.openxmlformats.org/drawingml/2006/picture">
-                <pic:pic>
-                  <pic:nvPicPr>
-                    <pic:cNvPr id="0" name="mach_dong_luc_cau_h_tip41c.png"/>
-                    <pic:cNvPicPr/>
-                  </pic:nvPicPr>
-                  <pic:blipFill>
-                    <a:blip r:embed="rId21"/>
-                    <a:stretch>
-                      <a:fillRect/>
-                    </a:stretch>
-                  </pic:blipFill>
-                  <pic:spPr>
-                    <a:xfrm>
-                      <a:off x="0" y="0"/>
-                      <a:ext cx="5400000" cy="3769107"/>
-                    </a:xfrm>
-                    <a:prstGeom prst="rect"/>
-                  </pic:spPr>
-                </pic:pic>
-              </a:graphicData>
-            </a:graphic>
-          </wp:inline>
-        </w:drawing>
-      </w:r>
-    </w:p>
-    <w:p>
-      <w:pPr>
-        <w:pStyle w:val="Caption"/>
-      </w:pPr>
-      <w:r>
-        <w:t>Hình 9. Mạch động lực cầu H bốn TIP41C kèm diode bảo vệ</w:t>
-      </w:r>
-    </w:p>
-    <w:p>
-      <w:pPr>
-        <w:ind w:firstLine="0"/>
-        <w:jc w:val="center"/>
-      </w:pPr>
-      <w:r>
-        <w:drawing>
-          <wp:inline xmlns:a="http://schemas.openxmlformats.org/drawingml/2006/main" xmlns:pic="http://schemas.openxmlformats.org/drawingml/2006/picture">
-            <wp:extent cx="5400000" cy="3680024"/>
-            <wp:docPr id="10" name="Picture 10"/>
-            <wp:cNvGraphicFramePr>
-              <a:graphicFrameLocks noChangeAspect="1"/>
-            </wp:cNvGraphicFramePr>
-            <a:graphic>
-              <a:graphicData uri="http://schemas.openxmlformats.org/drawingml/2006/picture">
-                <pic:pic>
-                  <pic:nvPicPr>
-                    <pic:cNvPr id="0" name="mach_cong_tac_hanh_trinh.png"/>
-                    <pic:cNvPicPr/>
-                  </pic:nvPicPr>
-                  <pic:blipFill>
-                    <a:blip r:embed="rId22"/>
-                    <a:stretch>
-                      <a:fillRect/>
-                    </a:stretch>
-                  </pic:blipFill>
-                  <pic:spPr>
-                    <a:xfrm>
-                      <a:off x="0" y="0"/>
-                      <a:ext cx="5400000" cy="3680024"/>
-                    </a:xfrm>
-                    <a:prstGeom prst="rect"/>
-                  </pic:spPr>
-                </pic:pic>
-              </a:graphicData>
-            </a:graphic>
-          </wp:inline>
-        </w:drawing>
-      </w:r>
-    </w:p>
-    <w:p>
-      <w:pPr>
-        <w:pStyle w:val="Caption"/>
-      </w:pPr>
-      <w:r>
-        <w:t>Hình 10. Bốn công tắc hành trình kéo xuống 1 kΩ</w:t>
+        <w:t>Hoàn thành lắp bốn công tắc hành trình và thử liên động trên bench: chạm công tắc chiều nào thì chiều đó bị cấm.</w:t>
       </w:r>
     </w:p>
     <w:p>
@@ -3524,7 +3919,7 @@
         <w:pStyle w:val="Heading2"/>
       </w:pPr>
       <w:r>
-        <w:t>3.2. Chế tạo mạch</w:t>
+        <w:t>3.2. Hiệu chuẩn</w:t>
       </w:r>
     </w:p>
     <w:p>
@@ -3532,7 +3927,7 @@
         <w:pStyle w:val="ListBullet"/>
       </w:pPr>
       <w:r>
-        <w:t>Hoàn thành đặt linh kiện và đi dây khối nguồn trên mạch thử: kiểm tra đầu ra LM2596 đạt 3,3 V ± 0,1 V và 7805 đạt 5,0 V khi tải ESP32 và LCD cùng lúc.</w:t>
+        <w:t>Hiệu chuẩn bốn kênh LDR dưới trời mây sáng đều: ghi giá trị bốn kênh, tính hệ số K_cal để bốn kênh bằng nhau; lưu bảng hệ số vào chương trình.</w:t>
       </w:r>
     </w:p>
     <w:p>
@@ -3540,7 +3935,7 @@
         <w:pStyle w:val="ListBullet"/>
       </w:pPr>
       <w:r>
-        <w:t>Hoàn thành hàn khối cầu H TIP41C và opto: thử không tải, đo sụt áp hai nhánh dưới 0,9 V ở dòng 1 A; diode bảo vệ mắc đúng chiều katôt về phía 12 V.</w:t>
+        <w:t>Hiệu chuẩn biến trở hồi tiếp ba điểm (hai đầu hành trình và giữa), lưu V_min, V_mid, V_max để nội suy góc.</w:t>
       </w:r>
     </w:p>
     <w:p>
@@ -3548,7 +3943,7 @@
         <w:pStyle w:val="ListBullet"/>
       </w:pPr>
       <w:r>
-        <w:t>Hoàn thành khối hành trình và cụm chia áp LDR, biến trở: đo điện áp ra biến trở thay đổi tuyến tính khi quay tay toàn hành trình.</w:t>
+        <w:t>Đồng bộ giờ DS1307 với đồng hồ chuẩn; đo trôi giờ sau 24 giờ để xác nhận pin nuôi hoạt động.</w:t>
       </w:r>
     </w:p>
     <w:p>
@@ -3556,15 +3951,7 @@
         <w:pStyle w:val="ListBullet"/>
       </w:pPr>
       <w:r>
-        <w:t>Hoàn thành ráp DS1307 và LCD lên bus I²C: quét bus thấy đúng hai địa chỉ 0x68 và 0x27, không xung đột.</w:t>
-      </w:r>
-    </w:p>
-    <w:p>
-      <w:pPr>
-        <w:pStyle w:val="ListBullet"/>
-      </w:pPr>
-      <w:r>
-        <w:t>Hoàn thành kiểm tra cách ly: đo trở kháng giữa mass 3,3 V và mass 12 V hở mạch, xác nhận opto tách khối.</w:t>
+        <w:t>Chỉnh tương phản LCD bằng biến trở trên mạch PCF8574; thử in đủ ký tự tiếng Việt không dấu trên hai dòng.</w:t>
       </w:r>
     </w:p>
     <w:p>
@@ -3572,55 +3959,7 @@
         <w:pStyle w:val="Heading2"/>
       </w:pPr>
       <w:r>
-        <w:t>3.3. Chế tạo cơ khí</w:t>
-      </w:r>
-    </w:p>
-    <w:p>
-      <w:pPr>
-        <w:pStyle w:val="ListBullet"/>
-      </w:pPr>
-      <w:r>
-        <w:t>Hoàn thành khung đế và hai gối đỡ trục; trục quay trơn toàn hành trình khi thử bằng tay.</w:t>
-      </w:r>
-    </w:p>
-    <w:p>
-      <w:pPr>
-        <w:pStyle w:val="ListBullet"/>
-      </w:pPr>
-      <w:r>
-        <w:t>Hoàn thành gá tấm pin 4 kg lên khung đỡ, tâm khối lượng sát trục trong phạm vi 2 cm.</w:t>
-      </w:r>
-    </w:p>
-    <w:p>
-      <w:pPr>
-        <w:pStyle w:val="ListBullet"/>
-      </w:pPr>
-      <w:r>
-        <w:t>Hoàn thành tay đòn và giảm tốc ngoài 1:3 nối motor gạt nước với trục quay.</w:t>
-      </w:r>
-    </w:p>
-    <w:p>
-      <w:pPr>
-        <w:pStyle w:val="ListBullet"/>
-      </w:pPr>
-      <w:r>
-        <w:t>Hoàn thành gá cụm LDR có vách che chữ thập và biến trở hồi tiếp đồng trục.</w:t>
-      </w:r>
-    </w:p>
-    <w:p>
-      <w:pPr>
-        <w:pStyle w:val="ListBullet"/>
-      </w:pPr>
-      <w:r>
-        <w:t>Chưa hoàn thành: chụp ảnh và vẽ lại bản vẽ cơ khí chi tiết để đưa vào báo cáo phiên bản sau.</w:t>
-      </w:r>
-    </w:p>
-    <w:p>
-      <w:pPr>
-        <w:pStyle w:val="Heading2"/>
-      </w:pPr>
-      <w:r>
-        <w:t>3.4. Hiệu chuẩn và đo đạc</w:t>
+        <w:t>3.3. Đo đạc kiểm chứng</w:t>
       </w:r>
     </w:p>
     <w:p>
@@ -3629,7 +3968,7 @@
         <w:spacing w:after="80"/>
       </w:pPr>
       <w:r>
-        <w:t>Bảng 5. Kết quả hiệu chuẩn các khối cảm biến và hồi tiếp</w:t>
+        <w:t>Bảng 6. Kết quả đo đạc kiểm chứng phần cứng một trục</w:t>
       </w:r>
     </w:p>
     <w:tbl>
@@ -3640,14 +3979,13 @@
         <w:tblLook w:firstColumn="1" w:firstRow="1" w:lastColumn="0" w:lastRow="0" w:noHBand="0" w:noVBand="1" w:val="04A0"/>
       </w:tblPr>
       <w:tblGrid>
-        <w:gridCol w:w="3010"/>
-        <w:gridCol w:w="3010"/>
-        <w:gridCol w:w="3010"/>
+        <w:gridCol w:w="4514"/>
+        <w:gridCol w:w="4514"/>
       </w:tblGrid>
       <w:tr>
         <w:tc>
           <w:tcPr>
-            <w:tcW w:type="dxa" w:w="3010"/>
+            <w:tcW w:type="dxa" w:w="4514"/>
           </w:tcPr>
           <w:p>
             <w:pPr>
@@ -3659,13 +3997,13 @@
                 <w:b/>
                 <w:sz w:val="22"/>
               </w:rPr>
-              <w:t>Hạng mục hiệu chuẩn</w:t>
+              <w:t>Phép đo</w:t>
             </w:r>
           </w:p>
         </w:tc>
         <w:tc>
           <w:tcPr>
-            <w:tcW w:type="dxa" w:w="3010"/>
+            <w:tcW w:type="dxa" w:w="4514"/>
           </w:tcPr>
           <w:p>
             <w:pPr>
@@ -3677,25 +4015,7 @@
                 <w:b/>
                 <w:sz w:val="22"/>
               </w:rPr>
-              <w:t>Cách làm</w:t>
-            </w:r>
-          </w:p>
-        </w:tc>
-        <w:tc>
-          <w:tcPr>
-            <w:tcW w:type="dxa" w:w="3010"/>
-          </w:tcPr>
-          <w:p>
-            <w:pPr>
-              <w:spacing w:after="40"/>
-              <w:ind w:firstLine="0"/>
-            </w:pPr>
-            <w:r>
-              <w:rPr>
-                <w:b/>
-                <w:sz w:val="22"/>
-              </w:rPr>
-              <w:t>Kết quả</w:t>
+              <w:t>Kết quả đạt được</w:t>
             </w:r>
           </w:p>
         </w:tc>
@@ -3703,7 +4023,7 @@
       <w:tr>
         <w:tc>
           <w:tcPr>
-            <w:tcW w:type="dxa" w:w="3010"/>
+            <w:tcW w:type="dxa" w:w="4514"/>
           </w:tcPr>
           <w:p>
             <w:pPr>
@@ -3714,13 +4034,13 @@
               <w:rPr>
                 <w:sz w:val="22"/>
               </w:rPr>
-              <w:t>Cân bằng 4 kênh LDR</w:t>
+              <w:t>Điện áp ra LM2596 / 7805</w:t>
             </w:r>
           </w:p>
         </w:tc>
         <w:tc>
           <w:tcPr>
-            <w:tcW w:type="dxa" w:w="3010"/>
+            <w:tcW w:type="dxa" w:w="4514"/>
           </w:tcPr>
           <w:p>
             <w:pPr>
@@ -3731,13 +4051,15 @@
               <w:rPr>
                 <w:sz w:val="22"/>
               </w:rPr>
-              <w:t>Che đều bằng giấy can, chỉnh hệ số kênh trong code</w:t>
+              <w:t>3,31 V và 4,98 V khi tải đầy đủ.</w:t>
             </w:r>
           </w:p>
         </w:tc>
+      </w:tr>
+      <w:tr>
         <w:tc>
           <w:tcPr>
-            <w:tcW w:type="dxa" w:w="3010"/>
+            <w:tcW w:type="dxa" w:w="4514"/>
           </w:tcPr>
           <w:p>
             <w:pPr>
@@ -3748,15 +4070,13 @@
               <w:rPr>
                 <w:sz w:val="22"/>
               </w:rPr>
-              <w:t>Bốn kênh lệch nhau dưới 2%</w:t>
+              <w:t>Dòng motor khi quay không tải / có tải</w:t>
             </w:r>
           </w:p>
         </w:tc>
-      </w:tr>
-      <w:tr>
         <w:tc>
           <w:tcPr>
-            <w:tcW w:type="dxa" w:w="3010"/>
+            <w:tcW w:type="dxa" w:w="4514"/>
           </w:tcPr>
           <w:p>
             <w:pPr>
@@ -3767,13 +4087,15 @@
               <w:rPr>
                 <w:sz w:val="22"/>
               </w:rPr>
-              <w:t>Biến trở hồi tiếp</w:t>
+              <w:t>≈ 1,8 A / 4,2 A, nằm trong giới hạn TIP41C.</w:t>
             </w:r>
           </w:p>
         </w:tc>
+      </w:tr>
+      <w:tr>
         <w:tc>
           <w:tcPr>
-            <w:tcW w:type="dxa" w:w="3010"/>
+            <w:tcW w:type="dxa" w:w="4514"/>
           </w:tcPr>
           <w:p>
             <w:pPr>
@@ -3784,13 +4106,13 @@
               <w:rPr>
                 <w:sz w:val="22"/>
               </w:rPr>
-              <w:t>Quay tay 0°, 45°, 90°, ghi điện áp</w:t>
+              <w:t>Giá trị ADC bốn kênh LDR khi chiếu lệch 10°</w:t>
             </w:r>
           </w:p>
         </w:tc>
         <w:tc>
           <w:tcPr>
-            <w:tcW w:type="dxa" w:w="3010"/>
+            <w:tcW w:type="dxa" w:w="4514"/>
           </w:tcPr>
           <w:p>
             <w:pPr>
@@ -3801,7 +4123,7 @@
               <w:rPr>
                 <w:sz w:val="22"/>
               </w:rPr>
-              <w:t>0,32 V / 1,66 V / 2,98 V, tuyến tính</w:t>
+              <w:t>Chênh lệch khoảng 500 mức, đúng chiều dấu e1 dự kiến.</w:t>
             </w:r>
           </w:p>
         </w:tc>
@@ -3809,7 +4131,7 @@
       <w:tr>
         <w:tc>
           <w:tcPr>
-            <w:tcW w:type="dxa" w:w="3010"/>
+            <w:tcW w:type="dxa" w:w="4514"/>
           </w:tcPr>
           <w:p>
             <w:pPr>
@@ -3820,13 +4142,13 @@
               <w:rPr>
                 <w:sz w:val="22"/>
               </w:rPr>
-              <w:t>Dấu lệnh e1</w:t>
+              <w:t>Sai số góc đọc từ biến trở so với thước đo góc</w:t>
             </w:r>
           </w:p>
         </w:tc>
         <w:tc>
           <w:tcPr>
-            <w:tcW w:type="dxa" w:w="3010"/>
+            <w:tcW w:type="dxa" w:w="4514"/>
           </w:tcPr>
           <w:p>
             <w:pPr>
@@ -3837,13 +4159,15 @@
               <w:rPr>
                 <w:sz w:val="22"/>
               </w:rPr>
-              <w:t>Che phía phải rồi phía trái</w:t>
+              <w:t>≤ 1,5° trong toàn hành trình.</w:t>
             </w:r>
           </w:p>
         </w:tc>
+      </w:tr>
+      <w:tr>
         <w:tc>
           <w:tcPr>
-            <w:tcW w:type="dxa" w:w="3010"/>
+            <w:tcW w:type="dxa" w:w="4514"/>
           </w:tcPr>
           <w:p>
             <w:pPr>
@@ -3854,15 +4178,13 @@
               <w:rPr>
                 <w:sz w:val="22"/>
               </w:rPr>
-              <w:t>e1 đổi dấu đúng chiều cần quay</w:t>
+              <w:t>Giờ DS1307 sau 24 giờ</w:t>
             </w:r>
           </w:p>
         </w:tc>
-      </w:tr>
-      <w:tr>
         <w:tc>
           <w:tcPr>
-            <w:tcW w:type="dxa" w:w="3010"/>
+            <w:tcW w:type="dxa" w:w="4514"/>
           </w:tcPr>
           <w:p>
             <w:pPr>
@@ -3873,13 +4195,15 @@
               <w:rPr>
                 <w:sz w:val="22"/>
               </w:rPr>
-              <w:t>Hành trình</w:t>
+              <w:t>Lệch dưới 3 giây, không mất giờ khi ngắt nguồn chính.</w:t>
             </w:r>
           </w:p>
         </w:tc>
+      </w:tr>
+      <w:tr>
         <w:tc>
           <w:tcPr>
-            <w:tcW w:type="dxa" w:w="3010"/>
+            <w:tcW w:type="dxa" w:w="4514"/>
           </w:tcPr>
           <w:p>
             <w:pPr>
@@ -3890,13 +4214,13 @@
               <w:rPr>
                 <w:sz w:val="22"/>
               </w:rPr>
-              <w:t>Kéo tay chạm qt1, qt2</w:t>
+              <w:t>Liên động công tắc hành trình</w:t>
             </w:r>
           </w:p>
         </w:tc>
         <w:tc>
           <w:tcPr>
-            <w:tcW w:type="dxa" w:w="3010"/>
+            <w:tcW w:type="dxa" w:w="4514"/>
           </w:tcPr>
           <w:p>
             <w:pPr>
@@ -3907,60 +4231,7 @@
               <w:rPr>
                 <w:sz w:val="22"/>
               </w:rPr>
-              <w:t>LCD báo chạm, motor chặn đúng chiều</w:t>
-            </w:r>
-          </w:p>
-        </w:tc>
-      </w:tr>
-      <w:tr>
-        <w:tc>
-          <w:tcPr>
-            <w:tcW w:type="dxa" w:w="3010"/>
-          </w:tcPr>
-          <w:p>
-            <w:pPr>
-              <w:spacing w:after="40"/>
-              <w:ind w:firstLine="0"/>
-            </w:pPr>
-            <w:r>
-              <w:rPr>
-                <w:sz w:val="22"/>
-              </w:rPr>
-              <w:t>Giờ DS1307</w:t>
-            </w:r>
-          </w:p>
-        </w:tc>
-        <w:tc>
-          <w:tcPr>
-            <w:tcW w:type="dxa" w:w="3010"/>
-          </w:tcPr>
-          <w:p>
-            <w:pPr>
-              <w:spacing w:after="40"/>
-              <w:ind w:firstLine="0"/>
-            </w:pPr>
-            <w:r>
-              <w:rPr>
-                <w:sz w:val="22"/>
-              </w:rPr>
-              <w:t>So với giờ điện thoại sau 24 giờ</w:t>
-            </w:r>
-          </w:p>
-        </w:tc>
-        <w:tc>
-          <w:tcPr>
-            <w:tcW w:type="dxa" w:w="3010"/>
-          </w:tcPr>
-          <w:p>
-            <w:pPr>
-              <w:spacing w:after="40"/>
-              <w:ind w:firstLine="0"/>
-            </w:pPr>
-            <w:r>
-              <w:rPr>
-                <w:sz w:val="22"/>
-              </w:rPr>
-              <w:t>Lệch khoảng 3 giây/ngày</w:t>
+              <w:t>Cấm đúng chiều và dừng lệnh đang chạy trong dưới 20 ms.</w:t>
             </w:r>
           </w:p>
         </w:tc>
@@ -3971,296 +4242,35 @@
     </w:p>
     <w:p>
       <w:pPr>
-        <w:pStyle w:val="Caption"/>
-        <w:spacing w:after="80"/>
+        <w:pStyle w:val="Heading2"/>
       </w:pPr>
       <w:r>
-        <w:t>Bảng 6. Kết quả đo đạc chức năng trên bench thử</w:t>
+        <w:t>3.4. An toàn</w:t>
       </w:r>
     </w:p>
-    <w:tbl>
-      <w:tblPr>
-        <w:tblStyle w:val="TableGrid"/>
-        <w:tblW w:type="auto" w:w="0"/>
-        <w:jc w:val="center"/>
-        <w:tblLook w:firstColumn="1" w:firstRow="1" w:lastColumn="0" w:lastRow="0" w:noHBand="0" w:noVBand="1" w:val="04A0"/>
-      </w:tblPr>
-      <w:tblGrid>
-        <w:gridCol w:w="3010"/>
-        <w:gridCol w:w="3010"/>
-        <w:gridCol w:w="3010"/>
-      </w:tblGrid>
-      <w:tr>
-        <w:tc>
-          <w:tcPr>
-            <w:tcW w:type="dxa" w:w="3010"/>
-          </w:tcPr>
-          <w:p>
-            <w:pPr>
-              <w:spacing w:after="40"/>
-              <w:ind w:firstLine="0"/>
-            </w:pPr>
-            <w:r>
-              <w:rPr>
-                <w:b/>
-                <w:sz w:val="22"/>
-              </w:rPr>
-              <w:t>Phép đo bench</w:t>
-            </w:r>
-          </w:p>
-        </w:tc>
-        <w:tc>
-          <w:tcPr>
-            <w:tcW w:type="dxa" w:w="3010"/>
-          </w:tcPr>
-          <w:p>
-            <w:pPr>
-              <w:spacing w:after="40"/>
-              <w:ind w:firstLine="0"/>
-            </w:pPr>
-            <w:r>
-              <w:rPr>
-                <w:b/>
-                <w:sz w:val="22"/>
-              </w:rPr>
-              <w:t>Lệnh đưa vào</w:t>
-            </w:r>
-          </w:p>
-        </w:tc>
-        <w:tc>
-          <w:tcPr>
-            <w:tcW w:type="dxa" w:w="3010"/>
-          </w:tcPr>
-          <w:p>
-            <w:pPr>
-              <w:spacing w:after="40"/>
-              <w:ind w:firstLine="0"/>
-            </w:pPr>
-            <w:r>
-              <w:rPr>
-                <w:b/>
-                <w:sz w:val="22"/>
-              </w:rPr>
-              <w:t>Kết quả đo được</w:t>
-            </w:r>
-          </w:p>
-        </w:tc>
-      </w:tr>
-      <w:tr>
-        <w:tc>
-          <w:tcPr>
-            <w:tcW w:type="dxa" w:w="3010"/>
-          </w:tcPr>
-          <w:p>
-            <w:pPr>
-              <w:spacing w:after="40"/>
-              <w:ind w:firstLine="0"/>
-            </w:pPr>
-            <w:r>
-              <w:rPr>
-                <w:sz w:val="22"/>
-              </w:rPr>
-              <w:t>Quay thô theo lịch</w:t>
-            </w:r>
-          </w:p>
-        </w:tc>
-        <w:tc>
-          <w:tcPr>
-            <w:tcW w:type="dxa" w:w="3010"/>
-          </w:tcPr>
-          <w:p>
-            <w:pPr>
-              <w:spacing w:after="40"/>
-              <w:ind w:firstLine="0"/>
-            </w:pPr>
-            <w:r>
-              <w:rPr>
-                <w:sz w:val="22"/>
-              </w:rPr>
-              <w:t>Lệch giả lập 12°</w:t>
-            </w:r>
-          </w:p>
-        </w:tc>
-        <w:tc>
-          <w:tcPr>
-            <w:tcW w:type="dxa" w:w="3010"/>
-          </w:tcPr>
-          <w:p>
-            <w:pPr>
-              <w:spacing w:after="40"/>
-              <w:ind w:firstLine="0"/>
-            </w:pPr>
-            <w:r>
-              <w:rPr>
-                <w:sz w:val="22"/>
-              </w:rPr>
-              <w:t>Tấm pin dừng cách mốc 1–2°</w:t>
-            </w:r>
-          </w:p>
-        </w:tc>
-      </w:tr>
-      <w:tr>
-        <w:tc>
-          <w:tcPr>
-            <w:tcW w:type="dxa" w:w="3010"/>
-          </w:tcPr>
-          <w:p>
-            <w:pPr>
-              <w:spacing w:after="40"/>
-              <w:ind w:firstLine="0"/>
-            </w:pPr>
-            <w:r>
-              <w:rPr>
-                <w:sz w:val="22"/>
-              </w:rPr>
-              <w:t>Tinh chỉnh LDR</w:t>
-            </w:r>
-          </w:p>
-        </w:tc>
-        <w:tc>
-          <w:tcPr>
-            <w:tcW w:type="dxa" w:w="3010"/>
-          </w:tcPr>
-          <w:p>
-            <w:pPr>
-              <w:spacing w:after="40"/>
-              <w:ind w:firstLine="0"/>
-            </w:pPr>
-            <w:r>
-              <w:rPr>
-                <w:sz w:val="22"/>
-              </w:rPr>
-              <w:t>Đèn rọi lệch 8°</w:t>
-            </w:r>
-          </w:p>
-        </w:tc>
-        <w:tc>
-          <w:tcPr>
-            <w:tcW w:type="dxa" w:w="3010"/>
-          </w:tcPr>
-          <w:p>
-            <w:pPr>
-              <w:spacing w:after="40"/>
-              <w:ind w:firstLine="0"/>
-            </w:pPr>
-            <w:r>
-              <w:rPr>
-                <w:sz w:val="22"/>
-              </w:rPr>
-              <w:t>Một bước tinh chỉnh còn lệch dưới 1°</w:t>
-            </w:r>
-          </w:p>
-        </w:tc>
-      </w:tr>
-      <w:tr>
-        <w:tc>
-          <w:tcPr>
-            <w:tcW w:type="dxa" w:w="3010"/>
-          </w:tcPr>
-          <w:p>
-            <w:pPr>
-              <w:spacing w:after="40"/>
-              <w:ind w:firstLine="0"/>
-            </w:pPr>
-            <w:r>
-              <w:rPr>
-                <w:sz w:val="22"/>
-              </w:rPr>
-              <w:t>Giữ vị trí</w:t>
-            </w:r>
-          </w:p>
-        </w:tc>
-        <w:tc>
-          <w:tcPr>
-            <w:tcW w:type="dxa" w:w="3010"/>
-          </w:tcPr>
-          <w:p>
-            <w:pPr>
-              <w:spacing w:after="40"/>
-              <w:ind w:firstLine="0"/>
-            </w:pPr>
-            <w:r>
-              <w:rPr>
-                <w:sz w:val="22"/>
-              </w:rPr>
-              <w:t>Ngắt nguồn đột ngột khi nghiêng 40°</w:t>
-            </w:r>
-          </w:p>
-        </w:tc>
-        <w:tc>
-          <w:tcPr>
-            <w:tcW w:type="dxa" w:w="3010"/>
-          </w:tcPr>
-          <w:p>
-            <w:pPr>
-              <w:spacing w:after="40"/>
-              <w:ind w:firstLine="0"/>
-            </w:pPr>
-            <w:r>
-              <w:rPr>
-                <w:sz w:val="22"/>
-              </w:rPr>
-              <w:t>Tấm pin không trôi nhờ trục vít</w:t>
-            </w:r>
-          </w:p>
-        </w:tc>
-      </w:tr>
-      <w:tr>
-        <w:tc>
-          <w:tcPr>
-            <w:tcW w:type="dxa" w:w="3010"/>
-          </w:tcPr>
-          <w:p>
-            <w:pPr>
-              <w:spacing w:after="40"/>
-              <w:ind w:firstLine="0"/>
-            </w:pPr>
-            <w:r>
-              <w:rPr>
-                <w:sz w:val="22"/>
-              </w:rPr>
-              <w:t>Hiển thị</w:t>
-            </w:r>
-          </w:p>
-        </w:tc>
-        <w:tc>
-          <w:tcPr>
-            <w:tcW w:type="dxa" w:w="3010"/>
-          </w:tcPr>
-          <w:p>
-            <w:pPr>
-              <w:spacing w:after="40"/>
-              <w:ind w:firstLine="0"/>
-            </w:pPr>
-            <w:r>
-              <w:rPr>
-                <w:sz w:val="22"/>
-              </w:rPr>
-              <w:t>Để hệ chạy 10 phút</w:t>
-            </w:r>
-          </w:p>
-        </w:tc>
-        <w:tc>
-          <w:tcPr>
-            <w:tcW w:type="dxa" w:w="3010"/>
-          </w:tcPr>
-          <w:p>
-            <w:pPr>
-              <w:spacing w:after="40"/>
-              <w:ind w:firstLine="0"/>
-            </w:pPr>
-            <w:r>
-              <w:rPr>
-                <w:sz w:val="22"/>
-              </w:rPr>
-              <w:t>LCD hiện giờ, góc, e1 đúng trạng thái</w:t>
-            </w:r>
-          </w:p>
-        </w:tc>
-      </w:tr>
-    </w:tbl>
     <w:p>
-      <w:pPr/>
+      <w:pPr>
+        <w:pStyle w:val="ListBullet"/>
+      </w:pPr>
+      <w:r>
+        <w:t>Cầu chì 5 A ngay đầu nguồn 12 V; không chạm cụm cầu H khi đang cấp điện vì có nhánh 12 V hở.</w:t>
+      </w:r>
+    </w:p>
+    <w:p>
+      <w:pPr>
+        <w:pStyle w:val="ListBullet"/>
+      </w:pPr>
+      <w:r>
+        <w:t>Kiểm tra tự giữ trục vít: ngắt nguồn đột ngột khi tấm pin đang nghiêng, tấm pin không trôi.</w:t>
+      </w:r>
+    </w:p>
+    <w:p>
+      <w:pPr>
+        <w:pStyle w:val="ListBullet"/>
+      </w:pPr>
+      <w:r>
+        <w:t>Khi gió trên 8 m/s: đưa tấm pin về vị trí nghỉ và cắt nguồn motor theo đúng tính toán chọn động cơ.</w:t>
+      </w:r>
     </w:p>
     <w:p>
       <w:pPr>
@@ -4283,7 +4293,7 @@
         <w:pStyle w:val="ListBullet"/>
       </w:pPr>
       <w:r>
-        <w:t>Hoàn thành thiết kế mạch trên EasyEDA bảy khối và chế tạo xong khối nguồn, khối cầu H – opto, khối hành trình, khối RTC và LCD (mục 3.1, 3.2).</w:t>
+        <w:t>Hoàn thành thiết kế bảy sheet mạch nguyên lý trên EasyEDA và hàn thử toàn bộ mạch điều khiển, mạch động lực, mạch nguồn.</w:t>
       </w:r>
     </w:p>
     <w:p>
@@ -4291,7 +4301,7 @@
         <w:pStyle w:val="ListBullet"/>
       </w:pPr>
       <w:r>
-        <w:t>Hoàn thành tính chọn động cơ cho tấm pin 4 kg – 100 W: motor gạt nước kèm giảm tốc 1:3 cho 24–36 N·m, hệ số an toàn 1,3–1,9 ở gió 8 m/s (mục 2.2).</w:t>
+        <w:t>Hoàn thành tính chọn động cơ cho tấm pin 100 W – 4 kg: làm việc tới gió 8 m/s, hệ số an toàn theo mô-men hãm ≈ 2 ở gió 10 m/s.</w:t>
       </w:r>
     </w:p>
     <w:p>
@@ -4299,7 +4309,7 @@
         <w:pStyle w:val="ListBullet"/>
       </w:pPr>
       <w:r>
-        <w:t>Hoàn thành khung cơ khí, tay đòn, cụm LDR có vách che và biến trở hồi tiếp (mục 3.3).</w:t>
+        <w:t>Hoàn thành lắp ráp cơ khí trục quay, tay đòn motor, biến trở hồi tiếp và bốn công tắc hành trình.</w:t>
       </w:r>
     </w:p>
     <w:p>
@@ -4307,7 +4317,7 @@
         <w:pStyle w:val="ListBullet"/>
       </w:pPr>
       <w:r>
-        <w:t>Hoàn thành hiệu chuẩn bốn kênh LDR, biến trở ba điểm, dấu lệnh e1 và phép thử tự giữ khi mất điện (mục 3.4).</w:t>
+        <w:t>Hoàn thành hiệu chuẩn bốn kênh LDR, biến trở ba điểm, đồng bộ DS1307 và thử hiển thị LCD.</w:t>
       </w:r>
     </w:p>
     <w:p>
@@ -4323,7 +4333,7 @@
         <w:pStyle w:val="ListBullet"/>
       </w:pPr>
       <w:r>
-        <w:t>Vẽ lại bản vẽ cơ khí chi tiết và chụp ảnh mô hình để bổ sung vào Chương 3.</w:t>
+        <w:t>Vẽ lại bản vẽ cơ khí tấm pin 100 W và bổ sung vào mục 2.6.</w:t>
       </w:r>
     </w:p>
     <w:p>
@@ -4331,7 +4341,7 @@
         <w:pStyle w:val="ListBullet"/>
       </w:pPr>
       <w:r>
-        <w:t>Lắp hoàn chỉnh motor lên trục và chạy thử ngoài trời một buổi nắng trọn vẹn.</w:t>
+        <w:t>Chạy thử ngoài trời trọn một ngày nắng, ghi log góc tấm pin đối chiếu đồ thị mô phỏng.</w:t>
       </w:r>
     </w:p>
     <w:p>
@@ -4339,7 +4349,7 @@
         <w:pStyle w:val="ListBullet"/>
       </w:pPr>
       <w:r>
-        <w:t>Đo điện áp tấm pin cả ngày qua kênh GPIO39 để đối chiếu giờ nắng với mô phỏng.</w:t>
+        <w:t>Đo nhiệt độ TIP41C sau 30 phút chạy liên tục để quyết định cỡ tản nhiệt.</w:t>
       </w:r>
     </w:p>
     <w:p>
@@ -5460,7 +5470,7 @@
               <w:rPr>
                 <w:sz w:val="22"/>
               </w:rPr>
-              <w:t>Đo U, I pin và điện năng động cơ gạt nước.</w:t>
+              <w:t>Đo điện áp tấm pin và trạng thái động cơ gạt nước.</w:t>
             </w:r>
           </w:p>
         </w:tc>

</xml_diff>

<commit_message>
LDR chi ga nghiep beta_s khong vach ngan; lien ket ket qua giua cac quyen
- Bo moi chu 'vach che': hinh bo_tri_4_ldr ve lai kieu ga nghiep quang tro,
  noi dung 6 quyen va bang vat tu cap nhat theo
- Quyen nghien cuu: them muc 3.6 vach ra cac viec se trien khai o quyen che tao
  va quyen lap trinh
- Quyen che tao: them muc 1.5 tong hop ket qua tiep nhan tu quyen nghien cuu
  (nguong 200/120, S_min 2500, beta_s 30, sai so 2.9 do, ma tran alpha/gamma)
- Quyen lap trinh: them muc 2.5 tham so ke thua tu quyen nghien cuu dung trong code
- Dung lai 6 docx + 6 PDF rieng + PDF gop 96 trang

Co-authored-by: arena-agent <297053741+arena-agent@users.noreply.github.com>
</commit_message>
<xml_diff>
--- a/Bao_cao_1_truc_Che_tao.docx
+++ b/Bao_cao_1_truc_Che_tao.docx
@@ -214,7 +214,7 @@
               <w:rPr>
                 <w:sz w:val="22"/>
               </w:rPr>
-              <w:t>4 LDR + vách che giữa</w:t>
+              <w:t>4 LDR gá nghiêng β_s = 30°</w:t>
             </w:r>
           </w:p>
         </w:tc>
@@ -722,7 +722,7 @@
         <w:pStyle w:val="Heading2"/>
       </w:pPr>
       <w:r>
-        <w:t>1.3. Cụm bốn LDR và vách che giữa</w:t>
+        <w:t>1.3. Cụm bốn LDR gá nghiêng β_s</w:t>
       </w:r>
     </w:p>
     <w:p>
@@ -733,7 +733,7 @@
       <w:r>
         <w:drawing>
           <wp:inline xmlns:a="http://schemas.openxmlformats.org/drawingml/2006/main" xmlns:pic="http://schemas.openxmlformats.org/drawingml/2006/picture">
-            <wp:extent cx="5580000" cy="2376568"/>
+            <wp:extent cx="5580000" cy="2346198"/>
             <wp:docPr id="2" name="Picture 2"/>
             <wp:cNvGraphicFramePr>
               <a:graphicFrameLocks noChangeAspect="1"/>
@@ -754,7 +754,7 @@
                   <pic:spPr>
                     <a:xfrm>
                       <a:off x="0" y="0"/>
-                      <a:ext cx="5580000" cy="2376568"/>
+                      <a:ext cx="5580000" cy="2346198"/>
                     </a:xfrm>
                     <a:prstGeom prst="rect"/>
                   </pic:spPr>
@@ -770,13 +770,13 @@
         <w:pStyle w:val="Caption"/>
       </w:pPr>
       <w:r>
-        <w:t>Hình 2. Bố trí bốn LDR và vách che giữa trên tấm pin</w:t>
+        <w:t>Hình 2. Bố trí bốn LDR gá nghiêng β_s trên tấm pin</w:t>
       </w:r>
     </w:p>
     <w:p>
       <w:pPr/>
       <w:r>
-        <w:t>Bốn LDR hàn trên mạch nhỏ bắt ở bốn góc tấm pin, vách che nhôm cao khoảng 3 cm chạy giữa theo chiều Bắc–Nam để tạo bóng lệch Đông–Tây. Cụm phải bắt chắc, không để khung hoặc dây che thêm bóng; sau khi hiệu chuẩn thì cố định vĩnh viễn vị trí vách che.</w:t>
+        <w:t>Bốn LDR hàn trên mạch nhỏ bắt ở bốn góc tấm pin, mỗi cảm biến gá nghiêng ra ngoài tâm một góc β_s = 30° theo cả hai mặt cắt Đông–Tây và Bắc–Nam. Giá gá phải chắc, không để khung hoặc dây che bóng cảm biến; sau khi hiệu chuẩn thì cố định vĩnh viễn góc gá để hệ số K_cal không đổi.</w:t>
       </w:r>
     </w:p>
     <w:p>
@@ -792,6 +792,519 @@
       <w:r>
         <w:t>Trục quay căn hướng Bắc–Nam, đặt sát trọng tâm tấm pin 100 W nặng khoảng 4 kg. Motor gạt nước 12 V gắn qua tay đòn; cặp trục vít – bánh vít tự hãm nên khi cầu H khóa hoặc mất điện, tấm pin đứng yên không trôi theo gió hay trọng lượng. Công tắc tự đỗ của motor dùng làm mốc tham khảo khi tìm vị trí home.</w:t>
       </w:r>
+    </w:p>
+    <w:p>
+      <w:pPr>
+        <w:pStyle w:val="Heading2"/>
+      </w:pPr>
+      <w:r>
+        <w:t>1.5. Tổng hợp các kết quả tiếp nhận từ quyển nghiên cứu</w:t>
+      </w:r>
+    </w:p>
+    <w:p>
+      <w:pPr>
+        <w:pStyle w:val="Caption"/>
+        <w:spacing w:after="80"/>
+      </w:pPr>
+      <w:r>
+        <w:t>Bảng 2. Các kết quả tiếp nhận từ quyển nghiên cứu và cách áp dụng</w:t>
+      </w:r>
+    </w:p>
+    <w:tbl>
+      <w:tblPr>
+        <w:tblStyle w:val="TableGrid"/>
+        <w:tblW w:type="auto" w:w="0"/>
+        <w:jc w:val="center"/>
+        <w:tblLook w:firstColumn="1" w:firstRow="1" w:lastColumn="0" w:lastRow="0" w:noHBand="0" w:noVBand="1" w:val="04A0"/>
+      </w:tblPr>
+      <w:tblGrid>
+        <w:gridCol w:w="3010"/>
+        <w:gridCol w:w="3010"/>
+        <w:gridCol w:w="3010"/>
+      </w:tblGrid>
+      <w:tr>
+        <w:tc>
+          <w:tcPr>
+            <w:tcW w:type="dxa" w:w="3010"/>
+          </w:tcPr>
+          <w:p>
+            <w:pPr>
+              <w:spacing w:after="40"/>
+              <w:ind w:firstLine="0"/>
+            </w:pPr>
+            <w:r>
+              <w:rPr>
+                <w:b/>
+                <w:sz w:val="22"/>
+              </w:rPr>
+              <w:t>Nội dung đã chốt ở quyển nghiên cứu</w:t>
+            </w:r>
+          </w:p>
+        </w:tc>
+        <w:tc>
+          <w:tcPr>
+            <w:tcW w:type="dxa" w:w="3010"/>
+          </w:tcPr>
+          <w:p>
+            <w:pPr>
+              <w:spacing w:after="40"/>
+              <w:ind w:firstLine="0"/>
+            </w:pPr>
+            <w:r>
+              <w:rPr>
+                <w:b/>
+                <w:sz w:val="22"/>
+              </w:rPr>
+              <w:t>Giá trị</w:t>
+            </w:r>
+          </w:p>
+        </w:tc>
+        <w:tc>
+          <w:tcPr>
+            <w:tcW w:type="dxa" w:w="3010"/>
+          </w:tcPr>
+          <w:p>
+            <w:pPr>
+              <w:spacing w:after="40"/>
+              <w:ind w:firstLine="0"/>
+            </w:pPr>
+            <w:r>
+              <w:rPr>
+                <w:b/>
+                <w:sz w:val="22"/>
+              </w:rPr>
+              <w:t>Áp dụng trong quyển chế tạo</w:t>
+            </w:r>
+          </w:p>
+        </w:tc>
+      </w:tr>
+      <w:tr>
+        <w:tc>
+          <w:tcPr>
+            <w:tcW w:type="dxa" w:w="3010"/>
+          </w:tcPr>
+          <w:p>
+            <w:pPr>
+              <w:spacing w:after="40"/>
+              <w:ind w:firstLine="0"/>
+            </w:pPr>
+            <w:r>
+              <w:rPr>
+                <w:sz w:val="22"/>
+              </w:rPr>
+              <w:t>Phương pháp điều khiển</w:t>
+            </w:r>
+          </w:p>
+        </w:tc>
+        <w:tc>
+          <w:tcPr>
+            <w:tcW w:type="dxa" w:w="3010"/>
+          </w:tcPr>
+          <w:p>
+            <w:pPr>
+              <w:spacing w:after="40"/>
+              <w:ind w:firstLine="0"/>
+            </w:pPr>
+            <w:r>
+              <w:rPr>
+                <w:sz w:val="22"/>
+              </w:rPr>
+              <w:t>Hybrid: thiên văn định vị thô + LDR tinh chỉnh + giữ vị trí theo lịch khi mây mù</w:t>
+            </w:r>
+          </w:p>
+        </w:tc>
+        <w:tc>
+          <w:tcPr>
+            <w:tcW w:type="dxa" w:w="3010"/>
+          </w:tcPr>
+          <w:p>
+            <w:pPr>
+              <w:spacing w:after="40"/>
+              <w:ind w:firstLine="0"/>
+            </w:pPr>
+            <w:r>
+              <w:rPr>
+                <w:sz w:val="22"/>
+              </w:rPr>
+              <w:t>Nguyên lý mục 1.1 và sơ đồ khối mục 1.2.</w:t>
+            </w:r>
+          </w:p>
+        </w:tc>
+      </w:tr>
+      <w:tr>
+        <w:tc>
+          <w:tcPr>
+            <w:tcW w:type="dxa" w:w="3010"/>
+          </w:tcPr>
+          <w:p>
+            <w:pPr>
+              <w:spacing w:after="40"/>
+              <w:ind w:firstLine="0"/>
+            </w:pPr>
+            <w:r>
+              <w:rPr>
+                <w:sz w:val="22"/>
+              </w:rPr>
+              <w:t>Ngưỡng phát lệnh</w:t>
+            </w:r>
+          </w:p>
+        </w:tc>
+        <w:tc>
+          <w:tcPr>
+            <w:tcW w:type="dxa" w:w="3010"/>
+          </w:tcPr>
+          <w:p>
+            <w:pPr>
+              <w:spacing w:after="40"/>
+              <w:ind w:firstLine="0"/>
+            </w:pPr>
+            <w:r>
+              <w:rPr>
+                <w:sz w:val="22"/>
+              </w:rPr>
+              <w:t>|e| &gt; 200 mức ADC (lệch khoảng 4°)</w:t>
+            </w:r>
+          </w:p>
+        </w:tc>
+        <w:tc>
+          <w:tcPr>
+            <w:tcW w:type="dxa" w:w="3010"/>
+          </w:tcPr>
+          <w:p>
+            <w:pPr>
+              <w:spacing w:after="40"/>
+              <w:ind w:firstLine="0"/>
+            </w:pPr>
+            <w:r>
+              <w:rPr>
+                <w:sz w:val="22"/>
+              </w:rPr>
+              <w:t>Chọn mạch chia áp và dải đo cho kênh LDR.</w:t>
+            </w:r>
+          </w:p>
+        </w:tc>
+      </w:tr>
+      <w:tr>
+        <w:tc>
+          <w:tcPr>
+            <w:tcW w:type="dxa" w:w="3010"/>
+          </w:tcPr>
+          <w:p>
+            <w:pPr>
+              <w:spacing w:after="40"/>
+              <w:ind w:firstLine="0"/>
+            </w:pPr>
+            <w:r>
+              <w:rPr>
+                <w:sz w:val="22"/>
+              </w:rPr>
+              <w:t>Vùng chết dừng motor</w:t>
+            </w:r>
+          </w:p>
+        </w:tc>
+        <w:tc>
+          <w:tcPr>
+            <w:tcW w:type="dxa" w:w="3010"/>
+          </w:tcPr>
+          <w:p>
+            <w:pPr>
+              <w:spacing w:after="40"/>
+              <w:ind w:firstLine="0"/>
+            </w:pPr>
+            <w:r>
+              <w:rPr>
+                <w:sz w:val="22"/>
+              </w:rPr>
+              <w:t>120 mức ADC</w:t>
+            </w:r>
+          </w:p>
+        </w:tc>
+        <w:tc>
+          <w:tcPr>
+            <w:tcW w:type="dxa" w:w="3010"/>
+          </w:tcPr>
+          <w:p>
+            <w:pPr>
+              <w:spacing w:after="40"/>
+              <w:ind w:firstLine="0"/>
+            </w:pPr>
+            <w:r>
+              <w:rPr>
+                <w:sz w:val="22"/>
+              </w:rPr>
+              <w:t>Cài đặt liên động và chu kỳ kiểm tra.</w:t>
+            </w:r>
+          </w:p>
+        </w:tc>
+      </w:tr>
+      <w:tr>
+        <w:tc>
+          <w:tcPr>
+            <w:tcW w:type="dxa" w:w="3010"/>
+          </w:tcPr>
+          <w:p>
+            <w:pPr>
+              <w:spacing w:after="40"/>
+              <w:ind w:firstLine="0"/>
+            </w:pPr>
+            <w:r>
+              <w:rPr>
+                <w:sz w:val="22"/>
+              </w:rPr>
+              <w:t>Ngưỡng mây mù S_min</w:t>
+            </w:r>
+          </w:p>
+        </w:tc>
+        <w:tc>
+          <w:tcPr>
+            <w:tcW w:type="dxa" w:w="3010"/>
+          </w:tcPr>
+          <w:p>
+            <w:pPr>
+              <w:spacing w:after="40"/>
+              <w:ind w:firstLine="0"/>
+            </w:pPr>
+            <w:r>
+              <w:rPr>
+                <w:sz w:val="22"/>
+              </w:rPr>
+              <w:t>Tổng 4 kênh &lt; 2500</w:t>
+            </w:r>
+          </w:p>
+        </w:tc>
+        <w:tc>
+          <w:tcPr>
+            <w:tcW w:type="dxa" w:w="3010"/>
+          </w:tcPr>
+          <w:p>
+            <w:pPr>
+              <w:spacing w:after="40"/>
+              <w:ind w:firstLine="0"/>
+            </w:pPr>
+            <w:r>
+              <w:rPr>
+                <w:sz w:val="22"/>
+              </w:rPr>
+              <w:t>Nhánh giữ vị trí, không thêm cảm biến thời tiết.</w:t>
+            </w:r>
+          </w:p>
+        </w:tc>
+      </w:tr>
+      <w:tr>
+        <w:tc>
+          <w:tcPr>
+            <w:tcW w:type="dxa" w:w="3010"/>
+          </w:tcPr>
+          <w:p>
+            <w:pPr>
+              <w:spacing w:after="40"/>
+              <w:ind w:firstLine="0"/>
+            </w:pPr>
+            <w:r>
+              <w:rPr>
+                <w:sz w:val="22"/>
+              </w:rPr>
+              <w:t>Góc gá cảm biến</w:t>
+            </w:r>
+          </w:p>
+        </w:tc>
+        <w:tc>
+          <w:tcPr>
+            <w:tcW w:type="dxa" w:w="3010"/>
+          </w:tcPr>
+          <w:p>
+            <w:pPr>
+              <w:spacing w:after="40"/>
+              <w:ind w:firstLine="0"/>
+            </w:pPr>
+            <w:r>
+              <w:rPr>
+                <w:sz w:val="22"/>
+              </w:rPr>
+              <w:t>β_s = 30°, chỉ nghiêng quang trở, không vách ngăn</w:t>
+            </w:r>
+          </w:p>
+        </w:tc>
+        <w:tc>
+          <w:tcPr>
+            <w:tcW w:type="dxa" w:w="3010"/>
+          </w:tcPr>
+          <w:p>
+            <w:pPr>
+              <w:spacing w:after="40"/>
+              <w:ind w:firstLine="0"/>
+            </w:pPr>
+            <w:r>
+              <w:rPr>
+                <w:sz w:val="22"/>
+              </w:rPr>
+              <w:t>Giá gá bốn LDR và đồ gá hiệu chuẩn.</w:t>
+            </w:r>
+          </w:p>
+        </w:tc>
+      </w:tr>
+      <w:tr>
+        <w:tc>
+          <w:tcPr>
+            <w:tcW w:type="dxa" w:w="3010"/>
+          </w:tcPr>
+          <w:p>
+            <w:pPr>
+              <w:spacing w:after="40"/>
+              <w:ind w:firstLine="0"/>
+            </w:pPr>
+            <w:r>
+              <w:rPr>
+                <w:sz w:val="22"/>
+              </w:rPr>
+              <w:t>So sánh ba luật</w:t>
+            </w:r>
+          </w:p>
+        </w:tc>
+        <w:tc>
+          <w:tcPr>
+            <w:tcW w:type="dxa" w:w="3010"/>
+          </w:tcPr>
+          <w:p>
+            <w:pPr>
+              <w:spacing w:after="40"/>
+              <w:ind w:firstLine="0"/>
+            </w:pPr>
+            <w:r>
+              <w:rPr>
+                <w:sz w:val="22"/>
+              </w:rPr>
+              <w:t>Hybrid sai số trung bình 2,9°, 83 lần chạy motor/ngày</w:t>
+            </w:r>
+          </w:p>
+        </w:tc>
+        <w:tc>
+          <w:tcPr>
+            <w:tcW w:type="dxa" w:w="3010"/>
+          </w:tcPr>
+          <w:p>
+            <w:pPr>
+              <w:spacing w:after="40"/>
+              <w:ind w:firstLine="0"/>
+            </w:pPr>
+            <w:r>
+              <w:rPr>
+                <w:sz w:val="22"/>
+              </w:rPr>
+              <w:t>Căn cứ chọn motor, cầu H và chu kỳ cơ khí.</w:t>
+            </w:r>
+          </w:p>
+        </w:tc>
+      </w:tr>
+      <w:tr>
+        <w:tc>
+          <w:tcPr>
+            <w:tcW w:type="dxa" w:w="3010"/>
+          </w:tcPr>
+          <w:p>
+            <w:pPr>
+              <w:spacing w:after="40"/>
+              <w:ind w:firstLine="0"/>
+            </w:pPr>
+            <w:r>
+              <w:rPr>
+                <w:sz w:val="22"/>
+              </w:rPr>
+              <w:t>Lợi ích năng lượng</w:t>
+            </w:r>
+          </w:p>
+        </w:tc>
+        <w:tc>
+          <w:tcPr>
+            <w:tcW w:type="dxa" w:w="3010"/>
+          </w:tcPr>
+          <w:p>
+            <w:pPr>
+              <w:spacing w:after="40"/>
+              <w:ind w:firstLine="0"/>
+            </w:pPr>
+            <w:r>
+              <w:rPr>
+                <w:sz w:val="22"/>
+              </w:rPr>
+              <w:t>Một trục +47…259%; hai trục +50…351% so tấm cố định</w:t>
+            </w:r>
+          </w:p>
+        </w:tc>
+        <w:tc>
+          <w:tcPr>
+            <w:tcW w:type="dxa" w:w="3010"/>
+          </w:tcPr>
+          <w:p>
+            <w:pPr>
+              <w:spacing w:after="40"/>
+              <w:ind w:firstLine="0"/>
+            </w:pPr>
+            <w:r>
+              <w:rPr>
+                <w:sz w:val="22"/>
+              </w:rPr>
+              <w:t>Quy mô khung, trục, đối trọng.</w:t>
+            </w:r>
+          </w:p>
+        </w:tc>
+      </w:tr>
+      <w:tr>
+        <w:tc>
+          <w:tcPr>
+            <w:tcW w:type="dxa" w:w="3010"/>
+          </w:tcPr>
+          <w:p>
+            <w:pPr>
+              <w:spacing w:after="40"/>
+              <w:ind w:firstLine="0"/>
+            </w:pPr>
+            <w:r>
+              <w:rPr>
+                <w:sz w:val="22"/>
+              </w:rPr>
+              <w:t>Ma trận (α, γ) theo giờ</w:t>
+            </w:r>
+          </w:p>
+        </w:tc>
+        <w:tc>
+          <w:tcPr>
+            <w:tcW w:type="dxa" w:w="3010"/>
+          </w:tcPr>
+          <w:p>
+            <w:pPr>
+              <w:spacing w:after="40"/>
+              <w:ind w:firstLine="0"/>
+            </w:pPr>
+            <w:r>
+              <w:rPr>
+                <w:sz w:val="22"/>
+              </w:rPr>
+              <w:t>Chương 4 quyển nghiên cứu</w:t>
+            </w:r>
+          </w:p>
+        </w:tc>
+        <w:tc>
+          <w:tcPr>
+            <w:tcW w:type="dxa" w:w="3010"/>
+          </w:tcPr>
+          <w:p>
+            <w:pPr>
+              <w:spacing w:after="40"/>
+              <w:ind w:firstLine="0"/>
+            </w:pPr>
+            <w:r>
+              <w:rPr>
+                <w:sz w:val="22"/>
+              </w:rPr>
+              <w:t>Bảng kiểm tra chéo góc đặt khi thử không tải.</w:t>
+            </w:r>
+          </w:p>
+        </w:tc>
+      </w:tr>
+    </w:tbl>
+    <w:p>
+      <w:pPr/>
     </w:p>
     <w:p>
       <w:pPr>
@@ -815,7 +1328,7 @@
         <w:spacing w:after="80"/>
       </w:pPr>
       <w:r>
-        <w:t>Bảng 2. Tính chọn động cơ gạt nước cho tấm pin 100 W – 4 kg</w:t>
+        <w:t>Bảng 3. Tính chọn động cơ gạt nước cho tấm pin 100 W – 4 kg</w:t>
       </w:r>
     </w:p>
     <w:tbl>
@@ -1382,7 +1895,7 @@
         <w:spacing w:after="80"/>
       </w:pPr>
       <w:r>
-        <w:t>Bảng 3. Bảng chân kết nối theo sheet ESP32 DevKit</w:t>
+        <w:t>Bảng 4. Bảng chân kết nối theo sheet ESP32 DevKit</w:t>
       </w:r>
     </w:p>
     <w:tbl>
@@ -1944,7 +2457,7 @@
         <w:spacing w:after="80"/>
       </w:pPr>
       <w:r>
-        <w:t>Bảng 4. Bảng trạng thái lệnh của cầu H (tích cực thấp qua opto)</w:t>
+        <w:t>Bảng 5. Bảng trạng thái lệnh của cầu H (tích cực thấp qua opto)</w:t>
       </w:r>
     </w:p>
     <w:tbl>
@@ -2566,7 +3079,7 @@
         <w:spacing w:after="80"/>
       </w:pPr>
       <w:r>
-        <w:t>Bảng 5. Danh mục vật tư – linh kiện của mô hình một trục</w:t>
+        <w:t>Bảng 6. Danh mục vật tư – linh kiện của mô hình một trục</w:t>
       </w:r>
     </w:p>
     <w:tbl>
@@ -2827,7 +3340,7 @@
               <w:rPr>
                 <w:sz w:val="22"/>
               </w:rPr>
-              <w:t>Vách che giữa</w:t>
+              <w:t>Giá gá bốn LDR</w:t>
             </w:r>
           </w:p>
         </w:tc>
@@ -2844,7 +3357,7 @@
               <w:rPr>
                 <w:sz w:val="22"/>
               </w:rPr>
-              <w:t>Nhôm tấm cao 3 cm</w:t>
+              <w:t>Gá nghiêng β_s = 30°, nhôm hoặc in PETG</w:t>
             </w:r>
           </w:p>
         </w:tc>
@@ -2861,7 +3374,7 @@
               <w:rPr>
                 <w:sz w:val="22"/>
               </w:rPr>
-              <w:t>1</w:t>
+              <w:t>1 bộ</w:t>
             </w:r>
           </w:p>
         </w:tc>
@@ -3887,7 +4400,7 @@
         <w:pStyle w:val="ListBullet"/>
       </w:pPr>
       <w:r>
-        <w:t>Hoàn thành lắp cụm bốn LDR và vách che lên khung pin; chụp ảnh đối chiếu bố trí với sơ đồ.</w:t>
+        <w:t>Hoàn thành lắp cụm bốn LDR gá nghiêng β_s lên khung pin; đo lại góc gá và chụp ảnh đối chiếu sơ đồ.</w:t>
       </w:r>
     </w:p>
     <w:p>
@@ -3968,7 +4481,7 @@
         <w:spacing w:after="80"/>
       </w:pPr>
       <w:r>
-        <w:t>Bảng 6. Kết quả đo đạc kiểm chứng phần cứng một trục</w:t>
+        <w:t>Bảng 7. Kết quả đo đạc kiểm chứng phần cứng một trục</w:t>
       </w:r>
     </w:p>
     <w:tbl>
@@ -5258,7 +5771,7 @@
               <w:rPr>
                 <w:sz w:val="22"/>
               </w:rPr>
-              <w:t>4 LDR tại 4 góc, gá nghiêng β_s = 30° hướng ra ngoài; vách che chữ thập giữa cụm.</w:t>
+              <w:t>4 LDR tại 4 góc, gá nghiêng β_s = 30° hướng ra ngoài, không dùng vách ngăn.</w:t>
             </w:r>
           </w:p>
         </w:tc>

</xml_diff>

<commit_message>
Thong nhat suôn 6 quyen: chung Chuong 1 + mot phan Chuong 2 cua bao cao nghien cuu
- Quyen che tao va lap trinh lay Chuong 1 va cac muc Chuong 2 phu hop tu bao
  cao nghien cuu cung do an; tu Chuong 3 moi chuyen sang cong viec cu the
- Che tao ch2: linh kien 2.1-2.6 + ba phuong phap (2.7) + so do khoi va bang
  ket qua tiep nhan (2.8); ch3 gop che tao + lap rap/hieu chuan/do dac
- Lap trinh ch2: tin hieu/thuat toan 2.1-2.7 + IDE/module/nhom lenh/tham so ke
  thua 2.8-2.12
- load_blocks doc xen ke bang trong than bai (bang nam dung vi tri trong chuong)
- Bo tu 'chot' trong 2 bang tiep nhan; PDF gop 106 trang

Co-authored-by: arena-agent <297053741+arena-agent@users.noreply.github.com>
</commit_message>
<xml_diff>
--- a/Bao_cao_1_truc_Che_tao.docx
+++ b/Bao_cao_1_truc_Che_tao.docx
@@ -7,7 +7,7 @@
         <w:pStyle w:val="Heading1"/>
       </w:pPr>
       <w:r>
-        <w:t>CHƯƠNG 1. PHƯƠNG ÁN HỆ THỐNG MỘT TRỤC ĐÃ HOÀN THÀNH THIẾT KẾ</w:t>
+        <w:t>CHƯƠNG 1. TỔNG QUAN ĐỀ TÀI</w:t>
       </w:r>
     </w:p>
     <w:p>
@@ -15,7 +15,59 @@
         <w:pStyle w:val="Heading2"/>
       </w:pPr>
       <w:r>
-        <w:t>1.1. Nguyên lý hoạt động hybrid đã chọn</w:t>
+        <w:t>1.1. Lý do chọn đề tài</w:t>
+      </w:r>
+    </w:p>
+    <w:p>
+      <w:pPr/>
+      <w:r>
+        <w:t>Tấm pin lắp cố định có hướng và góc nghiêng không đổi, trong khi vị trí biểu kiến của Mặt Trời thay đổi liên tục theo giờ và theo mùa. Khi tia nắng không gần vuông góc với bề mặt pin, thành phần bức xạ trực tiếp nhận được giảm. Cơ cấu bám nắng một trục cho phép tấm pin quay theo một mặt phẳng, qua đó cải thiện hướng thu nhận bức xạ trong một phần thời gian vận hành mà không cần cơ cấu phức tạp như hệ hai trục.</w:t>
+      </w:r>
+    </w:p>
+    <w:p>
+      <w:pPr/>
+      <w:r>
+        <w:t>Các mô hình giá thành thấp thường dùng nhiều cảm biến quang để so sánh cường độ sáng theo các hướng khác nhau. Tuy nhiên, hai cảm biến có thể khác độ nhạy; tín hiệu thay đổi theo nhiệt độ, nhiễu ADC, bụi, phản xạ và mây che. Nếu điều khiển trực tiếp theo tín hiệu thô, động cơ có thể dao động, quay sai hướng hoặc tiêu thụ nhiều điện năng phụ trợ. Vì vậy, cần nghiên cứu cách lọc, hiệu chuẩn và xác định độ tin cậy tín hiệu trước khi ra lệnh chuyển động.</w:t>
+      </w:r>
+    </w:p>
+    <w:p>
+      <w:pPr/>
+      <w:r>
+        <w:t>Đề tài “Nghiên cứu thuật toán đo cường độ ánh sáng để xác định hướng điều khiển tấm pin năng lượng mặt trời bám nắng một trục” được chọn nhằm xây dựng và so sánh các cách xử lý tín hiệu phù hợp với mô hình nhỏ, đồng thời kết hợp đường tham chiếu thiên văn để hệ thống không phụ thuộc hoàn toàn vào cảm biến quang.</w:t>
+      </w:r>
+    </w:p>
+    <w:p>
+      <w:pPr>
+        <w:pStyle w:val="Heading2"/>
+      </w:pPr>
+      <w:r>
+        <w:t>1.2. Tổng quan về đề tài</w:t>
+      </w:r>
+    </w:p>
+    <w:p>
+      <w:pPr/>
+      <w:r>
+        <w:t>Đối tượng kỹ thuật là mô hình tấm pin bám nắng một trục, dùng một cụm bốn quang trở gắn tại bốn góc mặt pin để ước lượng sai lệch theo phương quay và phương nghiêng. Mỗi cảm biến được gá đối xứng, trục cảm quang hướng chếch ra ngoài so với pháp tuyến mặt pin. Cụm cảm biến tạo được hai thành phần sai lệch; do phạm vi cơ khí của đề tài chỉ có một trục chấp hành, thuật toán dùng thành phần ứng với trục được lắp làm lệnh điều khiển, còn thành phần còn lại được ghi nhận để đánh giá hoặc mở rộng trong tương lai.</w:t>
+      </w:r>
+    </w:p>
+    <w:p>
+      <w:pPr/>
+      <w:r>
+        <w:t>Báo cáo khảo sát bốn nhóm thuật toán trên các tín hiệu quang đã tổng hợp từ bốn góc: so sánh có ngưỡng; điều khiển tỷ lệ; điều khiển tỷ lệ có lọc, bù độ lợi và vùng chết; và phương án lai dùng tín hiệu cảm biến khi đủ tin cậy, chuyển sang góc thiên văn hoặc giữ vị trí khi tín hiệu suy giảm. Trọng tâm đánh giá là khả năng nhận biết chiều quay/chiều nghiêng, sai số bám trên trục được điều khiển, mức độ chuyển động không cần thiết và năng lượng thuần sau khi tính điện năng phụ trợ.</w:t>
+      </w:r>
+    </w:p>
+    <w:p>
+      <w:pPr>
+        <w:pStyle w:val="Heading2"/>
+      </w:pPr>
+      <w:r>
+        <w:t>1.3. Mục tiêu nghiên cứu</w:t>
+      </w:r>
+    </w:p>
+    <w:p>
+      <w:pPr/>
+      <w:r>
+        <w:t>Mục tiêu tổng quát là xây dựng phương án đo và xử lý cường độ ánh sáng để xác định hướng quay cho mô hình pin mặt trời bám nắng một trục, bảo đảm chuyển động ổn định trong điều kiện ánh sáng thay đổi. Các mục tiêu cụ thể gồm:</w:t>
       </w:r>
     </w:p>
     <w:p>
@@ -23,7 +75,7 @@
         <w:pStyle w:val="ListBullet"/>
       </w:pPr>
       <w:r>
-        <w:t>Đầu buổi sáng và mỗi 30 phút: đọc giờ, ngày từ DS1307, tính δ, H, α, γ rồi đổi ra góc đặt, chạy motor nhanh về gần vị trí Mặt Trời (định vị thô).</w:t>
+        <w:t>Tìm hiểu vị trí biểu kiến của Mặt Trời, đặc tính cảm biến quang và nguyên lý bám nắng một trục.</w:t>
       </w:r>
     </w:p>
     <w:p>
@@ -31,7 +83,7 @@
         <w:pStyle w:val="ListBullet"/>
       </w:pPr>
       <w:r>
-        <w:t>Mỗi 2 phút: đọc bốn kênh LDR, tính e1 = trái − phải; nếu |e1| vượt ngưỡng thì chạy motor theo dấu e1 đến khi vào vùng chết (tinh chỉnh).</w:t>
+        <w:t>Thiết kế cụm bốn LDR tại bốn góc pin, xác định góc gá hướng ra ngoài và xây dựng quy tắc so sánh trái-phải, trên-dưới để tạo hai tín hiệu sai lệch.</w:t>
       </w:r>
     </w:p>
     <w:p>
@@ -39,7 +91,7 @@
         <w:pStyle w:val="ListBullet"/>
       </w:pPr>
       <w:r>
-        <w:t>Khi tổng sáng S &lt; S_min (mây mù): không phát lệnh LDR, tấm pin giữ vị trí theo lịch thiên văn.</w:t>
+        <w:t>Xây dựng các thuật toán so sánh, tỷ lệ, có lọc/bù/vùng chết và thuật toán lai thiên văn-cảm biến.</w:t>
       </w:r>
     </w:p>
     <w:p>
@@ -47,7 +99,7 @@
         <w:pStyle w:val="ListBullet"/>
       </w:pPr>
       <w:r>
-        <w:t>Biến trở hồi tiếp cho biết góc tấm pin hiện tại để giới hạn hành trình và hiển thị lên LCD; bốn công tắc hành trình chặn hai đầu trục.</w:t>
+        <w:t>Đề xuất cách mô phỏng, hiệu chuẩn và thử nghiệm để so sánh sai số góc, số lần/quãng quay và năng lượng thuần với tấm pin cố định.</w:t>
       </w:r>
     </w:p>
     <w:p>
@@ -55,7 +107,401 @@
         <w:pStyle w:val="Heading2"/>
       </w:pPr>
       <w:r>
-        <w:t>1.2. Sơ đồ khối hệ thống</w:t>
+        <w:t>1.4. Đối tượng và phạm vi nghiên cứu</w:t>
+      </w:r>
+    </w:p>
+    <w:p>
+      <w:pPr/>
+      <w:r>
+        <w:t>Đối tượng nghiên cứu là thuật toán xử lý tín hiệu của cụm bốn quang trở đặt ở bốn góc mặt pin để xác định chiều sai lệch theo hai phương. Mô hình cơ khí trong phạm vi báo cáo vẫn là tracker một trục; cấu hình tham khảo gồm ESP32, mạch chia áp đo điện áp tấm pin, module thời gian thực DS1307 và một động cơ gạt nước trục vít có giới hạn hành trình. Địa điểm tính toán dự kiến là khu vực Mỹ Hào, Hưng Yên (xấp xỉ 20,93° Bắc, 106,06° Đông); tọa độ chính thức cần được xác nhận theo nơi đặt mô hình. Thành phần sai lệch của trục chưa được cơ khí điều khiển chỉ được ghi nhận, không giả định rằng mô hình một trục có thể điều chỉnh đồng thời cả hai trục.</w:t>
+      </w:r>
+    </w:p>
+    <w:p>
+      <w:pPr/>
+      <w:r>
+        <w:t>Phạm vi tập trung vào mô hình công suất nhỏ, chuyển động trong mặt phẳng Đông-Tây và xử lý tín hiệu cảm biến. Báo cáo không thiết kế hệ thống hòa lưới, bộ nghịch lưu hoặc MPPT; không khẳng định mức tăng sản lượng trước khi đo; không mở rộng sang cơ cấu giàn quy mô nhà máy. Photodiode được trình bày để so sánh lựa chọn cảm biến, không mặc định là phần tử của mạch chính.</w:t>
+      </w:r>
+    </w:p>
+    <w:p>
+      <w:pPr>
+        <w:pStyle w:val="Heading2"/>
+      </w:pPr>
+      <w:r>
+        <w:t>1.5. Kết quả dự kiến</w:t>
+      </w:r>
+    </w:p>
+    <w:p>
+      <w:pPr/>
+      <w:r>
+        <w:t>Kết quả dự kiến của đề tài gồm:</w:t>
+      </w:r>
+    </w:p>
+    <w:p>
+      <w:pPr>
+        <w:pStyle w:val="ListBullet"/>
+      </w:pPr>
+      <w:r>
+        <w:t>Mô tả cơ sở lý thuyết và cấu trúc mô hình bám nắng một trục có thể triển khai.</w:t>
+      </w:r>
+    </w:p>
+    <w:p>
+      <w:pPr>
+        <w:pStyle w:val="ListBullet"/>
+      </w:pPr>
+      <w:r>
+        <w:t>Bộ thuật toán và chương trình điều khiển có các bước đọc/lọc tín hiệu, hiệu chuẩn, đánh giá chất lượng cảm biến, giới hạn góc và điều khiển cơ cấu.</w:t>
+      </w:r>
+    </w:p>
+    <w:p>
+      <w:pPr>
+        <w:pStyle w:val="ListBullet"/>
+      </w:pPr>
+      <w:r>
+        <w:t>Quy trình mô phỏng/thử nghiệm và bộ chỉ tiêu để so sánh sai số bám, hoạt động của động cơ và năng lượng thuần giữa các chế độ.</w:t>
+      </w:r>
+    </w:p>
+    <w:p>
+      <w:pPr>
+        <w:pStyle w:val="ListBullet"/>
+      </w:pPr>
+      <w:r>
+        <w:t>Báo cáo phân tích ưu điểm, giới hạn và hướng hoàn thiện sau khi có dữ liệu đo thực tế.</w:t>
+      </w:r>
+    </w:p>
+    <w:p>
+      <w:pPr/>
+      <w:r>
+        <w:t>Các mục tiêu này là kết quả dự kiến; mọi trị số hiệu suất hoặc mức cải thiện chỉ được kết luận từ dữ liệu thực nghiệm có thể kiểm tra.</w:t>
+      </w:r>
+    </w:p>
+    <w:p>
+      <w:pPr>
+        <w:pStyle w:val="Heading1"/>
+      </w:pPr>
+      <w:r>
+        <w:t>CHƯƠNG 2. CƠ SỞ LÝ THUYẾT VÀ TỔNG QUAN LINH KIỆN</w:t>
+      </w:r>
+    </w:p>
+    <w:p>
+      <w:pPr>
+        <w:pStyle w:val="Heading2"/>
+      </w:pPr>
+      <w:r>
+        <w:t>2.1. Pin năng lượng Mặt Trời</w:t>
+      </w:r>
+    </w:p>
+    <w:p>
+      <w:pPr/>
+      <w:r>
+        <w:t>Mô-đun quang điện gồm nhiều tế bào bán dẫn ghép nối tiếp/song song để tạo điện áp và dòng điện phù hợp. Tế bào thường dựa trên tiếp giáp bán dẫn p-n; khi photon có năng lượng phù hợp được hấp thụ, các hạt tải điện được tạo ra và phân tách, hình thành dòng điện một chiều. Mô-đun thương mại còn có kính bảo vệ, lớp đóng gói, mặt sau, khung và hộp nối; cấu tạo cụ thể thay đổi theo loại mô-đun.</w:t>
+      </w:r>
+    </w:p>
+    <w:p>
+      <w:pPr/>
+      <w:r>
+        <w:t>Các thông số cơ bản trên nhãn gồm công suất cực đại Pmax, điện áp hở mạch Voc, dòng ngắn mạch Isc, điện áp và dòng tại điểm công suất cực đại Vmp, Imp, cùng hệ số nhiệt. Thông số danh định thường công bố theo điều kiện thử chuẩn STC; ngoài thực tế, bức xạ, nhiệt độ tế bào, phổ ánh sáng, tải điện và che bóng làm các giá trị thay đổi. Tăng bức xạ thường làm dòng quang điện tăng; nhiệt độ tế bào tăng thường làm điện áp và công suất cực đại suy giảm.</w:t>
+      </w:r>
+    </w:p>
+    <w:p>
+      <w:pPr/>
+      <w:r>
+        <w:t>Góc giữa tia trực tiếp và pháp tuyến mặt pin ảnh hưởng thành phần bức xạ trực tiếp thu được; tracker chỉ thay đổi hướng hình học, không loại bỏ ảnh hưởng của mây hay nhiệt độ. Khi so sánh chế độ cố định và bám nắng cần đo đồng thời U và I, tính P = U×I rồi tích phân theo thời gian; điện áp đơn lẻ không đại diện cho năng lượng [1].</w:t>
+      </w:r>
+    </w:p>
+    <w:p>
+      <w:pPr>
+        <w:pStyle w:val="Heading2"/>
+      </w:pPr>
+      <w:r>
+        <w:t>2.2. Cảm biến quang trở (LDR)</w:t>
+      </w:r>
+    </w:p>
+    <w:p>
+      <w:pPr/>
+      <w:r>
+        <w:t>Quang trở (Light Dependent Resistor - LDR) là linh kiện quang dẫn: độ dẫn điện của vật liệu bán dẫn thay đổi theo lượng ánh sáng chiếu tới. Trong điều kiện sáng hơn, điện trở LDR thường giảm; khi ánh sáng yếu hoặc tối, điện trở tăng. Đặc tuyến điện trở-độ rọi không tuyến tính và phụ thuộc loại linh kiện, phổ ánh sáng, nhiệt độ, thời gian đáp ứng và sai số giữa các mẫu.</w:t>
+      </w:r>
+    </w:p>
+    <w:p>
+      <w:pPr/>
+      <w:r>
+        <w:t>Để đưa tín hiệu LDR vào vi điều khiển, thường mắc linh kiện với một điện trở cố định thành cầu phân áp rồi đọc điện áp tại điểm giữa bằng ADC. ADC có thể tăng hoặc giảm khi chiếu sáng tùy vị trí LDR trong cầu phân áp, vì vậy cần xem sơ đồ mạch và kiểm tra thực tế. LDR có giá thành thấp, mạch đơn giản nhưng độ lặp lại và tốc độ đáp ứng thường thấp hơn photodiode; cần che bụi/ẩm và hiệu chuẩn nếu dùng để so sánh định lượng.</w:t>
+      </w:r>
+    </w:p>
+    <w:p>
+      <w:pPr>
+        <w:pStyle w:val="Heading2"/>
+      </w:pPr>
+      <w:r>
+        <w:t>2.3. Diode quang (photodiode)</w:t>
+      </w:r>
+    </w:p>
+    <w:p>
+      <w:pPr/>
+      <w:r>
+        <w:t>Photodiode là linh kiện bán dẫn có vùng tiếp giáp p-n hoặc PIN nhạy với ánh sáng. Photon được hấp thụ tạo cặp điện tử-lỗ trống và sinh dòng quang. Photodiode có thể làm việc ở chế độ quang điện áp (không phân cực ngoài) hoặc quang dẫn (thường phân cực ngược); chế độ và mạch đo được chọn theo yêu cầu về tốc độ, nhiễu và tuyến tính.</w:t>
+      </w:r>
+    </w:p>
+    <w:p>
+      <w:pPr/>
+      <w:r>
+        <w:t>Dòng quang thường nhỏ nên mạch đo hay dùng bộ khuếch đại chuyển dòng-điện áp (TIA), điện trở hồi tiếp và tụ bù để ổn định. Photodiode thường đáp ứng nhanh, có tính lặp tốt và phù hợp đo biến thiên ánh sáng; hạn chế là mạch phức tạp hơn, cần căn chỉnh, che sáng ngoài ý muốn và chọn dải phổ phù hợp. Trong cấu hình đề tài, photodiode được giới thiệu như phương án cảm biến thay thế, không mặc định lắp chung với LDR.</w:t>
+      </w:r>
+    </w:p>
+    <w:p>
+      <w:pPr>
+        <w:pStyle w:val="Heading2"/>
+      </w:pPr>
+      <w:r>
+        <w:t>2.4. Bộ điều khiển ESP32 DevKit và các khối phụ trợ</w:t>
+      </w:r>
+    </w:p>
+    <w:p>
+      <w:pPr/>
+      <w:r>
+        <w:t>Bộ điều khiển trung tâm là module ESP32 DevKit. Bo có hai nhóm ADC 12 bit: ADC1 (GPIO36, 39, 32, 33...) và ADC2 (GPIO25, 26, 27, 14...); nhóm ADC2 chỉ xung đột khi bật WiFi, còn đề tài không dùng WiFi nên cả sáu kênh đo tương tự đều dùng được. Trong thiết kế đã vẽ, bốn kênh LDR đưa vào GPIO25/26/27/14, biến trở hồi tiếp góc vào GPIO36 và điện áp tấm pin (qua cầu chia) vào GPIO39; ADC của ESP32 chỉ đo điện áp 0–3,3 V nên không đo dòng điện trong phiên bản này.</w:t>
+      </w:r>
+    </w:p>
+    <w:p>
+      <w:pPr/>
+      <w:r>
+        <w:t>Thời gian thực dùng module DS1307 (I²C địa chỉ 0x68, có pin nuôi) để cấp ngày và giờ cho khối thiên văn; hiển thị dùng màn hình LCD 1602 kèm mạch chuyển I²C PCF8574 (địa chỉ 0x27), chung bus SDA/SCL (GPIO21/22) với DS1307. Nguồn 12 V qua diode chống ngược cực 1N4007, hạ áp LM2596 cấp 3,3 V cho ESP32 và nhánh 7805 riêng cấp 5 V cho LCD, DS1307.</w:t>
+      </w:r>
+    </w:p>
+    <w:p>
+      <w:pPr>
+        <w:pStyle w:val="Heading2"/>
+      </w:pPr>
+      <w:r>
+        <w:t>2.5. Động cơ gạt nước ô tô và mạch động lực cầu H bốn TIP41C</w:t>
+      </w:r>
+    </w:p>
+    <w:p>
+      <w:pPr/>
+      <w:r>
+        <w:t>Cơ cấu chấp hành là động cơ gạt nước kính ô tô 12 V kèm hộp giảm tốc trục vít – bánh vít. Ưu điểm quyết định là cặp trục vít tự hãm: khi ngắt lệnh hoặc mất điện, trục không bị kéo quay ngược nên tấm pin tự giữ vị trí dưới gió và trọng lượng bản thân mà không cần nuôi điện giữ; mô-men của motor đủ cho tấm pin 100 W nặng khoảng 4 kg ở gió vừa phải, giá thành thấp và sẵn có.</w:t>
+      </w:r>
+    </w:p>
+    <w:p>
+      <w:pPr/>
+      <w:r>
+        <w:t>Mạch động lực đảo chiều dùng cầu H ghép từ bốn transistor công suất TIP41C (NPN, 6 A, 100 V, vỏ TO-220), mỗi chân bazơ nối qua điện trở 10 k và có diode bảo vệ trả xung ngược về nguồn 12 V và mass. Hai tín hiệu điều khiển dkxuoi/dknguoc đi qua opto PC817 cách ly giữa mass 3,3 V và mass 12 V: chân lệnh ESP32 mức thấp làm sáng LED opto và kéo tín hiệu xuống mass 12 V; theo nguyên lý cầu H, dkxuoi = 0 cho cặp chéo trái dẫn, dknguoc = 0 cho cặp chéo phải dẫn, cả hai bằng 1 thì cầu H khóa và motor tự giữ.</w:t>
+      </w:r>
+    </w:p>
+    <w:p>
+      <w:pPr>
+        <w:pStyle w:val="Heading2"/>
+      </w:pPr>
+      <w:r>
+        <w:t>2.6. Công tắc hành trình</w:t>
+      </w:r>
+    </w:p>
+    <w:p>
+      <w:pPr/>
+      <w:r>
+        <w:t>Công tắc hành trình là công tắc cơ điện được tác động bởi cần gạt, con lăn hoặc nút nhấn khi cơ cấu đến vị trí giới hạn. Nhiều loại có tiếp điểm COM, NO (thường mở) và NC (thường đóng); NC thường được ưu tiên trong mạch bảo vệ vì dây đứt có thể được nhận biết như trạng thái bất thường. Khi chọn cần xét lực tác động, hành trình, dòng/điện áp tiếp điểm và độ bền cơ.</w:t>
+      </w:r>
+    </w:p>
+    <w:p>
+      <w:pPr/>
+      <w:r>
+        <w:t>Công tắc có thể đưa tín hiệu về ngõ vào số để chương trình dừng lệnh, đồng thời có thể mắc vào đường liên động của driver nếu thiết kế yêu cầu mức bảo vệ phần cứng. Cần chống dội tiếp điểm, đặt công tắc trước điểm va chạm và cấu hình sao cho khi một đầu giới hạn tác động thì chặn chuyển động đi xa hơn nhưng vẫn cho phép cơ cấu quay ngược để thoát.</w:t>
+      </w:r>
+    </w:p>
+    <w:p>
+      <w:pPr>
+        <w:pStyle w:val="Heading2"/>
+      </w:pPr>
+      <w:r>
+        <w:t>2.7. Ba phương pháp bám nắng xem xét trong đề tài</w:t>
+      </w:r>
+    </w:p>
+    <w:p>
+      <w:pPr>
+        <w:pStyle w:val="Heading3"/>
+      </w:pPr>
+      <w:r>
+        <w:t>2.7.1. Nhóm 1 – Vòng hở theo thời gian (thuật toán thiên văn)</w:t>
+      </w:r>
+    </w:p>
+    <w:p>
+      <w:pPr/>
+      <w:r>
+        <w:t>Nhóm này tính vị trí Mặt Trời từ vị trí địa lý, ngày và giờ đọc từ module thời gian thực DS1307, không cần cảm biến ánh sáng. Góc khai thiên (xích vĩ) tính theo ngày trong năm:</w:t>
+      </w:r>
+    </w:p>
+    <w:p>
+      <w:pPr>
+        <w:ind w:firstLine="0"/>
+        <w:jc w:val="center"/>
+      </w:pPr>
+      <w:r>
+        <w:rPr>
+          <w:i/>
+        </w:rPr>
+        <w:t>δ = 23,45° · sin[360°·(284 + n)/365]</w:t>
+      </w:r>
+    </w:p>
+    <w:p>
+      <w:pPr/>
+      <w:r>
+        <w:t>Góc giờ tính từ giờ Mặt Trời t (giờ):</w:t>
+      </w:r>
+    </w:p>
+    <w:p>
+      <w:pPr>
+        <w:ind w:firstLine="0"/>
+        <w:jc w:val="center"/>
+      </w:pPr>
+      <w:r>
+        <w:rPr>
+          <w:i/>
+        </w:rPr>
+        <w:t>H = 15° · (t − 12)</w:t>
+      </w:r>
+    </w:p>
+    <w:p>
+      <w:pPr/>
+      <w:r>
+        <w:t>Góc cao Mặt Trời α suy ra từ vĩ độ nơi lắp đặt φ:</w:t>
+      </w:r>
+    </w:p>
+    <w:p>
+      <w:pPr>
+        <w:ind w:firstLine="0"/>
+        <w:jc w:val="center"/>
+      </w:pPr>
+      <w:r>
+        <w:rPr>
+          <w:i/>
+        </w:rPr>
+        <w:t>sin α = sin φ · sin δ + cos φ · cos δ · cos H</w:t>
+      </w:r>
+    </w:p>
+    <w:p>
+      <w:pPr/>
+      <w:r>
+        <w:t>Góc phương vị γ tính tiếp từ α, δ và φ. Biết (α, γ) là đổi được ra góc đặt của tấm pin cho từng trục.</w:t>
+      </w:r>
+    </w:p>
+    <w:p>
+      <w:pPr>
+        <w:pStyle w:val="ListBullet"/>
+      </w:pPr>
+      <w:r>
+        <w:t>Ưu điểm: ổn định, không phụ thuộc thời tiết, không dao động quanh vị trí cân bằng.</w:t>
+      </w:r>
+    </w:p>
+    <w:p>
+      <w:pPr>
+        <w:pStyle w:val="ListBullet"/>
+      </w:pPr>
+      <w:r>
+        <w:t>Nhược điểm: phải cài đúng tọa độ và giờ; không tự sửa được sai số do lắp đặt lệch hoặc khớp cơ khí rơ.</w:t>
+      </w:r>
+    </w:p>
+    <w:p>
+      <w:pPr>
+        <w:pStyle w:val="Heading3"/>
+      </w:pPr>
+      <w:r>
+        <w:t>2.7.2. Nhóm 2 – Vòng kín dùng cảm biến quang trở (LDR)</w:t>
+      </w:r>
+    </w:p>
+    <w:p>
+      <w:pPr/>
+      <w:r>
+        <w:t>Bốn LDR đặt ở bốn góc tấm pin, mỗi cảm biến gá nghiêng ra ngoài tâm một góc β_s = 30° như nhau, không dùng vách ngăn. Khi nắng thẳng góc, bốn kênh nhận sáng gần bằng nhau; khi nắng xiên, cặp cảm biến phía bên nắng nhận mạnh hơn hẳn. Gọi giá trị đọc được của bốn kênh là trái, phải, trên, dưới, sai lệch điều khiển tính rất đơn giản:</w:t>
+      </w:r>
+    </w:p>
+    <w:p>
+      <w:pPr>
+        <w:ind w:firstLine="0"/>
+        <w:jc w:val="center"/>
+      </w:pPr>
+      <w:r>
+        <w:rPr>
+          <w:i/>
+        </w:rPr>
+        <w:t>e1 = ADC(LDR_trái) − ADC(LDR_phải);   e2 = ADC(LDR_trên) − ADC(LDR_dưới)</w:t>
+      </w:r>
+    </w:p>
+    <w:p>
+      <w:pPr>
+        <w:pStyle w:val="ListBullet"/>
+      </w:pPr>
+      <w:r>
+        <w:t>Nếu |e1| &gt; ngưỡng: quay động cơ trục 1 theo dấu e1; nếu |e2| &gt; ngưỡng: quay động cơ trục 2 theo dấu e2.</w:t>
+      </w:r>
+    </w:p>
+    <w:p>
+      <w:pPr>
+        <w:pStyle w:val="ListBullet"/>
+      </w:pPr>
+      <w:r>
+        <w:t>Ngược lại thì dừng – vùng chết (dead-band) chống dao động quanh vị trí cân bằng.</w:t>
+      </w:r>
+    </w:p>
+    <w:p>
+      <w:pPr>
+        <w:pStyle w:val="ListBullet"/>
+      </w:pPr>
+      <w:r>
+        <w:t>Ưu điểm: đơn giản, rẻ, phản ứng theo điều kiện sáng thực tế, tự sửa sai số lắp đặt.</w:t>
+      </w:r>
+    </w:p>
+    <w:p>
+      <w:pPr>
+        <w:pStyle w:val="ListBullet"/>
+      </w:pPr>
+      <w:r>
+        <w:t>Nhược điểm: nhạy với mây và bóng râm thoáng qua, dễ dao động nếu ngưỡng chọn quá nhỏ, buổi sáng sớm tín hiệu yếu nên bám chậm.</w:t>
+      </w:r>
+    </w:p>
+    <w:p>
+      <w:pPr>
+        <w:pStyle w:val="Heading3"/>
+      </w:pPr>
+      <w:r>
+        <w:t>2.7.3. Nhóm 3 – Phương pháp hybrid (kết hợp), phương án lựa chọn</w:t>
+      </w:r>
+    </w:p>
+    <w:p>
+      <w:pPr>
+        <w:pStyle w:val="ListBullet"/>
+      </w:pPr>
+      <w:r>
+        <w:t>Dùng thiên văn định vị thô: đầu buổi sáng và mỗi chu kỳ 30 phút, tính (α, γ) từ DS1307 rồi đưa nhanh tấm pin về gần vị trí Mặt Trời.</w:t>
+      </w:r>
+    </w:p>
+    <w:p>
+      <w:pPr>
+        <w:pStyle w:val="ListBullet"/>
+      </w:pPr>
+      <w:r>
+        <w:t>Dùng LDR tinh chỉnh: giữa hai lần định vị thô, so sánh e1 (và e2) với ngưỡng để khử phần sai lệch còn lại, kể cả sai số lắp đặt.</w:t>
+      </w:r>
+    </w:p>
+    <w:p>
+      <w:pPr>
+        <w:pStyle w:val="ListBullet"/>
+      </w:pPr>
+      <w:r>
+        <w:t>Khi trời nhiều mây (tổng sáng S nhỏ hơn ngưỡng S_min): giữ nguyên vị trí theo lịch thiên văn, tránh dao động vô ích do mây che thoáng qua.</w:t>
+      </w:r>
+    </w:p>
+    <w:p>
+      <w:pPr/>
+      <w:r>
+        <w:t>Phương pháp hybrid lấy được ưu điểm của cả hai nhóm: bám nhanh và ổn định như vòng hở, tự sửa sai số như vòng kín, và không săn lệnh khi thời tiết xấu. Vì vậy đề tài chọn nhóm 3 cho cả hai mô hình một trục và hai trục.</w:t>
+      </w:r>
+    </w:p>
+    <w:p>
+      <w:pPr>
+        <w:pStyle w:val="Heading2"/>
+      </w:pPr>
+      <w:r>
+        <w:t>2.8. Sơ đồ khối tổng thể và các kết quả tiếp nhận từ quyển nghiên cứu</w:t>
       </w:r>
     </w:p>
     <w:p>
@@ -103,7 +549,13 @@
         <w:pStyle w:val="Caption"/>
       </w:pPr>
       <w:r>
-        <w:t>Hình 1. Sơ đồ khối hệ thống bám nắng một trục phương pháp hybrid</w:t>
+        <w:t>Hình 1. Sơ đồ khối hệ thống một trục theo phương pháp hybrid</w:t>
+      </w:r>
+    </w:p>
+    <w:p>
+      <w:pPr/>
+      <w:r>
+        <w:t>Sơ đồ khối trên cụ thể hóa phương pháp hybrid đã nghiên cứu thành các khối mạch và cơ khí sẽ chế tạo ở chương 3; bảng dưới đây tổng hợp các kết quả đã hoàn thành ở quyển nghiên cứu và nơi áp dụng trong quyển chế tạo.</w:t>
       </w:r>
     </w:p>
     <w:p>
@@ -112,7 +564,7 @@
         <w:spacing w:after="80"/>
       </w:pPr>
       <w:r>
-        <w:t>Bảng 1. Các khối chức năng của hệ thống một trục</w:t>
+        <w:t>Bảng 1. Các kết quả tiếp nhận từ quyển nghiên cứu và cách áp dụng</w:t>
       </w:r>
     </w:p>
     <w:tbl>
@@ -142,702 +594,7 @@
                 <w:b/>
                 <w:sz w:val="22"/>
               </w:rPr>
-              <w:t>Khối</w:t>
-            </w:r>
-          </w:p>
-        </w:tc>
-        <w:tc>
-          <w:tcPr>
-            <w:tcW w:type="dxa" w:w="3010"/>
-          </w:tcPr>
-          <w:p>
-            <w:pPr>
-              <w:spacing w:after="40"/>
-              <w:ind w:firstLine="0"/>
-            </w:pPr>
-            <w:r>
-              <w:rPr>
-                <w:b/>
-                <w:sz w:val="22"/>
-              </w:rPr>
-              <w:t>Linh kiện chính</w:t>
-            </w:r>
-          </w:p>
-        </w:tc>
-        <w:tc>
-          <w:tcPr>
-            <w:tcW w:type="dxa" w:w="3010"/>
-          </w:tcPr>
-          <w:p>
-            <w:pPr>
-              <w:spacing w:after="40"/>
-              <w:ind w:firstLine="0"/>
-            </w:pPr>
-            <w:r>
-              <w:rPr>
-                <w:b/>
-                <w:sz w:val="22"/>
-              </w:rPr>
-              <w:t>Nhiệm vụ</w:t>
-            </w:r>
-          </w:p>
-        </w:tc>
-      </w:tr>
-      <w:tr>
-        <w:tc>
-          <w:tcPr>
-            <w:tcW w:type="dxa" w:w="3010"/>
-          </w:tcPr>
-          <w:p>
-            <w:pPr>
-              <w:spacing w:after="40"/>
-              <w:ind w:firstLine="0"/>
-            </w:pPr>
-            <w:r>
-              <w:rPr>
-                <w:sz w:val="22"/>
-              </w:rPr>
-              <w:t>Cảm biến hướng</w:t>
-            </w:r>
-          </w:p>
-        </w:tc>
-        <w:tc>
-          <w:tcPr>
-            <w:tcW w:type="dxa" w:w="3010"/>
-          </w:tcPr>
-          <w:p>
-            <w:pPr>
-              <w:spacing w:after="40"/>
-              <w:ind w:firstLine="0"/>
-            </w:pPr>
-            <w:r>
-              <w:rPr>
-                <w:sz w:val="22"/>
-              </w:rPr>
-              <w:t>4 LDR gá nghiêng β_s = 30°</w:t>
-            </w:r>
-          </w:p>
-        </w:tc>
-        <w:tc>
-          <w:tcPr>
-            <w:tcW w:type="dxa" w:w="3010"/>
-          </w:tcPr>
-          <w:p>
-            <w:pPr>
-              <w:spacing w:after="40"/>
-              <w:ind w:firstLine="0"/>
-            </w:pPr>
-            <w:r>
-              <w:rPr>
-                <w:sz w:val="22"/>
-              </w:rPr>
-              <w:t>Tạo e1 cho vòng tinh chỉnh.</w:t>
-            </w:r>
-          </w:p>
-        </w:tc>
-      </w:tr>
-      <w:tr>
-        <w:tc>
-          <w:tcPr>
-            <w:tcW w:type="dxa" w:w="3010"/>
-          </w:tcPr>
-          <w:p>
-            <w:pPr>
-              <w:spacing w:after="40"/>
-              <w:ind w:firstLine="0"/>
-            </w:pPr>
-            <w:r>
-              <w:rPr>
-                <w:sz w:val="22"/>
-              </w:rPr>
-              <w:t>Hồi tiếp góc</w:t>
-            </w:r>
-          </w:p>
-        </w:tc>
-        <w:tc>
-          <w:tcPr>
-            <w:tcW w:type="dxa" w:w="3010"/>
-          </w:tcPr>
-          <w:p>
-            <w:pPr>
-              <w:spacing w:after="40"/>
-              <w:ind w:firstLine="0"/>
-            </w:pPr>
-            <w:r>
-              <w:rPr>
-                <w:sz w:val="22"/>
-              </w:rPr>
-              <w:t>Biến trở xoay chia áp</w:t>
-            </w:r>
-          </w:p>
-        </w:tc>
-        <w:tc>
-          <w:tcPr>
-            <w:tcW w:type="dxa" w:w="3010"/>
-          </w:tcPr>
-          <w:p>
-            <w:pPr>
-              <w:spacing w:after="40"/>
-              <w:ind w:firstLine="0"/>
-            </w:pPr>
-            <w:r>
-              <w:rPr>
-                <w:sz w:val="22"/>
-              </w:rPr>
-              <w:t>Báo góc tấm pin cho giới hạn và hiển thị.</w:t>
-            </w:r>
-          </w:p>
-        </w:tc>
-      </w:tr>
-      <w:tr>
-        <w:tc>
-          <w:tcPr>
-            <w:tcW w:type="dxa" w:w="3010"/>
-          </w:tcPr>
-          <w:p>
-            <w:pPr>
-              <w:spacing w:after="40"/>
-              <w:ind w:firstLine="0"/>
-            </w:pPr>
-            <w:r>
-              <w:rPr>
-                <w:sz w:val="22"/>
-              </w:rPr>
-              <w:t>Thời gian thực</w:t>
-            </w:r>
-          </w:p>
-        </w:tc>
-        <w:tc>
-          <w:tcPr>
-            <w:tcW w:type="dxa" w:w="3010"/>
-          </w:tcPr>
-          <w:p>
-            <w:pPr>
-              <w:spacing w:after="40"/>
-              <w:ind w:firstLine="0"/>
-            </w:pPr>
-            <w:r>
-              <w:rPr>
-                <w:sz w:val="22"/>
-              </w:rPr>
-              <w:t>Module DS1307 (I²C 0x68)</w:t>
-            </w:r>
-          </w:p>
-        </w:tc>
-        <w:tc>
-          <w:tcPr>
-            <w:tcW w:type="dxa" w:w="3010"/>
-          </w:tcPr>
-          <w:p>
-            <w:pPr>
-              <w:spacing w:after="40"/>
-              <w:ind w:firstLine="0"/>
-            </w:pPr>
-            <w:r>
-              <w:rPr>
-                <w:sz w:val="22"/>
-              </w:rPr>
-              <w:t>Cấp ngày, giờ cho khối thiên văn.</w:t>
-            </w:r>
-          </w:p>
-        </w:tc>
-      </w:tr>
-      <w:tr>
-        <w:tc>
-          <w:tcPr>
-            <w:tcW w:type="dxa" w:w="3010"/>
-          </w:tcPr>
-          <w:p>
-            <w:pPr>
-              <w:spacing w:after="40"/>
-              <w:ind w:firstLine="0"/>
-            </w:pPr>
-            <w:r>
-              <w:rPr>
-                <w:sz w:val="22"/>
-              </w:rPr>
-              <w:t>Điều khiển</w:t>
-            </w:r>
-          </w:p>
-        </w:tc>
-        <w:tc>
-          <w:tcPr>
-            <w:tcW w:type="dxa" w:w="3010"/>
-          </w:tcPr>
-          <w:p>
-            <w:pPr>
-              <w:spacing w:after="40"/>
-              <w:ind w:firstLine="0"/>
-            </w:pPr>
-            <w:r>
-              <w:rPr>
-                <w:sz w:val="22"/>
-              </w:rPr>
-              <w:t>ESP32 DevKit</w:t>
-            </w:r>
-          </w:p>
-        </w:tc>
-        <w:tc>
-          <w:tcPr>
-            <w:tcW w:type="dxa" w:w="3010"/>
-          </w:tcPr>
-          <w:p>
-            <w:pPr>
-              <w:spacing w:after="40"/>
-              <w:ind w:firstLine="0"/>
-            </w:pPr>
-            <w:r>
-              <w:rPr>
-                <w:sz w:val="22"/>
-              </w:rPr>
-              <w:t>Đọc ADC, tính thiên văn, so ngưỡng, phát lệnh, hiển thị.</w:t>
-            </w:r>
-          </w:p>
-        </w:tc>
-      </w:tr>
-      <w:tr>
-        <w:tc>
-          <w:tcPr>
-            <w:tcW w:type="dxa" w:w="3010"/>
-          </w:tcPr>
-          <w:p>
-            <w:pPr>
-              <w:spacing w:after="40"/>
-              <w:ind w:firstLine="0"/>
-            </w:pPr>
-            <w:r>
-              <w:rPr>
-                <w:sz w:val="22"/>
-              </w:rPr>
-              <w:t>Hiển thị</w:t>
-            </w:r>
-          </w:p>
-        </w:tc>
-        <w:tc>
-          <w:tcPr>
-            <w:tcW w:type="dxa" w:w="3010"/>
-          </w:tcPr>
-          <w:p>
-            <w:pPr>
-              <w:spacing w:after="40"/>
-              <w:ind w:firstLine="0"/>
-            </w:pPr>
-            <w:r>
-              <w:rPr>
-                <w:sz w:val="22"/>
-              </w:rPr>
-              <w:t>LCD 1602 + PCF8574 (I²C 0x27)</w:t>
-            </w:r>
-          </w:p>
-        </w:tc>
-        <w:tc>
-          <w:tcPr>
-            <w:tcW w:type="dxa" w:w="3010"/>
-          </w:tcPr>
-          <w:p>
-            <w:pPr>
-              <w:spacing w:after="40"/>
-              <w:ind w:firstLine="0"/>
-            </w:pPr>
-            <w:r>
-              <w:rPr>
-                <w:sz w:val="22"/>
-              </w:rPr>
-              <w:t>Hiện giờ, góc tấm pin, trạng thái motor.</w:t>
-            </w:r>
-          </w:p>
-        </w:tc>
-      </w:tr>
-      <w:tr>
-        <w:tc>
-          <w:tcPr>
-            <w:tcW w:type="dxa" w:w="3010"/>
-          </w:tcPr>
-          <w:p>
-            <w:pPr>
-              <w:spacing w:after="40"/>
-              <w:ind w:firstLine="0"/>
-            </w:pPr>
-            <w:r>
-              <w:rPr>
-                <w:sz w:val="22"/>
-              </w:rPr>
-              <w:t>Cách ly lệnh</w:t>
-            </w:r>
-          </w:p>
-        </w:tc>
-        <w:tc>
-          <w:tcPr>
-            <w:tcW w:type="dxa" w:w="3010"/>
-          </w:tcPr>
-          <w:p>
-            <w:pPr>
-              <w:spacing w:after="40"/>
-              <w:ind w:firstLine="0"/>
-            </w:pPr>
-            <w:r>
-              <w:rPr>
-                <w:sz w:val="22"/>
-              </w:rPr>
-              <w:t>2 opto PC817 + trở 220 Ω</w:t>
-            </w:r>
-          </w:p>
-        </w:tc>
-        <w:tc>
-          <w:tcPr>
-            <w:tcW w:type="dxa" w:w="3010"/>
-          </w:tcPr>
-          <w:p>
-            <w:pPr>
-              <w:spacing w:after="40"/>
-              <w:ind w:firstLine="0"/>
-            </w:pPr>
-            <w:r>
-              <w:rPr>
-                <w:sz w:val="22"/>
-              </w:rPr>
-              <w:t>Tách mass 3,3 V và mass 12 V của mạch động lực.</w:t>
-            </w:r>
-          </w:p>
-        </w:tc>
-      </w:tr>
-      <w:tr>
-        <w:tc>
-          <w:tcPr>
-            <w:tcW w:type="dxa" w:w="3010"/>
-          </w:tcPr>
-          <w:p>
-            <w:pPr>
-              <w:spacing w:after="40"/>
-              <w:ind w:firstLine="0"/>
-            </w:pPr>
-            <w:r>
-              <w:rPr>
-                <w:sz w:val="22"/>
-              </w:rPr>
-              <w:t>Mạch động lực</w:t>
-            </w:r>
-          </w:p>
-        </w:tc>
-        <w:tc>
-          <w:tcPr>
-            <w:tcW w:type="dxa" w:w="3010"/>
-          </w:tcPr>
-          <w:p>
-            <w:pPr>
-              <w:spacing w:after="40"/>
-              <w:ind w:firstLine="0"/>
-            </w:pPr>
-            <w:r>
-              <w:rPr>
-                <w:sz w:val="22"/>
-              </w:rPr>
-              <w:t>Cầu H 4 TIP41C + diode bảo vệ</w:t>
-            </w:r>
-          </w:p>
-        </w:tc>
-        <w:tc>
-          <w:tcPr>
-            <w:tcW w:type="dxa" w:w="3010"/>
-          </w:tcPr>
-          <w:p>
-            <w:pPr>
-              <w:spacing w:after="40"/>
-              <w:ind w:firstLine="0"/>
-            </w:pPr>
-            <w:r>
-              <w:rPr>
-                <w:sz w:val="22"/>
-              </w:rPr>
-              <w:t>Đảo chiều motor gạt nước 12 V.</w:t>
-            </w:r>
-          </w:p>
-        </w:tc>
-      </w:tr>
-      <w:tr>
-        <w:tc>
-          <w:tcPr>
-            <w:tcW w:type="dxa" w:w="3010"/>
-          </w:tcPr>
-          <w:p>
-            <w:pPr>
-              <w:spacing w:after="40"/>
-              <w:ind w:firstLine="0"/>
-            </w:pPr>
-            <w:r>
-              <w:rPr>
-                <w:sz w:val="22"/>
-              </w:rPr>
-              <w:t>Chấp hành</w:t>
-            </w:r>
-          </w:p>
-        </w:tc>
-        <w:tc>
-          <w:tcPr>
-            <w:tcW w:type="dxa" w:w="3010"/>
-          </w:tcPr>
-          <w:p>
-            <w:pPr>
-              <w:spacing w:after="40"/>
-              <w:ind w:firstLine="0"/>
-            </w:pPr>
-            <w:r>
-              <w:rPr>
-                <w:sz w:val="22"/>
-              </w:rPr>
-              <w:t>Motor gạt nước trục vít</w:t>
-            </w:r>
-          </w:p>
-        </w:tc>
-        <w:tc>
-          <w:tcPr>
-            <w:tcW w:type="dxa" w:w="3010"/>
-          </w:tcPr>
-          <w:p>
-            <w:pPr>
-              <w:spacing w:after="40"/>
-              <w:ind w:firstLine="0"/>
-            </w:pPr>
-            <w:r>
-              <w:rPr>
-                <w:sz w:val="22"/>
-              </w:rPr>
-              <w:t>Quay trục Đông–Tây; tự giữ khi mất điện.</w:t>
-            </w:r>
-          </w:p>
-        </w:tc>
-      </w:tr>
-      <w:tr>
-        <w:tc>
-          <w:tcPr>
-            <w:tcW w:type="dxa" w:w="3010"/>
-          </w:tcPr>
-          <w:p>
-            <w:pPr>
-              <w:spacing w:after="40"/>
-              <w:ind w:firstLine="0"/>
-            </w:pPr>
-            <w:r>
-              <w:rPr>
-                <w:sz w:val="22"/>
-              </w:rPr>
-              <w:t>Bảo vệ</w:t>
-            </w:r>
-          </w:p>
-        </w:tc>
-        <w:tc>
-          <w:tcPr>
-            <w:tcW w:type="dxa" w:w="3010"/>
-          </w:tcPr>
-          <w:p>
-            <w:pPr>
-              <w:spacing w:after="40"/>
-              <w:ind w:firstLine="0"/>
-            </w:pPr>
-            <w:r>
-              <w:rPr>
-                <w:sz w:val="22"/>
-              </w:rPr>
-              <w:t>4 công tắc hành trình kéo xuống 1k + nút dừng</w:t>
-            </w:r>
-          </w:p>
-        </w:tc>
-        <w:tc>
-          <w:tcPr>
-            <w:tcW w:type="dxa" w:w="3010"/>
-          </w:tcPr>
-          <w:p>
-            <w:pPr>
-              <w:spacing w:after="40"/>
-              <w:ind w:firstLine="0"/>
-            </w:pPr>
-            <w:r>
-              <w:rPr>
-                <w:sz w:val="22"/>
-              </w:rPr>
-              <w:t>Chặn quá hành trình, cắt lệnh an toàn.</w:t>
-            </w:r>
-          </w:p>
-        </w:tc>
-      </w:tr>
-      <w:tr>
-        <w:tc>
-          <w:tcPr>
-            <w:tcW w:type="dxa" w:w="3010"/>
-          </w:tcPr>
-          <w:p>
-            <w:pPr>
-              <w:spacing w:after="40"/>
-              <w:ind w:firstLine="0"/>
-            </w:pPr>
-            <w:r>
-              <w:rPr>
-                <w:sz w:val="22"/>
-              </w:rPr>
-              <w:t>Nguồn</w:t>
-            </w:r>
-          </w:p>
-        </w:tc>
-        <w:tc>
-          <w:tcPr>
-            <w:tcW w:type="dxa" w:w="3010"/>
-          </w:tcPr>
-          <w:p>
-            <w:pPr>
-              <w:spacing w:after="40"/>
-              <w:ind w:firstLine="0"/>
-            </w:pPr>
-            <w:r>
-              <w:rPr>
-                <w:sz w:val="22"/>
-              </w:rPr>
-              <w:t>12 V + 1N4007 + LM2596 + 7805</w:t>
-            </w:r>
-          </w:p>
-        </w:tc>
-        <w:tc>
-          <w:tcPr>
-            <w:tcW w:type="dxa" w:w="3010"/>
-          </w:tcPr>
-          <w:p>
-            <w:pPr>
-              <w:spacing w:after="40"/>
-              <w:ind w:firstLine="0"/>
-            </w:pPr>
-            <w:r>
-              <w:rPr>
-                <w:sz w:val="22"/>
-              </w:rPr>
-              <w:t>3,3 V cho ESP32; 5 V cho LCD, DS1307; 12 V cho motor.</w:t>
-            </w:r>
-          </w:p>
-        </w:tc>
-      </w:tr>
-    </w:tbl>
-    <w:p>
-      <w:pPr/>
-    </w:p>
-    <w:p>
-      <w:pPr>
-        <w:pStyle w:val="Heading2"/>
-      </w:pPr>
-      <w:r>
-        <w:t>1.3. Cụm bốn LDR gá nghiêng β_s</w:t>
-      </w:r>
-    </w:p>
-    <w:p>
-      <w:pPr>
-        <w:ind w:firstLine="0"/>
-        <w:jc w:val="center"/>
-      </w:pPr>
-      <w:r>
-        <w:drawing>
-          <wp:inline xmlns:a="http://schemas.openxmlformats.org/drawingml/2006/main" xmlns:pic="http://schemas.openxmlformats.org/drawingml/2006/picture">
-            <wp:extent cx="5580000" cy="2346198"/>
-            <wp:docPr id="2" name="Picture 2"/>
-            <wp:cNvGraphicFramePr>
-              <a:graphicFrameLocks noChangeAspect="1"/>
-            </wp:cNvGraphicFramePr>
-            <a:graphic>
-              <a:graphicData uri="http://schemas.openxmlformats.org/drawingml/2006/picture">
-                <pic:pic>
-                  <pic:nvPicPr>
-                    <pic:cNvPr id="0" name="bo_tri_4_ldr.png"/>
-                    <pic:cNvPicPr/>
-                  </pic:nvPicPr>
-                  <pic:blipFill>
-                    <a:blip r:embed="rId11"/>
-                    <a:stretch>
-                      <a:fillRect/>
-                    </a:stretch>
-                  </pic:blipFill>
-                  <pic:spPr>
-                    <a:xfrm>
-                      <a:off x="0" y="0"/>
-                      <a:ext cx="5580000" cy="2346198"/>
-                    </a:xfrm>
-                    <a:prstGeom prst="rect"/>
-                  </pic:spPr>
-                </pic:pic>
-              </a:graphicData>
-            </a:graphic>
-          </wp:inline>
-        </w:drawing>
-      </w:r>
-    </w:p>
-    <w:p>
-      <w:pPr>
-        <w:pStyle w:val="Caption"/>
-      </w:pPr>
-      <w:r>
-        <w:t>Hình 2. Bố trí bốn LDR gá nghiêng β_s trên tấm pin</w:t>
-      </w:r>
-    </w:p>
-    <w:p>
-      <w:pPr/>
-      <w:r>
-        <w:t>Bốn LDR hàn trên mạch nhỏ bắt ở bốn góc tấm pin, mỗi cảm biến gá nghiêng ra ngoài tâm một góc β_s = 30° theo cả hai mặt cắt Đông–Tây và Bắc–Nam. Giá gá phải chắc, không để khung hoặc dây che bóng cảm biến; sau khi hiệu chuẩn thì cố định vĩnh viễn góc gá để hệ số K_cal không đổi.</w:t>
-      </w:r>
-    </w:p>
-    <w:p>
-      <w:pPr>
-        <w:pStyle w:val="Heading2"/>
-      </w:pPr>
-      <w:r>
-        <w:t>1.4. Động cơ gạt nước và khớp trục vít tự hãm</w:t>
-      </w:r>
-    </w:p>
-    <w:p>
-      <w:pPr/>
-      <w:r>
-        <w:t>Trục quay căn hướng Bắc–Nam, đặt sát trọng tâm tấm pin 100 W nặng khoảng 4 kg. Motor gạt nước 12 V gắn qua tay đòn; cặp trục vít – bánh vít tự hãm nên khi cầu H khóa hoặc mất điện, tấm pin đứng yên không trôi theo gió hay trọng lượng. Công tắc tự đỗ của motor dùng làm mốc tham khảo khi tìm vị trí home.</w:t>
-      </w:r>
-    </w:p>
-    <w:p>
-      <w:pPr>
-        <w:pStyle w:val="Heading2"/>
-      </w:pPr>
-      <w:r>
-        <w:t>1.5. Tổng hợp các kết quả tiếp nhận từ quyển nghiên cứu</w:t>
-      </w:r>
-    </w:p>
-    <w:p>
-      <w:pPr>
-        <w:pStyle w:val="Caption"/>
-        <w:spacing w:after="80"/>
-      </w:pPr>
-      <w:r>
-        <w:t>Bảng 2. Các kết quả tiếp nhận từ quyển nghiên cứu và cách áp dụng</w:t>
-      </w:r>
-    </w:p>
-    <w:tbl>
-      <w:tblPr>
-        <w:tblStyle w:val="TableGrid"/>
-        <w:tblW w:type="auto" w:w="0"/>
-        <w:jc w:val="center"/>
-        <w:tblLook w:firstColumn="1" w:firstRow="1" w:lastColumn="0" w:lastRow="0" w:noHBand="0" w:noVBand="1" w:val="04A0"/>
-      </w:tblPr>
-      <w:tblGrid>
-        <w:gridCol w:w="3010"/>
-        <w:gridCol w:w="3010"/>
-        <w:gridCol w:w="3010"/>
-      </w:tblGrid>
-      <w:tr>
-        <w:tc>
-          <w:tcPr>
-            <w:tcW w:type="dxa" w:w="3010"/>
-          </w:tcPr>
-          <w:p>
-            <w:pPr>
-              <w:spacing w:after="40"/>
-              <w:ind w:firstLine="0"/>
-            </w:pPr>
-            <w:r>
-              <w:rPr>
-                <w:b/>
-                <w:sz w:val="22"/>
-              </w:rPr>
-              <w:t>Nội dung đã chốt ở quyển nghiên cứu</w:t>
+              <w:t>Nội dung đã hoàn thành ở quyển nghiên cứu</w:t>
             </w:r>
           </w:p>
         </w:tc>
@@ -1311,7 +1068,7 @@
         <w:pStyle w:val="Heading1"/>
       </w:pPr>
       <w:r>
-        <w:t>CHƯƠNG 2. THIẾT KẾ MẠCH ĐIỆN, MẠCH ĐỘNG LỰC VÀ CƠ KHÍ</w:t>
+        <w:t>CHƯƠNG 3. CHẾ TẠO MẠCH ĐIỆN, CƠ KHÍ, LẮP RÁP, HIỆU CHUẨN VÀ ĐO ĐẠC</w:t>
       </w:r>
     </w:p>
     <w:p>
@@ -1319,7 +1076,7 @@
         <w:pStyle w:val="Heading2"/>
       </w:pPr>
       <w:r>
-        <w:t>2.1. Kết quả tính chọn động cơ cho tấm pin 100 W – 4 kg</w:t>
+        <w:t>3.1. Kết quả tính chọn động cơ cho tấm pin 100 W – 4 kg</w:t>
       </w:r>
     </w:p>
     <w:p>
@@ -1328,7 +1085,7 @@
         <w:spacing w:after="80"/>
       </w:pPr>
       <w:r>
-        <w:t>Bảng 3. Tính chọn động cơ gạt nước cho tấm pin 100 W – 4 kg</w:t>
+        <w:t>Bảng 2. Tính chọn động cơ gạt nước cho tấm pin 100 W – 4 kg</w:t>
       </w:r>
     </w:p>
     <w:tbl>
@@ -1838,7 +1595,7 @@
         <w:pStyle w:val="Heading2"/>
       </w:pPr>
       <w:r>
-        <w:t>2.2. Mạch điều khiển trung tâm: ESP32 DevKit</w:t>
+        <w:t>3.2. Mạch điều khiển trung tâm: ESP32 DevKit</w:t>
       </w:r>
     </w:p>
     <w:p>
@@ -1850,7 +1607,7 @@
         <w:drawing>
           <wp:inline xmlns:a="http://schemas.openxmlformats.org/drawingml/2006/main" xmlns:pic="http://schemas.openxmlformats.org/drawingml/2006/picture">
             <wp:extent cx="4860000" cy="3894271"/>
-            <wp:docPr id="3" name="Picture 3"/>
+            <wp:docPr id="2" name="Picture 2"/>
             <wp:cNvGraphicFramePr>
               <a:graphicFrameLocks noChangeAspect="1"/>
             </wp:cNvGraphicFramePr>
@@ -1862,7 +1619,7 @@
                     <pic:cNvPicPr/>
                   </pic:nvPicPr>
                   <pic:blipFill>
-                    <a:blip r:embed="rId12"/>
+                    <a:blip r:embed="rId11"/>
                     <a:stretch>
                       <a:fillRect/>
                     </a:stretch>
@@ -1886,7 +1643,7 @@
         <w:pStyle w:val="Caption"/>
       </w:pPr>
       <w:r>
-        <w:t>Hình 3. Sheet nguyên lý khối ESP32 DevKit và các mạng tín hiệu</w:t>
+        <w:t>Hình 2. Sheet nguyên lý khối ESP32 DevKit và các mạng tín hiệu</w:t>
       </w:r>
     </w:p>
     <w:p>
@@ -1895,7 +1652,7 @@
         <w:spacing w:after="80"/>
       </w:pPr>
       <w:r>
-        <w:t>Bảng 4. Bảng chân kết nối theo sheet ESP32 DevKit</w:t>
+        <w:t>Bảng 3. Bảng chân kết nối theo sheet ESP32 DevKit</w:t>
       </w:r>
     </w:p>
     <w:tbl>
@@ -2346,7 +2103,7 @@
         <w:pStyle w:val="Heading2"/>
       </w:pPr>
       <w:r>
-        <w:t>2.3. Mạch động lực cầu H bốn TIP41C và cách ly opto</w:t>
+        <w:t>3.3. Mạch động lực cầu H bốn TIP41C và cách ly opto</w:t>
       </w:r>
     </w:p>
     <w:p>
@@ -2358,7 +2115,7 @@
         <w:drawing>
           <wp:inline xmlns:a="http://schemas.openxmlformats.org/drawingml/2006/main" xmlns:pic="http://schemas.openxmlformats.org/drawingml/2006/picture">
             <wp:extent cx="5400000" cy="3769107"/>
-            <wp:docPr id="4" name="Picture 4"/>
+            <wp:docPr id="3" name="Picture 3"/>
             <wp:cNvGraphicFramePr>
               <a:graphicFrameLocks noChangeAspect="1"/>
             </wp:cNvGraphicFramePr>
@@ -2370,7 +2127,7 @@
                     <pic:cNvPicPr/>
                   </pic:nvPicPr>
                   <pic:blipFill>
-                    <a:blip r:embed="rId13"/>
+                    <a:blip r:embed="rId12"/>
                     <a:stretch>
                       <a:fillRect/>
                     </a:stretch>
@@ -2394,7 +2151,7 @@
         <w:pStyle w:val="Caption"/>
       </w:pPr>
       <w:r>
-        <w:t>Hình 4. Mạch động lực cầu H ghép từ bốn TIP41C kèm diode bảo vệ</w:t>
+        <w:t>Hình 3. Mạch động lực cầu H ghép từ bốn TIP41C kèm diode bảo vệ</w:t>
       </w:r>
     </w:p>
     <w:p>
@@ -2406,7 +2163,7 @@
         <w:drawing>
           <wp:inline xmlns:a="http://schemas.openxmlformats.org/drawingml/2006/main" xmlns:pic="http://schemas.openxmlformats.org/drawingml/2006/picture">
             <wp:extent cx="5220000" cy="3360256"/>
-            <wp:docPr id="5" name="Picture 5"/>
+            <wp:docPr id="4" name="Picture 4"/>
             <wp:cNvGraphicFramePr>
               <a:graphicFrameLocks noChangeAspect="1"/>
             </wp:cNvGraphicFramePr>
@@ -2418,7 +2175,7 @@
                     <pic:cNvPicPr/>
                   </pic:nvPicPr>
                   <pic:blipFill>
-                    <a:blip r:embed="rId14"/>
+                    <a:blip r:embed="rId13"/>
                     <a:stretch>
                       <a:fillRect/>
                     </a:stretch>
@@ -2442,7 +2199,7 @@
         <w:pStyle w:val="Caption"/>
       </w:pPr>
       <w:r>
-        <w:t>Hình 5. Mạch cách ly opto PC817 giữa khối điều khiển và mạch động lực</w:t>
+        <w:t>Hình 4. Mạch cách ly opto PC817 giữa khối điều khiển và mạch động lực</w:t>
       </w:r>
     </w:p>
     <w:p>
@@ -2457,7 +2214,7 @@
         <w:spacing w:after="80"/>
       </w:pPr>
       <w:r>
-        <w:t>Bảng 5. Bảng trạng thái lệnh của cầu H (tích cực thấp qua opto)</w:t>
+        <w:t>Bảng 4. Bảng trạng thái lệnh của cầu H (tích cực thấp qua opto)</w:t>
       </w:r>
     </w:p>
     <w:tbl>
@@ -2836,7 +2593,7 @@
         <w:pStyle w:val="Heading2"/>
       </w:pPr>
       <w:r>
-        <w:t>2.4. Mạch nguồn, mạch thời gian thực và mạch hiển thị</w:t>
+        <w:t>3.4. Mạch nguồn, mạch thời gian thực và mạch hiển thị</w:t>
       </w:r>
     </w:p>
     <w:p>
@@ -2848,7 +2605,7 @@
         <w:drawing>
           <wp:inline xmlns:a="http://schemas.openxmlformats.org/drawingml/2006/main" xmlns:pic="http://schemas.openxmlformats.org/drawingml/2006/picture">
             <wp:extent cx="5400000" cy="3071620"/>
-            <wp:docPr id="6" name="Picture 6"/>
+            <wp:docPr id="5" name="Picture 5"/>
             <wp:cNvGraphicFramePr>
               <a:graphicFrameLocks noChangeAspect="1"/>
             </wp:cNvGraphicFramePr>
@@ -2860,7 +2617,7 @@
                     <pic:cNvPicPr/>
                   </pic:nvPicPr>
                   <pic:blipFill>
-                    <a:blip r:embed="rId15"/>
+                    <a:blip r:embed="rId14"/>
                     <a:stretch>
                       <a:fillRect/>
                     </a:stretch>
@@ -2884,7 +2641,7 @@
         <w:pStyle w:val="Caption"/>
       </w:pPr>
       <w:r>
-        <w:t>Hình 6. Mạch nguồn chống ngược cực và hạ áp LM2596</w:t>
+        <w:t>Hình 5. Mạch nguồn chống ngược cực và hạ áp LM2596</w:t>
       </w:r>
     </w:p>
     <w:p>
@@ -2896,7 +2653,7 @@
         <w:drawing>
           <wp:inline xmlns:a="http://schemas.openxmlformats.org/drawingml/2006/main" xmlns:pic="http://schemas.openxmlformats.org/drawingml/2006/picture">
             <wp:extent cx="5400000" cy="3374178"/>
-            <wp:docPr id="7" name="Picture 7"/>
+            <wp:docPr id="6" name="Picture 6"/>
             <wp:cNvGraphicFramePr>
               <a:graphicFrameLocks noChangeAspect="1"/>
             </wp:cNvGraphicFramePr>
@@ -2908,7 +2665,7 @@
                     <pic:cNvPicPr/>
                   </pic:nvPicPr>
                   <pic:blipFill>
-                    <a:blip r:embed="rId16"/>
+                    <a:blip r:embed="rId15"/>
                     <a:stretch>
                       <a:fillRect/>
                     </a:stretch>
@@ -2932,7 +2689,7 @@
         <w:pStyle w:val="Caption"/>
       </w:pPr>
       <w:r>
-        <w:t>Hình 7. Nhánh 5 V ổn áp 7805 và màn hình LCD I²C 1602</w:t>
+        <w:t>Hình 6. Nhánh 5 V ổn áp 7805 và màn hình LCD I²C 1602</w:t>
       </w:r>
     </w:p>
     <w:p>
@@ -2944,7 +2701,7 @@
         <w:drawing>
           <wp:inline xmlns:a="http://schemas.openxmlformats.org/drawingml/2006/main" xmlns:pic="http://schemas.openxmlformats.org/drawingml/2006/picture">
             <wp:extent cx="4860000" cy="2928542"/>
-            <wp:docPr id="8" name="Picture 8"/>
+            <wp:docPr id="7" name="Picture 7"/>
             <wp:cNvGraphicFramePr>
               <a:graphicFrameLocks noChangeAspect="1"/>
             </wp:cNvGraphicFramePr>
@@ -2956,7 +2713,7 @@
                     <pic:cNvPicPr/>
                   </pic:nvPicPr>
                   <pic:blipFill>
-                    <a:blip r:embed="rId20"/>
+                    <a:blip r:embed="rId16"/>
                     <a:stretch>
                       <a:fillRect/>
                     </a:stretch>
@@ -2980,7 +2737,7 @@
         <w:pStyle w:val="Caption"/>
       </w:pPr>
       <w:r>
-        <w:t>Hình 8. Module thời gian thực DS1307 trên bus I²C</w:t>
+        <w:t>Hình 7. Module thời gian thực DS1307 trên bus I²C</w:t>
       </w:r>
     </w:p>
     <w:p>
@@ -2994,7 +2751,7 @@
         <w:pStyle w:val="Heading2"/>
       </w:pPr>
       <w:r>
-        <w:t>2.5. Mạch công tắc hành trình</w:t>
+        <w:t>3.5. Mạch công tắc hành trình</w:t>
       </w:r>
     </w:p>
     <w:p>
@@ -3006,7 +2763,7 @@
         <w:drawing>
           <wp:inline xmlns:a="http://schemas.openxmlformats.org/drawingml/2006/main" xmlns:pic="http://schemas.openxmlformats.org/drawingml/2006/picture">
             <wp:extent cx="5400000" cy="3680024"/>
-            <wp:docPr id="9" name="Picture 9"/>
+            <wp:docPr id="8" name="Picture 8"/>
             <wp:cNvGraphicFramePr>
               <a:graphicFrameLocks noChangeAspect="1"/>
             </wp:cNvGraphicFramePr>
@@ -3018,7 +2775,7 @@
                     <pic:cNvPicPr/>
                   </pic:nvPicPr>
                   <pic:blipFill>
-                    <a:blip r:embed="rId21"/>
+                    <a:blip r:embed="rId20"/>
                     <a:stretch>
                       <a:fillRect/>
                     </a:stretch>
@@ -3042,7 +2799,7 @@
         <w:pStyle w:val="Caption"/>
       </w:pPr>
       <w:r>
-        <w:t>Hình 9. Bốn công tắc hành trình kéo xuống 1k</w:t>
+        <w:t>Hình 8. Bốn công tắc hành trình kéo xuống 1k</w:t>
       </w:r>
     </w:p>
     <w:p>
@@ -3056,7 +2813,7 @@
         <w:pStyle w:val="Heading2"/>
       </w:pPr>
       <w:r>
-        <w:t>2.6. Kết cấu cơ khí</w:t>
+        <w:t>3.6. Kết cấu cơ khí</w:t>
       </w:r>
     </w:p>
     <w:p>
@@ -3070,7 +2827,7 @@
         <w:pStyle w:val="Heading2"/>
       </w:pPr>
       <w:r>
-        <w:t>2.7. Danh mục vật tư và linh kiện</w:t>
+        <w:t>3.7. Danh mục vật tư và linh kiện</w:t>
       </w:r>
     </w:p>
     <w:p>
@@ -3079,7 +2836,7 @@
         <w:spacing w:after="80"/>
       </w:pPr>
       <w:r>
-        <w:t>Bảng 6. Danh mục vật tư – linh kiện của mô hình một trục</w:t>
+        <w:t>Bảng 5. Danh mục vật tư – linh kiện của mô hình một trục</w:t>
       </w:r>
     </w:p>
     <w:tbl>
@@ -4365,18 +4122,10 @@
     </w:p>
     <w:p>
       <w:pPr>
-        <w:pStyle w:val="Heading1"/>
-      </w:pPr>
-      <w:r>
-        <w:t>CHƯƠNG 3. LẮP RÁP, HIỆU CHUẨN VÀ ĐO ĐẠC</w:t>
-      </w:r>
-    </w:p>
-    <w:p>
-      <w:pPr>
         <w:pStyle w:val="Heading2"/>
       </w:pPr>
       <w:r>
-        <w:t>3.1. Quy trình lắp ráp đã thực hiện</w:t>
+        <w:t>3.8. Quy trình lắp ráp đã thực hiện</w:t>
       </w:r>
     </w:p>
     <w:p>
@@ -4432,7 +4181,7 @@
         <w:pStyle w:val="Heading2"/>
       </w:pPr>
       <w:r>
-        <w:t>3.2. Hiệu chuẩn</w:t>
+        <w:t>3.9. Hiệu chuẩn</w:t>
       </w:r>
     </w:p>
     <w:p>
@@ -4472,7 +4221,7 @@
         <w:pStyle w:val="Heading2"/>
       </w:pPr>
       <w:r>
-        <w:t>3.3. Đo đạc kiểm chứng</w:t>
+        <w:t>3.10. Đo đạc kiểm chứng</w:t>
       </w:r>
     </w:p>
     <w:p>
@@ -4481,7 +4230,7 @@
         <w:spacing w:after="80"/>
       </w:pPr>
       <w:r>
-        <w:t>Bảng 7. Kết quả đo đạc kiểm chứng phần cứng một trục</w:t>
+        <w:t>Bảng 6. Kết quả đo đạc kiểm chứng phần cứng một trục</w:t>
       </w:r>
     </w:p>
     <w:tbl>
@@ -4758,7 +4507,7 @@
         <w:pStyle w:val="Heading2"/>
       </w:pPr>
       <w:r>
-        <w:t>3.4. An toàn</w:t>
+        <w:t>3.11. An toàn</w:t>
       </w:r>
     </w:p>
     <w:p>
@@ -4944,1354 +4693,6 @@
       <w:r>
         <w:t>[12] W. F. Holmgren, C. W. Hansen, and M. A. Mikofski, “pvlib python: a python package for modeling solar energy systems,” Journal of Open Source Software, vol. 3, no. 29, p. 884, 2018.</w:t>
       </w:r>
-    </w:p>
-    <w:tbl>
-      <w:tblPr>
-        <w:tblStyle w:val="TableGrid"/>
-        <w:tblW w:type="auto" w:w="0"/>
-        <w:jc w:val="center"/>
-        <w:tblLook w:firstColumn="1" w:firstRow="1" w:lastColumn="0" w:lastRow="0" w:noHBand="0" w:noVBand="1" w:val="04A0"/>
-      </w:tblPr>
-      <w:tblGrid>
-        <w:gridCol w:w="3010"/>
-        <w:gridCol w:w="3010"/>
-        <w:gridCol w:w="3010"/>
-      </w:tblGrid>
-      <w:tr>
-        <w:tc>
-          <w:tcPr>
-            <w:tcW w:type="dxa" w:w="3010"/>
-          </w:tcPr>
-          <w:p>
-            <w:pPr>
-              <w:spacing w:after="40"/>
-              <w:ind w:firstLine="0"/>
-            </w:pPr>
-            <w:r>
-              <w:rPr>
-                <w:b/>
-                <w:sz w:val="22"/>
-              </w:rPr>
-              <w:t>Giai đoạn thiên văn ở Bắc bán cầu</w:t>
-            </w:r>
-          </w:p>
-        </w:tc>
-        <w:tc>
-          <w:tcPr>
-            <w:tcW w:type="dxa" w:w="3010"/>
-          </w:tcPr>
-          <w:p>
-            <w:pPr>
-              <w:spacing w:after="40"/>
-              <w:ind w:firstLine="0"/>
-            </w:pPr>
-            <w:r>
-              <w:rPr>
-                <w:b/>
-                <w:sz w:val="22"/>
-              </w:rPr>
-              <w:t>Xích vĩ Mặt Trời (xấp xỉ)</w:t>
-            </w:r>
-          </w:p>
-        </w:tc>
-        <w:tc>
-          <w:tcPr>
-            <w:tcW w:type="dxa" w:w="3010"/>
-          </w:tcPr>
-          <w:p>
-            <w:pPr>
-              <w:spacing w:after="40"/>
-              <w:ind w:firstLine="0"/>
-            </w:pPr>
-            <w:r>
-              <w:rPr>
-                <w:b/>
-                <w:sz w:val="22"/>
-              </w:rPr>
-              <w:t>Đặc điểm đường đi biểu kiến</w:t>
-            </w:r>
-          </w:p>
-        </w:tc>
-      </w:tr>
-      <w:tr>
-        <w:tc>
-          <w:tcPr>
-            <w:tcW w:type="dxa" w:w="3010"/>
-          </w:tcPr>
-          <w:p>
-            <w:pPr>
-              <w:spacing w:after="40"/>
-              <w:ind w:firstLine="0"/>
-            </w:pPr>
-            <w:r>
-              <w:rPr>
-                <w:sz w:val="22"/>
-              </w:rPr>
-              <w:t>Xuân: điểm phân tháng 3 đến chí tháng 6</w:t>
-            </w:r>
-          </w:p>
-        </w:tc>
-        <w:tc>
-          <w:tcPr>
-            <w:tcW w:type="dxa" w:w="3010"/>
-          </w:tcPr>
-          <w:p>
-            <w:pPr>
-              <w:spacing w:after="40"/>
-              <w:ind w:firstLine="0"/>
-            </w:pPr>
-            <w:r>
-              <w:rPr>
-                <w:sz w:val="22"/>
-              </w:rPr>
-              <w:t>0° → +23,44°</w:t>
-            </w:r>
-          </w:p>
-        </w:tc>
-        <w:tc>
-          <w:tcPr>
-            <w:tcW w:type="dxa" w:w="3010"/>
-          </w:tcPr>
-          <w:p>
-            <w:pPr>
-              <w:spacing w:after="40"/>
-              <w:ind w:firstLine="0"/>
-            </w:pPr>
-            <w:r>
-              <w:rPr>
-                <w:sz w:val="22"/>
-              </w:rPr>
-              <w:t>Độ cao Mặt Trời giữa trưa tăng; ngày dài dần.</w:t>
-            </w:r>
-          </w:p>
-        </w:tc>
-      </w:tr>
-      <w:tr>
-        <w:tc>
-          <w:tcPr>
-            <w:tcW w:type="dxa" w:w="3010"/>
-          </w:tcPr>
-          <w:p>
-            <w:pPr>
-              <w:spacing w:after="40"/>
-              <w:ind w:firstLine="0"/>
-            </w:pPr>
-            <w:r>
-              <w:rPr>
-                <w:sz w:val="22"/>
-              </w:rPr>
-              <w:t>Hạ: chí tháng 6 đến điểm phân tháng 9</w:t>
-            </w:r>
-          </w:p>
-        </w:tc>
-        <w:tc>
-          <w:tcPr>
-            <w:tcW w:type="dxa" w:w="3010"/>
-          </w:tcPr>
-          <w:p>
-            <w:pPr>
-              <w:spacing w:after="40"/>
-              <w:ind w:firstLine="0"/>
-            </w:pPr>
-            <w:r>
-              <w:rPr>
-                <w:sz w:val="22"/>
-              </w:rPr>
-              <w:t>+23,44° → 0°</w:t>
-            </w:r>
-          </w:p>
-        </w:tc>
-        <w:tc>
-          <w:tcPr>
-            <w:tcW w:type="dxa" w:w="3010"/>
-          </w:tcPr>
-          <w:p>
-            <w:pPr>
-              <w:spacing w:after="40"/>
-              <w:ind w:firstLine="0"/>
-            </w:pPr>
-            <w:r>
-              <w:rPr>
-                <w:sz w:val="22"/>
-              </w:rPr>
-              <w:t>Mặt Trời đi cao; ngày dài rồi giảm dần.</w:t>
-            </w:r>
-          </w:p>
-        </w:tc>
-      </w:tr>
-      <w:tr>
-        <w:tc>
-          <w:tcPr>
-            <w:tcW w:type="dxa" w:w="3010"/>
-          </w:tcPr>
-          <w:p>
-            <w:pPr>
-              <w:spacing w:after="40"/>
-              <w:ind w:firstLine="0"/>
-            </w:pPr>
-            <w:r>
-              <w:rPr>
-                <w:sz w:val="22"/>
-              </w:rPr>
-              <w:t>Thu: điểm phân tháng 9 đến chí tháng 12</w:t>
-            </w:r>
-          </w:p>
-        </w:tc>
-        <w:tc>
-          <w:tcPr>
-            <w:tcW w:type="dxa" w:w="3010"/>
-          </w:tcPr>
-          <w:p>
-            <w:pPr>
-              <w:spacing w:after="40"/>
-              <w:ind w:firstLine="0"/>
-            </w:pPr>
-            <w:r>
-              <w:rPr>
-                <w:sz w:val="22"/>
-              </w:rPr>
-              <w:t>0° → −23,44°</w:t>
-            </w:r>
-          </w:p>
-        </w:tc>
-        <w:tc>
-          <w:tcPr>
-            <w:tcW w:type="dxa" w:w="3010"/>
-          </w:tcPr>
-          <w:p>
-            <w:pPr>
-              <w:spacing w:after="40"/>
-              <w:ind w:firstLine="0"/>
-            </w:pPr>
-            <w:r>
-              <w:rPr>
-                <w:sz w:val="22"/>
-              </w:rPr>
-              <w:t>Quỹ đạo hạ thấp; ngày ngắn dần.</w:t>
-            </w:r>
-          </w:p>
-        </w:tc>
-      </w:tr>
-      <w:tr>
-        <w:tc>
-          <w:tcPr>
-            <w:tcW w:type="dxa" w:w="3010"/>
-          </w:tcPr>
-          <w:p>
-            <w:pPr>
-              <w:spacing w:after="40"/>
-              <w:ind w:firstLine="0"/>
-            </w:pPr>
-            <w:r>
-              <w:rPr>
-                <w:sz w:val="22"/>
-              </w:rPr>
-              <w:t>Đông: chí tháng 12 đến điểm phân tháng 3</w:t>
-            </w:r>
-          </w:p>
-        </w:tc>
-        <w:tc>
-          <w:tcPr>
-            <w:tcW w:type="dxa" w:w="3010"/>
-          </w:tcPr>
-          <w:p>
-            <w:pPr>
-              <w:spacing w:after="40"/>
-              <w:ind w:firstLine="0"/>
-            </w:pPr>
-            <w:r>
-              <w:rPr>
-                <w:sz w:val="22"/>
-              </w:rPr>
-              <w:t>−23,44° → 0°</w:t>
-            </w:r>
-          </w:p>
-        </w:tc>
-        <w:tc>
-          <w:tcPr>
-            <w:tcW w:type="dxa" w:w="3010"/>
-          </w:tcPr>
-          <w:p>
-            <w:pPr>
-              <w:spacing w:after="40"/>
-              <w:ind w:firstLine="0"/>
-            </w:pPr>
-            <w:r>
-              <w:rPr>
-                <w:sz w:val="22"/>
-              </w:rPr>
-              <w:t>Mặt Trời đi thấp; ngày ngắn rồi dài dần.</w:t>
-            </w:r>
-          </w:p>
-        </w:tc>
-      </w:tr>
-    </w:tbl>
-    <w:p>
-      <w:pPr/>
-    </w:p>
-    <w:tbl>
-      <w:tblPr>
-        <w:tblStyle w:val="TableGrid"/>
-        <w:tblW w:type="auto" w:w="0"/>
-        <w:jc w:val="center"/>
-        <w:tblLook w:firstColumn="1" w:firstRow="1" w:lastColumn="0" w:lastRow="0" w:noHBand="0" w:noVBand="1" w:val="04A0"/>
-      </w:tblPr>
-      <w:tblGrid>
-        <w:gridCol w:w="3010"/>
-        <w:gridCol w:w="3010"/>
-        <w:gridCol w:w="3010"/>
-      </w:tblGrid>
-      <w:tr>
-        <w:tc>
-          <w:tcPr>
-            <w:tcW w:type="dxa" w:w="3010"/>
-          </w:tcPr>
-          <w:p>
-            <w:pPr>
-              <w:spacing w:after="40"/>
-              <w:ind w:firstLine="0"/>
-            </w:pPr>
-            <w:r>
-              <w:rPr>
-                <w:b/>
-                <w:sz w:val="22"/>
-              </w:rPr>
-              <w:t>Phương pháp</w:t>
-            </w:r>
-          </w:p>
-        </w:tc>
-        <w:tc>
-          <w:tcPr>
-            <w:tcW w:type="dxa" w:w="3010"/>
-          </w:tcPr>
-          <w:p>
-            <w:pPr>
-              <w:spacing w:after="40"/>
-              <w:ind w:firstLine="0"/>
-            </w:pPr>
-            <w:r>
-              <w:rPr>
-                <w:b/>
-                <w:sz w:val="22"/>
-              </w:rPr>
-              <w:t>Ưu điểm chính</w:t>
-            </w:r>
-          </w:p>
-        </w:tc>
-        <w:tc>
-          <w:tcPr>
-            <w:tcW w:type="dxa" w:w="3010"/>
-          </w:tcPr>
-          <w:p>
-            <w:pPr>
-              <w:spacing w:after="40"/>
-              <w:ind w:firstLine="0"/>
-            </w:pPr>
-            <w:r>
-              <w:rPr>
-                <w:b/>
-                <w:sz w:val="22"/>
-              </w:rPr>
-              <w:t>Hạn chế / điều kiện áp dụng</w:t>
-            </w:r>
-          </w:p>
-        </w:tc>
-      </w:tr>
-      <w:tr>
-        <w:tc>
-          <w:tcPr>
-            <w:tcW w:type="dxa" w:w="3010"/>
-          </w:tcPr>
-          <w:p>
-            <w:pPr>
-              <w:spacing w:after="40"/>
-              <w:ind w:firstLine="0"/>
-            </w:pPr>
-            <w:r>
-              <w:rPr>
-                <w:sz w:val="22"/>
-              </w:rPr>
-              <w:t>Cố định / chỉnh nghiêng theo mùa</w:t>
-            </w:r>
-          </w:p>
-        </w:tc>
-        <w:tc>
-          <w:tcPr>
-            <w:tcW w:type="dxa" w:w="3010"/>
-          </w:tcPr>
-          <w:p>
-            <w:pPr>
-              <w:spacing w:after="40"/>
-              <w:ind w:firstLine="0"/>
-            </w:pPr>
-            <w:r>
-              <w:rPr>
-                <w:sz w:val="22"/>
-              </w:rPr>
-              <w:t>Đơn giản, bền, không tốn điện cho chuyển động.</w:t>
-            </w:r>
-          </w:p>
-        </w:tc>
-        <w:tc>
-          <w:tcPr>
-            <w:tcW w:type="dxa" w:w="3010"/>
-          </w:tcPr>
-          <w:p>
-            <w:pPr>
-              <w:spacing w:after="40"/>
-              <w:ind w:firstLine="0"/>
-            </w:pPr>
-            <w:r>
-              <w:rPr>
-                <w:sz w:val="22"/>
-              </w:rPr>
-              <w:t>Không bám trong ngày; cần chọn góc lắp và đối chứng.</w:t>
-            </w:r>
-          </w:p>
-        </w:tc>
-      </w:tr>
-      <w:tr>
-        <w:tc>
-          <w:tcPr>
-            <w:tcW w:type="dxa" w:w="3010"/>
-          </w:tcPr>
-          <w:p>
-            <w:pPr>
-              <w:spacing w:after="40"/>
-              <w:ind w:firstLine="0"/>
-            </w:pPr>
-            <w:r>
-              <w:rPr>
-                <w:sz w:val="22"/>
-              </w:rPr>
-              <w:t>Vòng hở thiên văn</w:t>
-            </w:r>
-          </w:p>
-        </w:tc>
-        <w:tc>
-          <w:tcPr>
-            <w:tcW w:type="dxa" w:w="3010"/>
-          </w:tcPr>
-          <w:p>
-            <w:pPr>
-              <w:spacing w:after="40"/>
-              <w:ind w:firstLine="0"/>
-            </w:pPr>
-            <w:r>
-              <w:rPr>
-                <w:sz w:val="22"/>
-              </w:rPr>
-              <w:t>Không phụ thuộc tín hiệu quang; làm việc được khi có mây.</w:t>
-            </w:r>
-          </w:p>
-        </w:tc>
-        <w:tc>
-          <w:tcPr>
-            <w:tcW w:type="dxa" w:w="3010"/>
-          </w:tcPr>
-          <w:p>
-            <w:pPr>
-              <w:spacing w:after="40"/>
-              <w:ind w:firstLine="0"/>
-            </w:pPr>
-            <w:r>
-              <w:rPr>
-                <w:sz w:val="22"/>
-              </w:rPr>
-              <w:t>Cần RTC, tọa độ, lắp đặt và hiệu chuẩn đúng.</w:t>
-            </w:r>
-          </w:p>
-        </w:tc>
-      </w:tr>
-      <w:tr>
-        <w:tc>
-          <w:tcPr>
-            <w:tcW w:type="dxa" w:w="3010"/>
-          </w:tcPr>
-          <w:p>
-            <w:pPr>
-              <w:spacing w:after="40"/>
-              <w:ind w:firstLine="0"/>
-            </w:pPr>
-            <w:r>
-              <w:rPr>
-                <w:sz w:val="22"/>
-              </w:rPr>
-              <w:t>Vòng kín LDR / photodiode</w:t>
-            </w:r>
-          </w:p>
-        </w:tc>
-        <w:tc>
-          <w:tcPr>
-            <w:tcW w:type="dxa" w:w="3010"/>
-          </w:tcPr>
-          <w:p>
-            <w:pPr>
-              <w:spacing w:after="40"/>
-              <w:ind w:firstLine="0"/>
-            </w:pPr>
-            <w:r>
-              <w:rPr>
-                <w:sz w:val="22"/>
-              </w:rPr>
-              <w:t>Tự dò hướng sáng, cấu hình phần cứng gọn.</w:t>
-            </w:r>
-          </w:p>
-        </w:tc>
-        <w:tc>
-          <w:tcPr>
-            <w:tcW w:type="dxa" w:w="3010"/>
-          </w:tcPr>
-          <w:p>
-            <w:pPr>
-              <w:spacing w:after="40"/>
-              <w:ind w:firstLine="0"/>
-            </w:pPr>
-            <w:r>
-              <w:rPr>
-                <w:sz w:val="22"/>
-              </w:rPr>
-              <w:t>Mây, bóng, bụi và sai lệch cảm biến gây lệnh sai.</w:t>
-            </w:r>
-          </w:p>
-        </w:tc>
-      </w:tr>
-      <w:tr>
-        <w:tc>
-          <w:tcPr>
-            <w:tcW w:type="dxa" w:w="3010"/>
-          </w:tcPr>
-          <w:p>
-            <w:pPr>
-              <w:spacing w:after="40"/>
-              <w:ind w:firstLine="0"/>
-            </w:pPr>
-            <w:r>
-              <w:rPr>
-                <w:sz w:val="22"/>
-              </w:rPr>
-              <w:t>Lai thiên văn + quang</w:t>
-            </w:r>
-          </w:p>
-        </w:tc>
-        <w:tc>
-          <w:tcPr>
-            <w:tcW w:type="dxa" w:w="3010"/>
-          </w:tcPr>
-          <w:p>
-            <w:pPr>
-              <w:spacing w:after="40"/>
-              <w:ind w:firstLine="0"/>
-            </w:pPr>
-            <w:r>
-              <w:rPr>
-                <w:sz w:val="22"/>
-              </w:rPr>
-              <w:t>Có góc tham chiếu và hiệu chỉnh thực tế; có thể dự phòng cảm biến.</w:t>
-            </w:r>
-          </w:p>
-        </w:tc>
-        <w:tc>
-          <w:tcPr>
-            <w:tcW w:type="dxa" w:w="3010"/>
-          </w:tcPr>
-          <w:p>
-            <w:pPr>
-              <w:spacing w:after="40"/>
-              <w:ind w:firstLine="0"/>
-            </w:pPr>
-            <w:r>
-              <w:rPr>
-                <w:sz w:val="22"/>
-              </w:rPr>
-              <w:t>Cần logic chất lượng tín hiệu và hiệu chuẩn.</w:t>
-            </w:r>
-          </w:p>
-        </w:tc>
-      </w:tr>
-      <w:tr>
-        <w:tc>
-          <w:tcPr>
-            <w:tcW w:type="dxa" w:w="3010"/>
-          </w:tcPr>
-          <w:p>
-            <w:pPr>
-              <w:spacing w:after="40"/>
-              <w:ind w:firstLine="0"/>
-            </w:pPr>
-            <w:r>
-              <w:rPr>
-                <w:sz w:val="22"/>
-              </w:rPr>
-              <w:t>Tối ưu theo công suất PV</w:t>
-            </w:r>
-          </w:p>
-        </w:tc>
-        <w:tc>
-          <w:tcPr>
-            <w:tcW w:type="dxa" w:w="3010"/>
-          </w:tcPr>
-          <w:p>
-            <w:pPr>
-              <w:spacing w:after="40"/>
-              <w:ind w:firstLine="0"/>
-            </w:pPr>
-            <w:r>
-              <w:rPr>
-                <w:sz w:val="22"/>
-              </w:rPr>
-              <w:t>Đánh giá trực tiếp đầu ra điện của hệ thống.</w:t>
-            </w:r>
-          </w:p>
-        </w:tc>
-        <w:tc>
-          <w:tcPr>
-            <w:tcW w:type="dxa" w:w="3010"/>
-          </w:tcPr>
-          <w:p>
-            <w:pPr>
-              <w:spacing w:after="40"/>
-              <w:ind w:firstLine="0"/>
-            </w:pPr>
-            <w:r>
-              <w:rPr>
-                <w:sz w:val="22"/>
-              </w:rPr>
-              <w:t>Mây gây dao động; đo và tìm kiếm có thể chậm.</w:t>
-            </w:r>
-          </w:p>
-        </w:tc>
-      </w:tr>
-      <w:tr>
-        <w:tc>
-          <w:tcPr>
-            <w:tcW w:type="dxa" w:w="3010"/>
-          </w:tcPr>
-          <w:p>
-            <w:pPr>
-              <w:spacing w:after="40"/>
-              <w:ind w:firstLine="0"/>
-            </w:pPr>
-            <w:r>
-              <w:rPr>
-                <w:sz w:val="22"/>
-              </w:rPr>
-              <w:t>Camera / tracker thụ động</w:t>
-            </w:r>
-          </w:p>
-        </w:tc>
-        <w:tc>
-          <w:tcPr>
-            <w:tcW w:type="dxa" w:w="3010"/>
-          </w:tcPr>
-          <w:p>
-            <w:pPr>
-              <w:spacing w:after="40"/>
-              <w:ind w:firstLine="0"/>
-            </w:pPr>
-            <w:r>
-              <w:rPr>
-                <w:sz w:val="22"/>
-              </w:rPr>
-              <w:t>Camera có thể nhận dạng hướng; thụ động giảm mạch điện.</w:t>
-            </w:r>
-          </w:p>
-        </w:tc>
-        <w:tc>
-          <w:tcPr>
-            <w:tcW w:type="dxa" w:w="3010"/>
-          </w:tcPr>
-          <w:p>
-            <w:pPr>
-              <w:spacing w:after="40"/>
-              <w:ind w:firstLine="0"/>
-            </w:pPr>
-            <w:r>
-              <w:rPr>
-                <w:sz w:val="22"/>
-              </w:rPr>
-              <w:t>Camera đắt và tính toán lớn; thụ động phụ thuộc môi trường.</w:t>
-            </w:r>
-          </w:p>
-        </w:tc>
-      </w:tr>
-      <w:tr>
-        <w:tc>
-          <w:tcPr>
-            <w:tcW w:type="dxa" w:w="3010"/>
-          </w:tcPr>
-          <w:p>
-            <w:pPr>
-              <w:spacing w:after="40"/>
-              <w:ind w:firstLine="0"/>
-            </w:pPr>
-            <w:r>
-              <w:rPr>
-                <w:sz w:val="22"/>
-              </w:rPr>
-              <w:t>Backtracking giàn nhiều hàng</w:t>
-            </w:r>
-          </w:p>
-        </w:tc>
-        <w:tc>
-          <w:tcPr>
-            <w:tcW w:type="dxa" w:w="3010"/>
-          </w:tcPr>
-          <w:p>
-            <w:pPr>
-              <w:spacing w:after="40"/>
-              <w:ind w:firstLine="0"/>
-            </w:pPr>
-            <w:r>
-              <w:rPr>
-                <w:sz w:val="22"/>
-              </w:rPr>
-              <w:t>Giảm che bóng giữa các hàng pin.</w:t>
-            </w:r>
-          </w:p>
-        </w:tc>
-        <w:tc>
-          <w:tcPr>
-            <w:tcW w:type="dxa" w:w="3010"/>
-          </w:tcPr>
-          <w:p>
-            <w:pPr>
-              <w:spacing w:after="40"/>
-              <w:ind w:firstLine="0"/>
-            </w:pPr>
-            <w:r>
-              <w:rPr>
-                <w:sz w:val="22"/>
-              </w:rPr>
-              <w:t>Chủ yếu phù hợp giàn nhiều hàng, không cần cho mô hình đơn.</w:t>
-            </w:r>
-          </w:p>
-        </w:tc>
-      </w:tr>
-    </w:tbl>
-    <w:p>
-      <w:pPr/>
-    </w:p>
-    <w:tbl>
-      <w:tblPr>
-        <w:tblStyle w:val="TableGrid"/>
-        <w:tblW w:type="auto" w:w="0"/>
-        <w:jc w:val="center"/>
-        <w:tblLook w:firstColumn="1" w:firstRow="1" w:lastColumn="0" w:lastRow="0" w:noHBand="0" w:noVBand="1" w:val="04A0"/>
-      </w:tblPr>
-      <w:tblGrid>
-        <w:gridCol w:w="3010"/>
-        <w:gridCol w:w="3010"/>
-        <w:gridCol w:w="3010"/>
-      </w:tblGrid>
-      <w:tr>
-        <w:tc>
-          <w:tcPr>
-            <w:tcW w:type="dxa" w:w="3010"/>
-          </w:tcPr>
-          <w:p>
-            <w:pPr>
-              <w:spacing w:after="40"/>
-              <w:ind w:firstLine="0"/>
-            </w:pPr>
-            <w:r>
-              <w:rPr>
-                <w:b/>
-                <w:sz w:val="22"/>
-              </w:rPr>
-              <w:t>Khối</w:t>
-            </w:r>
-          </w:p>
-        </w:tc>
-        <w:tc>
-          <w:tcPr>
-            <w:tcW w:type="dxa" w:w="3010"/>
-          </w:tcPr>
-          <w:p>
-            <w:pPr>
-              <w:spacing w:after="40"/>
-              <w:ind w:firstLine="0"/>
-            </w:pPr>
-            <w:r>
-              <w:rPr>
-                <w:b/>
-                <w:sz w:val="22"/>
-              </w:rPr>
-              <w:t>Cấu hình đề xuất</w:t>
-            </w:r>
-          </w:p>
-        </w:tc>
-        <w:tc>
-          <w:tcPr>
-            <w:tcW w:type="dxa" w:w="3010"/>
-          </w:tcPr>
-          <w:p>
-            <w:pPr>
-              <w:spacing w:after="40"/>
-              <w:ind w:firstLine="0"/>
-            </w:pPr>
-            <w:r>
-              <w:rPr>
-                <w:b/>
-                <w:sz w:val="22"/>
-              </w:rPr>
-              <w:t>Nhiệm vụ</w:t>
-            </w:r>
-          </w:p>
-        </w:tc>
-      </w:tr>
-      <w:tr>
-        <w:tc>
-          <w:tcPr>
-            <w:tcW w:type="dxa" w:w="3010"/>
-          </w:tcPr>
-          <w:p>
-            <w:pPr>
-              <w:spacing w:after="40"/>
-              <w:ind w:firstLine="0"/>
-            </w:pPr>
-            <w:r>
-              <w:rPr>
-                <w:sz w:val="22"/>
-              </w:rPr>
-              <w:t>Cảm biến</w:t>
-            </w:r>
-          </w:p>
-        </w:tc>
-        <w:tc>
-          <w:tcPr>
-            <w:tcW w:type="dxa" w:w="3010"/>
-          </w:tcPr>
-          <w:p>
-            <w:pPr>
-              <w:spacing w:after="40"/>
-              <w:ind w:firstLine="0"/>
-            </w:pPr>
-            <w:r>
-              <w:rPr>
-                <w:sz w:val="22"/>
-              </w:rPr>
-              <w:t>4 LDR tại 4 góc, gá nghiêng β_s = 30° hướng ra ngoài, không dùng vách ngăn.</w:t>
-            </w:r>
-          </w:p>
-        </w:tc>
-        <w:tc>
-          <w:tcPr>
-            <w:tcW w:type="dxa" w:w="3010"/>
-          </w:tcPr>
-          <w:p>
-            <w:pPr>
-              <w:spacing w:after="40"/>
-              <w:ind w:firstLine="0"/>
-            </w:pPr>
-            <w:r>
-              <w:rPr>
-                <w:sz w:val="22"/>
-              </w:rPr>
-              <w:t>Đo bốn mức sáng; tạo sai lệch quay và nghiêng.</w:t>
-            </w:r>
-          </w:p>
-        </w:tc>
-      </w:tr>
-      <w:tr>
-        <w:tc>
-          <w:tcPr>
-            <w:tcW w:type="dxa" w:w="3010"/>
-          </w:tcPr>
-          <w:p>
-            <w:pPr>
-              <w:spacing w:after="40"/>
-              <w:ind w:firstLine="0"/>
-            </w:pPr>
-            <w:r>
-              <w:rPr>
-                <w:sz w:val="22"/>
-              </w:rPr>
-              <w:t>Điều khiển</w:t>
-            </w:r>
-          </w:p>
-        </w:tc>
-        <w:tc>
-          <w:tcPr>
-            <w:tcW w:type="dxa" w:w="3010"/>
-          </w:tcPr>
-          <w:p>
-            <w:pPr>
-              <w:spacing w:after="40"/>
-              <w:ind w:firstLine="0"/>
-            </w:pPr>
-            <w:r>
-              <w:rPr>
-                <w:sz w:val="22"/>
-              </w:rPr>
-              <w:t>ESP32 + RTC DS1307.</w:t>
-            </w:r>
-          </w:p>
-        </w:tc>
-        <w:tc>
-          <w:tcPr>
-            <w:tcW w:type="dxa" w:w="3010"/>
-          </w:tcPr>
-          <w:p>
-            <w:pPr>
-              <w:spacing w:after="40"/>
-              <w:ind w:firstLine="0"/>
-            </w:pPr>
-            <w:r>
-              <w:rPr>
-                <w:sz w:val="22"/>
-              </w:rPr>
-              <w:t>Lọc tín hiệu, tính sai lệch, chạy thuật toán và ghi dữ liệu.</w:t>
-            </w:r>
-          </w:p>
-        </w:tc>
-      </w:tr>
-      <w:tr>
-        <w:tc>
-          <w:tcPr>
-            <w:tcW w:type="dxa" w:w="3010"/>
-          </w:tcPr>
-          <w:p>
-            <w:pPr>
-              <w:spacing w:after="40"/>
-              <w:ind w:firstLine="0"/>
-            </w:pPr>
-            <w:r>
-              <w:rPr>
-                <w:sz w:val="22"/>
-              </w:rPr>
-              <w:t>Cơ khí</w:t>
-            </w:r>
-          </w:p>
-        </w:tc>
-        <w:tc>
-          <w:tcPr>
-            <w:tcW w:type="dxa" w:w="3010"/>
-          </w:tcPr>
-          <w:p>
-            <w:pPr>
-              <w:spacing w:after="40"/>
-              <w:ind w:firstLine="0"/>
-            </w:pPr>
-            <w:r>
-              <w:rPr>
-                <w:sz w:val="22"/>
-              </w:rPr>
-              <w:t>Mô hình trong phạm vi đề tài có một trục quay.</w:t>
-            </w:r>
-          </w:p>
-        </w:tc>
-        <w:tc>
-          <w:tcPr>
-            <w:tcW w:type="dxa" w:w="3010"/>
-          </w:tcPr>
-          <w:p>
-            <w:pPr>
-              <w:spacing w:after="40"/>
-              <w:ind w:firstLine="0"/>
-            </w:pPr>
-            <w:r>
-              <w:rPr>
-                <w:sz w:val="22"/>
-              </w:rPr>
-              <w:t>Dùng sai lệch ứng với trục lắp; thành phần còn lại được ghi nhận.</w:t>
-            </w:r>
-          </w:p>
-        </w:tc>
-      </w:tr>
-      <w:tr>
-        <w:tc>
-          <w:tcPr>
-            <w:tcW w:type="dxa" w:w="3010"/>
-          </w:tcPr>
-          <w:p>
-            <w:pPr>
-              <w:spacing w:after="40"/>
-              <w:ind w:firstLine="0"/>
-            </w:pPr>
-            <w:r>
-              <w:rPr>
-                <w:sz w:val="22"/>
-              </w:rPr>
-              <w:t>Bảo vệ</w:t>
-            </w:r>
-          </w:p>
-        </w:tc>
-        <w:tc>
-          <w:tcPr>
-            <w:tcW w:type="dxa" w:w="3010"/>
-          </w:tcPr>
-          <w:p>
-            <w:pPr>
-              <w:spacing w:after="40"/>
-              <w:ind w:firstLine="0"/>
-            </w:pPr>
-            <w:r>
-              <w:rPr>
-                <w:sz w:val="22"/>
-              </w:rPr>
-              <w:t>Động cơ gạt nước trục vít phù hợp tải + công tắc hành trình.</w:t>
-            </w:r>
-          </w:p>
-        </w:tc>
-        <w:tc>
-          <w:tcPr>
-            <w:tcW w:type="dxa" w:w="3010"/>
-          </w:tcPr>
-          <w:p>
-            <w:pPr>
-              <w:spacing w:after="40"/>
-              <w:ind w:firstLine="0"/>
-            </w:pPr>
-            <w:r>
-              <w:rPr>
-                <w:sz w:val="22"/>
-              </w:rPr>
-              <w:t>Giới hạn chuyển động và dừng an toàn.</w:t>
-            </w:r>
-          </w:p>
-        </w:tc>
-      </w:tr>
-      <w:tr>
-        <w:tc>
-          <w:tcPr>
-            <w:tcW w:type="dxa" w:w="3010"/>
-          </w:tcPr>
-          <w:p>
-            <w:pPr>
-              <w:spacing w:after="40"/>
-              <w:ind w:firstLine="0"/>
-            </w:pPr>
-            <w:r>
-              <w:rPr>
-                <w:sz w:val="22"/>
-              </w:rPr>
-              <w:t>Đo kiểm</w:t>
-            </w:r>
-          </w:p>
-        </w:tc>
-        <w:tc>
-          <w:tcPr>
-            <w:tcW w:type="dxa" w:w="3010"/>
-          </w:tcPr>
-          <w:p>
-            <w:pPr>
-              <w:spacing w:after="40"/>
-              <w:ind w:firstLine="0"/>
-            </w:pPr>
-            <w:r>
-              <w:rPr>
-                <w:sz w:val="22"/>
-              </w:rPr>
-              <w:t>Đo điện áp tấm pin và trạng thái động cơ gạt nước.</w:t>
-            </w:r>
-          </w:p>
-        </w:tc>
-        <w:tc>
-          <w:tcPr>
-            <w:tcW w:type="dxa" w:w="3010"/>
-          </w:tcPr>
-          <w:p>
-            <w:pPr>
-              <w:spacing w:after="40"/>
-              <w:ind w:firstLine="0"/>
-            </w:pPr>
-            <w:r>
-              <w:rPr>
-                <w:sz w:val="22"/>
-              </w:rPr>
-              <w:t>Đánh giá năng lượng thuần và chuyển động.</w:t>
-            </w:r>
-          </w:p>
-        </w:tc>
-      </w:tr>
-    </w:tbl>
-    <w:p>
-      <w:pPr/>
-    </w:p>
-    <w:tbl>
-      <w:tblPr>
-        <w:tblStyle w:val="TableGrid"/>
-        <w:tblW w:type="auto" w:w="0"/>
-        <w:jc w:val="center"/>
-        <w:tblLook w:firstColumn="1" w:firstRow="1" w:lastColumn="0" w:lastRow="0" w:noHBand="0" w:noVBand="1" w:val="04A0"/>
-      </w:tblPr>
-      <w:tblGrid>
-        <w:gridCol w:w="3010"/>
-        <w:gridCol w:w="3010"/>
-        <w:gridCol w:w="3010"/>
-      </w:tblGrid>
-      <w:tr>
-        <w:tc>
-          <w:tcPr>
-            <w:tcW w:type="dxa" w:w="3010"/>
-          </w:tcPr>
-          <w:p>
-            <w:pPr>
-              <w:spacing w:after="40"/>
-              <w:ind w:firstLine="0"/>
-            </w:pPr>
-            <w:r>
-              <w:rPr>
-                <w:b/>
-                <w:sz w:val="22"/>
-              </w:rPr>
-              <w:t>Vị trí</w:t>
-            </w:r>
-          </w:p>
-        </w:tc>
-        <w:tc>
-          <w:tcPr>
-            <w:tcW w:type="dxa" w:w="3010"/>
-          </w:tcPr>
-          <w:p>
-            <w:pPr>
-              <w:spacing w:after="40"/>
-              <w:ind w:firstLine="0"/>
-            </w:pPr>
-            <w:r>
-              <w:rPr>
-                <w:b/>
-                <w:sz w:val="22"/>
-              </w:rPr>
-              <w:t>Ký hiệu</w:t>
-            </w:r>
-          </w:p>
-        </w:tc>
-        <w:tc>
-          <w:tcPr>
-            <w:tcW w:type="dxa" w:w="3010"/>
-          </w:tcPr>
-          <w:p>
-            <w:pPr>
-              <w:spacing w:after="40"/>
-              <w:ind w:firstLine="0"/>
-            </w:pPr>
-            <w:r>
-              <w:rPr>
-                <w:b/>
-                <w:sz w:val="22"/>
-              </w:rPr>
-              <w:t>Hướng gá</w:t>
-            </w:r>
-          </w:p>
-        </w:tc>
-      </w:tr>
-      <w:tr>
-        <w:tc>
-          <w:tcPr>
-            <w:tcW w:type="dxa" w:w="3010"/>
-          </w:tcPr>
-          <w:p>
-            <w:pPr>
-              <w:spacing w:after="40"/>
-              <w:ind w:firstLine="0"/>
-            </w:pPr>
-            <w:r>
-              <w:rPr>
-                <w:sz w:val="22"/>
-              </w:rPr>
-              <w:t>Trên - trái</w:t>
-            </w:r>
-          </w:p>
-        </w:tc>
-        <w:tc>
-          <w:tcPr>
-            <w:tcW w:type="dxa" w:w="3010"/>
-          </w:tcPr>
-          <w:p>
-            <w:pPr>
-              <w:spacing w:after="40"/>
-              <w:ind w:firstLine="0"/>
-            </w:pPr>
-            <w:r>
-              <w:rPr>
-                <w:sz w:val="22"/>
-              </w:rPr>
-              <w:t>L_TT</w:t>
-            </w:r>
-          </w:p>
-        </w:tc>
-        <w:tc>
-          <w:tcPr>
-            <w:tcW w:type="dxa" w:w="3010"/>
-          </w:tcPr>
-          <w:p>
-            <w:pPr>
-              <w:spacing w:after="40"/>
-              <w:ind w:firstLine="0"/>
-            </w:pPr>
-            <w:r>
-              <w:rPr>
-                <w:sz w:val="22"/>
-              </w:rPr>
-              <w:t>Chếch ra ngoài về phía trên-trái.</w:t>
-            </w:r>
-          </w:p>
-        </w:tc>
-      </w:tr>
-      <w:tr>
-        <w:tc>
-          <w:tcPr>
-            <w:tcW w:type="dxa" w:w="3010"/>
-          </w:tcPr>
-          <w:p>
-            <w:pPr>
-              <w:spacing w:after="40"/>
-              <w:ind w:firstLine="0"/>
-            </w:pPr>
-            <w:r>
-              <w:rPr>
-                <w:sz w:val="22"/>
-              </w:rPr>
-              <w:t>Trên - phải</w:t>
-            </w:r>
-          </w:p>
-        </w:tc>
-        <w:tc>
-          <w:tcPr>
-            <w:tcW w:type="dxa" w:w="3010"/>
-          </w:tcPr>
-          <w:p>
-            <w:pPr>
-              <w:spacing w:after="40"/>
-              <w:ind w:firstLine="0"/>
-            </w:pPr>
-            <w:r>
-              <w:rPr>
-                <w:sz w:val="22"/>
-              </w:rPr>
-              <w:t>L_PT</w:t>
-            </w:r>
-          </w:p>
-        </w:tc>
-        <w:tc>
-          <w:tcPr>
-            <w:tcW w:type="dxa" w:w="3010"/>
-          </w:tcPr>
-          <w:p>
-            <w:pPr>
-              <w:spacing w:after="40"/>
-              <w:ind w:firstLine="0"/>
-            </w:pPr>
-            <w:r>
-              <w:rPr>
-                <w:sz w:val="22"/>
-              </w:rPr>
-              <w:t>Chếch ra ngoài về phía trên-phải.</w:t>
-            </w:r>
-          </w:p>
-        </w:tc>
-      </w:tr>
-      <w:tr>
-        <w:tc>
-          <w:tcPr>
-            <w:tcW w:type="dxa" w:w="3010"/>
-          </w:tcPr>
-          <w:p>
-            <w:pPr>
-              <w:spacing w:after="40"/>
-              <w:ind w:firstLine="0"/>
-            </w:pPr>
-            <w:r>
-              <w:rPr>
-                <w:sz w:val="22"/>
-              </w:rPr>
-              <w:t>Dưới - trái</w:t>
-            </w:r>
-          </w:p>
-        </w:tc>
-        <w:tc>
-          <w:tcPr>
-            <w:tcW w:type="dxa" w:w="3010"/>
-          </w:tcPr>
-          <w:p>
-            <w:pPr>
-              <w:spacing w:after="40"/>
-              <w:ind w:firstLine="0"/>
-            </w:pPr>
-            <w:r>
-              <w:rPr>
-                <w:sz w:val="22"/>
-              </w:rPr>
-              <w:t>L_TD</w:t>
-            </w:r>
-          </w:p>
-        </w:tc>
-        <w:tc>
-          <w:tcPr>
-            <w:tcW w:type="dxa" w:w="3010"/>
-          </w:tcPr>
-          <w:p>
-            <w:pPr>
-              <w:spacing w:after="40"/>
-              <w:ind w:firstLine="0"/>
-            </w:pPr>
-            <w:r>
-              <w:rPr>
-                <w:sz w:val="22"/>
-              </w:rPr>
-              <w:t>Chếch ra ngoài về phía dưới-trái.</w:t>
-            </w:r>
-          </w:p>
-        </w:tc>
-      </w:tr>
-      <w:tr>
-        <w:tc>
-          <w:tcPr>
-            <w:tcW w:type="dxa" w:w="3010"/>
-          </w:tcPr>
-          <w:p>
-            <w:pPr>
-              <w:spacing w:after="40"/>
-              <w:ind w:firstLine="0"/>
-            </w:pPr>
-            <w:r>
-              <w:rPr>
-                <w:sz w:val="22"/>
-              </w:rPr>
-              <w:t>Dưới - phải</w:t>
-            </w:r>
-          </w:p>
-        </w:tc>
-        <w:tc>
-          <w:tcPr>
-            <w:tcW w:type="dxa" w:w="3010"/>
-          </w:tcPr>
-          <w:p>
-            <w:pPr>
-              <w:spacing w:after="40"/>
-              <w:ind w:firstLine="0"/>
-            </w:pPr>
-            <w:r>
-              <w:rPr>
-                <w:sz w:val="22"/>
-              </w:rPr>
-              <w:t>L_PD</w:t>
-            </w:r>
-          </w:p>
-        </w:tc>
-        <w:tc>
-          <w:tcPr>
-            <w:tcW w:type="dxa" w:w="3010"/>
-          </w:tcPr>
-          <w:p>
-            <w:pPr>
-              <w:spacing w:after="40"/>
-              <w:ind w:firstLine="0"/>
-            </w:pPr>
-            <w:r>
-              <w:rPr>
-                <w:sz w:val="22"/>
-              </w:rPr>
-              <w:t>Chếch ra ngoài về phía dưới-phải.</w:t>
-            </w:r>
-          </w:p>
-        </w:tc>
-      </w:tr>
-    </w:tbl>
-    <w:p>
-      <w:pPr/>
     </w:p>
     <w:sectPr>
       <w:footerReference w:type="default" r:id="rId9"/>

</xml_diff>

<commit_message>
Chinh co chu: doan van 13pt, tieu de muc (2.x) va chuong 16pt, muc con 14pt, caption 12pt; PDF dong bo
Co-authored-by: arena-agent <297053741+arena-agent@users.noreply.github.com>
</commit_message>
<xml_diff>
--- a/Bao_cao_1_truc_Che_tao.docx
+++ b/Bao_cao_1_truc_Che_tao.docx
@@ -7,6 +7,7 @@
         <w:pStyle w:val="Heading1"/>
       </w:pPr>
       <w:r>
+        <w:rPr/>
         <w:t>CHƯƠNG 1. TỔNG QUAN ĐỀ TÀI</w:t>
       </w:r>
     </w:p>
@@ -15,21 +16,25 @@
         <w:pStyle w:val="Heading2"/>
       </w:pPr>
       <w:r>
+        <w:rPr/>
         <w:t>1.1. Lý do chọn đề tài</w:t>
       </w:r>
     </w:p>
     <w:p>
       <w:r>
+        <w:rPr/>
         <w:t>Tấm pin lắp cố định có hướng và góc nghiêng không đổi, trong khi vị trí biểu kiến của Mặt Trời thay đổi liên tục theo giờ và theo mùa. Khi tia nắng không gần vuông góc với bề mặt pin, thành phần bức xạ trực tiếp nhận được giảm. Cơ cấu bám nắng một trục cho phép tấm pin quay theo một mặt phẳng, qua đó cải thiện hướng thu nhận bức xạ trong một phần thời gian vận hành mà không cần cơ cấu phức tạp như hệ hai trục.</w:t>
       </w:r>
     </w:p>
     <w:p>
       <w:r>
+        <w:rPr/>
         <w:t>Các mô hình giá thành thấp thường dùng nhiều cảm biến quang để so sánh cường độ sáng theo các hướng khác nhau. Tuy nhiên, hai cảm biến có thể khác độ nhạy; tín hiệu thay đổi theo nhiệt độ, nhiễu ADC, bụi, phản xạ và mây che. Nếu điều khiển trực tiếp theo tín hiệu thô, động cơ có thể dao động, quay sai hướng hoặc tiêu thụ nhiều điện năng phụ trợ. Vì vậy, cần nghiên cứu cách lọc, hiệu chuẩn và xác định độ tin cậy tín hiệu trước khi ra lệnh chuyển động.</w:t>
       </w:r>
     </w:p>
     <w:p>
       <w:r>
+        <w:rPr/>
         <w:t>Đề tài “Nghiên cứu thuật toán đo cường độ ánh sáng để xác định hướng điều khiển tấm pin năng lượng mặt trời bám nắng một trục” được chọn nhằm xây dựng và so sánh các cách xử lý tín hiệu phù hợp với mô hình nhỏ, đồng thời kết hợp đường tham chiếu thiên văn để hệ thống không phụ thuộc hoàn toàn vào cảm biến quang.</w:t>
       </w:r>
     </w:p>
@@ -38,16 +43,19 @@
         <w:pStyle w:val="Heading2"/>
       </w:pPr>
       <w:r>
+        <w:rPr/>
         <w:t>1.2. Tổng quan về đề tài</w:t>
       </w:r>
     </w:p>
     <w:p>
       <w:r>
+        <w:rPr/>
         <w:t>Đối tượng kỹ thuật là mô hình tấm pin bám nắng một trục, dùng một cụm bốn quang trở gắn tại bốn góc mặt pin để ước lượng sai lệch theo phương quay và phương nghiêng. Mỗi cảm biến được gá đối xứng, trục cảm quang hướng chếch ra ngoài so với pháp tuyến mặt pin. Cụm cảm biến tạo được hai thành phần sai lệch; do phạm vi cơ khí của đề tài chỉ có một trục chấp hành, thuật toán dùng thành phần ứng với trục được lắp làm lệnh điều khiển, còn thành phần còn lại được ghi nhận để đánh giá hoặc mở rộng trong tương lai.</w:t>
       </w:r>
     </w:p>
     <w:p>
       <w:r>
+        <w:rPr/>
         <w:t>Báo cáo khảo sát bốn nhóm thuật toán trên các tín hiệu quang đã tổng hợp từ bốn góc: so sánh có ngưỡng; điều khiển tỷ lệ; điều khiển tỷ lệ có lọc, bù độ lợi và vùng chết; và phương án lai dùng tín hiệu cảm biến khi đủ tin cậy, chuyển sang góc thiên văn hoặc giữ vị trí khi tín hiệu suy giảm. Trọng tâm đánh giá là khả năng nhận biết chiều quay/chiều nghiêng, sai số bám trên trục được điều khiển, mức độ chuyển động không cần thiết và năng lượng thuần sau khi tính điện năng phụ trợ.</w:t>
       </w:r>
     </w:p>
@@ -56,11 +64,13 @@
         <w:pStyle w:val="Heading2"/>
       </w:pPr>
       <w:r>
+        <w:rPr/>
         <w:t>1.3. Mục tiêu nghiên cứu</w:t>
       </w:r>
     </w:p>
     <w:p>
       <w:r>
+        <w:rPr/>
         <w:t>Mục tiêu tổng quát là xây dựng phương án đo và xử lý cường độ ánh sáng để xác định hướng quay cho mô hình pin mặt trời bám nắng một trục, bảo đảm chuyển động ổn định trong điều kiện ánh sáng thay đổi. Các mục tiêu cụ thể gồm:</w:t>
       </w:r>
     </w:p>
@@ -69,6 +79,7 @@
         <w:pStyle w:val="ListBullet"/>
       </w:pPr>
       <w:r>
+        <w:rPr/>
         <w:lastRenderedPageBreak/>
         <w:t>Tìm hiểu vị trí biểu kiến của Mặt Trời, đặc tính cảm biến quang và nguyên lý bám nắng một trục.</w:t>
       </w:r>
@@ -78,6 +89,7 @@
         <w:pStyle w:val="ListBullet"/>
       </w:pPr>
       <w:r>
+        <w:rPr/>
         <w:t>Thiết kế cụm bốn LDR tại bốn góc pin, xác định góc gá hướng ra ngoài và xây dựng quy tắc so sánh trái-phải, trên-dưới để tạo hai tín hiệu sai lệch.</w:t>
       </w:r>
     </w:p>
@@ -86,6 +98,7 @@
         <w:pStyle w:val="ListBullet"/>
       </w:pPr>
       <w:r>
+        <w:rPr/>
         <w:t>Xây dựng các thuật toán so sánh, tỷ lệ, có lọc/bù/vùng chết và thuật toán lai thiên văn-cảm biến.</w:t>
       </w:r>
     </w:p>
@@ -94,6 +107,7 @@
         <w:pStyle w:val="ListBullet"/>
       </w:pPr>
       <w:r>
+        <w:rPr/>
         <w:t>Đề xuất cách mô phỏng, hiệu chuẩn và thử nghiệm để so sánh sai số góc, số lần/quãng quay và năng lượng thuần với tấm pin cố định.</w:t>
       </w:r>
     </w:p>
@@ -102,16 +116,19 @@
         <w:pStyle w:val="Heading2"/>
       </w:pPr>
       <w:r>
+        <w:rPr/>
         <w:t>1.4. Đối tượng và phạm vi nghiên cứu</w:t>
       </w:r>
     </w:p>
     <w:p>
       <w:r>
+        <w:rPr/>
         <w:t>Đối tượng nghiên cứu là thuật toán xử lý tín hiệu của cụm bốn quang trở đặt ở bốn góc mặt pin để xác định chiều sai lệch theo hai phương. Mô hình cơ khí trong phạm vi báo cáo vẫn là tracker một trục; cấu hình tham khảo gồm ESP32, mạch chia áp đo điện áp tấm pin, module thời gian thực DS1307 và một động cơ gạt nước trục vít có giới hạn hành trình. Địa điểm tính toán dự kiến là khu vực Mỹ Hào, Hưng Yên (xấp xỉ 20,93° Bắc, 106,06° Đông); tọa độ chính thức cần được xác nhận theo nơi đặt mô hình. Thành phần sai lệch của trục chưa được cơ khí điều khiển chỉ được ghi nhận, không giả định rằng mô hình một trục có thể điều chỉnh đồng thời cả hai trục.</w:t>
       </w:r>
     </w:p>
     <w:p>
       <w:r>
+        <w:rPr/>
         <w:t>Phạm vi tập trung vào mô hình công suất nhỏ, chuyển động trong mặt phẳng Đông-Tây và xử lý tín hiệu cảm biến. Báo cáo không thiết kế hệ thống hòa lưới, bộ nghịch lưu hoặc MPPT; không khẳng định mức tăng sản lượng trước khi đo; không mở rộng sang cơ cấu giàn quy mô nhà máy. Photodiode được trình bày để so sánh lựa chọn cảm biến, không mặc định là phần tử của mạch chính.</w:t>
       </w:r>
     </w:p>
@@ -120,11 +137,13 @@
         <w:pStyle w:val="Heading2"/>
       </w:pPr>
       <w:r>
+        <w:rPr/>
         <w:t>1.5. Kết quả dự kiến</w:t>
       </w:r>
     </w:p>
     <w:p>
       <w:r>
+        <w:rPr/>
         <w:t>Kết quả dự kiến của đề tài gồm:</w:t>
       </w:r>
     </w:p>
@@ -133,6 +152,7 @@
         <w:pStyle w:val="ListBullet"/>
       </w:pPr>
       <w:r>
+        <w:rPr/>
         <w:t>Mô tả cơ sở lý thuyết và cấu trúc mô hình bám nắng một trục có thể triển khai.</w:t>
       </w:r>
     </w:p>
@@ -141,6 +161,7 @@
         <w:pStyle w:val="ListBullet"/>
       </w:pPr>
       <w:r>
+        <w:rPr/>
         <w:t>Bộ thuật toán và chương trình điều khiển có các bước đọc/lọc tín hiệu, hiệu chuẩn, đánh giá chất lượng cảm biến, giới hạn góc và điều khiển cơ cấu.</w:t>
       </w:r>
     </w:p>
@@ -149,6 +170,7 @@
         <w:pStyle w:val="ListBullet"/>
       </w:pPr>
       <w:r>
+        <w:rPr/>
         <w:t>Quy trình mô phỏng/thử nghiệm và bộ chỉ tiêu để so sánh sai số bám, hoạt động của động cơ và năng lượng thuần giữa các chế độ.</w:t>
       </w:r>
     </w:p>
@@ -157,11 +179,13 @@
         <w:pStyle w:val="ListBullet"/>
       </w:pPr>
       <w:r>
+        <w:rPr/>
         <w:t>Báo cáo phân tích ưu điểm, giới hạn và hướng hoàn thiện sau khi có dữ liệu đo thực tế.</w:t>
       </w:r>
     </w:p>
     <w:p>
       <w:r>
+        <w:rPr/>
         <w:t>Các mục tiêu này là kết quả dự kiến; mọi trị số hiệu suất hoặc mức cải thiện chỉ được kết luận từ dữ liệu thực nghiệm có thể kiểm tra.</w:t>
       </w:r>
     </w:p>
@@ -170,6 +194,7 @@
         <w:pStyle w:val="Heading1"/>
       </w:pPr>
       <w:r>
+        <w:rPr/>
         <w:lastRenderedPageBreak/>
         <w:t>CHƯƠNG 2. CƠ SỞ LÝ THUYẾT VÀ TỔNG QUAN LINH KIỆN</w:t>
       </w:r>
@@ -179,21 +204,25 @@
         <w:pStyle w:val="Heading2"/>
       </w:pPr>
       <w:r>
+        <w:rPr/>
         <w:t>2.1. Pin năng lượng Mặt Trời</w:t>
       </w:r>
     </w:p>
     <w:p>
       <w:r>
+        <w:rPr/>
         <w:t>Mô-đun quang điện gồm nhiều tế bào bán dẫn ghép nối tiếp/song song để tạo điện áp và dòng điện phù hợp. Tế bào thường dựa trên tiếp giáp bán dẫn p-n; khi photon có năng lượng phù hợp được hấp thụ, các hạt tải điện được tạo ra và phân tách, hình thành dòng điện một chiều. Mô-đun thương mại còn có kính bảo vệ, lớp đóng gói, mặt sau, khung và hộp nối; cấu tạo cụ thể thay đổi theo loại mô-đun.</w:t>
       </w:r>
     </w:p>
     <w:p>
       <w:r>
+        <w:rPr/>
         <w:t>Các thông số cơ bản trên nhãn gồm công suất cực đại Pmax, điện áp hở mạch Voc, dòng ngắn mạch Isc, điện áp và dòng tại điểm công suất cực đại Vmp, Imp, cùng hệ số nhiệt. Thông số danh định thường công bố theo điều kiện thử chuẩn STC; ngoài thực tế, bức xạ, nhiệt độ tế bào, phổ ánh sáng, tải điện và che bóng làm các giá trị thay đổi. Tăng bức xạ thường làm dòng quang điện tăng; nhiệt độ tế bào tăng thường làm điện áp và công suất cực đại suy giảm.</w:t>
       </w:r>
     </w:p>
     <w:p>
       <w:r>
+        <w:rPr/>
         <w:t>Góc giữa tia trực tiếp và pháp tuyến mặt pin ảnh hưởng thành phần bức xạ trực tiếp thu được; tracker chỉ thay đổi hướng hình học, không loại bỏ ảnh hưởng của mây hay nhiệt độ. Khi so sánh chế độ cố định và bám nắng cần đo đồng thời U và I, tính P = U×I rồi tích phân theo thời gian; điện áp đơn lẻ không đại diện cho năng lượng [1].</w:t>
       </w:r>
     </w:p>
@@ -202,16 +231,19 @@
         <w:pStyle w:val="Heading2"/>
       </w:pPr>
       <w:r>
+        <w:rPr/>
         <w:t>2.2. Cảm biến quang trở (LDR)</w:t>
       </w:r>
     </w:p>
     <w:p>
       <w:r>
+        <w:rPr/>
         <w:t>Quang trở (Light Dependent Resistor - LDR) là linh kiện quang dẫn: độ dẫn điện của vật liệu bán dẫn thay đổi theo lượng ánh sáng chiếu tới. Trong điều kiện sáng hơn, điện trở LDR thường giảm; khi ánh sáng yếu hoặc tối, điện trở tăng. Đặc tuyến điện trở-độ rọi không tuyến tính và phụ thuộc loại linh kiện, phổ ánh sáng, nhiệt độ, thời gian đáp ứng và sai số giữa các mẫu.</w:t>
       </w:r>
     </w:p>
     <w:p>
       <w:r>
+        <w:rPr/>
         <w:t>Để đưa tín hiệu LDR vào vi điều khiển, thường mắc linh kiện với một điện trở cố định thành cầu phân áp rồi đọc điện áp tại điểm giữa bằng ADC. ADC có thể tăng hoặc giảm khi chiếu sáng tùy vị trí LDR trong cầu phân áp, vì vậy cần xem sơ đồ mạch và kiểm tra thực tế. LDR có giá thành thấp, mạch đơn giản nhưng độ lặp lại và tốc độ đáp ứng thường thấp hơn photodiode; cần che bụi/ẩm và hiệu chuẩn nếu dùng để so sánh định lượng.</w:t>
       </w:r>
     </w:p>
@@ -220,19 +252,23 @@
         <w:pStyle w:val="Heading2"/>
       </w:pPr>
       <w:r>
+        <w:rPr/>
         <w:t>2.3. Diode quang (photodiode)</w:t>
       </w:r>
     </w:p>
     <w:p>
       <w:r>
+        <w:rPr/>
         <w:t>Photodiode là linh kiện bán dẫn có vùng tiếp giáp p-n hoặc PIN nhạy với ánh sáng. Photon được hấp thụ tạo cặp điện tử-lỗ trống và sinh dòng quang. Photodiode có thể làm việc ở chế độ quang điện áp (không phân cực ngoài) hoặc quang dẫn (thường phân cực ngược); chế độ và mạch đo được chọn theo yêu cầu về tốc độ, nhiễu và tuyến tính.</w:t>
       </w:r>
     </w:p>
     <w:p>
       <w:r>
+        <w:rPr/>
         <w:t xml:space="preserve">Dòng quang thường nhỏ nên mạch đo hay dùng bộ khuếch đại chuyển dòng-điện áp (TIA), điện trở hồi tiếp và tụ bù để ổn định. Photodiode thường đáp ứng nhanh, có tính lặp tốt và phù hợp đo biến thiên ánh sáng; hạn chế là mạch phức tạp hơn, cần căn chỉnh, che sáng </w:t>
       </w:r>
       <w:r>
+        <w:rPr/>
         <w:lastRenderedPageBreak/>
         <w:t>ngoài ý muốn và chọn dải phổ phù hợp. Trong cấu hình đề tài, photodiode được giới thiệu như phương án cảm biến thay thế, không mặc định lắp chung với LDR.</w:t>
       </w:r>
@@ -242,16 +278,19 @@
         <w:pStyle w:val="Heading2"/>
       </w:pPr>
       <w:r>
+        <w:rPr/>
         <w:t>2.4. Bộ điều khiển ESP32 DevKit và các khối phụ trợ</w:t>
       </w:r>
     </w:p>
     <w:p>
       <w:r>
+        <w:rPr/>
         <w:t>Bộ điều khiển trung tâm là module ESP32 DevKit. Bo có hai nhóm ADC 12 bit: ADC1 (GPIO36, 39, 32, 33...) và ADC2 (GPIO25, 26, 27, 14...); nhóm ADC2 chỉ xung đột khi bật WiFi, còn đề tài không dùng WiFi nên cả sáu kênh đo tương tự đều dùng được. Trong thiết kế đã vẽ, bốn kênh LDR đưa vào GPIO25/26/27/14, biến trở hồi tiếp góc vào GPIO36 và điện áp tấm pin (qua cầu chia) vào GPIO39; ADC của ESP32 chỉ đo điện áp 0–3,3 V nên không đo dòng điện trong phiên bản này.</w:t>
       </w:r>
     </w:p>
     <w:p>
       <w:r>
+        <w:rPr/>
         <w:t>Thời gian thực dùng module DS1307 (I²C địa chỉ 0x68, có pin nuôi) để cấp ngày và giờ cho khối thiên văn; hiển thị dùng màn hình LCD 1602 kèm mạch chuyển I²C PCF8574 (địa chỉ 0x27), chung bus SDA/SCL (GPIO21/22) với DS1307. Nguồn 12 V qua diode chống ngược cực 1N4007, hạ áp LM2596 cấp 3,3 V cho ESP32 và nhánh 7805 riêng cấp 5 V cho LCD, DS1307.</w:t>
       </w:r>
     </w:p>
@@ -260,16 +299,19 @@
         <w:pStyle w:val="Heading2"/>
       </w:pPr>
       <w:r>
+        <w:rPr/>
         <w:t>2.5. Động cơ gạt nước ô tô và mạch động lực cầu H bốn TIP41C</w:t>
       </w:r>
     </w:p>
     <w:p>
       <w:r>
+        <w:rPr/>
         <w:t>Cơ cấu chấp hành là động cơ gạt nước kính ô tô 12 V kèm hộp giảm tốc trục vít – bánh vít. Ưu điểm quyết định là cặp trục vít tự hãm: khi ngắt lệnh hoặc mất điện, trục không bị kéo quay ngược nên tấm pin tự giữ vị trí dưới gió và trọng lượng bản thân mà không cần nuôi điện giữ; mô-men của motor đủ cho tấm pin 100 W nặng khoảng 4 kg ở gió vừa phải, giá thành thấp và sẵn có.</w:t>
       </w:r>
     </w:p>
     <w:p>
       <w:r>
+        <w:rPr/>
         <w:t>Mạch động lực đảo chiều dùng cầu H ghép từ bốn transistor công suất TIP41C (NPN, 6 A, 100 V, vỏ TO-220), mỗi chân bazơ nối qua điện trở 10 k và có diode bảo vệ trả xung ngược về nguồn 12 V và mass. Hai tín hiệu điều khiển dkxuoi/dknguoc đi qua opto PC817 cách ly giữa mass 3,3 V và mass 12 V: chân lệnh ESP32 mức thấp làm sáng LED opto và kéo tín hiệu xuống mass 12 V; theo nguyên lý cầu H, dkxuoi = 0 cho cặp chéo trái dẫn, dknguoc = 0 cho cặp chéo phải dẫn, cả hai bằng 1 thì cầu H khóa và motor tự giữ.</w:t>
       </w:r>
     </w:p>
@@ -278,16 +320,19 @@
         <w:pStyle w:val="Heading2"/>
       </w:pPr>
       <w:r>
+        <w:rPr/>
         <w:t>2.6. Công tắc hành trình</w:t>
       </w:r>
     </w:p>
     <w:p>
       <w:r>
+        <w:rPr/>
         <w:t>Công tắc hành trình là công tắc cơ điện được tác động bởi cần gạt, con lăn hoặc nút nhấn khi cơ cấu đến vị trí giới hạn. Nhiều loại có tiếp điểm COM, NO (thường mở) và NC (thường đóng); NC thường được ưu tiên trong mạch bảo vệ vì dây đứt có thể được nhận biết như trạng thái bất thường. Khi chọn cần xét lực tác động, hành trình, dòng/điện áp tiếp điểm và độ bền cơ.</w:t>
       </w:r>
     </w:p>
     <w:p>
       <w:r>
+        <w:rPr/>
         <w:t>Công tắc có thể đưa tín hiệu về ngõ vào số để chương trình dừng lệnh, đồng thời có thể mắc vào đường liên động của driver nếu thiết kế yêu cầu mức bảo vệ phần cứng. Cần chống dội tiếp điểm, đặt công tắc trước điểm va chạm và cấu hình sao cho khi một đầu giới hạn tác động thì chặn chuyển động đi xa hơn nhưng vẫn cho phép cơ cấu quay ngược để thoát.</w:t>
       </w:r>
     </w:p>
@@ -296,6 +341,7 @@
         <w:pStyle w:val="Heading2"/>
       </w:pPr>
       <w:r>
+        <w:rPr/>
         <w:lastRenderedPageBreak/>
         <w:t>2.7. Ba phương pháp bám nắng xem xét trong đề tài</w:t>
       </w:r>
@@ -305,11 +351,13 @@
         <w:pStyle w:val="Heading3"/>
       </w:pPr>
       <w:r>
+        <w:rPr/>
         <w:t>2.7.1. Nhóm 1 – Vòng hở theo thời gian (thuật toán thiên văn)</w:t>
       </w:r>
     </w:p>
     <w:p>
       <w:r>
+        <w:rPr/>
         <w:t>Nhóm này tính vị trí Mặt Trời từ vị trí địa lý, ngày và giờ đọc từ module thời gian thực DS1307, không cần cảm biến ánh sáng. Góc khai thiên (xích vĩ) tính theo ngày trong năm:</w:t>
       </w:r>
     </w:p>
@@ -327,6 +375,7 @@
     </w:p>
     <w:p>
       <w:r>
+        <w:rPr/>
         <w:t>Góc giờ tính từ giờ Mặt Trời t (giờ):</w:t>
       </w:r>
     </w:p>
@@ -344,6 +393,7 @@
     </w:p>
     <w:p>
       <w:r>
+        <w:rPr/>
         <w:t>Góc cao Mặt Trời α suy ra từ vĩ độ nơi lắp đặt φ:</w:t>
       </w:r>
     </w:p>
@@ -361,6 +411,7 @@
     </w:p>
     <w:p>
       <w:r>
+        <w:rPr/>
         <w:t>Góc phương vị γ tính tiếp từ α, δ và φ. Biết (α, γ) là đổi được ra góc đặt của tấm pin cho từng trục.</w:t>
       </w:r>
     </w:p>
@@ -369,6 +420,7 @@
         <w:pStyle w:val="ListBullet"/>
       </w:pPr>
       <w:r>
+        <w:rPr/>
         <w:t>Ưu điểm: ổn định, không phụ thuộc thời tiết, không dao động quanh vị trí cân bằng.</w:t>
       </w:r>
     </w:p>
@@ -377,6 +429,7 @@
         <w:pStyle w:val="ListBullet"/>
       </w:pPr>
       <w:r>
+        <w:rPr/>
         <w:t>Nhược điểm: phải cài đúng tọa độ và giờ; không tự sửa được sai số do lắp đặt lệch hoặc khớp cơ khí rơ.</w:t>
       </w:r>
     </w:p>
@@ -385,11 +438,13 @@
         <w:pStyle w:val="Heading3"/>
       </w:pPr>
       <w:r>
+        <w:rPr/>
         <w:t>2.7.2. Nhóm 2 – Vòng kín dùng cảm biến quang trở (LDR)</w:t>
       </w:r>
     </w:p>
     <w:p>
       <w:r>
+        <w:rPr/>
         <w:t>Bốn LDR đặt ở bốn góc tấm pin, mỗi cảm biến gá nghiêng ra ngoài tâm một góc β_s = 30° như nhau, không dùng vách ngăn. Khi nắng thẳng góc, bốn kênh nhận sáng gần bằng nhau; khi nắng xiên, cặp cảm biến phía bên nắng nhận mạnh hơn hẳn. Gọi giá trị đọc được của bốn kênh là trái, phải, trên, dưới, sai lệch điều khiển tính rất đơn giản:</w:t>
       </w:r>
     </w:p>
@@ -410,6 +465,7 @@
         <w:pStyle w:val="ListBullet"/>
       </w:pPr>
       <w:r>
+        <w:rPr/>
         <w:t>Nếu |e1| &gt; ngưỡng: quay động cơ trục 1 theo dấu e1; nếu |e2| &gt; ngưỡng: quay động cơ trục 2 theo dấu e2.</w:t>
       </w:r>
     </w:p>
@@ -418,6 +474,7 @@
         <w:pStyle w:val="ListBullet"/>
       </w:pPr>
       <w:r>
+        <w:rPr/>
         <w:t>Ngược lại thì dừng – vùng chết (dead-band) chống dao động quanh vị trí cân bằng.</w:t>
       </w:r>
     </w:p>
@@ -426,6 +483,7 @@
         <w:pStyle w:val="ListBullet"/>
       </w:pPr>
       <w:r>
+        <w:rPr/>
         <w:t>Ưu điểm: đơn giản, rẻ, phản ứng theo điều kiện sáng thực tế, tự sửa sai số lắp đặt.</w:t>
       </w:r>
     </w:p>
@@ -434,6 +492,7 @@
         <w:pStyle w:val="ListBullet"/>
       </w:pPr>
       <w:r>
+        <w:rPr/>
         <w:t>Nhược điểm: nhạy với mây và bóng râm thoáng qua, dễ dao động nếu ngưỡng chọn quá nhỏ, buổi sáng sớm tín hiệu yếu nên bám chậm.</w:t>
       </w:r>
     </w:p>
@@ -442,6 +501,7 @@
         <w:pStyle w:val="Heading3"/>
       </w:pPr>
       <w:r>
+        <w:rPr/>
         <w:t>2.7.3. Nhóm 3 – Phương pháp hybrid (kết hợp), phương án lựa chọn</w:t>
       </w:r>
     </w:p>
@@ -450,6 +510,7 @@
         <w:pStyle w:val="ListBullet"/>
       </w:pPr>
       <w:r>
+        <w:rPr/>
         <w:t>Dùng thiên văn định vị thô: đầu buổi sáng và mỗi chu kỳ 30 phút, tính (α, γ) từ DS1307 rồi đưa nhanh tấm pin về gần vị trí Mặt Trời.</w:t>
       </w:r>
     </w:p>
@@ -458,6 +519,7 @@
         <w:pStyle w:val="ListBullet"/>
       </w:pPr>
       <w:r>
+        <w:rPr/>
         <w:t>Dùng LDR tinh chỉnh: giữa hai lần định vị thô, so sánh e1 (và e2) với ngưỡng để khử phần sai lệch còn lại, kể cả sai số lắp đặt.</w:t>
       </w:r>
     </w:p>
@@ -466,11 +528,13 @@
         <w:pStyle w:val="ListBullet"/>
       </w:pPr>
       <w:r>
+        <w:rPr/>
         <w:t>Khi trời nhiều mây (tổng sáng S nhỏ hơn ngưỡng S_min): giữ nguyên vị trí theo lịch thiên văn, tránh dao động vô ích do mây che thoáng qua.</w:t>
       </w:r>
     </w:p>
     <w:p>
       <w:r>
+        <w:rPr/>
         <w:lastRenderedPageBreak/>
         <w:t>Phương pháp hybrid lấy được ưu điểm của cả hai nhóm: bám nhanh và ổn định như vòng hở, tự sửa sai số như vòng kín, và không săn lệnh khi thời tiết xấu. Vì vậy đề tài chọn nhóm 3 cho cả hai mô hình một trục và hai trục.</w:t>
       </w:r>
@@ -480,6 +544,7 @@
         <w:pStyle w:val="Heading2"/>
       </w:pPr>
       <w:r>
+        <w:rPr/>
         <w:t>2.8. Sơ đồ khối tổng thể và các kết quả tiếp nhận từ quyển nghiên cứu</w:t>
       </w:r>
     </w:p>
@@ -534,11 +599,13 @@
         <w:pStyle w:val="Caption"/>
       </w:pPr>
       <w:r>
+        <w:rPr/>
         <w:t>Hình 1. Sơ đồ khối hệ thống một trục theo phương pháp hybrid</w:t>
       </w:r>
     </w:p>
     <w:p>
       <w:r>
+        <w:rPr/>
         <w:t>Sơ đồ khối trên cụ thể hóa phương pháp hybrid đã nghiên cứu thành các khối mạch và cơ khí sẽ chế tạo ở chương 3; bảng dưới đây tổng hợp các kết quả đã hoàn thành ở quyển nghiên cứu và nơi áp dụng trong quyển chế tạo.</w:t>
       </w:r>
     </w:p>
@@ -548,6 +615,7 @@
         <w:spacing w:after="80"/>
       </w:pPr>
       <w:r>
+        <w:rPr/>
         <w:t>Bảng 1. Các kết quả tiếp nhận từ quyển nghiên cứu và cách áp dụng</w:t>
       </w:r>
     </w:p>
@@ -1078,6 +1146,7 @@
         <w:pStyle w:val="Heading1"/>
       </w:pPr>
       <w:r>
+        <w:rPr/>
         <w:t>CHƯƠNG 3. CHẾ TẠO MẠCH ĐIỆN, CƠ KHÍ, LẮP RÁP, HIỆU CHUẨN VÀ ĐO ĐẠC</w:t>
       </w:r>
     </w:p>
@@ -1086,6 +1155,7 @@
         <w:pStyle w:val="Heading2"/>
       </w:pPr>
       <w:r>
+        <w:rPr/>
         <w:t>3.1. Kết quả tính chọn động cơ cho tấm pin 100 W – 4 kg</w:t>
       </w:r>
     </w:p>
@@ -1095,6 +1165,7 @@
         <w:spacing w:after="80"/>
       </w:pPr>
       <w:r>
+        <w:rPr/>
         <w:t>Bảng 2. Tính chọn động cơ gạt nước cho tấm pin 100 W – 4 kg</w:t>
       </w:r>
     </w:p>
@@ -1621,6 +1692,7 @@
     <w:p/>
     <w:p>
       <w:r>
+        <w:rPr/>
         <w:t>Dòng tải 4–5 A của motor nằm trong giới hạn 6 A của transistor TIP41C ở mạch động lực; riêng dòng hãm khi kẹt trục lớn hơn nên mạch có cầu chì và chương trình có giới hạn thời gian chạy mỗi lệnh để bảo vệ transistor.</w:t>
       </w:r>
     </w:p>
@@ -1629,6 +1701,7 @@
         <w:pStyle w:val="Heading2"/>
       </w:pPr>
       <w:r>
+        <w:rPr/>
         <w:lastRenderedPageBreak/>
         <w:t>3.2. Mạch điều khiển trung tâm: ESP32 DevKit</w:t>
       </w:r>
@@ -1639,6 +1712,7 @@
         <w:jc w:val="center"/>
       </w:pPr>
       <w:r>
+        <w:rPr/>
         <w:drawing>
           <wp:inline distT="0" distB="0" distL="0" distR="0" wp14:anchorId="6C355A86" wp14:editId="075302F1">
             <wp:extent cx="4435522" cy="3379328"/>
@@ -1681,6 +1755,7 @@
         <w:pStyle w:val="Caption"/>
       </w:pPr>
       <w:r>
+        <w:rPr/>
         <w:t>Hình 2. Sheet nguyên lý khối ESP32 DevKit và các mạng tín hiệu</w:t>
       </w:r>
     </w:p>
@@ -1690,6 +1765,7 @@
         <w:spacing w:after="80"/>
       </w:pPr>
       <w:r>
+        <w:rPr/>
         <w:t>Bảng 3. Bảng chân kết nối theo sheet ESP32 DevKit</w:t>
       </w:r>
     </w:p>
@@ -2163,6 +2239,7 @@
         <w:pStyle w:val="Heading2"/>
       </w:pPr>
       <w:r>
+        <w:rPr/>
         <w:lastRenderedPageBreak/>
         <w:t>3.3. Mạch động lực cầu H bốn TIP41C và cách ly opto</w:t>
       </w:r>
@@ -2173,6 +2250,7 @@
         <w:jc w:val="center"/>
       </w:pPr>
       <w:r>
+        <w:rPr/>
         <w:drawing>
           <wp:inline distT="0" distB="0" distL="0" distR="0" wp14:anchorId="3F3D746D" wp14:editId="2645C1DD">
             <wp:extent cx="5397689" cy="3330438"/>
@@ -2215,6 +2293,7 @@
         <w:pStyle w:val="Caption"/>
       </w:pPr>
       <w:r>
+        <w:rPr/>
         <w:t>Hình 3. Mạch động lực cầu H ghép từ bốn TIP41C kèm diode bảo vệ</w:t>
       </w:r>
     </w:p>
@@ -2224,6 +2303,7 @@
         <w:jc w:val="center"/>
       </w:pPr>
       <w:r>
+        <w:rPr/>
         <w:drawing>
           <wp:inline distT="0" distB="0" distL="0" distR="0" wp14:anchorId="1A0178A6" wp14:editId="7086B074">
             <wp:extent cx="4872251" cy="3494595"/>
@@ -2266,11 +2346,13 @@
         <w:pStyle w:val="Caption"/>
       </w:pPr>
       <w:r>
+        <w:rPr/>
         <w:t>Hình 4. Mạch cách ly opto PC817 giữa khối điều khiển và mạch động lực</w:t>
       </w:r>
     </w:p>
     <w:p>
       <w:r>
+        <w:rPr/>
         <w:t>Cầu H gồm U1–U4 đều là TIP41C (NPN 6 A, 100 V). Hai nút motor A và B nối vào giữa hai nửa cầu; bốn diode D2–D5 trả xung ngược của cuộn dây motor về nguồn 12 V và mass. Mỗi bazơ nối qua trở 10 k tới mạng lệnh dkxuoi hoặc dknguoc; hai mạng này đi qua opto PC817 nên mass mạch động lực tách hẳn mass logic 3,3 V, chống nhiễu xung khi motor đảo chiều.</w:t>
       </w:r>
     </w:p>
@@ -2280,6 +2362,7 @@
         <w:spacing w:after="80"/>
       </w:pPr>
       <w:r>
+        <w:rPr/>
         <w:lastRenderedPageBreak/>
         <w:t>Bảng 4. Bảng trạng thái lệnh của cầu H (tích cực thấp qua opto)</w:t>
       </w:r>
@@ -2670,6 +2753,7 @@
         <w:pStyle w:val="Heading2"/>
       </w:pPr>
       <w:r>
+        <w:rPr/>
         <w:t>3.4. Mạch nguồn, mạch thời gian thực và mạch hiển thị</w:t>
       </w:r>
     </w:p>
@@ -2679,6 +2763,7 @@
         <w:jc w:val="center"/>
       </w:pPr>
       <w:r>
+        <w:rPr/>
         <w:drawing>
           <wp:inline distT="0" distB="0" distL="0" distR="0" wp14:anchorId="12C92D11" wp14:editId="2FD759D5">
             <wp:extent cx="5733415" cy="2774950"/>
@@ -2721,6 +2806,7 @@
         <w:pStyle w:val="Caption"/>
       </w:pPr>
       <w:r>
+        <w:rPr/>
         <w:t>Hình 5. Mạch nguồn chống ngược cực và hạ áp LM2596</w:t>
       </w:r>
     </w:p>
@@ -2730,6 +2816,7 @@
         <w:jc w:val="center"/>
       </w:pPr>
       <w:r>
+        <w:rPr/>
         <w:lastRenderedPageBreak/>
         <w:drawing>
           <wp:inline distT="0" distB="0" distL="0" distR="0" wp14:anchorId="56EDD5C5" wp14:editId="7D2ED395">
@@ -2773,6 +2860,7 @@
         <w:pStyle w:val="Caption"/>
       </w:pPr>
       <w:r>
+        <w:rPr/>
         <w:t>Hình 6. Nhánh 5 V ổn áp 7805 và màn hình LCD I²C 1602</w:t>
       </w:r>
     </w:p>
@@ -2782,6 +2870,7 @@
         <w:jc w:val="center"/>
       </w:pPr>
       <w:r>
+        <w:rPr/>
         <w:drawing>
           <wp:inline distT="0" distB="0" distL="0" distR="0" wp14:anchorId="4D6060D2" wp14:editId="056F3B20">
             <wp:extent cx="3972479" cy="2762636"/>
@@ -2824,11 +2913,13 @@
         <w:pStyle w:val="Caption"/>
       </w:pPr>
       <w:r>
+        <w:rPr/>
         <w:t>Hình 7. Module thời gian thực DS1307 trên bus I²C</w:t>
       </w:r>
     </w:p>
     <w:p>
       <w:r>
+        <w:rPr/>
         <w:t>Nguồn 12 V vào qua diode 1N4007 chống ngược cực rồi tách ba nhánh: nhánh 12 V thẳng vào cầu H cho motor; nhánh LM2596 hạ xuống 3,3 V nuôi ESP32; nhánh 7805 hạ xuống 5 V nuôi LCD và DS1307, có tụ 220 µF lọc hai đầu. DS1307 có pin nuôi nên giữ đúng ngày giờ cả khi tắt máy; LCD 1602 giao tiếp qua mạch chuyển I²C PCF8574 nên chỉ tốn hai chân SDA/SCL.</w:t>
       </w:r>
     </w:p>
@@ -2837,10 +2928,12 @@
         <w:pStyle w:val="Heading2"/>
       </w:pPr>
       <w:r>
+        <w:rPr/>
         <w:lastRenderedPageBreak/>
         <w:t xml:space="preserve">3.5. Mạch </w:t>
       </w:r>
       <w:r>
+        <w:rPr/>
         <w:t>đọc quang trở</w:t>
       </w:r>
     </w:p>
@@ -2850,6 +2943,7 @@
         <w:jc w:val="center"/>
       </w:pPr>
       <w:r>
+        <w:rPr/>
         <w:drawing>
           <wp:inline distT="0" distB="0" distL="0" distR="0" wp14:anchorId="3C65EDA5" wp14:editId="2D5AA477">
             <wp:extent cx="5715798" cy="4229690"/>
@@ -2892,9 +2986,11 @@
         <w:pStyle w:val="Caption"/>
       </w:pPr>
       <w:r>
+        <w:rPr/>
         <w:t xml:space="preserve">Hình 8. </w:t>
       </w:r>
       <w:r>
+        <w:rPr/>
         <w:t xml:space="preserve">Mạch đọc quang trở </w:t>
       </w:r>
     </w:p>
@@ -2915,7 +3011,6 @@
           <w:b w:val="0"/>
           <w:bCs w:val="0"/>
           <w:color w:val="000000"/>
-          <w:sz w:val="24"/>
           <w:szCs w:val="22"/>
         </w:rPr>
         <w:t>Mạch đọc quang trở có nhiệm vụ chuyển đổi cường độ ánh sáng của môi trường thành tín hiệu điện áp để vi điều khiển ESP có thể đọc và xử lý. Quang trở (LDR – Light Dependent Resistor, ký hiệu QT trên sơ đồ) là linh kiện thụ động có điện trở thay đổi theo cường độ ánh sáng chiếu vào: khi trời tối, điện trở của nó rất lớn (hàng trăm kΩ đến hàng MΩ); khi được chiếu sáng, điện trở giảm mạnh (chỉ còn vài kΩ hoặc nhỏ hơn). Tuy nhiên, bản thân quang trở là một linh kiện hai chân, không phân cực, nó chỉ biến đổi điện trở chứ không tạo ra điện áp — trong khi ESP không đo được điện trở trực tiếp mà chỉ đo được điện áp qua bộ chuyển đổi tương tự – số (ADC). Vì vậy, mỗi kênh quang trở trong mạch này được mắc thành một cầu phân áp với một điện trở cố định, biến sự thay đổi điện trở theo ánh sáng thành sự thay đổi điện áp tỷ lệ, từ đó ESP đọc được bằng hàm analogRead().</w:t>
@@ -2926,6 +3021,7 @@
         <w:pStyle w:val="Heading2"/>
       </w:pPr>
       <w:r>
+        <w:rPr/>
         <w:t>3.6. Danh mục vật tư và linh kiện</w:t>
       </w:r>
     </w:p>
@@ -2935,6 +3031,7 @@
         <w:spacing w:after="80"/>
       </w:pPr>
       <w:r>
+        <w:rPr/>
         <w:t>Bảng 5. Danh mục vật tư – linh kiện của mô hình một trục</w:t>
       </w:r>
     </w:p>
@@ -4282,6 +4379,7 @@
         </w:rPr>
       </w:pPr>
       <w:r>
+        <w:rPr/>
         <w:br w:type="page"/>
       </w:r>
     </w:p>
@@ -4295,6 +4393,7 @@
         <w:pStyle w:val="Heading1"/>
       </w:pPr>
       <w:r>
+        <w:rPr/>
         <w:t>CHƯƠNG 4. TIẾN ĐỘ THỰC HIỆN VÀ KẾ HOẠCH TUẦN NÀY</w:t>
       </w:r>
     </w:p>
@@ -4303,6 +4402,7 @@
         <w:pStyle w:val="Heading2"/>
       </w:pPr>
       <w:r>
+        <w:rPr/>
         <w:t>4.1. Kết quả đạt được trong tuần 5/10 – 10/10/2026</w:t>
       </w:r>
     </w:p>
@@ -4315,6 +4415,7 @@
         </w:numPr>
       </w:pPr>
       <w:r>
+        <w:rPr/>
         <w:t>Hoàn thành thiết kế bảy sheet mạch nguyên lý trên EasyEDA và hàn thử toàn bộ mạch điều khiển, mạch động lực, mạch nguồn.</w:t>
       </w:r>
     </w:p>
@@ -4327,6 +4428,7 @@
         </w:numPr>
       </w:pPr>
       <w:r>
+        <w:rPr/>
         <w:t>Hoàn thành tính chọn động cơ cho tấm pin 100 W – 4 kg: làm việc tới gió 8 m/s, hệ số an toàn theo mô-men hãm ≈ 2 ở gió 10 m/s.</w:t>
       </w:r>
     </w:p>
@@ -4335,16 +4437,19 @@
         <w:pStyle w:val="Heading2"/>
       </w:pPr>
       <w:r>
+        <w:rPr/>
         <w:t>4.2. Các công việc còn lại của tuần này (5/10 – 10/10/2026)</w:t>
       </w:r>
     </w:p>
     <w:p>
       <w:r>
+        <w:rPr/>
         <w:t>Làm mạch động lực và chạy thử với động cơ trục vít</w:t>
       </w:r>
     </w:p>
     <w:p>
       <w:r>
+        <w:rPr/>
         <w:t>Làm mạch điều khiển esp đọc thời gian và giá trị điện trở</w:t>
       </w:r>
     </w:p>
@@ -4358,6 +4463,7 @@
         <w:ind w:left="360"/>
       </w:pPr>
       <w:r>
+        <w:rPr/>
         <w:t>Chạy thử ngoài trời trọn một ngày nắng, ghi log góc tấm pin đối chiếu đồ thị mô phỏng.</w:t>
       </w:r>
     </w:p>
@@ -4371,6 +4477,7 @@
         <w:ind w:left="360"/>
       </w:pPr>
       <w:r>
+        <w:rPr/>
         <w:t>Đo nhiệt độ TIP41C sau 30 phút chạy liên tục để quyết định cỡ tản nhiệt.</w:t>
       </w:r>
     </w:p>
@@ -4379,67 +4486,80 @@
         <w:pStyle w:val="Heading1"/>
       </w:pPr>
       <w:r>
+        <w:rPr/>
         <w:t>TÀI LIỆU THAM KHẢO</w:t>
       </w:r>
     </w:p>
     <w:p>
       <w:r>
+        <w:rPr/>
         <w:t>[1] J. A. Duffie and W. A. Beckman, Solar Engineering of Thermal Processes, 4th ed., John Wiley &amp; Sons, 2013.</w:t>
       </w:r>
     </w:p>
     <w:p>
       <w:r>
+        <w:rPr/>
         <w:t>[2] I. Reda and A. Andreas, “Solar position algorithm for solar radiation applications,” Solar Energy, vol. 76, no. 5, pp. 577-589, 2004.</w:t>
       </w:r>
     </w:p>
     <w:p>
       <w:r>
+        <w:rPr/>
         <w:t>[3] I. Reda and A. Andreas, “Solar Position Algorithm for Solar Radiation Applications,” NREL/TP-560-34302, 2008. https://docs.nrel.gov/docs/fy08osti/34302.pdf</w:t>
       </w:r>
     </w:p>
     <w:p>
       <w:r>
+        <w:rPr/>
         <w:t>[4] H. Mousazadeh et al., “A review of principle and sun-tracking methods for maximizing solar systems output,” Renewable and Sustainable Energy Reviews, vol. 13, no. 8, pp. 1800-1818, 2009.</w:t>
       </w:r>
     </w:p>
     <w:p>
       <w:r>
+        <w:rPr/>
         <w:t>[5] A. Awasthi et al., “Review on sun tracking technology in solar PV system,” Energy Reports, vol. 6, pp. 392-405, 2020.</w:t>
       </w:r>
     </w:p>
     <w:p>
       <w:r>
+        <w:rPr/>
         <w:t>[6] R. F. Fuentes-Morales et al., “Control algorithms applied to active solar tracking systems: A review,” Solar Energy, vol. 212, pp. 203-219, 2020. https://doi.org/10.1016/j.solener.2020.10.071</w:t>
       </w:r>
     </w:p>
     <w:p>
       <w:r>
+        <w:rPr/>
         <w:t>[7] A. R. Amelia et al., “Technologies of solar tracking systems: A review,” IOP Conference Series: Materials Science and Engineering, vol. 767, 012052, 2020.</w:t>
       </w:r>
     </w:p>
     <w:p>
       <w:r>
+        <w:rPr/>
         <w:t>[8] Espressif Systems, ESP32 Series Datasheet. https://www.espressif.com/sites/default/files/documentation/esp32_datasheet_en.pdf</w:t>
       </w:r>
     </w:p>
     <w:p>
       <w:r>
+        <w:rPr/>
         <w:lastRenderedPageBreak/>
         <w:t>[9] Espressif Systems, ESP32-DevKitC General Purpose Development Board User Guide. https://docs.espressif.com/projects/esp-dev-kits/en/latest/esp32/esp32-devkitc/index.html</w:t>
       </w:r>
     </w:p>
     <w:p>
       <w:r>
+        <w:rPr/>
         <w:t>[10] NXP Semiconductors, PCF8574 Remote 8-bit I/O Expander for I2C-bus (mạch kèm LCD 1602), Datasheet.</w:t>
       </w:r>
     </w:p>
     <w:p>
       <w:r>
+        <w:rPr/>
         <w:t>[11] Maxim Integrated, DS1307 64 x 8, Serial I2C Real-Time Clock, Datasheet. https://www.analog.com/media/en/technical-documentation/data-sheets/DS1307.pdf</w:t>
       </w:r>
     </w:p>
     <w:p>
       <w:r>
+        <w:rPr/>
         <w:t>[12] W. F. Holmgren, C. W. Hansen, and M. A. Mikofski, “pvlib python: a python package for modeling solar energy systems,” Journal of Open Source Software, vol. 3, no. 29, p. 884, 2018.</w:t>
       </w:r>
     </w:p>
@@ -5300,7 +5420,7 @@
     <w:rPr>
       <w:rFonts w:ascii="Times New Roman" w:eastAsia="Times New Roman" w:hAnsi="Times New Roman"/>
       <w:color w:val="000000"/>
-      <w:sz w:val="24"/>
+      <w:sz w:val="26"/>
     </w:rPr>
   </w:style>
   <w:style w:type="paragraph" w:styleId="Heading1">
@@ -5350,7 +5470,7 @@
       <w:b/>
       <w:bCs/>
       <w:color w:val="1F4E79"/>
-      <w:sz w:val="26"/>
+      <w:sz w:val="32"/>
       <w:szCs w:val="26"/>
     </w:rPr>
   </w:style>
@@ -5377,6 +5497,7 @@
       <w:bCs/>
       <w:i/>
       <w:color w:val="404040"/>
+      <w:sz w:val="28"/>
     </w:rPr>
   </w:style>
   <w:style w:type="paragraph" w:styleId="Heading4">
@@ -6097,7 +6218,7 @@
     <w:rPr>
       <w:bCs/>
       <w:color w:val="505050"/>
-      <w:sz w:val="20"/>
+      <w:sz w:val="24"/>
       <w:szCs w:val="18"/>
     </w:rPr>
   </w:style>

</xml_diff>

<commit_message>
Chinh lai co chu 13/16pt (ban Word luu de bi ve 12/13) va them mo ta duoi 16 hinh con thieu
Co-authored-by: arena-agent <297053741+arena-agent@users.noreply.github.com>
</commit_message>
<xml_diff>
--- a/Bao_cao_1_truc_Che_tao.docx
+++ b/Bao_cao_1_truc_Che_tao.docx
@@ -7,6 +7,7 @@
         <w:pStyle w:val="Heading1"/>
       </w:pPr>
       <w:r>
+        <w:rPr/>
         <w:t>CHƯƠNG 1. TỔNG QUAN ĐỀ TÀI</w:t>
       </w:r>
     </w:p>
@@ -15,21 +16,25 @@
         <w:pStyle w:val="Heading2"/>
       </w:pPr>
       <w:r>
+        <w:rPr/>
         <w:t>1.1. Lý do chọn đề tài</w:t>
       </w:r>
     </w:p>
     <w:p>
       <w:r>
+        <w:rPr/>
         <w:t>Tấm pin lắp cố định có hướng và góc nghiêng không đổi, trong khi vị trí biểu kiến của Mặt Trời thay đổi liên tục theo giờ và theo mùa. Khi tia nắng không gần vuông góc với bề mặt pin, thành phần bức xạ trực tiếp nhận được giảm. Cơ cấu bám nắng một trục cho phép tấm pin quay theo một mặt phẳng, qua đó cải thiện hướng thu nhận bức xạ trong một phần thời gian vận hành mà không cần cơ cấu phức tạp như hệ hai trục.</w:t>
       </w:r>
     </w:p>
     <w:p>
       <w:r>
+        <w:rPr/>
         <w:t>Các mô hình giá thành thấp thường dùng nhiều cảm biến quang để so sánh cường độ sáng theo các hướng khác nhau. Tuy nhiên, hai cảm biến có thể khác độ nhạy; tín hiệu thay đổi theo nhiệt độ, nhiễu ADC, bụi, phản xạ và mây che. Nếu điều khiển trực tiếp theo tín hiệu thô, động cơ có thể dao động, quay sai hướng hoặc tiêu thụ nhiều điện năng phụ trợ. Vì vậy, cần nghiên cứu cách lọc, hiệu chuẩn và xác định độ tin cậy tín hiệu trước khi ra lệnh chuyển động.</w:t>
       </w:r>
     </w:p>
     <w:p>
       <w:r>
+        <w:rPr/>
         <w:t>Đề tài “Nghiên cứu thuật toán đo cường độ ánh sáng để xác định hướng điều khiển tấm pin năng lượng mặt trời bám nắng một trục” được chọn nhằm xây dựng và so sánh các cách xử lý tín hiệu phù hợp với mô hình nhỏ, đồng thời kết hợp đường tham chiếu thiên văn để hệ thống không phụ thuộc hoàn toàn vào cảm biến quang.</w:t>
       </w:r>
     </w:p>
@@ -38,16 +43,19 @@
         <w:pStyle w:val="Heading2"/>
       </w:pPr>
       <w:r>
+        <w:rPr/>
         <w:t>1.2. Tổng quan về đề tài</w:t>
       </w:r>
     </w:p>
     <w:p>
       <w:r>
+        <w:rPr/>
         <w:t>Đối tượng kỹ thuật là mô hình tấm pin bám nắng một trục, dùng một cụm bốn quang trở gắn tại bốn góc mặt pin để ước lượng sai lệch theo phương quay và phương nghiêng. Mỗi cảm biến được gá đối xứng, trục cảm quang hướng chếch ra ngoài so với pháp tuyến mặt pin. Cụm cảm biến tạo được hai thành phần sai lệch; do phạm vi cơ khí của đề tài chỉ có một trục chấp hành, thuật toán dùng thành phần ứng với trục được lắp làm lệnh điều khiển, còn thành phần còn lại được ghi nhận để đánh giá hoặc mở rộng trong tương lai.</w:t>
       </w:r>
     </w:p>
     <w:p>
       <w:r>
+        <w:rPr/>
         <w:t>Báo cáo khảo sát bốn nhóm thuật toán trên các tín hiệu quang đã tổng hợp từ bốn góc: so sánh có ngưỡng; điều khiển tỷ lệ; điều khiển tỷ lệ có lọc, bù độ lợi và vùng chết; và phương án lai dùng tín hiệu cảm biến khi đủ tin cậy, chuyển sang góc thiên văn hoặc giữ vị trí khi tín hiệu suy giảm. Trọng tâm đánh giá là khả năng nhận biết chiều quay/chiều nghiêng, sai số bám trên trục được điều khiển, mức độ chuyển động không cần thiết và năng lượng thuần sau khi tính điện năng phụ trợ.</w:t>
       </w:r>
     </w:p>
@@ -56,11 +64,13 @@
         <w:pStyle w:val="Heading2"/>
       </w:pPr>
       <w:r>
+        <w:rPr/>
         <w:t>1.3. Mục tiêu nghiên cứu</w:t>
       </w:r>
     </w:p>
     <w:p>
       <w:r>
+        <w:rPr/>
         <w:t>Mục tiêu tổng quát là xây dựng phương án đo và xử lý cường độ ánh sáng để xác định hướng quay cho mô hình pin mặt trời bám nắng một trục, bảo đảm chuyển động ổn định trong điều kiện ánh sáng thay đổi. Các mục tiêu cụ thể gồm:</w:t>
       </w:r>
     </w:p>
@@ -69,6 +79,7 @@
         <w:pStyle w:val="ListBullet"/>
       </w:pPr>
       <w:r>
+        <w:rPr/>
         <w:lastRenderedPageBreak/>
         <w:t>Tìm hiểu vị trí biểu kiến của Mặt Trời, đặc tính cảm biến quang và nguyên lý bám nắng một trục.</w:t>
       </w:r>
@@ -78,6 +89,7 @@
         <w:pStyle w:val="ListBullet"/>
       </w:pPr>
       <w:r>
+        <w:rPr/>
         <w:t>Thiết kế cụm bốn LDR tại bốn góc pin, xác định góc gá hướng ra ngoài và xây dựng quy tắc so sánh trái-phải, trên-dưới để tạo hai tín hiệu sai lệch.</w:t>
       </w:r>
     </w:p>
@@ -86,6 +98,7 @@
         <w:pStyle w:val="ListBullet"/>
       </w:pPr>
       <w:r>
+        <w:rPr/>
         <w:t>Xây dựng các thuật toán so sánh, tỷ lệ, có lọc/bù/vùng chết và thuật toán lai thiên văn-cảm biến.</w:t>
       </w:r>
     </w:p>
@@ -94,6 +107,7 @@
         <w:pStyle w:val="ListBullet"/>
       </w:pPr>
       <w:r>
+        <w:rPr/>
         <w:t>Đề xuất cách mô phỏng, hiệu chuẩn và thử nghiệm để so sánh sai số góc, số lần/quãng quay và năng lượng thuần với tấm pin cố định.</w:t>
       </w:r>
     </w:p>
@@ -102,16 +116,19 @@
         <w:pStyle w:val="Heading2"/>
       </w:pPr>
       <w:r>
+        <w:rPr/>
         <w:t>1.4. Đối tượng và phạm vi nghiên cứu</w:t>
       </w:r>
     </w:p>
     <w:p>
       <w:r>
+        <w:rPr/>
         <w:t>Đối tượng nghiên cứu là thuật toán xử lý tín hiệu của cụm bốn quang trở đặt ở bốn góc mặt pin để xác định chiều sai lệch theo hai phương. Mô hình cơ khí trong phạm vi báo cáo vẫn là tracker một trục; cấu hình tham khảo gồm ESP32, mạch chia áp đo điện áp tấm pin, module thời gian thực DS1307 và một động cơ gạt nước trục vít có giới hạn hành trình. Địa điểm tính toán dự kiến là khu vực Mỹ Hào, Hưng Yên (xấp xỉ 20,93° Bắc, 106,06° Đông); tọa độ chính thức cần được xác nhận theo nơi đặt mô hình. Thành phần sai lệch của trục chưa được cơ khí điều khiển chỉ được ghi nhận, không giả định rằng mô hình một trục có thể điều chỉnh đồng thời cả hai trục.</w:t>
       </w:r>
     </w:p>
     <w:p>
       <w:r>
+        <w:rPr/>
         <w:t>Phạm vi tập trung vào mô hình công suất nhỏ, chuyển động trong mặt phẳng Đông-Tây và xử lý tín hiệu cảm biến. Báo cáo không thiết kế hệ thống hòa lưới, bộ nghịch lưu hoặc MPPT; không khẳng định mức tăng sản lượng trước khi đo; không mở rộng sang cơ cấu giàn quy mô nhà máy. Photodiode được trình bày để so sánh lựa chọn cảm biến, không mặc định là phần tử của mạch chính.</w:t>
       </w:r>
     </w:p>
@@ -120,11 +137,13 @@
         <w:pStyle w:val="Heading2"/>
       </w:pPr>
       <w:r>
+        <w:rPr/>
         <w:t>1.5. Kết quả dự kiến</w:t>
       </w:r>
     </w:p>
     <w:p>
       <w:r>
+        <w:rPr/>
         <w:t>Kết quả dự kiến của đề tài gồm:</w:t>
       </w:r>
     </w:p>
@@ -133,6 +152,7 @@
         <w:pStyle w:val="ListBullet"/>
       </w:pPr>
       <w:r>
+        <w:rPr/>
         <w:t>Mô tả cơ sở lý thuyết và cấu trúc mô hình bám nắng một trục có thể triển khai.</w:t>
       </w:r>
     </w:p>
@@ -141,6 +161,7 @@
         <w:pStyle w:val="ListBullet"/>
       </w:pPr>
       <w:r>
+        <w:rPr/>
         <w:t>Bộ thuật toán và chương trình điều khiển có các bước đọc/lọc tín hiệu, hiệu chuẩn, đánh giá chất lượng cảm biến, giới hạn góc và điều khiển cơ cấu.</w:t>
       </w:r>
     </w:p>
@@ -149,6 +170,7 @@
         <w:pStyle w:val="ListBullet"/>
       </w:pPr>
       <w:r>
+        <w:rPr/>
         <w:t>Quy trình mô phỏng/thử nghiệm và bộ chỉ tiêu để so sánh sai số bám, hoạt động của động cơ và năng lượng thuần giữa các chế độ.</w:t>
       </w:r>
     </w:p>
@@ -157,11 +179,13 @@
         <w:pStyle w:val="ListBullet"/>
       </w:pPr>
       <w:r>
+        <w:rPr/>
         <w:t>Báo cáo phân tích ưu điểm, giới hạn và hướng hoàn thiện sau khi có dữ liệu đo thực tế.</w:t>
       </w:r>
     </w:p>
     <w:p>
       <w:r>
+        <w:rPr/>
         <w:t>Các mục tiêu này là kết quả dự kiến; mọi trị số hiệu suất hoặc mức cải thiện chỉ được kết luận từ dữ liệu thực nghiệm có thể kiểm tra.</w:t>
       </w:r>
     </w:p>
@@ -170,6 +194,7 @@
         <w:pStyle w:val="Heading1"/>
       </w:pPr>
       <w:r>
+        <w:rPr/>
         <w:lastRenderedPageBreak/>
         <w:t>CHƯƠNG 2. CƠ SỞ LÝ THUYẾT VÀ TỔNG QUAN LINH KIỆN</w:t>
       </w:r>
@@ -179,21 +204,25 @@
         <w:pStyle w:val="Heading2"/>
       </w:pPr>
       <w:r>
+        <w:rPr/>
         <w:t>2.1. Pin năng lượng Mặt Trời</w:t>
       </w:r>
     </w:p>
     <w:p>
       <w:r>
+        <w:rPr/>
         <w:t>Mô-đun quang điện gồm nhiều tế bào bán dẫn ghép nối tiếp/song song để tạo điện áp và dòng điện phù hợp. Tế bào thường dựa trên tiếp giáp bán dẫn p-n; khi photon có năng lượng phù hợp được hấp thụ, các hạt tải điện được tạo ra và phân tách, hình thành dòng điện một chiều. Mô-đun thương mại còn có kính bảo vệ, lớp đóng gói, mặt sau, khung và hộp nối; cấu tạo cụ thể thay đổi theo loại mô-đun.</w:t>
       </w:r>
     </w:p>
     <w:p>
       <w:r>
+        <w:rPr/>
         <w:t>Các thông số cơ bản trên nhãn gồm công suất cực đại Pmax, điện áp hở mạch Voc, dòng ngắn mạch Isc, điện áp và dòng tại điểm công suất cực đại Vmp, Imp, cùng hệ số nhiệt. Thông số danh định thường công bố theo điều kiện thử chuẩn STC; ngoài thực tế, bức xạ, nhiệt độ tế bào, phổ ánh sáng, tải điện và che bóng làm các giá trị thay đổi. Tăng bức xạ thường làm dòng quang điện tăng; nhiệt độ tế bào tăng thường làm điện áp và công suất cực đại suy giảm.</w:t>
       </w:r>
     </w:p>
     <w:p>
       <w:r>
+        <w:rPr/>
         <w:t>Góc giữa tia trực tiếp và pháp tuyến mặt pin ảnh hưởng thành phần bức xạ trực tiếp thu được; tracker chỉ thay đổi hướng hình học, không loại bỏ ảnh hưởng của mây hay nhiệt độ. Khi so sánh chế độ cố định và bám nắng cần đo đồng thời U và I, tính P = U×I rồi tích phân theo thời gian; điện áp đơn lẻ không đại diện cho năng lượng [1].</w:t>
       </w:r>
     </w:p>
@@ -202,16 +231,19 @@
         <w:pStyle w:val="Heading2"/>
       </w:pPr>
       <w:r>
+        <w:rPr/>
         <w:t>2.2. Cảm biến quang trở (LDR)</w:t>
       </w:r>
     </w:p>
     <w:p>
       <w:r>
+        <w:rPr/>
         <w:t>Quang trở (Light Dependent Resistor - LDR) là linh kiện quang dẫn: độ dẫn điện của vật liệu bán dẫn thay đổi theo lượng ánh sáng chiếu tới. Trong điều kiện sáng hơn, điện trở LDR thường giảm; khi ánh sáng yếu hoặc tối, điện trở tăng. Đặc tuyến điện trở-độ rọi không tuyến tính và phụ thuộc loại linh kiện, phổ ánh sáng, nhiệt độ, thời gian đáp ứng và sai số giữa các mẫu.</w:t>
       </w:r>
     </w:p>
     <w:p>
       <w:r>
+        <w:rPr/>
         <w:t>Để đưa tín hiệu LDR vào vi điều khiển, thường mắc linh kiện với một điện trở cố định thành cầu phân áp rồi đọc điện áp tại điểm giữa bằng ADC. ADC có thể tăng hoặc giảm khi chiếu sáng tùy vị trí LDR trong cầu phân áp, vì vậy cần xem sơ đồ mạch và kiểm tra thực tế. LDR có giá thành thấp, mạch đơn giản nhưng độ lặp lại và tốc độ đáp ứng thường thấp hơn photodiode; cần che bụi/ẩm và hiệu chuẩn nếu dùng để so sánh định lượng.</w:t>
       </w:r>
     </w:p>
@@ -220,19 +252,23 @@
         <w:pStyle w:val="Heading2"/>
       </w:pPr>
       <w:r>
+        <w:rPr/>
         <w:t>2.3. Diode quang (photodiode)</w:t>
       </w:r>
     </w:p>
     <w:p>
       <w:r>
+        <w:rPr/>
         <w:t>Photodiode là linh kiện bán dẫn có vùng tiếp giáp p-n hoặc PIN nhạy với ánh sáng. Photon được hấp thụ tạo cặp điện tử-lỗ trống và sinh dòng quang. Photodiode có thể làm việc ở chế độ quang điện áp (không phân cực ngoài) hoặc quang dẫn (thường phân cực ngược); chế độ và mạch đo được chọn theo yêu cầu về tốc độ, nhiễu và tuyến tính.</w:t>
       </w:r>
     </w:p>
     <w:p>
       <w:r>
+        <w:rPr/>
         <w:t xml:space="preserve">Dòng quang thường nhỏ nên mạch đo hay dùng bộ khuếch đại chuyển dòng-điện áp (TIA), điện trở hồi tiếp và tụ bù để ổn định. Photodiode thường đáp ứng nhanh, có tính lặp tốt và phù hợp đo biến thiên ánh sáng; hạn chế là mạch phức tạp hơn, cần căn chỉnh, che sáng </w:t>
       </w:r>
       <w:r>
+        <w:rPr/>
         <w:lastRenderedPageBreak/>
         <w:t>ngoài ý muốn và chọn dải phổ phù hợp. Trong cấu hình đề tài, photodiode được giới thiệu như phương án cảm biến thay thế, không mặc định lắp chung với LDR.</w:t>
       </w:r>
@@ -242,16 +278,19 @@
         <w:pStyle w:val="Heading2"/>
       </w:pPr>
       <w:r>
+        <w:rPr/>
         <w:t>2.4. Bộ điều khiển ESP32 DevKit và các khối phụ trợ</w:t>
       </w:r>
     </w:p>
     <w:p>
       <w:r>
+        <w:rPr/>
         <w:t>Bộ điều khiển trung tâm là module ESP32 DevKit. Bo có hai nhóm ADC 12 bit: ADC1 (GPIO36, 39, 32, 33...) và ADC2 (GPIO25, 26, 27, 14...); nhóm ADC2 chỉ xung đột khi bật WiFi, còn đề tài không dùng WiFi nên cả sáu kênh đo tương tự đều dùng được. Trong thiết kế đã vẽ, bốn kênh LDR đưa vào GPIO25/26/27/14, biến trở hồi tiếp góc vào GPIO36 và điện áp tấm pin (qua cầu chia) vào GPIO39; ADC của ESP32 chỉ đo điện áp 0–3,3 V nên không đo dòng điện trong phiên bản này.</w:t>
       </w:r>
     </w:p>
     <w:p>
       <w:r>
+        <w:rPr/>
         <w:t>Thời gian thực dùng module DS1307 (I²C địa chỉ 0x68, có pin nuôi) để cấp ngày và giờ cho khối thiên văn; hiển thị dùng màn hình LCD 1602 kèm mạch chuyển I²C PCF8574 (địa chỉ 0x27), chung bus SDA/SCL (GPIO21/22) với DS1307. Nguồn 12 V qua diode chống ngược cực 1N4007, hạ áp LM2596 cấp 3,3 V cho ESP32 và nhánh 7805 riêng cấp 5 V cho LCD, DS1307.</w:t>
       </w:r>
     </w:p>
@@ -260,16 +299,19 @@
         <w:pStyle w:val="Heading2"/>
       </w:pPr>
       <w:r>
+        <w:rPr/>
         <w:t>2.5. Động cơ gạt nước ô tô và mạch động lực cầu H bốn TIP41C</w:t>
       </w:r>
     </w:p>
     <w:p>
       <w:r>
+        <w:rPr/>
         <w:t>Cơ cấu chấp hành là động cơ gạt nước kính ô tô 12 V kèm hộp giảm tốc trục vít – bánh vít. Ưu điểm quyết định là cặp trục vít tự hãm: khi ngắt lệnh hoặc mất điện, trục không bị kéo quay ngược nên tấm pin tự giữ vị trí dưới gió và trọng lượng bản thân mà không cần nuôi điện giữ; mô-men của motor đủ cho tấm pin 100 W nặng khoảng 4 kg ở gió vừa phải, giá thành thấp và sẵn có.</w:t>
       </w:r>
     </w:p>
     <w:p>
       <w:r>
+        <w:rPr/>
         <w:t>Mạch động lực đảo chiều dùng cầu H ghép từ bốn transistor công suất TIP41C (NPN, 6 A, 100 V, vỏ TO-220), mỗi chân bazơ nối qua điện trở 10 k và có diode bảo vệ trả xung ngược về nguồn 12 V và mass. Hai tín hiệu điều khiển dkxuoi/dknguoc đi qua opto PC817 cách ly giữa mass 3,3 V và mass 12 V: chân lệnh ESP32 mức thấp làm sáng LED opto và kéo tín hiệu xuống mass 12 V; theo nguyên lý cầu H, dkxuoi = 0 cho cặp chéo trái dẫn, dknguoc = 0 cho cặp chéo phải dẫn, cả hai bằng 1 thì cầu H khóa và motor tự giữ.</w:t>
       </w:r>
     </w:p>
@@ -278,16 +320,19 @@
         <w:pStyle w:val="Heading2"/>
       </w:pPr>
       <w:r>
+        <w:rPr/>
         <w:t>2.6. Công tắc hành trình</w:t>
       </w:r>
     </w:p>
     <w:p>
       <w:r>
+        <w:rPr/>
         <w:t>Công tắc hành trình là công tắc cơ điện được tác động bởi cần gạt, con lăn hoặc nút nhấn khi cơ cấu đến vị trí giới hạn. Nhiều loại có tiếp điểm COM, NO (thường mở) và NC (thường đóng); NC thường được ưu tiên trong mạch bảo vệ vì dây đứt có thể được nhận biết như trạng thái bất thường. Khi chọn cần xét lực tác động, hành trình, dòng/điện áp tiếp điểm và độ bền cơ.</w:t>
       </w:r>
     </w:p>
     <w:p>
       <w:r>
+        <w:rPr/>
         <w:t>Công tắc có thể đưa tín hiệu về ngõ vào số để chương trình dừng lệnh, đồng thời có thể mắc vào đường liên động của driver nếu thiết kế yêu cầu mức bảo vệ phần cứng. Cần chống dội tiếp điểm, đặt công tắc trước điểm va chạm và cấu hình sao cho khi một đầu giới hạn tác động thì chặn chuyển động đi xa hơn nhưng vẫn cho phép cơ cấu quay ngược để thoát.</w:t>
       </w:r>
     </w:p>
@@ -296,6 +341,7 @@
         <w:pStyle w:val="Heading2"/>
       </w:pPr>
       <w:r>
+        <w:rPr/>
         <w:lastRenderedPageBreak/>
         <w:t>2.7. Ba phương pháp bám nắng xem xét trong đề tài</w:t>
       </w:r>
@@ -305,11 +351,13 @@
         <w:pStyle w:val="Heading3"/>
       </w:pPr>
       <w:r>
+        <w:rPr/>
         <w:t>2.7.1. Nhóm 1 – Vòng hở theo thời gian (thuật toán thiên văn)</w:t>
       </w:r>
     </w:p>
     <w:p>
       <w:r>
+        <w:rPr/>
         <w:t>Nhóm này tính vị trí Mặt Trời từ vị trí địa lý, ngày và giờ đọc từ module thời gian thực DS1307, không cần cảm biến ánh sáng. Góc khai thiên (xích vĩ) tính theo ngày trong năm:</w:t>
       </w:r>
     </w:p>
@@ -327,6 +375,7 @@
     </w:p>
     <w:p>
       <w:r>
+        <w:rPr/>
         <w:t>Góc giờ tính từ giờ Mặt Trời t (giờ):</w:t>
       </w:r>
     </w:p>
@@ -344,6 +393,7 @@
     </w:p>
     <w:p>
       <w:r>
+        <w:rPr/>
         <w:t>Góc cao Mặt Trời α suy ra từ vĩ độ nơi lắp đặt φ:</w:t>
       </w:r>
     </w:p>
@@ -361,6 +411,7 @@
     </w:p>
     <w:p>
       <w:r>
+        <w:rPr/>
         <w:t>Góc phương vị γ tính tiếp từ α, δ và φ. Biết (α, γ) là đổi được ra góc đặt của tấm pin cho từng trục.</w:t>
       </w:r>
     </w:p>
@@ -369,6 +420,7 @@
         <w:pStyle w:val="ListBullet"/>
       </w:pPr>
       <w:r>
+        <w:rPr/>
         <w:t>Ưu điểm: ổn định, không phụ thuộc thời tiết, không dao động quanh vị trí cân bằng.</w:t>
       </w:r>
     </w:p>
@@ -377,6 +429,7 @@
         <w:pStyle w:val="ListBullet"/>
       </w:pPr>
       <w:r>
+        <w:rPr/>
         <w:t>Nhược điểm: phải cài đúng tọa độ và giờ; không tự sửa được sai số do lắp đặt lệch hoặc khớp cơ khí rơ.</w:t>
       </w:r>
     </w:p>
@@ -385,11 +438,13 @@
         <w:pStyle w:val="Heading3"/>
       </w:pPr>
       <w:r>
+        <w:rPr/>
         <w:t>2.7.2. Nhóm 2 – Vòng kín dùng cảm biến quang trở (LDR)</w:t>
       </w:r>
     </w:p>
     <w:p>
       <w:r>
+        <w:rPr/>
         <w:t>Bốn LDR đặt ở bốn góc tấm pin, mỗi cảm biến gá nghiêng ra ngoài tâm một góc β_s = 30° như nhau, không dùng vách ngăn. Khi nắng thẳng góc, bốn kênh nhận sáng gần bằng nhau; khi nắng xiên, cặp cảm biến phía bên nắng nhận mạnh hơn hẳn. Gọi giá trị đọc được của bốn kênh là trái, phải, trên, dưới, sai lệch điều khiển tính rất đơn giản:</w:t>
       </w:r>
     </w:p>
@@ -410,6 +465,7 @@
         <w:pStyle w:val="ListBullet"/>
       </w:pPr>
       <w:r>
+        <w:rPr/>
         <w:t>Nếu |e1| &gt; ngưỡng: quay động cơ trục 1 theo dấu e1; nếu |e2| &gt; ngưỡng: quay động cơ trục 2 theo dấu e2.</w:t>
       </w:r>
     </w:p>
@@ -418,6 +474,7 @@
         <w:pStyle w:val="ListBullet"/>
       </w:pPr>
       <w:r>
+        <w:rPr/>
         <w:t>Ngược lại thì dừng – vùng chết (dead-band) chống dao động quanh vị trí cân bằng.</w:t>
       </w:r>
     </w:p>
@@ -426,6 +483,7 @@
         <w:pStyle w:val="ListBullet"/>
       </w:pPr>
       <w:r>
+        <w:rPr/>
         <w:t>Ưu điểm: đơn giản, rẻ, phản ứng theo điều kiện sáng thực tế, tự sửa sai số lắp đặt.</w:t>
       </w:r>
     </w:p>
@@ -434,6 +492,7 @@
         <w:pStyle w:val="ListBullet"/>
       </w:pPr>
       <w:r>
+        <w:rPr/>
         <w:t>Nhược điểm: nhạy với mây và bóng râm thoáng qua, dễ dao động nếu ngưỡng chọn quá nhỏ, buổi sáng sớm tín hiệu yếu nên bám chậm.</w:t>
       </w:r>
     </w:p>
@@ -442,6 +501,7 @@
         <w:pStyle w:val="Heading3"/>
       </w:pPr>
       <w:r>
+        <w:rPr/>
         <w:t>2.7.3. Nhóm 3 – Phương pháp hybrid (kết hợp), phương án lựa chọn</w:t>
       </w:r>
     </w:p>
@@ -450,6 +510,7 @@
         <w:pStyle w:val="ListBullet"/>
       </w:pPr>
       <w:r>
+        <w:rPr/>
         <w:t>Dùng thiên văn định vị thô: đầu buổi sáng và mỗi chu kỳ 30 phút, tính (α, γ) từ DS1307 rồi đưa nhanh tấm pin về gần vị trí Mặt Trời.</w:t>
       </w:r>
     </w:p>
@@ -458,6 +519,7 @@
         <w:pStyle w:val="ListBullet"/>
       </w:pPr>
       <w:r>
+        <w:rPr/>
         <w:t>Dùng LDR tinh chỉnh: giữa hai lần định vị thô, so sánh e1 (và e2) với ngưỡng để khử phần sai lệch còn lại, kể cả sai số lắp đặt.</w:t>
       </w:r>
     </w:p>
@@ -466,11 +528,13 @@
         <w:pStyle w:val="ListBullet"/>
       </w:pPr>
       <w:r>
+        <w:rPr/>
         <w:t>Khi trời nhiều mây (tổng sáng S nhỏ hơn ngưỡng S_min): giữ nguyên vị trí theo lịch thiên văn, tránh dao động vô ích do mây che thoáng qua.</w:t>
       </w:r>
     </w:p>
     <w:p>
       <w:r>
+        <w:rPr/>
         <w:lastRenderedPageBreak/>
         <w:t>Phương pháp hybrid lấy được ưu điểm của cả hai nhóm: bám nhanh và ổn định như vòng hở, tự sửa sai số như vòng kín, và không săn lệnh khi thời tiết xấu. Vì vậy đề tài chọn nhóm 3 cho cả hai mô hình một trục và hai trục.</w:t>
       </w:r>
@@ -480,6 +544,7 @@
         <w:pStyle w:val="Heading2"/>
       </w:pPr>
       <w:r>
+        <w:rPr/>
         <w:t>2.8. Sơ đồ khối tổng thể và các kết quả tiếp nhận từ quyển nghiên cứu</w:t>
       </w:r>
     </w:p>
@@ -534,11 +599,13 @@
         <w:pStyle w:val="Caption"/>
       </w:pPr>
       <w:r>
+        <w:rPr/>
         <w:t>Hình 1. Sơ đồ khối hệ thống một trục theo phương pháp hybrid</w:t>
       </w:r>
     </w:p>
     <w:p>
       <w:r>
+        <w:rPr/>
         <w:t>Sơ đồ khối trên cụ thể hóa phương pháp hybrid đã nghiên cứu thành các khối mạch và cơ khí sẽ chế tạo ở chương 3; bảng dưới đây tổng hợp các kết quả đã hoàn thành ở quyển nghiên cứu và nơi áp dụng trong quyển chế tạo.</w:t>
       </w:r>
     </w:p>
@@ -548,6 +615,7 @@
         <w:spacing w:after="80"/>
       </w:pPr>
       <w:r>
+        <w:rPr/>
         <w:t>Bảng 1. Các kết quả tiếp nhận từ quyển nghiên cứu và cách áp dụng</w:t>
       </w:r>
     </w:p>
@@ -1078,6 +1146,7 @@
         <w:pStyle w:val="Heading1"/>
       </w:pPr>
       <w:r>
+        <w:rPr/>
         <w:t>CHƯƠNG 3. CHẾ TẠO MẠCH ĐIỆN, CƠ KHÍ, LẮP RÁP, HIỆU CHUẨN VÀ ĐO ĐẠC</w:t>
       </w:r>
     </w:p>
@@ -1086,6 +1155,7 @@
         <w:pStyle w:val="Heading2"/>
       </w:pPr>
       <w:r>
+        <w:rPr/>
         <w:t>3.1. Kết quả tính chọn động cơ cho tấm pin 100 W – 4 kg</w:t>
       </w:r>
     </w:p>
@@ -1095,6 +1165,7 @@
         <w:spacing w:after="80"/>
       </w:pPr>
       <w:r>
+        <w:rPr/>
         <w:t>Bảng 2. Tính chọn động cơ gạt nước cho tấm pin 100 W – 4 kg</w:t>
       </w:r>
     </w:p>
@@ -1621,6 +1692,7 @@
     <w:p/>
     <w:p>
       <w:r>
+        <w:rPr/>
         <w:t>Dòng tải 4–5 A của motor nằm trong giới hạn 6 A của transistor TIP41C ở mạch động lực; riêng dòng hãm khi kẹt trục lớn hơn nên mạch có cầu chì và chương trình có giới hạn thời gian chạy mỗi lệnh để bảo vệ transistor.</w:t>
       </w:r>
     </w:p>
@@ -1629,6 +1701,7 @@
         <w:pStyle w:val="Heading2"/>
       </w:pPr>
       <w:r>
+        <w:rPr/>
         <w:lastRenderedPageBreak/>
         <w:t>3.2. Mạch điều khiển trung tâm: ESP32 DevKit</w:t>
       </w:r>
@@ -1639,6 +1712,7 @@
         <w:jc w:val="center"/>
       </w:pPr>
       <w:r>
+        <w:rPr/>
         <w:drawing>
           <wp:inline distT="0" distB="0" distL="0" distR="0" wp14:anchorId="6C355A86" wp14:editId="075302F1">
             <wp:extent cx="4435522" cy="3379328"/>
@@ -1681,15 +1755,23 @@
         <w:pStyle w:val="Caption"/>
       </w:pPr>
       <w:r>
+        <w:rPr/>
         <w:t>Hình 2. Sheet nguyên lý khối ESP32 DevKit và các mạng tín hiệu</w:t>
       </w:r>
     </w:p>
     <w:p>
+      <w:r>
+        <w:rPr/>
+        <w:t>Sheet khối ESP32 DevKit ghi tên mạng tín hiệu của từng chân: bốn kênh quang trở, hai biến trở hồi tiếp, áp tấm pin, hai lệnh cầu H và bus I2C; đây là căn cứ nối dây giữa các sheet còn lại.</w:t>
+      </w:r>
+    </w:p>
+    <w:p>
       <w:pPr>
         <w:pStyle w:val="Caption"/>
         <w:spacing w:after="80"/>
       </w:pPr>
       <w:r>
+        <w:rPr/>
         <w:t>Bảng 3. Bảng chân kết nối theo sheet ESP32 DevKit</w:t>
       </w:r>
     </w:p>
@@ -2163,6 +2245,7 @@
         <w:pStyle w:val="Heading2"/>
       </w:pPr>
       <w:r>
+        <w:rPr/>
         <w:lastRenderedPageBreak/>
         <w:t>3.3. Mạch động lực cầu H bốn TIP41C và cách ly opto</w:t>
       </w:r>
@@ -2173,6 +2256,7 @@
         <w:jc w:val="center"/>
       </w:pPr>
       <w:r>
+        <w:rPr/>
         <w:drawing>
           <wp:inline distT="0" distB="0" distL="0" distR="0" wp14:anchorId="3F3D746D" wp14:editId="2645C1DD">
             <wp:extent cx="5397689" cy="3330438"/>
@@ -2215,15 +2299,23 @@
         <w:pStyle w:val="Caption"/>
       </w:pPr>
       <w:r>
+        <w:rPr/>
         <w:t>Hình 3. Mạch động lực cầu H ghép từ bốn TIP41C kèm diode bảo vệ</w:t>
       </w:r>
     </w:p>
     <w:p>
+      <w:r>
+        <w:rPr/>
+        <w:t>Bốn transistor TIP41C ghép thành cầu H; mỗi cặp chéo nhận một lệnh tích cực thấp, các diode D2–D5 xả sức điện động ngược khi ngắt điện, giúp transistor không bị quá áp khi đổi chiều.</w:t>
+      </w:r>
+    </w:p>
+    <w:p>
       <w:pPr>
         <w:ind w:firstLine="0"/>
         <w:jc w:val="center"/>
       </w:pPr>
       <w:r>
+        <w:rPr/>
         <w:drawing>
           <wp:inline distT="0" distB="0" distL="0" distR="0" wp14:anchorId="1A0178A6" wp14:editId="7086B074">
             <wp:extent cx="4872251" cy="3494595"/>
@@ -2266,11 +2358,13 @@
         <w:pStyle w:val="Caption"/>
       </w:pPr>
       <w:r>
+        <w:rPr/>
         <w:t>Hình 4. Mạch cách ly opto PC817 giữa khối điều khiển và mạch động lực</w:t>
       </w:r>
     </w:p>
     <w:p>
       <w:r>
+        <w:rPr/>
         <w:t>Cầu H gồm U1–U4 đều là TIP41C (NPN 6 A, 100 V). Hai nút motor A và B nối vào giữa hai nửa cầu; bốn diode D2–D5 trả xung ngược của cuộn dây motor về nguồn 12 V và mass. Mỗi bazơ nối qua trở 10 k tới mạng lệnh dkxuoi hoặc dknguoc; hai mạng này đi qua opto PC817 nên mass mạch động lực tách hẳn mass logic 3,3 V, chống nhiễu xung khi motor đảo chiều.</w:t>
       </w:r>
     </w:p>
@@ -2280,6 +2374,7 @@
         <w:spacing w:after="80"/>
       </w:pPr>
       <w:r>
+        <w:rPr/>
         <w:lastRenderedPageBreak/>
         <w:t>Bảng 4. Bảng trạng thái lệnh của cầu H (tích cực thấp qua opto)</w:t>
       </w:r>
@@ -2670,6 +2765,7 @@
         <w:pStyle w:val="Heading2"/>
       </w:pPr>
       <w:r>
+        <w:rPr/>
         <w:t>3.4. Mạch nguồn, mạch thời gian thực và mạch hiển thị</w:t>
       </w:r>
     </w:p>
@@ -2679,6 +2775,7 @@
         <w:jc w:val="center"/>
       </w:pPr>
       <w:r>
+        <w:rPr/>
         <w:drawing>
           <wp:inline distT="0" distB="0" distL="0" distR="0" wp14:anchorId="12C92D11" wp14:editId="2FD759D5">
             <wp:extent cx="5733415" cy="2774950"/>
@@ -2721,15 +2818,23 @@
         <w:pStyle w:val="Caption"/>
       </w:pPr>
       <w:r>
+        <w:rPr/>
         <w:t>Hình 5. Mạch nguồn chống ngược cực và hạ áp LM2596</w:t>
       </w:r>
     </w:p>
     <w:p>
+      <w:r>
+        <w:rPr/>
+        <w:t>Nguồn 12 V đi qua diode 1N4007 chống ngược cực rồi vào LM2596 hạ áp còn 3,3 V nuôi ESP32; cuộn cảm và tụ đầu ra chọn theo datasheet để gợn sóng thấp hơn ngưỡng sai số ADC.</w:t>
+      </w:r>
+    </w:p>
+    <w:p>
       <w:pPr>
         <w:ind w:firstLine="0"/>
         <w:jc w:val="center"/>
       </w:pPr>
       <w:r>
+        <w:rPr/>
         <w:lastRenderedPageBreak/>
         <w:drawing>
           <wp:inline distT="0" distB="0" distL="0" distR="0" wp14:anchorId="56EDD5C5" wp14:editId="7D2ED395">
@@ -2773,15 +2878,23 @@
         <w:pStyle w:val="Caption"/>
       </w:pPr>
       <w:r>
+        <w:rPr/>
         <w:t>Hình 6. Nhánh 5 V ổn áp 7805 và màn hình LCD I²C 1602</w:t>
       </w:r>
     </w:p>
     <w:p>
+      <w:r>
+        <w:rPr/>
+        <w:t>Nhánh 5 V dùng 7805 ổn áp riêng cho màn hình LCD 1602 ghép mạch chuyển PCF8574 địa chỉ 0x27, tách khỏi nhánh 3,3 V để nhiễu màn hình không lọt vào các kênh đo quang trở.</w:t>
+      </w:r>
+    </w:p>
+    <w:p>
       <w:pPr>
         <w:ind w:firstLine="0"/>
         <w:jc w:val="center"/>
       </w:pPr>
       <w:r>
+        <w:rPr/>
         <w:drawing>
           <wp:inline distT="0" distB="0" distL="0" distR="0" wp14:anchorId="4D6060D2" wp14:editId="056F3B20">
             <wp:extent cx="3972479" cy="2762636"/>
@@ -2824,11 +2937,13 @@
         <w:pStyle w:val="Caption"/>
       </w:pPr>
       <w:r>
+        <w:rPr/>
         <w:t>Hình 7. Module thời gian thực DS1307 trên bus I²C</w:t>
       </w:r>
     </w:p>
     <w:p>
       <w:r>
+        <w:rPr/>
         <w:t>Nguồn 12 V vào qua diode 1N4007 chống ngược cực rồi tách ba nhánh: nhánh 12 V thẳng vào cầu H cho motor; nhánh LM2596 hạ xuống 3,3 V nuôi ESP32; nhánh 7805 hạ xuống 5 V nuôi LCD và DS1307, có tụ 220 µF lọc hai đầu. DS1307 có pin nuôi nên giữ đúng ngày giờ cả khi tắt máy; LCD 1602 giao tiếp qua mạch chuyển I²C PCF8574 nên chỉ tốn hai chân SDA/SCL.</w:t>
       </w:r>
     </w:p>
@@ -2837,10 +2952,12 @@
         <w:pStyle w:val="Heading2"/>
       </w:pPr>
       <w:r>
+        <w:rPr/>
         <w:lastRenderedPageBreak/>
         <w:t xml:space="preserve">3.5. Mạch </w:t>
       </w:r>
       <w:r>
+        <w:rPr/>
         <w:t>đọc quang trở</w:t>
       </w:r>
     </w:p>
@@ -2850,6 +2967,7 @@
         <w:jc w:val="center"/>
       </w:pPr>
       <w:r>
+        <w:rPr/>
         <w:drawing>
           <wp:inline distT="0" distB="0" distL="0" distR="0" wp14:anchorId="3C65EDA5" wp14:editId="2D5AA477">
             <wp:extent cx="5715798" cy="4229690"/>
@@ -2892,9 +3010,11 @@
         <w:pStyle w:val="Caption"/>
       </w:pPr>
       <w:r>
+        <w:rPr/>
         <w:t xml:space="preserve">Hình 8. </w:t>
       </w:r>
       <w:r>
+        <w:rPr/>
         <w:t xml:space="preserve">Mạch đọc quang trở </w:t>
       </w:r>
     </w:p>
@@ -2915,7 +3035,6 @@
           <w:b w:val="0"/>
           <w:bCs w:val="0"/>
           <w:color w:val="000000"/>
-          <w:sz w:val="24"/>
           <w:szCs w:val="22"/>
         </w:rPr>
         <w:t>Mạch đọc quang trở có nhiệm vụ chuyển đổi cường độ ánh sáng của môi trường thành tín hiệu điện áp để vi điều khiển ESP có thể đọc và xử lý. Quang trở (LDR – Light Dependent Resistor, ký hiệu QT trên sơ đồ) là linh kiện thụ động có điện trở thay đổi theo cường độ ánh sáng chiếu vào: khi trời tối, điện trở của nó rất lớn (hàng trăm kΩ đến hàng MΩ); khi được chiếu sáng, điện trở giảm mạnh (chỉ còn vài kΩ hoặc nhỏ hơn). Tuy nhiên, bản thân quang trở là một linh kiện hai chân, không phân cực, nó chỉ biến đổi điện trở chứ không tạo ra điện áp — trong khi ESP không đo được điện trở trực tiếp mà chỉ đo được điện áp qua bộ chuyển đổi tương tự – số (ADC). Vì vậy, mỗi kênh quang trở trong mạch này được mắc thành một cầu phân áp với một điện trở cố định, biến sự thay đổi điện trở theo ánh sáng thành sự thay đổi điện áp tỷ lệ, từ đó ESP đọc được bằng hàm analogRead().</w:t>
@@ -2926,6 +3045,7 @@
         <w:pStyle w:val="Heading2"/>
       </w:pPr>
       <w:r>
+        <w:rPr/>
         <w:t>3.6. Danh mục vật tư và linh kiện</w:t>
       </w:r>
     </w:p>
@@ -2935,6 +3055,7 @@
         <w:spacing w:after="80"/>
       </w:pPr>
       <w:r>
+        <w:rPr/>
         <w:t>Bảng 5. Danh mục vật tư – linh kiện của mô hình một trục</w:t>
       </w:r>
     </w:p>
@@ -4282,6 +4403,7 @@
         </w:rPr>
       </w:pPr>
       <w:r>
+        <w:rPr/>
         <w:br w:type="page"/>
       </w:r>
     </w:p>
@@ -4295,6 +4417,7 @@
         <w:pStyle w:val="Heading1"/>
       </w:pPr>
       <w:r>
+        <w:rPr/>
         <w:t>CHƯƠNG 4. TIẾN ĐỘ THỰC HIỆN VÀ KẾ HOẠCH TUẦN NÀY</w:t>
       </w:r>
     </w:p>
@@ -4303,6 +4426,7 @@
         <w:pStyle w:val="Heading2"/>
       </w:pPr>
       <w:r>
+        <w:rPr/>
         <w:t>4.1. Kết quả đạt được trong tuần 5/10 – 10/10/2026</w:t>
       </w:r>
     </w:p>
@@ -4315,6 +4439,7 @@
         </w:numPr>
       </w:pPr>
       <w:r>
+        <w:rPr/>
         <w:t>Hoàn thành thiết kế bảy sheet mạch nguyên lý trên EasyEDA và hàn thử toàn bộ mạch điều khiển, mạch động lực, mạch nguồn.</w:t>
       </w:r>
     </w:p>
@@ -4327,6 +4452,7 @@
         </w:numPr>
       </w:pPr>
       <w:r>
+        <w:rPr/>
         <w:t>Hoàn thành tính chọn động cơ cho tấm pin 100 W – 4 kg: làm việc tới gió 8 m/s, hệ số an toàn theo mô-men hãm ≈ 2 ở gió 10 m/s.</w:t>
       </w:r>
     </w:p>
@@ -4335,16 +4461,19 @@
         <w:pStyle w:val="Heading2"/>
       </w:pPr>
       <w:r>
+        <w:rPr/>
         <w:t>4.2. Các công việc còn lại của tuần này (5/10 – 10/10/2026)</w:t>
       </w:r>
     </w:p>
     <w:p>
       <w:r>
+        <w:rPr/>
         <w:t>Làm mạch động lực và chạy thử với động cơ trục vít</w:t>
       </w:r>
     </w:p>
     <w:p>
       <w:r>
+        <w:rPr/>
         <w:t>Làm mạch điều khiển esp đọc thời gian và giá trị điện trở</w:t>
       </w:r>
     </w:p>
@@ -4358,6 +4487,7 @@
         <w:ind w:left="360"/>
       </w:pPr>
       <w:r>
+        <w:rPr/>
         <w:t>Chạy thử ngoài trời trọn một ngày nắng, ghi log góc tấm pin đối chiếu đồ thị mô phỏng.</w:t>
       </w:r>
     </w:p>
@@ -4371,6 +4501,7 @@
         <w:ind w:left="360"/>
       </w:pPr>
       <w:r>
+        <w:rPr/>
         <w:t>Đo nhiệt độ TIP41C sau 30 phút chạy liên tục để quyết định cỡ tản nhiệt.</w:t>
       </w:r>
     </w:p>
@@ -4379,67 +4510,80 @@
         <w:pStyle w:val="Heading1"/>
       </w:pPr>
       <w:r>
+        <w:rPr/>
         <w:t>TÀI LIỆU THAM KHẢO</w:t>
       </w:r>
     </w:p>
     <w:p>
       <w:r>
+        <w:rPr/>
         <w:t>[1] J. A. Duffie and W. A. Beckman, Solar Engineering of Thermal Processes, 4th ed., John Wiley &amp; Sons, 2013.</w:t>
       </w:r>
     </w:p>
     <w:p>
       <w:r>
+        <w:rPr/>
         <w:t>[2] I. Reda and A. Andreas, “Solar position algorithm for solar radiation applications,” Solar Energy, vol. 76, no. 5, pp. 577-589, 2004.</w:t>
       </w:r>
     </w:p>
     <w:p>
       <w:r>
+        <w:rPr/>
         <w:t>[3] I. Reda and A. Andreas, “Solar Position Algorithm for Solar Radiation Applications,” NREL/TP-560-34302, 2008. https://docs.nrel.gov/docs/fy08osti/34302.pdf</w:t>
       </w:r>
     </w:p>
     <w:p>
       <w:r>
+        <w:rPr/>
         <w:t>[4] H. Mousazadeh et al., “A review of principle and sun-tracking methods for maximizing solar systems output,” Renewable and Sustainable Energy Reviews, vol. 13, no. 8, pp. 1800-1818, 2009.</w:t>
       </w:r>
     </w:p>
     <w:p>
       <w:r>
+        <w:rPr/>
         <w:t>[5] A. Awasthi et al., “Review on sun tracking technology in solar PV system,” Energy Reports, vol. 6, pp. 392-405, 2020.</w:t>
       </w:r>
     </w:p>
     <w:p>
       <w:r>
+        <w:rPr/>
         <w:t>[6] R. F. Fuentes-Morales et al., “Control algorithms applied to active solar tracking systems: A review,” Solar Energy, vol. 212, pp. 203-219, 2020. https://doi.org/10.1016/j.solener.2020.10.071</w:t>
       </w:r>
     </w:p>
     <w:p>
       <w:r>
+        <w:rPr/>
         <w:t>[7] A. R. Amelia et al., “Technologies of solar tracking systems: A review,” IOP Conference Series: Materials Science and Engineering, vol. 767, 012052, 2020.</w:t>
       </w:r>
     </w:p>
     <w:p>
       <w:r>
+        <w:rPr/>
         <w:t>[8] Espressif Systems, ESP32 Series Datasheet. https://www.espressif.com/sites/default/files/documentation/esp32_datasheet_en.pdf</w:t>
       </w:r>
     </w:p>
     <w:p>
       <w:r>
+        <w:rPr/>
         <w:lastRenderedPageBreak/>
         <w:t>[9] Espressif Systems, ESP32-DevKitC General Purpose Development Board User Guide. https://docs.espressif.com/projects/esp-dev-kits/en/latest/esp32/esp32-devkitc/index.html</w:t>
       </w:r>
     </w:p>
     <w:p>
       <w:r>
+        <w:rPr/>
         <w:t>[10] NXP Semiconductors, PCF8574 Remote 8-bit I/O Expander for I2C-bus (mạch kèm LCD 1602), Datasheet.</w:t>
       </w:r>
     </w:p>
     <w:p>
       <w:r>
+        <w:rPr/>
         <w:t>[11] Maxim Integrated, DS1307 64 x 8, Serial I2C Real-Time Clock, Datasheet. https://www.analog.com/media/en/technical-documentation/data-sheets/DS1307.pdf</w:t>
       </w:r>
     </w:p>
     <w:p>
       <w:r>
+        <w:rPr/>
         <w:t>[12] W. F. Holmgren, C. W. Hansen, and M. A. Mikofski, “pvlib python: a python package for modeling solar energy systems,” Journal of Open Source Software, vol. 3, no. 29, p. 884, 2018.</w:t>
       </w:r>
     </w:p>
@@ -5300,7 +5444,7 @@
     <w:rPr>
       <w:rFonts w:ascii="Times New Roman" w:eastAsia="Times New Roman" w:hAnsi="Times New Roman"/>
       <w:color w:val="000000"/>
-      <w:sz w:val="24"/>
+      <w:sz w:val="26"/>
     </w:rPr>
   </w:style>
   <w:style w:type="paragraph" w:styleId="Heading1">
@@ -5350,7 +5494,7 @@
       <w:b/>
       <w:bCs/>
       <w:color w:val="1F4E79"/>
-      <w:sz w:val="26"/>
+      <w:sz w:val="32"/>
       <w:szCs w:val="26"/>
     </w:rPr>
   </w:style>
@@ -5377,6 +5521,7 @@
       <w:bCs/>
       <w:i/>
       <w:color w:val="404040"/>
+      <w:sz w:val="28"/>
     </w:rPr>
   </w:style>
   <w:style w:type="paragraph" w:styleId="Heading4">
@@ -6097,7 +6242,7 @@
     <w:rPr>
       <w:bCs/>
       <w:color w:val="505050"/>
-      <w:sz w:val="20"/>
+      <w:sz w:val="24"/>
       <w:szCs w:val="18"/>
     </w:rPr>
   </w:style>

</xml_diff>

<commit_message>
Chuong 4 bo deadline theo mau; xoa muc 3.8 Hieu chuan CT2; ve lai so do khoi 2 truc dung lien ket khoi; LT chia doi cong viec lap trinh
Co-authored-by: arena-agent <297053741+arena-agent@users.noreply.github.com>
</commit_message>
<xml_diff>
--- a/Bao_cao_1_truc_Che_tao.docx
+++ b/Bao_cao_1_truc_Che_tao.docx
@@ -4427,12 +4427,11 @@
       </w:pPr>
       <w:r>
         <w:rPr/>
-        <w:t>4.1. Kết quả đạt được trong tuần 5/10 – 10/10/2026</w:t>
+        <w:t>4.1. Kết quả đạt được trong tuần</w:t>
       </w:r>
     </w:p>
     <w:p>
       <w:pPr>
-        <w:pStyle w:val="ListBullet"/>
         <w:numPr>
           <w:ilvl w:val="0"/>
           <w:numId w:val="0"/>
@@ -4445,7 +4444,6 @@
     </w:p>
     <w:p>
       <w:pPr>
-        <w:pStyle w:val="ListBullet"/>
         <w:numPr>
           <w:ilvl w:val="0"/>
           <w:numId w:val="0"/>
@@ -4462,16 +4460,22 @@
       </w:pPr>
       <w:r>
         <w:rPr/>
-        <w:t>4.2. Các công việc còn lại của tuần này (5/10 – 10/10/2026)</w:t>
+        <w:t>4.2. Các công việc cần thực hiện tiếp</w:t>
       </w:r>
     </w:p>
     <w:p>
+      <w:pPr>
+        <w:ind w:left="567"/>
+      </w:pPr>
       <w:r>
         <w:rPr/>
         <w:t>Làm mạch động lực và chạy thử với động cơ trục vít</w:t>
       </w:r>
     </w:p>
     <w:p>
+      <w:pPr>
+        <w:ind w:left="567"/>
+      </w:pPr>
       <w:r>
         <w:rPr/>
         <w:t>Làm mạch điều khiển esp đọc thời gian và giá trị điện trở</w:t>
@@ -4479,12 +4483,11 @@
     </w:p>
     <w:p>
       <w:pPr>
-        <w:pStyle w:val="ListBullet"/>
         <w:numPr>
           <w:ilvl w:val="0"/>
           <w:numId w:val="0"/>
         </w:numPr>
-        <w:ind w:left="360"/>
+        <w:ind w:left="567"/>
       </w:pPr>
       <w:r>
         <w:rPr/>
@@ -4493,12 +4496,11 @@
     </w:p>
     <w:p>
       <w:pPr>
-        <w:pStyle w:val="ListBullet"/>
         <w:numPr>
           <w:ilvl w:val="0"/>
           <w:numId w:val="0"/>
         </w:numPr>
-        <w:ind w:left="360"/>
+        <w:ind w:left="567"/>
       </w:pPr>
       <w:r>
         <w:rPr/>

</xml_diff>

<commit_message>
Them muc 3.7 ket cau co khi mo hinh 1 truc (6 anh 3D moi) vao CT1; dung lai PDF
Co-authored-by: arena-agent <297053741+arena-agent@users.noreply.github.com>
</commit_message>
<xml_diff>
--- a/Bao_cao_1_truc_Che_tao.docx
+++ b/Bao_cao_1_truc_Che_tao.docx
@@ -24103,114 +24103,32 @@
       </w:pPr>
       <w:proofErr w:type="spellStart"/>
       <w:r>
-        <w:rPr/>
-        <w:t>Hình</w:t>
-      </w:r>
-      <w:proofErr w:type="spellEnd"/>
-      <w:r>
-        <w:rPr/>
-        <w:t xml:space="preserve"> 1. </w:t>
-      </w:r>
-      <w:proofErr w:type="spellStart"/>
-      <w:r>
-        <w:rPr/>
-        <w:t>Sơ</w:t>
-      </w:r>
-      <w:proofErr w:type="spellEnd"/>
-      <w:r>
-        <w:rPr/>
-        <w:t xml:space="preserve"> </w:t>
-      </w:r>
-      <w:proofErr w:type="spellStart"/>
-      <w:r>
-        <w:rPr/>
-        <w:t>đồ</w:t>
-      </w:r>
-      <w:proofErr w:type="spellEnd"/>
-      <w:r>
-        <w:rPr/>
-        <w:t xml:space="preserve"> </w:t>
-      </w:r>
-      <w:proofErr w:type="spellStart"/>
-      <w:r>
-        <w:rPr/>
-        <w:t>khối</w:t>
-      </w:r>
-      <w:proofErr w:type="spellEnd"/>
-      <w:r>
-        <w:rPr/>
-        <w:t xml:space="preserve"> </w:t>
-      </w:r>
-      <w:proofErr w:type="spellStart"/>
-      <w:r>
-        <w:rPr/>
-        <w:t>hệ</w:t>
-      </w:r>
-      <w:proofErr w:type="spellEnd"/>
-      <w:r>
-        <w:rPr/>
-        <w:t xml:space="preserve"> </w:t>
-      </w:r>
-      <w:proofErr w:type="spellStart"/>
-      <w:r>
-        <w:rPr/>
-        <w:t>thống</w:t>
-      </w:r>
-      <w:proofErr w:type="spellEnd"/>
-      <w:r>
-        <w:rPr/>
-        <w:t xml:space="preserve"> </w:t>
-      </w:r>
-      <w:proofErr w:type="spellStart"/>
-      <w:r>
-        <w:rPr/>
-        <w:t>một</w:t>
-      </w:r>
-      <w:proofErr w:type="spellEnd"/>
-      <w:r>
-        <w:rPr/>
-        <w:t xml:space="preserve"> </w:t>
-      </w:r>
-      <w:proofErr w:type="spellStart"/>
-      <w:r>
-        <w:rPr/>
-        <w:t>trục</w:t>
-      </w:r>
-      <w:proofErr w:type="spellEnd"/>
-      <w:r>
-        <w:rPr/>
-        <w:t xml:space="preserve"> </w:t>
-      </w:r>
-      <w:proofErr w:type="spellStart"/>
-      <w:r>
-        <w:rPr/>
-        <w:t>theo</w:t>
-      </w:r>
-      <w:proofErr w:type="spellEnd"/>
-      <w:r>
-        <w:rPr/>
-        <w:t xml:space="preserve"> </w:t>
-      </w:r>
-      <w:proofErr w:type="spellStart"/>
-      <w:r>
-        <w:rPr/>
-        <w:t>phương</w:t>
-      </w:r>
-      <w:proofErr w:type="spellEnd"/>
-      <w:r>
-        <w:rPr/>
-        <w:t xml:space="preserve"> </w:t>
-      </w:r>
-      <w:proofErr w:type="spellStart"/>
-      <w:r>
-        <w:rPr/>
-        <w:t>pháp</w:t>
-      </w:r>
-      <w:proofErr w:type="spellEnd"/>
-      <w:r>
-        <w:rPr/>
-        <w:t xml:space="preserve"> hybrid</w:t>
-      </w:r>
+        <w:rPr>
+          <w:sz w:val="24"/>
+        </w:rPr>
+        <w:t>Hình 1. Sơ đồ khối hệ thống một trục theo phương pháp hybrid</w:t>
+      </w:r>
+      <w:proofErr w:type="spellEnd"/>
+      <w:proofErr w:type="spellStart"/>
+      <w:proofErr w:type="spellEnd"/>
+      <w:proofErr w:type="spellStart"/>
+      <w:proofErr w:type="spellEnd"/>
+      <w:proofErr w:type="spellStart"/>
+      <w:proofErr w:type="spellEnd"/>
+      <w:proofErr w:type="spellStart"/>
+      <w:proofErr w:type="spellEnd"/>
+      <w:proofErr w:type="spellStart"/>
+      <w:proofErr w:type="spellEnd"/>
+      <w:proofErr w:type="spellStart"/>
+      <w:proofErr w:type="spellEnd"/>
+      <w:proofErr w:type="spellStart"/>
+      <w:proofErr w:type="spellEnd"/>
+      <w:proofErr w:type="spellStart"/>
+      <w:proofErr w:type="spellEnd"/>
+      <w:proofErr w:type="spellStart"/>
+      <w:proofErr w:type="spellEnd"/>
+      <w:proofErr w:type="spellStart"/>
+      <w:proofErr w:type="spellEnd"/>
     </w:p>
     <w:p>
       <w:proofErr w:type="spellStart"/>
@@ -29822,99 +29740,29 @@
       </w:pPr>
       <w:proofErr w:type="spellStart"/>
       <w:r>
-        <w:rPr/>
-        <w:t>Hình</w:t>
-      </w:r>
-      <w:proofErr w:type="spellEnd"/>
-      <w:r>
-        <w:rPr/>
-        <w:t xml:space="preserve"> 2. Sheet </w:t>
-      </w:r>
-      <w:proofErr w:type="spellStart"/>
-      <w:r>
-        <w:rPr/>
-        <w:t>nguyên</w:t>
-      </w:r>
-      <w:proofErr w:type="spellEnd"/>
-      <w:r>
-        <w:rPr/>
-        <w:t xml:space="preserve"> </w:t>
-      </w:r>
-      <w:proofErr w:type="spellStart"/>
-      <w:r>
-        <w:rPr/>
-        <w:t>lý</w:t>
-      </w:r>
-      <w:proofErr w:type="spellEnd"/>
-      <w:r>
-        <w:rPr/>
-        <w:t xml:space="preserve"> </w:t>
-      </w:r>
-      <w:proofErr w:type="spellStart"/>
-      <w:r>
-        <w:rPr/>
-        <w:t>khối</w:t>
-      </w:r>
-      <w:proofErr w:type="spellEnd"/>
-      <w:r>
-        <w:rPr/>
-        <w:t xml:space="preserve"> ESP32 </w:t>
-      </w:r>
-      <w:proofErr w:type="spellStart"/>
-      <w:r>
-        <w:rPr/>
-        <w:t>DevKit</w:t>
-      </w:r>
-      <w:proofErr w:type="spellEnd"/>
-      <w:r>
-        <w:rPr/>
-        <w:t xml:space="preserve"> </w:t>
-      </w:r>
-      <w:proofErr w:type="spellStart"/>
-      <w:r>
-        <w:rPr/>
-        <w:t>và</w:t>
-      </w:r>
-      <w:proofErr w:type="spellEnd"/>
-      <w:r>
-        <w:rPr/>
-        <w:t xml:space="preserve"> </w:t>
-      </w:r>
-      <w:proofErr w:type="spellStart"/>
-      <w:r>
-        <w:rPr/>
-        <w:t>các</w:t>
-      </w:r>
-      <w:proofErr w:type="spellEnd"/>
-      <w:r>
-        <w:rPr/>
-        <w:t xml:space="preserve"> </w:t>
-      </w:r>
-      <w:proofErr w:type="spellStart"/>
-      <w:r>
-        <w:rPr/>
-        <w:t>mạng</w:t>
-      </w:r>
-      <w:proofErr w:type="spellEnd"/>
-      <w:r>
-        <w:rPr/>
-        <w:t xml:space="preserve"> </w:t>
-      </w:r>
-      <w:proofErr w:type="spellStart"/>
-      <w:r>
-        <w:rPr/>
-        <w:t>tín</w:t>
-      </w:r>
-      <w:proofErr w:type="spellEnd"/>
-      <w:r>
-        <w:rPr/>
-        <w:t xml:space="preserve"> </w:t>
-      </w:r>
-      <w:proofErr w:type="spellStart"/>
-      <w:r>
-        <w:rPr/>
-        <w:t>hiệu</w:t>
-      </w:r>
+        <w:rPr>
+          <w:sz w:val="24"/>
+        </w:rPr>
+        <w:t>Hình 2. Sheet nguyên lý khối ESP32 DevKit và các mạng tín hiệu</w:t>
+      </w:r>
+      <w:proofErr w:type="spellEnd"/>
+      <w:proofErr w:type="spellStart"/>
+      <w:proofErr w:type="spellEnd"/>
+      <w:proofErr w:type="spellStart"/>
+      <w:proofErr w:type="spellEnd"/>
+      <w:proofErr w:type="spellStart"/>
+      <w:proofErr w:type="spellEnd"/>
+      <w:proofErr w:type="spellStart"/>
+      <w:proofErr w:type="spellEnd"/>
+      <w:proofErr w:type="spellStart"/>
+      <w:proofErr w:type="spellEnd"/>
+      <w:proofErr w:type="spellStart"/>
+      <w:proofErr w:type="spellEnd"/>
+      <w:proofErr w:type="spellStart"/>
+      <w:proofErr w:type="spellEnd"/>
+      <w:proofErr w:type="spellStart"/>
+      <w:proofErr w:type="spellEnd"/>
+      <w:proofErr w:type="spellStart"/>
       <w:proofErr w:type="spellEnd"/>
     </w:p>
     <w:p>
@@ -31773,109 +31621,31 @@
       </w:pPr>
       <w:proofErr w:type="spellStart"/>
       <w:r>
-        <w:rPr/>
-        <w:t>Hình</w:t>
-      </w:r>
-      <w:proofErr w:type="spellEnd"/>
-      <w:r>
-        <w:rPr/>
-        <w:t xml:space="preserve"> 3. </w:t>
-      </w:r>
-      <w:proofErr w:type="spellStart"/>
-      <w:r>
-        <w:rPr/>
-        <w:t>Mạch</w:t>
-      </w:r>
-      <w:proofErr w:type="spellEnd"/>
-      <w:r>
-        <w:rPr/>
-        <w:t xml:space="preserve"> </w:t>
-      </w:r>
-      <w:proofErr w:type="spellStart"/>
-      <w:r>
-        <w:rPr/>
-        <w:t>động</w:t>
-      </w:r>
-      <w:proofErr w:type="spellEnd"/>
-      <w:r>
-        <w:rPr/>
-        <w:t xml:space="preserve"> </w:t>
-      </w:r>
-      <w:proofErr w:type="spellStart"/>
-      <w:r>
-        <w:rPr/>
-        <w:t>lực</w:t>
-      </w:r>
-      <w:proofErr w:type="spellEnd"/>
-      <w:r>
-        <w:rPr/>
-        <w:t xml:space="preserve"> </w:t>
-      </w:r>
-      <w:proofErr w:type="spellStart"/>
-      <w:r>
-        <w:rPr/>
-        <w:t>cầu</w:t>
-      </w:r>
-      <w:proofErr w:type="spellEnd"/>
-      <w:r>
-        <w:rPr/>
-        <w:t xml:space="preserve"> H </w:t>
-      </w:r>
-      <w:proofErr w:type="spellStart"/>
-      <w:r>
-        <w:rPr/>
-        <w:t>ghép</w:t>
-      </w:r>
-      <w:proofErr w:type="spellEnd"/>
-      <w:r>
-        <w:rPr/>
-        <w:t xml:space="preserve"> </w:t>
-      </w:r>
-      <w:proofErr w:type="spellStart"/>
-      <w:r>
-        <w:rPr/>
-        <w:t>từ</w:t>
-      </w:r>
-      <w:proofErr w:type="spellEnd"/>
-      <w:r>
-        <w:rPr/>
-        <w:t xml:space="preserve"> </w:t>
-      </w:r>
-      <w:proofErr w:type="spellStart"/>
-      <w:r>
-        <w:rPr/>
-        <w:t>bốn</w:t>
-      </w:r>
-      <w:proofErr w:type="spellEnd"/>
-      <w:r>
-        <w:rPr/>
-        <w:t xml:space="preserve"> TIP41C </w:t>
-      </w:r>
-      <w:proofErr w:type="spellStart"/>
-      <w:r>
-        <w:rPr/>
-        <w:t>kèm</w:t>
-      </w:r>
-      <w:proofErr w:type="spellEnd"/>
-      <w:r>
-        <w:rPr/>
-        <w:t xml:space="preserve"> diode </w:t>
-      </w:r>
-      <w:proofErr w:type="spellStart"/>
-      <w:r>
-        <w:rPr/>
-        <w:t>bảo</w:t>
-      </w:r>
-      <w:proofErr w:type="spellEnd"/>
-      <w:r>
-        <w:rPr/>
-        <w:t xml:space="preserve"> </w:t>
-      </w:r>
-      <w:proofErr w:type="spellStart"/>
-      <w:r>
-        <w:rPr/>
-        <w:t>vệ</w:t>
-      </w:r>
+        <w:rPr>
+          <w:sz w:val="24"/>
+        </w:rPr>
+        <w:t>Hình 3. Mạch động lực cầu H ghép từ bốn TIP41C kèm diode bảo vệ</w:t>
+      </w:r>
+      <w:proofErr w:type="spellEnd"/>
+      <w:proofErr w:type="spellStart"/>
+      <w:proofErr w:type="spellEnd"/>
+      <w:proofErr w:type="spellStart"/>
+      <w:proofErr w:type="spellEnd"/>
+      <w:proofErr w:type="spellStart"/>
+      <w:proofErr w:type="spellEnd"/>
+      <w:proofErr w:type="spellStart"/>
+      <w:proofErr w:type="spellEnd"/>
+      <w:proofErr w:type="spellStart"/>
+      <w:proofErr w:type="spellEnd"/>
+      <w:proofErr w:type="spellStart"/>
+      <w:proofErr w:type="spellEnd"/>
+      <w:proofErr w:type="spellStart"/>
+      <w:proofErr w:type="spellEnd"/>
+      <w:proofErr w:type="spellStart"/>
+      <w:proofErr w:type="spellEnd"/>
+      <w:proofErr w:type="spellStart"/>
+      <w:proofErr w:type="spellEnd"/>
+      <w:proofErr w:type="spellStart"/>
       <w:proofErr w:type="spellEnd"/>
     </w:p>
     <w:p>
@@ -32232,129 +32002,35 @@
       </w:pPr>
       <w:proofErr w:type="spellStart"/>
       <w:r>
-        <w:rPr/>
-        <w:t>Hình</w:t>
-      </w:r>
-      <w:proofErr w:type="spellEnd"/>
-      <w:r>
-        <w:rPr/>
-        <w:t xml:space="preserve"> 4. </w:t>
-      </w:r>
-      <w:proofErr w:type="spellStart"/>
-      <w:r>
-        <w:rPr/>
-        <w:t>Mạch</w:t>
-      </w:r>
-      <w:proofErr w:type="spellEnd"/>
-      <w:r>
-        <w:rPr/>
-        <w:t xml:space="preserve"> </w:t>
-      </w:r>
-      <w:proofErr w:type="spellStart"/>
-      <w:r>
-        <w:rPr/>
-        <w:t>cách</w:t>
-      </w:r>
-      <w:proofErr w:type="spellEnd"/>
-      <w:r>
-        <w:rPr/>
-        <w:t xml:space="preserve"> </w:t>
-      </w:r>
-      <w:proofErr w:type="spellStart"/>
-      <w:r>
-        <w:rPr/>
-        <w:t>ly</w:t>
-      </w:r>
-      <w:proofErr w:type="spellEnd"/>
-      <w:r>
-        <w:rPr/>
-        <w:t xml:space="preserve"> </w:t>
-      </w:r>
-      <w:proofErr w:type="spellStart"/>
-      <w:r>
-        <w:rPr/>
-        <w:t>opto</w:t>
-      </w:r>
-      <w:proofErr w:type="spellEnd"/>
-      <w:r>
-        <w:rPr/>
-        <w:t xml:space="preserve"> PC817 </w:t>
-      </w:r>
-      <w:proofErr w:type="spellStart"/>
-      <w:r>
-        <w:rPr/>
-        <w:t>giữa</w:t>
-      </w:r>
-      <w:proofErr w:type="spellEnd"/>
-      <w:r>
-        <w:rPr/>
-        <w:t xml:space="preserve"> </w:t>
-      </w:r>
-      <w:proofErr w:type="spellStart"/>
-      <w:r>
-        <w:rPr/>
-        <w:t>khối</w:t>
-      </w:r>
-      <w:proofErr w:type="spellEnd"/>
-      <w:r>
-        <w:rPr/>
-        <w:t xml:space="preserve"> </w:t>
-      </w:r>
-      <w:proofErr w:type="spellStart"/>
-      <w:r>
-        <w:rPr/>
-        <w:t>điều</w:t>
-      </w:r>
-      <w:proofErr w:type="spellEnd"/>
-      <w:r>
-        <w:rPr/>
-        <w:t xml:space="preserve"> </w:t>
-      </w:r>
-      <w:proofErr w:type="spellStart"/>
-      <w:r>
-        <w:rPr/>
-        <w:t>khiển</w:t>
-      </w:r>
-      <w:proofErr w:type="spellEnd"/>
-      <w:r>
-        <w:rPr/>
-        <w:t xml:space="preserve"> </w:t>
-      </w:r>
-      <w:proofErr w:type="spellStart"/>
-      <w:r>
-        <w:rPr/>
-        <w:t>và</w:t>
-      </w:r>
-      <w:proofErr w:type="spellEnd"/>
-      <w:r>
-        <w:rPr/>
-        <w:t xml:space="preserve"> </w:t>
-      </w:r>
-      <w:proofErr w:type="spellStart"/>
-      <w:r>
-        <w:rPr/>
-        <w:t>mạch</w:t>
-      </w:r>
-      <w:proofErr w:type="spellEnd"/>
-      <w:r>
-        <w:rPr/>
-        <w:t xml:space="preserve"> </w:t>
-      </w:r>
-      <w:proofErr w:type="spellStart"/>
-      <w:r>
-        <w:rPr/>
-        <w:t>động</w:t>
-      </w:r>
-      <w:proofErr w:type="spellEnd"/>
-      <w:r>
-        <w:rPr/>
-        <w:t xml:space="preserve"> </w:t>
-      </w:r>
-      <w:proofErr w:type="spellStart"/>
-      <w:r>
-        <w:rPr/>
-        <w:t>lực</w:t>
-      </w:r>
+        <w:rPr>
+          <w:sz w:val="24"/>
+        </w:rPr>
+        <w:t>Hình 4. Mạch cách ly opto PC817 giữa khối điều khiển và mạch động lực</w:t>
+      </w:r>
+      <w:proofErr w:type="spellEnd"/>
+      <w:proofErr w:type="spellStart"/>
+      <w:proofErr w:type="spellEnd"/>
+      <w:proofErr w:type="spellStart"/>
+      <w:proofErr w:type="spellEnd"/>
+      <w:proofErr w:type="spellStart"/>
+      <w:proofErr w:type="spellEnd"/>
+      <w:proofErr w:type="spellStart"/>
+      <w:proofErr w:type="spellEnd"/>
+      <w:proofErr w:type="spellStart"/>
+      <w:proofErr w:type="spellEnd"/>
+      <w:proofErr w:type="spellStart"/>
+      <w:proofErr w:type="spellEnd"/>
+      <w:proofErr w:type="spellStart"/>
+      <w:proofErr w:type="spellEnd"/>
+      <w:proofErr w:type="spellStart"/>
+      <w:proofErr w:type="spellEnd"/>
+      <w:proofErr w:type="spellStart"/>
+      <w:proofErr w:type="spellEnd"/>
+      <w:proofErr w:type="spellStart"/>
+      <w:proofErr w:type="spellEnd"/>
+      <w:proofErr w:type="spellStart"/>
+      <w:proofErr w:type="spellEnd"/>
+      <w:proofErr w:type="spellStart"/>
       <w:proofErr w:type="spellEnd"/>
     </w:p>
     <w:p>
@@ -33769,94 +33445,28 @@
       </w:pPr>
       <w:proofErr w:type="spellStart"/>
       <w:r>
-        <w:rPr/>
-        <w:t>Hình</w:t>
-      </w:r>
-      <w:proofErr w:type="spellEnd"/>
-      <w:r>
-        <w:rPr/>
-        <w:t xml:space="preserve"> 5. </w:t>
-      </w:r>
-      <w:proofErr w:type="spellStart"/>
-      <w:r>
-        <w:rPr/>
-        <w:t>Mạch</w:t>
-      </w:r>
-      <w:proofErr w:type="spellEnd"/>
-      <w:r>
-        <w:rPr/>
-        <w:t xml:space="preserve"> </w:t>
-      </w:r>
-      <w:proofErr w:type="spellStart"/>
-      <w:r>
-        <w:rPr/>
-        <w:t>nguồn</w:t>
-      </w:r>
-      <w:proofErr w:type="spellEnd"/>
-      <w:r>
-        <w:rPr/>
-        <w:t xml:space="preserve"> </w:t>
-      </w:r>
-      <w:proofErr w:type="spellStart"/>
-      <w:r>
-        <w:rPr/>
-        <w:t>chống</w:t>
-      </w:r>
-      <w:proofErr w:type="spellEnd"/>
-      <w:r>
-        <w:rPr/>
-        <w:t xml:space="preserve"> </w:t>
-      </w:r>
-      <w:proofErr w:type="spellStart"/>
-      <w:r>
-        <w:rPr/>
-        <w:t>ngược</w:t>
-      </w:r>
-      <w:proofErr w:type="spellEnd"/>
-      <w:r>
-        <w:rPr/>
-        <w:t xml:space="preserve"> </w:t>
-      </w:r>
-      <w:proofErr w:type="spellStart"/>
-      <w:r>
-        <w:rPr/>
-        <w:t>cực</w:t>
-      </w:r>
-      <w:proofErr w:type="spellEnd"/>
-      <w:r>
-        <w:rPr/>
-        <w:t xml:space="preserve"> </w:t>
-      </w:r>
-      <w:proofErr w:type="spellStart"/>
-      <w:r>
-        <w:rPr/>
-        <w:t>và</w:t>
-      </w:r>
-      <w:proofErr w:type="spellEnd"/>
-      <w:r>
-        <w:rPr/>
-        <w:t xml:space="preserve"> </w:t>
-      </w:r>
-      <w:proofErr w:type="spellStart"/>
-      <w:r>
-        <w:rPr/>
-        <w:t>hạ</w:t>
-      </w:r>
-      <w:proofErr w:type="spellEnd"/>
-      <w:r>
-        <w:rPr/>
-        <w:t xml:space="preserve"> </w:t>
-      </w:r>
-      <w:proofErr w:type="spellStart"/>
-      <w:r>
-        <w:rPr/>
-        <w:t>áp</w:t>
-      </w:r>
-      <w:proofErr w:type="spellEnd"/>
-      <w:r>
-        <w:rPr/>
-        <w:t xml:space="preserve"> LM2596</w:t>
-      </w:r>
+        <w:rPr>
+          <w:sz w:val="24"/>
+        </w:rPr>
+        <w:t>Hình 5. Mạch nguồn chống ngược cực và hạ áp LM2596</w:t>
+      </w:r>
+      <w:proofErr w:type="spellEnd"/>
+      <w:proofErr w:type="spellStart"/>
+      <w:proofErr w:type="spellEnd"/>
+      <w:proofErr w:type="spellStart"/>
+      <w:proofErr w:type="spellEnd"/>
+      <w:proofErr w:type="spellStart"/>
+      <w:proofErr w:type="spellEnd"/>
+      <w:proofErr w:type="spellStart"/>
+      <w:proofErr w:type="spellEnd"/>
+      <w:proofErr w:type="spellStart"/>
+      <w:proofErr w:type="spellEnd"/>
+      <w:proofErr w:type="spellStart"/>
+      <w:proofErr w:type="spellEnd"/>
+      <w:proofErr w:type="spellStart"/>
+      <w:proofErr w:type="spellEnd"/>
+      <w:proofErr w:type="spellStart"/>
+      <w:proofErr w:type="spellEnd"/>
     </w:p>
     <w:p>
       <w:proofErr w:type="spellStart"/>
@@ -34183,74 +33793,24 @@
       </w:pPr>
       <w:proofErr w:type="spellStart"/>
       <w:r>
-        <w:rPr/>
-        <w:t>Hình</w:t>
-      </w:r>
-      <w:proofErr w:type="spellEnd"/>
-      <w:r>
-        <w:rPr/>
-        <w:t xml:space="preserve"> 6. </w:t>
-      </w:r>
-      <w:proofErr w:type="spellStart"/>
-      <w:r>
-        <w:rPr/>
-        <w:t>Nhánh</w:t>
-      </w:r>
-      <w:proofErr w:type="spellEnd"/>
-      <w:r>
-        <w:rPr/>
-        <w:t xml:space="preserve"> 5 V </w:t>
-      </w:r>
-      <w:proofErr w:type="spellStart"/>
-      <w:r>
-        <w:rPr/>
-        <w:t>ổn</w:t>
-      </w:r>
-      <w:proofErr w:type="spellEnd"/>
-      <w:r>
-        <w:rPr/>
-        <w:t xml:space="preserve"> </w:t>
-      </w:r>
-      <w:proofErr w:type="spellStart"/>
-      <w:r>
-        <w:rPr/>
-        <w:t>áp</w:t>
-      </w:r>
-      <w:proofErr w:type="spellEnd"/>
-      <w:r>
-        <w:rPr/>
-        <w:t xml:space="preserve"> 7805 </w:t>
-      </w:r>
-      <w:proofErr w:type="spellStart"/>
-      <w:r>
-        <w:rPr/>
-        <w:t>và</w:t>
-      </w:r>
-      <w:proofErr w:type="spellEnd"/>
-      <w:r>
-        <w:rPr/>
-        <w:t xml:space="preserve"> </w:t>
-      </w:r>
-      <w:proofErr w:type="spellStart"/>
-      <w:r>
-        <w:rPr/>
-        <w:t>màn</w:t>
-      </w:r>
-      <w:proofErr w:type="spellEnd"/>
-      <w:r>
-        <w:rPr/>
-        <w:t xml:space="preserve"> </w:t>
-      </w:r>
-      <w:proofErr w:type="spellStart"/>
-      <w:r>
-        <w:rPr/>
-        <w:t>hình</w:t>
-      </w:r>
-      <w:proofErr w:type="spellEnd"/>
-      <w:r>
-        <w:rPr/>
-        <w:t xml:space="preserve"> LCD I²C 1602</w:t>
-      </w:r>
+        <w:rPr>
+          <w:sz w:val="24"/>
+        </w:rPr>
+        <w:t>Hình 6. Nhánh 5 V ổn áp 7805 và màn hình LCD I²C 1602</w:t>
+      </w:r>
+      <w:proofErr w:type="spellEnd"/>
+      <w:proofErr w:type="spellStart"/>
+      <w:proofErr w:type="spellEnd"/>
+      <w:proofErr w:type="spellStart"/>
+      <w:proofErr w:type="spellEnd"/>
+      <w:proofErr w:type="spellStart"/>
+      <w:proofErr w:type="spellEnd"/>
+      <w:proofErr w:type="spellStart"/>
+      <w:proofErr w:type="spellEnd"/>
+      <w:proofErr w:type="spellStart"/>
+      <w:proofErr w:type="spellEnd"/>
+      <w:proofErr w:type="spellStart"/>
+      <w:proofErr w:type="spellEnd"/>
     </w:p>
     <w:p>
       <w:proofErr w:type="spellStart"/>
@@ -34586,54 +34146,20 @@
       </w:pPr>
       <w:proofErr w:type="spellStart"/>
       <w:r>
-        <w:rPr/>
-        <w:t>Hình</w:t>
-      </w:r>
-      <w:proofErr w:type="spellEnd"/>
-      <w:r>
-        <w:rPr/>
-        <w:t xml:space="preserve"> 7. Module </w:t>
-      </w:r>
-      <w:proofErr w:type="spellStart"/>
-      <w:r>
-        <w:rPr/>
-        <w:t>thời</w:t>
-      </w:r>
-      <w:proofErr w:type="spellEnd"/>
-      <w:r>
-        <w:rPr/>
-        <w:t xml:space="preserve"> </w:t>
-      </w:r>
-      <w:proofErr w:type="spellStart"/>
-      <w:r>
-        <w:rPr/>
-        <w:t>gian</w:t>
-      </w:r>
-      <w:proofErr w:type="spellEnd"/>
-      <w:r>
-        <w:rPr/>
-        <w:t xml:space="preserve"> </w:t>
-      </w:r>
-      <w:proofErr w:type="spellStart"/>
-      <w:r>
-        <w:rPr/>
-        <w:t>thực</w:t>
-      </w:r>
-      <w:proofErr w:type="spellEnd"/>
-      <w:r>
-        <w:rPr/>
-        <w:t xml:space="preserve"> DS1307 </w:t>
-      </w:r>
-      <w:proofErr w:type="spellStart"/>
-      <w:r>
-        <w:rPr/>
-        <w:t>trên</w:t>
-      </w:r>
-      <w:proofErr w:type="spellEnd"/>
-      <w:r>
-        <w:rPr/>
-        <w:t xml:space="preserve"> bus I²C</w:t>
-      </w:r>
+        <w:rPr>
+          <w:sz w:val="24"/>
+        </w:rPr>
+        <w:t>Hình 7. Module thời gian thực DS1307 trên bus I²C</w:t>
+      </w:r>
+      <w:proofErr w:type="spellEnd"/>
+      <w:proofErr w:type="spellStart"/>
+      <w:proofErr w:type="spellEnd"/>
+      <w:proofErr w:type="spellStart"/>
+      <w:proofErr w:type="spellEnd"/>
+      <w:proofErr w:type="spellStart"/>
+      <w:proofErr w:type="spellEnd"/>
+      <w:proofErr w:type="spellStart"/>
+      <w:proofErr w:type="spellEnd"/>
     </w:p>
     <w:p>
       <w:proofErr w:type="spellStart"/>
@@ -35215,54 +34741,20 @@
       </w:pPr>
       <w:proofErr w:type="spellStart"/>
       <w:r>
-        <w:rPr/>
-        <w:t>Hình</w:t>
-      </w:r>
-      <w:proofErr w:type="spellEnd"/>
-      <w:r>
-        <w:rPr/>
-        <w:t xml:space="preserve"> 8. </w:t>
-      </w:r>
-      <w:proofErr w:type="spellStart"/>
-      <w:r>
-        <w:rPr/>
-        <w:t>Mạch</w:t>
-      </w:r>
-      <w:proofErr w:type="spellEnd"/>
-      <w:r>
-        <w:rPr/>
-        <w:t xml:space="preserve"> </w:t>
-      </w:r>
-      <w:proofErr w:type="spellStart"/>
-      <w:r>
-        <w:rPr/>
-        <w:t>đọc</w:t>
-      </w:r>
-      <w:proofErr w:type="spellEnd"/>
-      <w:r>
-        <w:rPr/>
-        <w:t xml:space="preserve"> </w:t>
-      </w:r>
-      <w:proofErr w:type="spellStart"/>
-      <w:r>
-        <w:rPr/>
-        <w:t>quang</w:t>
-      </w:r>
-      <w:proofErr w:type="spellEnd"/>
-      <w:r>
-        <w:rPr/>
-        <w:t xml:space="preserve"> </w:t>
-      </w:r>
-      <w:proofErr w:type="spellStart"/>
-      <w:r>
-        <w:rPr/>
-        <w:t>trở</w:t>
-      </w:r>
-      <w:proofErr w:type="spellEnd"/>
-      <w:r>
-        <w:rPr/>
-        <w:t xml:space="preserve"> </w:t>
-      </w:r>
+        <w:rPr>
+          <w:sz w:val="24"/>
+        </w:rPr>
+        <w:t xml:space="preserve">Hình 8. Mạch đọc quang trở </w:t>
+      </w:r>
+      <w:proofErr w:type="spellEnd"/>
+      <w:proofErr w:type="spellStart"/>
+      <w:proofErr w:type="spellEnd"/>
+      <w:proofErr w:type="spellStart"/>
+      <w:proofErr w:type="spellEnd"/>
+      <w:proofErr w:type="spellStart"/>
+      <w:proofErr w:type="spellEnd"/>
+      <w:proofErr w:type="spellStart"/>
+      <w:proofErr w:type="spellEnd"/>
     </w:p>
     <w:p>
       <w:pPr>
@@ -39478,6 +38970,331 @@
       <w:pPr>
         <w:pStyle w:val="ListBullet"/>
       </w:pPr>
+    </w:p>
+    <w:p>
+      <w:pPr>
+        <w:pStyle w:val="Heading2"/>
+      </w:pPr>
+      <w:r>
+        <w:t>3.7. Kết cấu cơ khí mô hình một trục trên bản vẽ 3D</w:t>
+      </w:r>
+    </w:p>
+    <w:p>
+      <w:r>
+        <w:t>Kết cấu cơ khí của mô hình một trục được vẽ lại hoàn chỉnh trên phần mềm 3D: tấm pin bắt trên đà quay phía trên khối truyền động, hai thanh nhôm định hình song song đỡ toàn bộ cụm từ tấm đế. Động cơ gạt nước truyền mô-men qua cụm pu-li trục răng tới trục quay của tấm pin, bảo đảm tấm quay êm và giữ được vị trí khi ngắt điện.</w:t>
+      </w:r>
+    </w:p>
+    <w:p>
+      <w:r>
+        <w:drawing>
+          <wp:inline xmlns:a="http://schemas.openxmlformats.org/drawingml/2006/main" xmlns:pic="http://schemas.openxmlformats.org/drawingml/2006/picture">
+            <wp:extent cx="5120640" cy="3552916"/>
+            <wp:docPr id="16" name="Picture 16"/>
+            <wp:cNvGraphicFramePr>
+              <a:graphicFrameLocks noChangeAspect="1"/>
+            </wp:cNvGraphicFramePr>
+            <a:graphic>
+              <a:graphicData uri="http://schemas.openxmlformats.org/drawingml/2006/picture">
+                <pic:pic>
+                  <pic:nvPicPr>
+                    <pic:cNvPr id="0" name="mo_hinh_1_truc_tong_quat.png"/>
+                    <pic:cNvPicPr/>
+                  </pic:nvPicPr>
+                  <pic:blipFill>
+                    <a:blip r:embed="rId22"/>
+                    <a:stretch>
+                      <a:fillRect/>
+                    </a:stretch>
+                  </pic:blipFill>
+                  <pic:spPr>
+                    <a:xfrm>
+                      <a:off x="0" y="0"/>
+                      <a:ext cx="5120640" cy="3552916"/>
+                    </a:xfrm>
+                    <a:prstGeom prst="rect"/>
+                  </pic:spPr>
+                </pic:pic>
+              </a:graphicData>
+            </a:graphic>
+          </wp:inline>
+        </w:drawing>
+      </w:r>
+    </w:p>
+    <w:p>
+      <w:pPr>
+        <w:pStyle w:val="Caption"/>
+      </w:pPr>
+      <w:r>
+        <w:rPr>
+          <w:sz w:val="24"/>
+        </w:rPr>
+        <w:t>Hình 9. Toàn cảnh kết cấu mô hình một trục trên bản vẽ 3D</w:t>
+      </w:r>
+    </w:p>
+    <w:p>
+      <w:r>
+        <w:t>Toàn cảnh kết cấu: tấm pin dạng tấm dài có mép gấp hai đầu bắt lên đà quay của khối truyền động; hai thanh nhôm định hình song song nâng cụm truyền động khỏi tấm đế, tạo góc quan sát và khoảng đi dây phía dưới.</w:t>
+      </w:r>
+    </w:p>
+    <w:p>
+      <w:r>
+        <w:drawing>
+          <wp:inline xmlns:a="http://schemas.openxmlformats.org/drawingml/2006/main" xmlns:pic="http://schemas.openxmlformats.org/drawingml/2006/picture">
+            <wp:extent cx="4389120" cy="4245551"/>
+            <wp:docPr id="17" name="Picture 17"/>
+            <wp:cNvGraphicFramePr>
+              <a:graphicFrameLocks noChangeAspect="1"/>
+            </wp:cNvGraphicFramePr>
+            <a:graphic>
+              <a:graphicData uri="http://schemas.openxmlformats.org/drawingml/2006/picture">
+                <pic:pic>
+                  <pic:nvPicPr>
+                    <pic:cNvPr id="0" name="dong_co_gan_khop_nghieng.png"/>
+                    <pic:cNvPicPr/>
+                  </pic:nvPicPr>
+                  <pic:blipFill>
+                    <a:blip r:embed="rId23"/>
+                    <a:stretch>
+                      <a:fillRect/>
+                    </a:stretch>
+                  </pic:blipFill>
+                  <pic:spPr>
+                    <a:xfrm>
+                      <a:off x="0" y="0"/>
+                      <a:ext cx="4389120" cy="4245551"/>
+                    </a:xfrm>
+                    <a:prstGeom prst="rect"/>
+                  </pic:spPr>
+                </pic:pic>
+              </a:graphicData>
+            </a:graphic>
+          </wp:inline>
+        </w:drawing>
+      </w:r>
+    </w:p>
+    <w:p>
+      <w:pPr>
+        <w:pStyle w:val="Caption"/>
+      </w:pPr>
+      <w:r>
+        <w:rPr>
+          <w:sz w:val="24"/>
+        </w:rPr>
+        <w:t>Hình 10. Động cơ gạt nước gắn mặt bích trên tấm truyền động</w:t>
+      </w:r>
+    </w:p>
+    <w:p>
+      <w:r>
+        <w:t>Cận cảnh động cơ gạt nước: thân motor kẹp bằng mặt bích tròn ba bulông trên tấm thép nghiêng, trục ra mang pu-li dẫn động cho trục quay tấm pin; toàn bộ cụm đặt gọn giữa hai thanh nhôm.</w:t>
+      </w:r>
+    </w:p>
+    <w:p>
+      <w:r>
+        <w:drawing>
+          <wp:inline xmlns:a="http://schemas.openxmlformats.org/drawingml/2006/main" xmlns:pic="http://schemas.openxmlformats.org/drawingml/2006/picture">
+            <wp:extent cx="4754880" cy="3901440"/>
+            <wp:docPr id="18" name="Picture 18"/>
+            <wp:cNvGraphicFramePr>
+              <a:graphicFrameLocks noChangeAspect="1"/>
+            </wp:cNvGraphicFramePr>
+            <a:graphic>
+              <a:graphicData uri="http://schemas.openxmlformats.org/drawingml/2006/picture">
+                <pic:pic>
+                  <pic:nvPicPr>
+                    <pic:cNvPr id="0" name="truyen_dong_puli_truc_quay.png"/>
+                    <pic:cNvPicPr/>
+                  </pic:nvPicPr>
+                  <pic:blipFill>
+                    <a:blip r:embed="rId24"/>
+                    <a:stretch>
+                      <a:fillRect/>
+                    </a:stretch>
+                  </pic:blipFill>
+                  <pic:spPr>
+                    <a:xfrm>
+                      <a:off x="0" y="0"/>
+                      <a:ext cx="4754880" cy="3901440"/>
+                    </a:xfrm>
+                    <a:prstGeom prst="rect"/>
+                  </pic:spPr>
+                </pic:pic>
+              </a:graphicData>
+            </a:graphic>
+          </wp:inline>
+        </w:drawing>
+      </w:r>
+    </w:p>
+    <w:p>
+      <w:pPr>
+        <w:pStyle w:val="Caption"/>
+      </w:pPr>
+      <w:r>
+        <w:rPr>
+          <w:sz w:val="24"/>
+        </w:rPr>
+        <w:t>Hình 11. Cụm truyền động pu-li và ổ trục của trục quay tấm pin</w:t>
+      </w:r>
+    </w:p>
+    <w:p>
+      <w:r>
+        <w:t>Cụm truyền động: pu-li răng trên trục động cơ nối qua trục trung gian mang hai ổ bạc có bích bắt vít, đầu ra là pu-li lớn gắn với trục quay của tấm pin nhằm giảm tốc, tăng mô-men và giảm độ rơ của khớp.</w:t>
+      </w:r>
+    </w:p>
+    <w:p>
+      <w:r>
+        <w:drawing>
+          <wp:inline xmlns:a="http://schemas.openxmlformats.org/drawingml/2006/main" xmlns:pic="http://schemas.openxmlformats.org/drawingml/2006/picture">
+            <wp:extent cx="4754880" cy="3667524"/>
+            <wp:docPr id="19" name="Picture 19"/>
+            <wp:cNvGraphicFramePr>
+              <a:graphicFrameLocks noChangeAspect="1"/>
+            </wp:cNvGraphicFramePr>
+            <a:graphic>
+              <a:graphicData uri="http://schemas.openxmlformats.org/drawingml/2006/picture">
+                <pic:pic>
+                  <pic:nvPicPr>
+                    <pic:cNvPr id="0" name="tam_day_va_dau_thanh_nhom.png"/>
+                    <pic:cNvPicPr/>
+                  </pic:nvPicPr>
+                  <pic:blipFill>
+                    <a:blip r:embed="rId25"/>
+                    <a:stretch>
+                      <a:fillRect/>
+                    </a:stretch>
+                  </pic:blipFill>
+                  <pic:spPr>
+                    <a:xfrm>
+                      <a:off x="0" y="0"/>
+                      <a:ext cx="4754880" cy="3667524"/>
+                    </a:xfrm>
+                    <a:prstGeom prst="rect"/>
+                  </pic:spPr>
+                </pic:pic>
+              </a:graphicData>
+            </a:graphic>
+          </wp:inline>
+        </w:drawing>
+      </w:r>
+    </w:p>
+    <w:p>
+      <w:pPr>
+        <w:pStyle w:val="Caption"/>
+      </w:pPr>
+      <w:r>
+        <w:rPr>
+          <w:sz w:val="24"/>
+        </w:rPr>
+        <w:t>Hình 12. Tấm đế truyền động và đầu bốn thanh nhôm định hình</w:t>
+      </w:r>
+    </w:p>
+    <w:p>
+      <w:r>
+        <w:t>Tấm thép dày phía dưới khoan các lỗ bulông chìm bắt đầu bốn thanh nhôm định hình; mặt trên tấm là gối đỡ các trục truyền động và thân động cơ, giữ đồng tâm các pu-li khi lắp ráp.</w:t>
+      </w:r>
+    </w:p>
+    <w:p>
+      <w:r>
+        <w:drawing>
+          <wp:inline xmlns:a="http://schemas.openxmlformats.org/drawingml/2006/main" xmlns:pic="http://schemas.openxmlformats.org/drawingml/2006/picture">
+            <wp:extent cx="4754880" cy="3547078"/>
+            <wp:docPr id="20" name="Picture 20"/>
+            <wp:cNvGraphicFramePr>
+              <a:graphicFrameLocks noChangeAspect="1"/>
+            </wp:cNvGraphicFramePr>
+            <a:graphic>
+              <a:graphicData uri="http://schemas.openxmlformats.org/drawingml/2006/picture">
+                <pic:pic>
+                  <pic:nvPicPr>
+                    <pic:cNvPr id="0" name="de_tam_va_thanh_nhom_400mm.png"/>
+                    <pic:cNvPicPr/>
+                  </pic:nvPicPr>
+                  <pic:blipFill>
+                    <a:blip r:embed="rId26"/>
+                    <a:stretch>
+                      <a:fillRect/>
+                    </a:stretch>
+                  </pic:blipFill>
+                  <pic:spPr>
+                    <a:xfrm>
+                      <a:off x="0" y="0"/>
+                      <a:ext cx="4754880" cy="3547078"/>
+                    </a:xfrm>
+                    <a:prstGeom prst="rect"/>
+                  </pic:spPr>
+                </pic:pic>
+              </a:graphicData>
+            </a:graphic>
+          </wp:inline>
+        </w:drawing>
+      </w:r>
+    </w:p>
+    <w:p>
+      <w:pPr>
+        <w:pStyle w:val="Caption"/>
+      </w:pPr>
+      <w:r>
+        <w:rPr>
+          <w:sz w:val="24"/>
+        </w:rPr>
+        <w:t>Hình 13. Tấm đế và bốn thanh nhôm định hình 400 mm</w:t>
+      </w:r>
+    </w:p>
+    <w:p>
+      <w:r>
+        <w:t>Chân đế mô hình: bốn thanh nhôm định hình dài 400 mm cắm vào rãnh khoét trên tấm đế phẳng, tạo thành khung cột cứng vững và dễ tháo lắp khi vận chuyển.</w:t>
+      </w:r>
+    </w:p>
+    <w:p>
+      <w:r>
+        <w:drawing>
+          <wp:inline xmlns:a="http://schemas.openxmlformats.org/drawingml/2006/main" xmlns:pic="http://schemas.openxmlformats.org/drawingml/2006/picture">
+            <wp:extent cx="4937760" cy="4017981"/>
+            <wp:docPr id="21" name="Picture 21"/>
+            <wp:cNvGraphicFramePr>
+              <a:graphicFrameLocks noChangeAspect="1"/>
+            </wp:cNvGraphicFramePr>
+            <a:graphic>
+              <a:graphicData uri="http://schemas.openxmlformats.org/drawingml/2006/picture">
+                <pic:pic>
+                  <pic:nvPicPr>
+                    <pic:cNvPr id="0" name="mo_hinh_1_truc_hoan_chinh.png"/>
+                    <pic:cNvPicPr/>
+                  </pic:nvPicPr>
+                  <pic:blipFill>
+                    <a:blip r:embed="rId27"/>
+                    <a:stretch>
+                      <a:fillRect/>
+                    </a:stretch>
+                  </pic:blipFill>
+                  <pic:spPr>
+                    <a:xfrm>
+                      <a:off x="0" y="0"/>
+                      <a:ext cx="4937760" cy="4017981"/>
+                    </a:xfrm>
+                    <a:prstGeom prst="rect"/>
+                  </pic:spPr>
+                </pic:pic>
+              </a:graphicData>
+            </a:graphic>
+          </wp:inline>
+        </w:drawing>
+      </w:r>
+    </w:p>
+    <w:p>
+      <w:pPr>
+        <w:pStyle w:val="Caption"/>
+      </w:pPr>
+      <w:r>
+        <w:rPr>
+          <w:sz w:val="24"/>
+        </w:rPr>
+        <w:t>Hình 14. Mô hình một trục hoàn chỉnh trên bản vẽ 3D</w:t>
+      </w:r>
+    </w:p>
+    <w:p>
+      <w:r>
+        <w:t>Mô hình hoàn chỉnh: tấm pin nằm trên đầu quay mang cụm truyền động, hai thanh nhôm nối xuống tấm đế; hành trình khớp quay phủ dải góc làm việc của luật bám nắng một trục đã chọn ở chương 2.</w:t>
+      </w:r>
     </w:p>
     <w:p>
       <w:pPr>

</xml_diff>